<commit_message>
rapport (structure ,intorduction,2	ANALYSE 2.1	Planification de toutes les tâches à réaliser Planification des tâches (outil GitHub Projects))
</commit_message>
<xml_diff>
--- a/documentation/rapport.docx
+++ b/documentation/rapport.docx
@@ -301,6 +301,9 @@
     <w:p>
       <w:pPr>
         <w:jc w:val="center"/>
+        <w:rPr>
+          <w:lang w:val="en-US"/>
+        </w:rPr>
       </w:pPr>
       <w:hyperlink r:id="rId7" w:history="1">
         <w:r>
@@ -310,15 +313,16 @@
             <w:sz w:val="21"/>
             <w:szCs w:val="21"/>
             <w:shd w:val="clear" w:color="auto" w:fill="FFFFFF"/>
+            <w:lang w:val="en-US"/>
           </w:rPr>
           <w:t>Charles-Henri Moser</w:t>
         </w:r>
       </w:hyperlink>
       <w:r>
-        <w:t xml:space="preserve"> </w:t>
-      </w:r>
-      <w:r>
-        <w:t>– CID2B</w:t>
+        <w:rPr>
+          <w:lang w:val="en-US"/>
+        </w:rPr>
+        <w:t xml:space="preserve"> – CID2B</w:t>
       </w:r>
     </w:p>
     <w:p>
@@ -388,7 +392,10 @@
     <w:sdt>
       <w:sdtPr>
         <w:rPr>
-          <w:rFonts w:ascii="Bookman Old Style" w:hAnsi="Bookman Old Style"/>
+          <w:rFonts w:ascii="Bookman Old Style" w:eastAsia="Times New Roman" w:hAnsi="Bookman Old Style" w:cs="Times New Roman"/>
+          <w:color w:val="auto"/>
+          <w:sz w:val="20"/>
+          <w:szCs w:val="20"/>
           <w:lang w:val="fr-FR"/>
         </w:rPr>
         <w:id w:val="103554202"/>
@@ -399,12 +406,8 @@
       </w:sdtPr>
       <w:sdtEndPr>
         <w:rPr>
-          <w:rFonts w:eastAsia="Times New Roman" w:cs="Times New Roman"/>
           <w:b/>
           <w:bCs/>
-          <w:color w:val="auto"/>
-          <w:sz w:val="20"/>
-          <w:szCs w:val="20"/>
         </w:rPr>
       </w:sdtEndPr>
       <w:sdtContent>
@@ -431,7 +434,7 @@
               <w:tab w:val="right" w:leader="dot" w:pos="9062"/>
             </w:tabs>
             <w:rPr>
-              <w:rFonts w:eastAsiaTheme="minorEastAsia" w:cstheme="minorBidi"/>
+              <w:rFonts w:asciiTheme="minorHAnsi" w:eastAsiaTheme="minorEastAsia" w:hAnsiTheme="minorHAnsi" w:cstheme="minorBidi"/>
               <w:b w:val="0"/>
               <w:bCs w:val="0"/>
               <w:caps w:val="0"/>
@@ -451,7 +454,7 @@
           <w:r>
             <w:fldChar w:fldCharType="separate"/>
           </w:r>
-          <w:hyperlink w:anchor="_Toc198653210" w:history="1">
+          <w:hyperlink w:anchor="_Toc198654059" w:history="1">
             <w:r>
               <w:rPr>
                 <w:rStyle w:val="Lienhypertexte"/>
@@ -461,7 +464,7 @@
             </w:r>
             <w:r>
               <w:rPr>
-                <w:rFonts w:eastAsiaTheme="minorEastAsia" w:cstheme="minorBidi"/>
+                <w:rFonts w:asciiTheme="minorHAnsi" w:eastAsiaTheme="minorEastAsia" w:hAnsiTheme="minorHAnsi" w:cstheme="minorBidi"/>
                 <w:b w:val="0"/>
                 <w:bCs w:val="0"/>
                 <w:caps w:val="0"/>
@@ -499,7 +502,7 @@
                 <w:noProof/>
                 <w:webHidden/>
               </w:rPr>
-              <w:instrText xml:space="preserve"> PAGEREF _Toc198653210 \h </w:instrText>
+              <w:instrText xml:space="preserve"> PAGEREF _Toc198654059 \h </w:instrText>
             </w:r>
             <w:r>
               <w:rPr>
@@ -538,7 +541,7 @@
               <w:tab w:val="right" w:leader="dot" w:pos="9062"/>
             </w:tabs>
             <w:rPr>
-              <w:rFonts w:eastAsiaTheme="minorEastAsia" w:cstheme="minorBidi"/>
+              <w:rFonts w:asciiTheme="minorHAnsi" w:eastAsiaTheme="minorEastAsia" w:hAnsiTheme="minorHAnsi" w:cstheme="minorBidi"/>
               <w:smallCaps w:val="0"/>
               <w:noProof/>
               <w:kern w:val="2"/>
@@ -547,7 +550,7 @@
               <w14:ligatures w14:val="standardContextual"/>
             </w:rPr>
           </w:pPr>
-          <w:hyperlink w:anchor="_Toc198653211" w:history="1">
+          <w:hyperlink w:anchor="_Toc198654060" w:history="1">
             <w:r>
               <w:rPr>
                 <w:rStyle w:val="Lienhypertexte"/>
@@ -557,7 +560,7 @@
             </w:r>
             <w:r>
               <w:rPr>
-                <w:rFonts w:eastAsiaTheme="minorEastAsia" w:cstheme="minorBidi"/>
+                <w:rFonts w:asciiTheme="minorHAnsi" w:eastAsiaTheme="minorEastAsia" w:hAnsiTheme="minorHAnsi" w:cstheme="minorBidi"/>
                 <w:smallCaps w:val="0"/>
                 <w:noProof/>
                 <w:kern w:val="2"/>
@@ -593,7 +596,7 @@
                 <w:noProof/>
                 <w:webHidden/>
               </w:rPr>
-              <w:instrText xml:space="preserve"> PAGEREF _Toc198653211 \h </w:instrText>
+              <w:instrText xml:space="preserve"> PAGEREF _Toc198654060 \h </w:instrText>
             </w:r>
             <w:r>
               <w:rPr>
@@ -632,7 +635,7 @@
               <w:tab w:val="right" w:leader="dot" w:pos="9062"/>
             </w:tabs>
             <w:rPr>
-              <w:rFonts w:eastAsiaTheme="minorEastAsia" w:cstheme="minorBidi"/>
+              <w:rFonts w:asciiTheme="minorHAnsi" w:eastAsiaTheme="minorEastAsia" w:hAnsiTheme="minorHAnsi" w:cstheme="minorBidi"/>
               <w:smallCaps w:val="0"/>
               <w:noProof/>
               <w:kern w:val="2"/>
@@ -641,7 +644,7 @@
               <w14:ligatures w14:val="standardContextual"/>
             </w:rPr>
           </w:pPr>
-          <w:hyperlink w:anchor="_Toc198653212" w:history="1">
+          <w:hyperlink w:anchor="_Toc198654061" w:history="1">
             <w:r>
               <w:rPr>
                 <w:rStyle w:val="Lienhypertexte"/>
@@ -651,7 +654,7 @@
             </w:r>
             <w:r>
               <w:rPr>
-                <w:rFonts w:eastAsiaTheme="minorEastAsia" w:cstheme="minorBidi"/>
+                <w:rFonts w:asciiTheme="minorHAnsi" w:eastAsiaTheme="minorEastAsia" w:hAnsiTheme="minorHAnsi" w:cstheme="minorBidi"/>
                 <w:smallCaps w:val="0"/>
                 <w:noProof/>
                 <w:kern w:val="2"/>
@@ -687,7 +690,7 @@
                 <w:noProof/>
                 <w:webHidden/>
               </w:rPr>
-              <w:instrText xml:space="preserve"> PAGEREF _Toc198653212 \h </w:instrText>
+              <w:instrText xml:space="preserve"> PAGEREF _Toc198654061 \h </w:instrText>
             </w:r>
             <w:r>
               <w:rPr>
@@ -726,7 +729,7 @@
               <w:tab w:val="right" w:leader="dot" w:pos="9062"/>
             </w:tabs>
             <w:rPr>
-              <w:rFonts w:eastAsiaTheme="minorEastAsia" w:cstheme="minorBidi"/>
+              <w:rFonts w:asciiTheme="minorHAnsi" w:eastAsiaTheme="minorEastAsia" w:hAnsiTheme="minorHAnsi" w:cstheme="minorBidi"/>
               <w:b w:val="0"/>
               <w:bCs w:val="0"/>
               <w:caps w:val="0"/>
@@ -737,7 +740,7 @@
               <w14:ligatures w14:val="standardContextual"/>
             </w:rPr>
           </w:pPr>
-          <w:hyperlink w:anchor="_Toc198653213" w:history="1">
+          <w:hyperlink w:anchor="_Toc198654062" w:history="1">
             <w:r>
               <w:rPr>
                 <w:rStyle w:val="Lienhypertexte"/>
@@ -747,7 +750,7 @@
             </w:r>
             <w:r>
               <w:rPr>
-                <w:rFonts w:eastAsiaTheme="minorEastAsia" w:cstheme="minorBidi"/>
+                <w:rFonts w:asciiTheme="minorHAnsi" w:eastAsiaTheme="minorEastAsia" w:hAnsiTheme="minorHAnsi" w:cstheme="minorBidi"/>
                 <w:b w:val="0"/>
                 <w:bCs w:val="0"/>
                 <w:caps w:val="0"/>
@@ -785,7 +788,383 @@
                 <w:noProof/>
                 <w:webHidden/>
               </w:rPr>
-              <w:instrText xml:space="preserve"> PAGEREF _Toc198653213 \h </w:instrText>
+              <w:instrText xml:space="preserve"> PAGEREF _Toc198654062 \h </w:instrText>
+            </w:r>
+            <w:r>
+              <w:rPr>
+                <w:noProof/>
+                <w:webHidden/>
+              </w:rPr>
+            </w:r>
+            <w:r>
+              <w:rPr>
+                <w:noProof/>
+                <w:webHidden/>
+              </w:rPr>
+              <w:fldChar w:fldCharType="separate"/>
+            </w:r>
+            <w:r>
+              <w:rPr>
+                <w:noProof/>
+                <w:webHidden/>
+              </w:rPr>
+              <w:t>3</w:t>
+            </w:r>
+            <w:r>
+              <w:rPr>
+                <w:noProof/>
+                <w:webHidden/>
+              </w:rPr>
+              <w:fldChar w:fldCharType="end"/>
+            </w:r>
+          </w:hyperlink>
+        </w:p>
+        <w:p>
+          <w:pPr>
+            <w:pStyle w:val="TM2"/>
+            <w:tabs>
+              <w:tab w:val="left" w:pos="880"/>
+              <w:tab w:val="right" w:leader="dot" w:pos="9062"/>
+            </w:tabs>
+            <w:rPr>
+              <w:rFonts w:asciiTheme="minorHAnsi" w:eastAsiaTheme="minorEastAsia" w:hAnsiTheme="minorHAnsi" w:cstheme="minorBidi"/>
+              <w:smallCaps w:val="0"/>
+              <w:noProof/>
+              <w:kern w:val="2"/>
+              <w:sz w:val="22"/>
+              <w:szCs w:val="22"/>
+              <w14:ligatures w14:val="standardContextual"/>
+            </w:rPr>
+          </w:pPr>
+          <w:hyperlink w:anchor="_Toc198654063" w:history="1">
+            <w:r>
+              <w:rPr>
+                <w:rStyle w:val="Lienhypertexte"/>
+                <w:noProof/>
+              </w:rPr>
+              <w:t>2.1</w:t>
+            </w:r>
+            <w:r>
+              <w:rPr>
+                <w:rFonts w:asciiTheme="minorHAnsi" w:eastAsiaTheme="minorEastAsia" w:hAnsiTheme="minorHAnsi" w:cstheme="minorBidi"/>
+                <w:smallCaps w:val="0"/>
+                <w:noProof/>
+                <w:kern w:val="2"/>
+                <w:sz w:val="22"/>
+                <w:szCs w:val="22"/>
+                <w14:ligatures w14:val="standardContextual"/>
+              </w:rPr>
+              <w:tab/>
+            </w:r>
+            <w:r>
+              <w:rPr>
+                <w:rStyle w:val="Lienhypertexte"/>
+                <w:noProof/>
+              </w:rPr>
+              <w:t>Planification de toutes les tâches à réaliser</w:t>
+            </w:r>
+            <w:r>
+              <w:rPr>
+                <w:noProof/>
+                <w:webHidden/>
+              </w:rPr>
+              <w:tab/>
+            </w:r>
+            <w:r>
+              <w:rPr>
+                <w:noProof/>
+                <w:webHidden/>
+              </w:rPr>
+              <w:fldChar w:fldCharType="begin"/>
+            </w:r>
+            <w:r>
+              <w:rPr>
+                <w:noProof/>
+                <w:webHidden/>
+              </w:rPr>
+              <w:instrText xml:space="preserve"> PAGEREF _Toc198654063 \h </w:instrText>
+            </w:r>
+            <w:r>
+              <w:rPr>
+                <w:noProof/>
+                <w:webHidden/>
+              </w:rPr>
+            </w:r>
+            <w:r>
+              <w:rPr>
+                <w:noProof/>
+                <w:webHidden/>
+              </w:rPr>
+              <w:fldChar w:fldCharType="separate"/>
+            </w:r>
+            <w:r>
+              <w:rPr>
+                <w:noProof/>
+                <w:webHidden/>
+              </w:rPr>
+              <w:t>3</w:t>
+            </w:r>
+            <w:r>
+              <w:rPr>
+                <w:noProof/>
+                <w:webHidden/>
+              </w:rPr>
+              <w:fldChar w:fldCharType="end"/>
+            </w:r>
+          </w:hyperlink>
+        </w:p>
+        <w:p>
+          <w:pPr>
+            <w:pStyle w:val="TM2"/>
+            <w:tabs>
+              <w:tab w:val="left" w:pos="880"/>
+              <w:tab w:val="right" w:leader="dot" w:pos="9062"/>
+            </w:tabs>
+            <w:rPr>
+              <w:rFonts w:asciiTheme="minorHAnsi" w:eastAsiaTheme="minorEastAsia" w:hAnsiTheme="minorHAnsi" w:cstheme="minorBidi"/>
+              <w:smallCaps w:val="0"/>
+              <w:noProof/>
+              <w:kern w:val="2"/>
+              <w:sz w:val="22"/>
+              <w:szCs w:val="22"/>
+              <w14:ligatures w14:val="standardContextual"/>
+            </w:rPr>
+          </w:pPr>
+          <w:hyperlink w:anchor="_Toc198654064" w:history="1">
+            <w:r>
+              <w:rPr>
+                <w:rStyle w:val="Lienhypertexte"/>
+                <w:noProof/>
+              </w:rPr>
+              <w:t>2.2</w:t>
+            </w:r>
+            <w:r>
+              <w:rPr>
+                <w:rFonts w:asciiTheme="minorHAnsi" w:eastAsiaTheme="minorEastAsia" w:hAnsiTheme="minorHAnsi" w:cstheme="minorBidi"/>
+                <w:smallCaps w:val="0"/>
+                <w:noProof/>
+                <w:kern w:val="2"/>
+                <w:sz w:val="22"/>
+                <w:szCs w:val="22"/>
+                <w14:ligatures w14:val="standardContextual"/>
+              </w:rPr>
+              <w:tab/>
+            </w:r>
+            <w:r>
+              <w:rPr>
+                <w:rStyle w:val="Lienhypertexte"/>
+                <w:noProof/>
+              </w:rPr>
+              <w:t>l’analyse de de la base de données à réaliser (MCD, MLD, MPD</w:t>
+            </w:r>
+            <w:r>
+              <w:rPr>
+                <w:noProof/>
+                <w:webHidden/>
+              </w:rPr>
+              <w:tab/>
+            </w:r>
+            <w:r>
+              <w:rPr>
+                <w:noProof/>
+                <w:webHidden/>
+              </w:rPr>
+              <w:fldChar w:fldCharType="begin"/>
+            </w:r>
+            <w:r>
+              <w:rPr>
+                <w:noProof/>
+                <w:webHidden/>
+              </w:rPr>
+              <w:instrText xml:space="preserve"> PAGEREF _Toc198654064 \h </w:instrText>
+            </w:r>
+            <w:r>
+              <w:rPr>
+                <w:noProof/>
+                <w:webHidden/>
+              </w:rPr>
+            </w:r>
+            <w:r>
+              <w:rPr>
+                <w:noProof/>
+                <w:webHidden/>
+              </w:rPr>
+              <w:fldChar w:fldCharType="separate"/>
+            </w:r>
+            <w:r>
+              <w:rPr>
+                <w:noProof/>
+                <w:webHidden/>
+              </w:rPr>
+              <w:t>3</w:t>
+            </w:r>
+            <w:r>
+              <w:rPr>
+                <w:noProof/>
+                <w:webHidden/>
+              </w:rPr>
+              <w:fldChar w:fldCharType="end"/>
+            </w:r>
+          </w:hyperlink>
+        </w:p>
+        <w:p>
+          <w:pPr>
+            <w:pStyle w:val="TM2"/>
+            <w:tabs>
+              <w:tab w:val="left" w:pos="880"/>
+              <w:tab w:val="right" w:leader="dot" w:pos="9062"/>
+            </w:tabs>
+            <w:rPr>
+              <w:rFonts w:asciiTheme="minorHAnsi" w:eastAsiaTheme="minorEastAsia" w:hAnsiTheme="minorHAnsi" w:cstheme="minorBidi"/>
+              <w:smallCaps w:val="0"/>
+              <w:noProof/>
+              <w:kern w:val="2"/>
+              <w:sz w:val="22"/>
+              <w:szCs w:val="22"/>
+              <w14:ligatures w14:val="standardContextual"/>
+            </w:rPr>
+          </w:pPr>
+          <w:hyperlink w:anchor="_Toc198654065" w:history="1">
+            <w:r>
+              <w:rPr>
+                <w:rStyle w:val="Lienhypertexte"/>
+                <w:noProof/>
+              </w:rPr>
+              <w:t>2.3</w:t>
+            </w:r>
+            <w:r>
+              <w:rPr>
+                <w:rFonts w:asciiTheme="minorHAnsi" w:eastAsiaTheme="minorEastAsia" w:hAnsiTheme="minorHAnsi" w:cstheme="minorBidi"/>
+                <w:smallCaps w:val="0"/>
+                <w:noProof/>
+                <w:kern w:val="2"/>
+                <w:sz w:val="22"/>
+                <w:szCs w:val="22"/>
+                <w14:ligatures w14:val="standardContextual"/>
+              </w:rPr>
+              <w:tab/>
+            </w:r>
+            <w:r>
+              <w:rPr>
+                <w:rStyle w:val="Lienhypertexte"/>
+                <w:noProof/>
+              </w:rPr>
+              <w:t>analyse de la structure du code qui sera effectuée</w:t>
+            </w:r>
+            <w:r>
+              <w:rPr>
+                <w:noProof/>
+                <w:webHidden/>
+              </w:rPr>
+              <w:tab/>
+            </w:r>
+            <w:r>
+              <w:rPr>
+                <w:noProof/>
+                <w:webHidden/>
+              </w:rPr>
+              <w:fldChar w:fldCharType="begin"/>
+            </w:r>
+            <w:r>
+              <w:rPr>
+                <w:noProof/>
+                <w:webHidden/>
+              </w:rPr>
+              <w:instrText xml:space="preserve"> PAGEREF _Toc198654065 \h </w:instrText>
+            </w:r>
+            <w:r>
+              <w:rPr>
+                <w:noProof/>
+                <w:webHidden/>
+              </w:rPr>
+            </w:r>
+            <w:r>
+              <w:rPr>
+                <w:noProof/>
+                <w:webHidden/>
+              </w:rPr>
+              <w:fldChar w:fldCharType="separate"/>
+            </w:r>
+            <w:r>
+              <w:rPr>
+                <w:noProof/>
+                <w:webHidden/>
+              </w:rPr>
+              <w:t>3</w:t>
+            </w:r>
+            <w:r>
+              <w:rPr>
+                <w:noProof/>
+                <w:webHidden/>
+              </w:rPr>
+              <w:fldChar w:fldCharType="end"/>
+            </w:r>
+          </w:hyperlink>
+        </w:p>
+        <w:p>
+          <w:pPr>
+            <w:pStyle w:val="TM2"/>
+            <w:tabs>
+              <w:tab w:val="left" w:pos="880"/>
+              <w:tab w:val="right" w:leader="dot" w:pos="9062"/>
+            </w:tabs>
+            <w:rPr>
+              <w:rFonts w:asciiTheme="minorHAnsi" w:eastAsiaTheme="minorEastAsia" w:hAnsiTheme="minorHAnsi" w:cstheme="minorBidi"/>
+              <w:smallCaps w:val="0"/>
+              <w:noProof/>
+              <w:kern w:val="2"/>
+              <w:sz w:val="22"/>
+              <w:szCs w:val="22"/>
+              <w14:ligatures w14:val="standardContextual"/>
+            </w:rPr>
+          </w:pPr>
+          <w:hyperlink w:anchor="_Toc198654066" w:history="1">
+            <w:r>
+              <w:rPr>
+                <w:rStyle w:val="Lienhypertexte"/>
+                <w:noProof/>
+              </w:rPr>
+              <w:t>2.4</w:t>
+            </w:r>
+            <w:r>
+              <w:rPr>
+                <w:rFonts w:asciiTheme="minorHAnsi" w:eastAsiaTheme="minorEastAsia" w:hAnsiTheme="minorHAnsi" w:cstheme="minorBidi"/>
+                <w:smallCaps w:val="0"/>
+                <w:noProof/>
+                <w:kern w:val="2"/>
+                <w:sz w:val="22"/>
+                <w:szCs w:val="22"/>
+                <w14:ligatures w14:val="standardContextual"/>
+              </w:rPr>
+              <w:tab/>
+            </w:r>
+            <w:r>
+              <w:rPr>
+                <w:rStyle w:val="Lienhypertexte"/>
+                <w:noProof/>
+              </w:rPr>
+              <w:t>Schéma de l’architecture représentant les interactions entre le frontend et le backend</w:t>
+            </w:r>
+            <w:r>
+              <w:rPr>
+                <w:noProof/>
+                <w:webHidden/>
+              </w:rPr>
+              <w:tab/>
+            </w:r>
+            <w:r>
+              <w:rPr>
+                <w:noProof/>
+                <w:webHidden/>
+              </w:rPr>
+              <w:fldChar w:fldCharType="begin"/>
+            </w:r>
+            <w:r>
+              <w:rPr>
+                <w:noProof/>
+                <w:webHidden/>
+              </w:rPr>
+              <w:instrText xml:space="preserve"> PAGEREF _Toc198654066 \h </w:instrText>
             </w:r>
             <w:r>
               <w:rPr>
@@ -824,7 +1203,7 @@
               <w:tab w:val="right" w:leader="dot" w:pos="9062"/>
             </w:tabs>
             <w:rPr>
-              <w:rFonts w:eastAsiaTheme="minorEastAsia" w:cstheme="minorBidi"/>
+              <w:rFonts w:asciiTheme="minorHAnsi" w:eastAsiaTheme="minorEastAsia" w:hAnsiTheme="minorHAnsi" w:cstheme="minorBidi"/>
               <w:b w:val="0"/>
               <w:bCs w:val="0"/>
               <w:caps w:val="0"/>
@@ -835,7 +1214,7 @@
               <w14:ligatures w14:val="standardContextual"/>
             </w:rPr>
           </w:pPr>
-          <w:hyperlink w:anchor="_Toc198653214" w:history="1">
+          <w:hyperlink w:anchor="_Toc198654067" w:history="1">
             <w:r>
               <w:rPr>
                 <w:rStyle w:val="Lienhypertexte"/>
@@ -845,7 +1224,7 @@
             </w:r>
             <w:r>
               <w:rPr>
-                <w:rFonts w:eastAsiaTheme="minorEastAsia" w:cstheme="minorBidi"/>
+                <w:rFonts w:asciiTheme="minorHAnsi" w:eastAsiaTheme="minorEastAsia" w:hAnsiTheme="minorHAnsi" w:cstheme="minorBidi"/>
                 <w:b w:val="0"/>
                 <w:bCs w:val="0"/>
                 <w:caps w:val="0"/>
@@ -883,7 +1262,7 @@
                 <w:noProof/>
                 <w:webHidden/>
               </w:rPr>
-              <w:instrText xml:space="preserve"> PAGEREF _Toc198653214 \h </w:instrText>
+              <w:instrText xml:space="preserve"> PAGEREF _Toc198654067 \h </w:instrText>
             </w:r>
             <w:r>
               <w:rPr>
@@ -903,7 +1282,289 @@
                 <w:noProof/>
                 <w:webHidden/>
               </w:rPr>
-              <w:t>3</w:t>
+              <w:t>4</w:t>
+            </w:r>
+            <w:r>
+              <w:rPr>
+                <w:noProof/>
+                <w:webHidden/>
+              </w:rPr>
+              <w:fldChar w:fldCharType="end"/>
+            </w:r>
+          </w:hyperlink>
+        </w:p>
+        <w:p>
+          <w:pPr>
+            <w:pStyle w:val="TM2"/>
+            <w:tabs>
+              <w:tab w:val="left" w:pos="880"/>
+              <w:tab w:val="right" w:leader="dot" w:pos="9062"/>
+            </w:tabs>
+            <w:rPr>
+              <w:rFonts w:asciiTheme="minorHAnsi" w:eastAsiaTheme="minorEastAsia" w:hAnsiTheme="minorHAnsi" w:cstheme="minorBidi"/>
+              <w:smallCaps w:val="0"/>
+              <w:noProof/>
+              <w:kern w:val="2"/>
+              <w:sz w:val="22"/>
+              <w:szCs w:val="22"/>
+              <w14:ligatures w14:val="standardContextual"/>
+            </w:rPr>
+          </w:pPr>
+          <w:hyperlink w:anchor="_Toc198654068" w:history="1">
+            <w:r>
+              <w:rPr>
+                <w:rStyle w:val="Lienhypertexte"/>
+                <w:noProof/>
+              </w:rPr>
+              <w:t>3.1</w:t>
+            </w:r>
+            <w:r>
+              <w:rPr>
+                <w:rFonts w:asciiTheme="minorHAnsi" w:eastAsiaTheme="minorEastAsia" w:hAnsiTheme="minorHAnsi" w:cstheme="minorBidi"/>
+                <w:smallCaps w:val="0"/>
+                <w:noProof/>
+                <w:kern w:val="2"/>
+                <w:sz w:val="22"/>
+                <w:szCs w:val="22"/>
+                <w14:ligatures w14:val="standardContextual"/>
+              </w:rPr>
+              <w:tab/>
+            </w:r>
+            <w:r>
+              <w:rPr>
+                <w:rStyle w:val="Lienhypertexte"/>
+                <w:noProof/>
+              </w:rPr>
+              <w:t>explication des mesures prises pour les aspects de sécurité</w:t>
+            </w:r>
+            <w:r>
+              <w:rPr>
+                <w:noProof/>
+                <w:webHidden/>
+              </w:rPr>
+              <w:tab/>
+            </w:r>
+            <w:r>
+              <w:rPr>
+                <w:noProof/>
+                <w:webHidden/>
+              </w:rPr>
+              <w:fldChar w:fldCharType="begin"/>
+            </w:r>
+            <w:r>
+              <w:rPr>
+                <w:noProof/>
+                <w:webHidden/>
+              </w:rPr>
+              <w:instrText xml:space="preserve"> PAGEREF _Toc198654068 \h </w:instrText>
+            </w:r>
+            <w:r>
+              <w:rPr>
+                <w:noProof/>
+                <w:webHidden/>
+              </w:rPr>
+            </w:r>
+            <w:r>
+              <w:rPr>
+                <w:noProof/>
+                <w:webHidden/>
+              </w:rPr>
+              <w:fldChar w:fldCharType="separate"/>
+            </w:r>
+            <w:r>
+              <w:rPr>
+                <w:noProof/>
+                <w:webHidden/>
+              </w:rPr>
+              <w:t>4</w:t>
+            </w:r>
+            <w:r>
+              <w:rPr>
+                <w:noProof/>
+                <w:webHidden/>
+              </w:rPr>
+              <w:fldChar w:fldCharType="end"/>
+            </w:r>
+          </w:hyperlink>
+        </w:p>
+        <w:p>
+          <w:pPr>
+            <w:pStyle w:val="TM2"/>
+            <w:tabs>
+              <w:tab w:val="left" w:pos="880"/>
+              <w:tab w:val="right" w:leader="dot" w:pos="9062"/>
+            </w:tabs>
+            <w:rPr>
+              <w:rFonts w:asciiTheme="minorHAnsi" w:eastAsiaTheme="minorEastAsia" w:hAnsiTheme="minorHAnsi" w:cstheme="minorBidi"/>
+              <w:smallCaps w:val="0"/>
+              <w:noProof/>
+              <w:kern w:val="2"/>
+              <w:sz w:val="22"/>
+              <w:szCs w:val="22"/>
+              <w14:ligatures w14:val="standardContextual"/>
+            </w:rPr>
+          </w:pPr>
+          <w:hyperlink w:anchor="_Toc198654069" w:history="1">
+            <w:r>
+              <w:rPr>
+                <w:rStyle w:val="Lienhypertexte"/>
+                <w:noProof/>
+              </w:rPr>
+              <w:t>3.2</w:t>
+            </w:r>
+            <w:r>
+              <w:rPr>
+                <w:rFonts w:asciiTheme="minorHAnsi" w:eastAsiaTheme="minorEastAsia" w:hAnsiTheme="minorHAnsi" w:cstheme="minorBidi"/>
+                <w:smallCaps w:val="0"/>
+                <w:noProof/>
+                <w:kern w:val="2"/>
+                <w:sz w:val="22"/>
+                <w:szCs w:val="22"/>
+                <w14:ligatures w14:val="standardContextual"/>
+              </w:rPr>
+              <w:tab/>
+            </w:r>
+            <w:r>
+              <w:rPr>
+                <w:rStyle w:val="Lienhypertexte"/>
+                <w:noProof/>
+              </w:rPr>
+              <w:t>explication sur chaque fonctionnalité technique demandée</w:t>
+            </w:r>
+            <w:r>
+              <w:rPr>
+                <w:noProof/>
+                <w:webHidden/>
+              </w:rPr>
+              <w:tab/>
+            </w:r>
+            <w:r>
+              <w:rPr>
+                <w:noProof/>
+                <w:webHidden/>
+              </w:rPr>
+              <w:fldChar w:fldCharType="begin"/>
+            </w:r>
+            <w:r>
+              <w:rPr>
+                <w:noProof/>
+                <w:webHidden/>
+              </w:rPr>
+              <w:instrText xml:space="preserve"> PAGEREF _Toc198654069 \h </w:instrText>
+            </w:r>
+            <w:r>
+              <w:rPr>
+                <w:noProof/>
+                <w:webHidden/>
+              </w:rPr>
+            </w:r>
+            <w:r>
+              <w:rPr>
+                <w:noProof/>
+                <w:webHidden/>
+              </w:rPr>
+              <w:fldChar w:fldCharType="separate"/>
+            </w:r>
+            <w:r>
+              <w:rPr>
+                <w:noProof/>
+                <w:webHidden/>
+              </w:rPr>
+              <w:t>4</w:t>
+            </w:r>
+            <w:r>
+              <w:rPr>
+                <w:noProof/>
+                <w:webHidden/>
+              </w:rPr>
+              <w:fldChar w:fldCharType="end"/>
+            </w:r>
+          </w:hyperlink>
+        </w:p>
+        <w:p>
+          <w:pPr>
+            <w:pStyle w:val="TM2"/>
+            <w:tabs>
+              <w:tab w:val="left" w:pos="880"/>
+              <w:tab w:val="right" w:leader="dot" w:pos="9062"/>
+            </w:tabs>
+            <w:rPr>
+              <w:rFonts w:asciiTheme="minorHAnsi" w:eastAsiaTheme="minorEastAsia" w:hAnsiTheme="minorHAnsi" w:cstheme="minorBidi"/>
+              <w:smallCaps w:val="0"/>
+              <w:noProof/>
+              <w:kern w:val="2"/>
+              <w:sz w:val="22"/>
+              <w:szCs w:val="22"/>
+              <w14:ligatures w14:val="standardContextual"/>
+            </w:rPr>
+          </w:pPr>
+          <w:hyperlink w:anchor="_Toc198654070" w:history="1">
+            <w:r>
+              <w:rPr>
+                <w:rStyle w:val="Lienhypertexte"/>
+                <w:noProof/>
+              </w:rPr>
+              <w:t>3.3</w:t>
+            </w:r>
+            <w:r>
+              <w:rPr>
+                <w:rFonts w:asciiTheme="minorHAnsi" w:eastAsiaTheme="minorEastAsia" w:hAnsiTheme="minorHAnsi" w:cstheme="minorBidi"/>
+                <w:smallCaps w:val="0"/>
+                <w:noProof/>
+                <w:kern w:val="2"/>
+                <w:sz w:val="22"/>
+                <w:szCs w:val="22"/>
+                <w14:ligatures w14:val="standardContextual"/>
+              </w:rPr>
+              <w:tab/>
+            </w:r>
+            <w:r>
+              <w:rPr>
+                <w:rStyle w:val="Lienhypertexte"/>
+                <w:noProof/>
+              </w:rPr>
+              <w:t>explication de l’organisation du groupe quant à la gestion du code avec git/github</w:t>
+            </w:r>
+            <w:r>
+              <w:rPr>
+                <w:noProof/>
+                <w:webHidden/>
+              </w:rPr>
+              <w:tab/>
+            </w:r>
+            <w:r>
+              <w:rPr>
+                <w:noProof/>
+                <w:webHidden/>
+              </w:rPr>
+              <w:fldChar w:fldCharType="begin"/>
+            </w:r>
+            <w:r>
+              <w:rPr>
+                <w:noProof/>
+                <w:webHidden/>
+              </w:rPr>
+              <w:instrText xml:space="preserve"> PAGEREF _Toc198654070 \h </w:instrText>
+            </w:r>
+            <w:r>
+              <w:rPr>
+                <w:noProof/>
+                <w:webHidden/>
+              </w:rPr>
+            </w:r>
+            <w:r>
+              <w:rPr>
+                <w:noProof/>
+                <w:webHidden/>
+              </w:rPr>
+              <w:fldChar w:fldCharType="separate"/>
+            </w:r>
+            <w:r>
+              <w:rPr>
+                <w:noProof/>
+                <w:webHidden/>
+              </w:rPr>
+              <w:t>4</w:t>
             </w:r>
             <w:r>
               <w:rPr>
@@ -922,7 +1583,7 @@
               <w:tab w:val="right" w:leader="dot" w:pos="9062"/>
             </w:tabs>
             <w:rPr>
-              <w:rFonts w:eastAsiaTheme="minorEastAsia" w:cstheme="minorBidi"/>
+              <w:rFonts w:asciiTheme="minorHAnsi" w:eastAsiaTheme="minorEastAsia" w:hAnsiTheme="minorHAnsi" w:cstheme="minorBidi"/>
               <w:b w:val="0"/>
               <w:bCs w:val="0"/>
               <w:caps w:val="0"/>
@@ -933,7 +1594,7 @@
               <w14:ligatures w14:val="standardContextual"/>
             </w:rPr>
           </w:pPr>
-          <w:hyperlink w:anchor="_Toc198653215" w:history="1">
+          <w:hyperlink w:anchor="_Toc198654071" w:history="1">
             <w:r>
               <w:rPr>
                 <w:rStyle w:val="Lienhypertexte"/>
@@ -943,7 +1604,7 @@
             </w:r>
             <w:r>
               <w:rPr>
-                <w:rFonts w:eastAsiaTheme="minorEastAsia" w:cstheme="minorBidi"/>
+                <w:rFonts w:asciiTheme="minorHAnsi" w:eastAsiaTheme="minorEastAsia" w:hAnsiTheme="minorHAnsi" w:cstheme="minorBidi"/>
                 <w:b w:val="0"/>
                 <w:bCs w:val="0"/>
                 <w:caps w:val="0"/>
@@ -981,7 +1642,7 @@
                 <w:noProof/>
                 <w:webHidden/>
               </w:rPr>
-              <w:instrText xml:space="preserve"> PAGEREF _Toc198653215 \h </w:instrText>
+              <w:instrText xml:space="preserve"> PAGEREF _Toc198654071 \h </w:instrText>
             </w:r>
             <w:r>
               <w:rPr>
@@ -1001,7 +1662,101 @@
                 <w:noProof/>
                 <w:webHidden/>
               </w:rPr>
-              <w:t>3</w:t>
+              <w:t>4</w:t>
+            </w:r>
+            <w:r>
+              <w:rPr>
+                <w:noProof/>
+                <w:webHidden/>
+              </w:rPr>
+              <w:fldChar w:fldCharType="end"/>
+            </w:r>
+          </w:hyperlink>
+        </w:p>
+        <w:p>
+          <w:pPr>
+            <w:pStyle w:val="TM2"/>
+            <w:tabs>
+              <w:tab w:val="left" w:pos="880"/>
+              <w:tab w:val="right" w:leader="dot" w:pos="9062"/>
+            </w:tabs>
+            <w:rPr>
+              <w:rFonts w:asciiTheme="minorHAnsi" w:eastAsiaTheme="minorEastAsia" w:hAnsiTheme="minorHAnsi" w:cstheme="minorBidi"/>
+              <w:smallCaps w:val="0"/>
+              <w:noProof/>
+              <w:kern w:val="2"/>
+              <w:sz w:val="22"/>
+              <w:szCs w:val="22"/>
+              <w14:ligatures w14:val="standardContextual"/>
+            </w:rPr>
+          </w:pPr>
+          <w:hyperlink w:anchor="_Toc198654072" w:history="1">
+            <w:r>
+              <w:rPr>
+                <w:rStyle w:val="Lienhypertexte"/>
+                <w:noProof/>
+              </w:rPr>
+              <w:t>4.1</w:t>
+            </w:r>
+            <w:r>
+              <w:rPr>
+                <w:rFonts w:asciiTheme="minorHAnsi" w:eastAsiaTheme="minorEastAsia" w:hAnsiTheme="minorHAnsi" w:cstheme="minorBidi"/>
+                <w:smallCaps w:val="0"/>
+                <w:noProof/>
+                <w:kern w:val="2"/>
+                <w:sz w:val="22"/>
+                <w:szCs w:val="22"/>
+                <w14:ligatures w14:val="standardContextual"/>
+              </w:rPr>
+              <w:tab/>
+            </w:r>
+            <w:r>
+              <w:rPr>
+                <w:rStyle w:val="Lienhypertexte"/>
+                <w:noProof/>
+              </w:rPr>
+              <w:t>explication de la stratégie de tests</w:t>
+            </w:r>
+            <w:r>
+              <w:rPr>
+                <w:noProof/>
+                <w:webHidden/>
+              </w:rPr>
+              <w:tab/>
+            </w:r>
+            <w:r>
+              <w:rPr>
+                <w:noProof/>
+                <w:webHidden/>
+              </w:rPr>
+              <w:fldChar w:fldCharType="begin"/>
+            </w:r>
+            <w:r>
+              <w:rPr>
+                <w:noProof/>
+                <w:webHidden/>
+              </w:rPr>
+              <w:instrText xml:space="preserve"> PAGEREF _Toc198654072 \h </w:instrText>
+            </w:r>
+            <w:r>
+              <w:rPr>
+                <w:noProof/>
+                <w:webHidden/>
+              </w:rPr>
+            </w:r>
+            <w:r>
+              <w:rPr>
+                <w:noProof/>
+                <w:webHidden/>
+              </w:rPr>
+              <w:fldChar w:fldCharType="separate"/>
+            </w:r>
+            <w:r>
+              <w:rPr>
+                <w:noProof/>
+                <w:webHidden/>
+              </w:rPr>
+              <w:t>4</w:t>
             </w:r>
             <w:r>
               <w:rPr>
@@ -1020,7 +1775,7 @@
               <w:tab w:val="right" w:leader="dot" w:pos="9062"/>
             </w:tabs>
             <w:rPr>
-              <w:rFonts w:eastAsiaTheme="minorEastAsia" w:cstheme="minorBidi"/>
+              <w:rFonts w:asciiTheme="minorHAnsi" w:eastAsiaTheme="minorEastAsia" w:hAnsiTheme="minorHAnsi" w:cstheme="minorBidi"/>
               <w:b w:val="0"/>
               <w:bCs w:val="0"/>
               <w:caps w:val="0"/>
@@ -1031,17 +1786,18 @@
               <w14:ligatures w14:val="standardContextual"/>
             </w:rPr>
           </w:pPr>
-          <w:hyperlink w:anchor="_Toc198653216" w:history="1">
+          <w:hyperlink w:anchor="_Toc198654073" w:history="1">
             <w:r>
               <w:rPr>
                 <w:rStyle w:val="Lienhypertexte"/>
                 <w:noProof/>
+                <w:lang w:val="en-US"/>
               </w:rPr>
               <w:t>5</w:t>
             </w:r>
             <w:r>
               <w:rPr>
-                <w:rFonts w:eastAsiaTheme="minorEastAsia" w:cstheme="minorBidi"/>
+                <w:rFonts w:asciiTheme="minorHAnsi" w:eastAsiaTheme="minorEastAsia" w:hAnsiTheme="minorHAnsi" w:cstheme="minorBidi"/>
                 <w:b w:val="0"/>
                 <w:bCs w:val="0"/>
                 <w:caps w:val="0"/>
@@ -1080,7 +1836,7 @@
                 <w:noProof/>
                 <w:webHidden/>
               </w:rPr>
-              <w:instrText xml:space="preserve"> PAGEREF _Toc198653216 \h </w:instrText>
+              <w:instrText xml:space="preserve"> PAGEREF _Toc198654073 \h </w:instrText>
             </w:r>
             <w:r>
               <w:rPr>
@@ -1100,7 +1856,289 @@
                 <w:noProof/>
                 <w:webHidden/>
               </w:rPr>
-              <w:t>3</w:t>
+              <w:t>4</w:t>
+            </w:r>
+            <w:r>
+              <w:rPr>
+                <w:noProof/>
+                <w:webHidden/>
+              </w:rPr>
+              <w:fldChar w:fldCharType="end"/>
+            </w:r>
+          </w:hyperlink>
+        </w:p>
+        <w:p>
+          <w:pPr>
+            <w:pStyle w:val="TM2"/>
+            <w:tabs>
+              <w:tab w:val="left" w:pos="880"/>
+              <w:tab w:val="right" w:leader="dot" w:pos="9062"/>
+            </w:tabs>
+            <w:rPr>
+              <w:rFonts w:asciiTheme="minorHAnsi" w:eastAsiaTheme="minorEastAsia" w:hAnsiTheme="minorHAnsi" w:cstheme="minorBidi"/>
+              <w:smallCaps w:val="0"/>
+              <w:noProof/>
+              <w:kern w:val="2"/>
+              <w:sz w:val="22"/>
+              <w:szCs w:val="22"/>
+              <w14:ligatures w14:val="standardContextual"/>
+            </w:rPr>
+          </w:pPr>
+          <w:hyperlink w:anchor="_Toc198654074" w:history="1">
+            <w:r>
+              <w:rPr>
+                <w:rStyle w:val="Lienhypertexte"/>
+                <w:noProof/>
+              </w:rPr>
+              <w:t>5.1</w:t>
+            </w:r>
+            <w:r>
+              <w:rPr>
+                <w:rFonts w:asciiTheme="minorHAnsi" w:eastAsiaTheme="minorEastAsia" w:hAnsiTheme="minorHAnsi" w:cstheme="minorBidi"/>
+                <w:smallCaps w:val="0"/>
+                <w:noProof/>
+                <w:kern w:val="2"/>
+                <w:sz w:val="22"/>
+                <w:szCs w:val="22"/>
+                <w14:ligatures w14:val="standardContextual"/>
+              </w:rPr>
+              <w:tab/>
+            </w:r>
+            <w:r>
+              <w:rPr>
+                <w:rStyle w:val="Lienhypertexte"/>
+                <w:noProof/>
+              </w:rPr>
+              <w:t>conclusion générale</w:t>
+            </w:r>
+            <w:r>
+              <w:rPr>
+                <w:noProof/>
+                <w:webHidden/>
+              </w:rPr>
+              <w:tab/>
+            </w:r>
+            <w:r>
+              <w:rPr>
+                <w:noProof/>
+                <w:webHidden/>
+              </w:rPr>
+              <w:fldChar w:fldCharType="begin"/>
+            </w:r>
+            <w:r>
+              <w:rPr>
+                <w:noProof/>
+                <w:webHidden/>
+              </w:rPr>
+              <w:instrText xml:space="preserve"> PAGEREF _Toc198654074 \h </w:instrText>
+            </w:r>
+            <w:r>
+              <w:rPr>
+                <w:noProof/>
+                <w:webHidden/>
+              </w:rPr>
+            </w:r>
+            <w:r>
+              <w:rPr>
+                <w:noProof/>
+                <w:webHidden/>
+              </w:rPr>
+              <w:fldChar w:fldCharType="separate"/>
+            </w:r>
+            <w:r>
+              <w:rPr>
+                <w:noProof/>
+                <w:webHidden/>
+              </w:rPr>
+              <w:t>4</w:t>
+            </w:r>
+            <w:r>
+              <w:rPr>
+                <w:noProof/>
+                <w:webHidden/>
+              </w:rPr>
+              <w:fldChar w:fldCharType="end"/>
+            </w:r>
+          </w:hyperlink>
+        </w:p>
+        <w:p>
+          <w:pPr>
+            <w:pStyle w:val="TM2"/>
+            <w:tabs>
+              <w:tab w:val="left" w:pos="880"/>
+              <w:tab w:val="right" w:leader="dot" w:pos="9062"/>
+            </w:tabs>
+            <w:rPr>
+              <w:rFonts w:asciiTheme="minorHAnsi" w:eastAsiaTheme="minorEastAsia" w:hAnsiTheme="minorHAnsi" w:cstheme="minorBidi"/>
+              <w:smallCaps w:val="0"/>
+              <w:noProof/>
+              <w:kern w:val="2"/>
+              <w:sz w:val="22"/>
+              <w:szCs w:val="22"/>
+              <w14:ligatures w14:val="standardContextual"/>
+            </w:rPr>
+          </w:pPr>
+          <w:hyperlink w:anchor="_Toc198654075" w:history="1">
+            <w:r>
+              <w:rPr>
+                <w:rStyle w:val="Lienhypertexte"/>
+                <w:noProof/>
+              </w:rPr>
+              <w:t>5.2</w:t>
+            </w:r>
+            <w:r>
+              <w:rPr>
+                <w:rFonts w:asciiTheme="minorHAnsi" w:eastAsiaTheme="minorEastAsia" w:hAnsiTheme="minorHAnsi" w:cstheme="minorBidi"/>
+                <w:smallCaps w:val="0"/>
+                <w:noProof/>
+                <w:kern w:val="2"/>
+                <w:sz w:val="22"/>
+                <w:szCs w:val="22"/>
+                <w14:ligatures w14:val="standardContextual"/>
+              </w:rPr>
+              <w:tab/>
+            </w:r>
+            <w:r>
+              <w:rPr>
+                <w:rStyle w:val="Lienhypertexte"/>
+                <w:noProof/>
+              </w:rPr>
+              <w:t>conclusion personnelle</w:t>
+            </w:r>
+            <w:r>
+              <w:rPr>
+                <w:noProof/>
+                <w:webHidden/>
+              </w:rPr>
+              <w:tab/>
+            </w:r>
+            <w:r>
+              <w:rPr>
+                <w:noProof/>
+                <w:webHidden/>
+              </w:rPr>
+              <w:fldChar w:fldCharType="begin"/>
+            </w:r>
+            <w:r>
+              <w:rPr>
+                <w:noProof/>
+                <w:webHidden/>
+              </w:rPr>
+              <w:instrText xml:space="preserve"> PAGEREF _Toc198654075 \h </w:instrText>
+            </w:r>
+            <w:r>
+              <w:rPr>
+                <w:noProof/>
+                <w:webHidden/>
+              </w:rPr>
+            </w:r>
+            <w:r>
+              <w:rPr>
+                <w:noProof/>
+                <w:webHidden/>
+              </w:rPr>
+              <w:fldChar w:fldCharType="separate"/>
+            </w:r>
+            <w:r>
+              <w:rPr>
+                <w:noProof/>
+                <w:webHidden/>
+              </w:rPr>
+              <w:t>4</w:t>
+            </w:r>
+            <w:r>
+              <w:rPr>
+                <w:noProof/>
+                <w:webHidden/>
+              </w:rPr>
+              <w:fldChar w:fldCharType="end"/>
+            </w:r>
+          </w:hyperlink>
+        </w:p>
+        <w:p>
+          <w:pPr>
+            <w:pStyle w:val="TM2"/>
+            <w:tabs>
+              <w:tab w:val="left" w:pos="880"/>
+              <w:tab w:val="right" w:leader="dot" w:pos="9062"/>
+            </w:tabs>
+            <w:rPr>
+              <w:rFonts w:asciiTheme="minorHAnsi" w:eastAsiaTheme="minorEastAsia" w:hAnsiTheme="minorHAnsi" w:cstheme="minorBidi"/>
+              <w:smallCaps w:val="0"/>
+              <w:noProof/>
+              <w:kern w:val="2"/>
+              <w:sz w:val="22"/>
+              <w:szCs w:val="22"/>
+              <w14:ligatures w14:val="standardContextual"/>
+            </w:rPr>
+          </w:pPr>
+          <w:hyperlink w:anchor="_Toc198654076" w:history="1">
+            <w:r>
+              <w:rPr>
+                <w:rStyle w:val="Lienhypertexte"/>
+                <w:noProof/>
+              </w:rPr>
+              <w:t>5.3</w:t>
+            </w:r>
+            <w:r>
+              <w:rPr>
+                <w:rFonts w:asciiTheme="minorHAnsi" w:eastAsiaTheme="minorEastAsia" w:hAnsiTheme="minorHAnsi" w:cstheme="minorBidi"/>
+                <w:smallCaps w:val="0"/>
+                <w:noProof/>
+                <w:kern w:val="2"/>
+                <w:sz w:val="22"/>
+                <w:szCs w:val="22"/>
+                <w14:ligatures w14:val="standardContextual"/>
+              </w:rPr>
+              <w:tab/>
+            </w:r>
+            <w:r>
+              <w:rPr>
+                <w:rStyle w:val="Lienhypertexte"/>
+                <w:noProof/>
+              </w:rPr>
+              <w:t>critique constructive sur la planification du projet</w:t>
+            </w:r>
+            <w:r>
+              <w:rPr>
+                <w:noProof/>
+                <w:webHidden/>
+              </w:rPr>
+              <w:tab/>
+            </w:r>
+            <w:r>
+              <w:rPr>
+                <w:noProof/>
+                <w:webHidden/>
+              </w:rPr>
+              <w:fldChar w:fldCharType="begin"/>
+            </w:r>
+            <w:r>
+              <w:rPr>
+                <w:noProof/>
+                <w:webHidden/>
+              </w:rPr>
+              <w:instrText xml:space="preserve"> PAGEREF _Toc198654076 \h </w:instrText>
+            </w:r>
+            <w:r>
+              <w:rPr>
+                <w:noProof/>
+                <w:webHidden/>
+              </w:rPr>
+            </w:r>
+            <w:r>
+              <w:rPr>
+                <w:noProof/>
+                <w:webHidden/>
+              </w:rPr>
+              <w:fldChar w:fldCharType="separate"/>
+            </w:r>
+            <w:r>
+              <w:rPr>
+                <w:noProof/>
+                <w:webHidden/>
+              </w:rPr>
+              <w:t>4</w:t>
             </w:r>
             <w:r>
               <w:rPr>
@@ -1119,7 +2157,7 @@
               <w:tab w:val="right" w:leader="dot" w:pos="9062"/>
             </w:tabs>
             <w:rPr>
-              <w:rFonts w:eastAsiaTheme="minorEastAsia" w:cstheme="minorBidi"/>
+              <w:rFonts w:asciiTheme="minorHAnsi" w:eastAsiaTheme="minorEastAsia" w:hAnsiTheme="minorHAnsi" w:cstheme="minorBidi"/>
               <w:b w:val="0"/>
               <w:bCs w:val="0"/>
               <w:caps w:val="0"/>
@@ -1130,7 +2168,7 @@
               <w14:ligatures w14:val="standardContextual"/>
             </w:rPr>
           </w:pPr>
-          <w:hyperlink w:anchor="_Toc198653217" w:history="1">
+          <w:hyperlink w:anchor="_Toc198654077" w:history="1">
             <w:r>
               <w:rPr>
                 <w:rStyle w:val="Lienhypertexte"/>
@@ -1140,7 +2178,7 @@
             </w:r>
             <w:r>
               <w:rPr>
-                <w:rFonts w:eastAsiaTheme="minorEastAsia" w:cstheme="minorBidi"/>
+                <w:rFonts w:asciiTheme="minorHAnsi" w:eastAsiaTheme="minorEastAsia" w:hAnsiTheme="minorHAnsi" w:cstheme="minorBidi"/>
                 <w:b w:val="0"/>
                 <w:bCs w:val="0"/>
                 <w:caps w:val="0"/>
@@ -1178,7 +2216,7 @@
                 <w:noProof/>
                 <w:webHidden/>
               </w:rPr>
-              <w:instrText xml:space="preserve"> PAGEREF _Toc198653217 \h </w:instrText>
+              <w:instrText xml:space="preserve"> PAGEREF _Toc198654077 \h </w:instrText>
             </w:r>
             <w:r>
               <w:rPr>
@@ -1198,7 +2236,7 @@
                 <w:noProof/>
                 <w:webHidden/>
               </w:rPr>
-              <w:t>3</w:t>
+              <w:t>4</w:t>
             </w:r>
             <w:r>
               <w:rPr>
@@ -1252,7 +2290,7 @@
         <w:pStyle w:val="Titre1"/>
       </w:pPr>
       <w:bookmarkStart w:id="0" w:name="_Toc181370745"/>
-      <w:bookmarkStart w:id="1" w:name="_Toc198653210"/>
+      <w:bookmarkStart w:id="1" w:name="_Toc198654059"/>
       <w:r>
         <w:lastRenderedPageBreak/>
         <w:t>Introduction</w:t>
@@ -1275,7 +2313,7 @@
       <w:bookmarkStart w:id="2" w:name="_Toc181370746"/>
       <w:bookmarkStart w:id="3" w:name="_Toc532179969"/>
       <w:bookmarkStart w:id="4" w:name="_Toc165969639"/>
-      <w:bookmarkStart w:id="5" w:name="_Toc198653211"/>
+      <w:bookmarkStart w:id="5" w:name="_Toc198654060"/>
       <w:r>
         <w:t>Titre</w:t>
       </w:r>
@@ -1295,13 +2333,30 @@
         <w:pStyle w:val="Titre2"/>
       </w:pPr>
       <w:bookmarkStart w:id="6" w:name="_Toc181370747"/>
-      <w:bookmarkStart w:id="7" w:name="_Toc198653212"/>
+      <w:bookmarkStart w:id="7" w:name="_Toc198654061"/>
       <w:r>
         <w:t>Description</w:t>
       </w:r>
       <w:bookmarkEnd w:id="6"/>
       <w:bookmarkEnd w:id="7"/>
     </w:p>
+    <w:p>
+      <w:pPr>
+        <w:jc w:val="both"/>
+      </w:pPr>
+      <w:r>
+        <w:t xml:space="preserve">Le projet </w:t>
+      </w:r>
+      <w:r>
+        <w:rPr>
+          <w:rStyle w:val="lev"/>
+        </w:rPr>
+        <w:t>« Passion Lecture »</w:t>
+      </w:r>
+      <w:r>
+        <w:t xml:space="preserve"> s’inscrit dans le cadre du module ETML P_WEB294 et vise à développer le frontend d’une application web destinée aux passionnés de lecture. Cette application permet aux utilisateurs de consulter des ouvrages, d’échanger leurs avis et de contribuer à une base de données collaborative autour du livre. Après avoir posé les bases techniques lors du module précédent (P_WEB295) — incluant la conception de la maquette, de la base de données et du backend — ce projet se concentre sur l’intégration complète du frontend avec Vue.js. Il met également l’accent sur la structuration du code, la documentation, l’écoconception ainsi qu’une gestion de projet rigoureuse grâce à des outils collaboratifs comme GitHub Projects.</w:t>
+      </w:r>
+    </w:p>
     <w:bookmarkEnd w:id="3"/>
     <w:bookmarkEnd w:id="4"/>
     <w:p>
@@ -1316,7 +2371,7 @@
       <w:pPr>
         <w:pStyle w:val="Titre1"/>
       </w:pPr>
-      <w:bookmarkStart w:id="8" w:name="_Toc198653213"/>
+      <w:bookmarkStart w:id="8" w:name="_Toc198654062"/>
       <w:r>
         <w:t>ANalyse</w:t>
       </w:r>
@@ -1324,48 +2379,352 @@
     </w:p>
     <w:p>
       <w:pPr>
-        <w:pStyle w:val="Titre1"/>
-      </w:pPr>
-      <w:bookmarkStart w:id="9" w:name="_Toc198653214"/>
+        <w:pStyle w:val="Titre2"/>
+      </w:pPr>
+      <w:bookmarkStart w:id="9" w:name="_Toc198654063"/>
       <w:r>
-        <w:t>Réalisation</w:t>
+        <w:t>Planification de toutes les tâches à réaliser</w:t>
       </w:r>
       <w:bookmarkEnd w:id="9"/>
     </w:p>
     <w:p>
       <w:pPr>
+        <w:pStyle w:val="Retraitcorpsdetexte"/>
+      </w:pPr>
+    </w:p>
+    <w:p>
+      <w:pPr>
+        <w:pStyle w:val="Titre4"/>
+        <w:rPr>
+          <w:rFonts w:ascii="Bookman Old Style" w:hAnsi="Bookman Old Style"/>
+          <w:b/>
+          <w:bCs/>
+          <w:i w:val="0"/>
+          <w:iCs w:val="0"/>
+          <w:color w:val="auto"/>
+        </w:rPr>
+      </w:pPr>
+      <w:r>
+        <w:rPr>
+          <w:rFonts w:ascii="Bookman Old Style" w:hAnsi="Bookman Old Style"/>
+          <w:b/>
+          <w:bCs/>
+          <w:i w:val="0"/>
+          <w:iCs w:val="0"/>
+          <w:color w:val="auto"/>
+        </w:rPr>
+        <w:t>Planification des tâches (outil GitHub Projects)</w:t>
+      </w:r>
+    </w:p>
+    <w:p>
+      <w:pPr>
+        <w:spacing w:before="100" w:beforeAutospacing="1" w:after="100" w:afterAutospacing="1"/>
+      </w:pPr>
+      <w:r>
+        <w:t xml:space="preserve">Pour assurer une bonne organisation et un suivi efficace du projet, nous avons utilisé </w:t>
+      </w:r>
+      <w:r>
+        <w:rPr>
+          <w:rStyle w:val="lev"/>
+        </w:rPr>
+        <w:t>GitHub Projects</w:t>
+      </w:r>
+      <w:r>
+        <w:t>, un outil de gestion visuelle des tâches sous forme de tableau Kanban. Chaque fonctionnalité a été définie sous forme de "carte", regroupée dans différentes colonnes correspondant aux étapes du développement :</w:t>
+      </w:r>
+    </w:p>
+    <w:p>
+      <w:pPr>
+        <w:numPr>
+          <w:ilvl w:val="0"/>
+          <w:numId w:val="79"/>
+        </w:numPr>
+        <w:spacing w:before="100" w:beforeAutospacing="1" w:after="100" w:afterAutospacing="1"/>
+      </w:pPr>
+      <w:r>
+        <w:rPr>
+          <w:rStyle w:val="lev"/>
+        </w:rPr>
+        <w:t>À faire (To Do)</w:t>
+      </w:r>
+    </w:p>
+    <w:p>
+      <w:pPr>
+        <w:numPr>
+          <w:ilvl w:val="0"/>
+          <w:numId w:val="79"/>
+        </w:numPr>
+        <w:spacing w:before="100" w:beforeAutospacing="1" w:after="100" w:afterAutospacing="1"/>
+      </w:pPr>
+      <w:r>
+        <w:rPr>
+          <w:rStyle w:val="lev"/>
+        </w:rPr>
+        <w:t>En cours (In Progress)</w:t>
+      </w:r>
+    </w:p>
+    <w:p>
+      <w:pPr>
+        <w:numPr>
+          <w:ilvl w:val="0"/>
+          <w:numId w:val="79"/>
+        </w:numPr>
+        <w:spacing w:before="100" w:beforeAutospacing="1" w:after="100" w:afterAutospacing="1"/>
+      </w:pPr>
+      <w:r>
+        <w:rPr>
+          <w:rStyle w:val="lev"/>
+        </w:rPr>
+        <w:t>À valider (Review)</w:t>
+      </w:r>
+    </w:p>
+    <w:p>
+      <w:pPr>
+        <w:numPr>
+          <w:ilvl w:val="0"/>
+          <w:numId w:val="79"/>
+        </w:numPr>
+        <w:spacing w:before="100" w:beforeAutospacing="1" w:after="100" w:afterAutospacing="1"/>
+      </w:pPr>
+      <w:r>
+        <w:rPr>
+          <w:rStyle w:val="lev"/>
+        </w:rPr>
+        <w:t>Terminé (Done)</w:t>
+      </w:r>
+    </w:p>
+    <w:p>
+      <w:pPr>
+        <w:spacing w:before="100" w:beforeAutospacing="1" w:after="100" w:afterAutospacing="1"/>
+      </w:pPr>
+      <w:r>
+        <w:t>Chaque tâche était associée à un responsable, une priorité, une échéance, et éventuellement des commentaires techniques. Cette méthode nous a permis :</w:t>
+      </w:r>
+    </w:p>
+    <w:p>
+      <w:pPr>
+        <w:numPr>
+          <w:ilvl w:val="0"/>
+          <w:numId w:val="80"/>
+        </w:numPr>
+        <w:spacing w:before="100" w:beforeAutospacing="1" w:after="100" w:afterAutospacing="1"/>
+      </w:pPr>
+      <w:r>
+        <w:t>de répartir équitablement les responsabilités,</w:t>
+      </w:r>
+    </w:p>
+    <w:p>
+      <w:pPr>
+        <w:numPr>
+          <w:ilvl w:val="0"/>
+          <w:numId w:val="80"/>
+        </w:numPr>
+        <w:spacing w:before="100" w:beforeAutospacing="1" w:after="100" w:afterAutospacing="1"/>
+      </w:pPr>
+      <w:r>
+        <w:t>d’avoir une vue claire de l’avancement,</w:t>
+      </w:r>
+    </w:p>
+    <w:p>
+      <w:pPr>
+        <w:numPr>
+          <w:ilvl w:val="0"/>
+          <w:numId w:val="80"/>
+        </w:numPr>
+        <w:spacing w:before="100" w:beforeAutospacing="1" w:after="100" w:afterAutospacing="1"/>
+      </w:pPr>
+      <w:r>
+        <w:t>de détecter rapidement les blocages ou retards.</w:t>
+      </w:r>
+    </w:p>
+    <w:p>
+      <w:pPr>
+        <w:spacing w:before="100" w:beforeAutospacing="1" w:after="100" w:afterAutospacing="1"/>
+      </w:pPr>
+      <w:r>
+        <w:t>Des réunions régulières (rapides check-ins hebdomadaires) ont permis de mettre à jour le tableau et d’ajuster les priorités. Cet outil a joué un rôle central dans la fluidité du travail en équipe et dans le respect des délais impartis.</w:t>
+      </w:r>
+    </w:p>
+    <w:p>
+      <w:pPr>
+        <w:pStyle w:val="Retraitcorpsdetexte"/>
+        <w:ind w:left="1854"/>
+      </w:pPr>
+    </w:p>
+    <w:p>
+      <w:pPr>
+        <w:pStyle w:val="Titre2"/>
+      </w:pPr>
+      <w:bookmarkStart w:id="10" w:name="_Toc198654064"/>
+      <w:r>
+        <w:t>l’analyse de de la base de données à réaliser (MCD, MLD, MPD</w:t>
+      </w:r>
+      <w:bookmarkEnd w:id="10"/>
+      <w:r>
+        <w:t>)</w:t>
+      </w:r>
+    </w:p>
+    <w:p>
+      <w:pPr>
+        <w:pStyle w:val="Titre2"/>
+      </w:pPr>
+      <w:bookmarkStart w:id="11" w:name="_Toc198654065"/>
+      <w:r>
+        <w:t>analyse de la structure du code qui sera effectuée</w:t>
+      </w:r>
+      <w:bookmarkEnd w:id="11"/>
+    </w:p>
+    <w:p>
+      <w:pPr>
+        <w:pStyle w:val="Titre2"/>
+      </w:pPr>
+      <w:bookmarkStart w:id="12" w:name="_Toc198654066"/>
+      <w:r>
+        <w:t>Schéma de l’architecture représentant les interactions entre le frontend et le backend</w:t>
+      </w:r>
+      <w:bookmarkEnd w:id="12"/>
+      <w:r>
+        <w:t xml:space="preserve"> </w:t>
+      </w:r>
+    </w:p>
+    <w:p>
+      <w:pPr>
+        <w:pStyle w:val="Retraitcorpsdetexte"/>
+      </w:pPr>
+    </w:p>
+    <w:p>
+      <w:pPr>
         <w:pStyle w:val="Titre1"/>
       </w:pPr>
-      <w:bookmarkStart w:id="10" w:name="_Toc198653215"/>
+      <w:bookmarkStart w:id="13" w:name="_Toc198654067"/>
+      <w:r>
+        <w:lastRenderedPageBreak/>
+        <w:t>Réalisation</w:t>
+      </w:r>
+      <w:bookmarkEnd w:id="13"/>
+    </w:p>
+    <w:p>
+      <w:pPr>
+        <w:pStyle w:val="Titre2"/>
+      </w:pPr>
+      <w:bookmarkStart w:id="14" w:name="_Toc198654068"/>
+      <w:r>
+        <w:t>explication des mesures prises pour les aspects de sécurité</w:t>
+      </w:r>
+      <w:bookmarkEnd w:id="14"/>
+    </w:p>
+    <w:p>
+      <w:pPr>
+        <w:pStyle w:val="Titre2"/>
+      </w:pPr>
+      <w:bookmarkStart w:id="15" w:name="_Toc198654069"/>
+      <w:r>
+        <w:t>explication sur chaque fonctionnalité technique demandée</w:t>
+      </w:r>
+      <w:bookmarkEnd w:id="15"/>
+    </w:p>
+    <w:p>
+      <w:pPr>
+        <w:pStyle w:val="Titre2"/>
+      </w:pPr>
+      <w:bookmarkStart w:id="16" w:name="_Toc198654070"/>
+      <w:r>
+        <w:t>explication de l’organisation du groupe quant à la gestion du code avec git/github</w:t>
+      </w:r>
+      <w:bookmarkEnd w:id="16"/>
+    </w:p>
+    <w:p>
+      <w:pPr>
+        <w:pStyle w:val="Retraitcorpsdetexte"/>
+      </w:pPr>
+    </w:p>
+    <w:p>
+      <w:pPr>
+        <w:pStyle w:val="Titre1"/>
+      </w:pPr>
+      <w:bookmarkStart w:id="17" w:name="_Toc198654071"/>
       <w:r>
         <w:t>test</w:t>
       </w:r>
-      <w:bookmarkEnd w:id="10"/>
+      <w:bookmarkEnd w:id="17"/>
     </w:p>
     <w:p>
       <w:pPr>
+        <w:pStyle w:val="Titre2"/>
+      </w:pPr>
+      <w:bookmarkStart w:id="18" w:name="_Toc198654072"/>
+      <w:r>
+        <w:t>explication de la stratégie de tests</w:t>
+      </w:r>
+      <w:bookmarkEnd w:id="18"/>
+    </w:p>
+    <w:p>
+      <w:pPr>
+        <w:pStyle w:val="Retraitcorpsdetexte"/>
+      </w:pPr>
+    </w:p>
+    <w:p>
+      <w:pPr>
         <w:pStyle w:val="Titre1"/>
-      </w:pPr>
-      <w:bookmarkStart w:id="11" w:name="_Toc198653216"/>
+        <w:rPr>
+          <w:lang w:val="en-US"/>
+        </w:rPr>
+      </w:pPr>
+      <w:bookmarkStart w:id="19" w:name="_Toc198654073"/>
       <w:r>
         <w:rPr>
           <w:lang w:val="en-US"/>
         </w:rPr>
         <w:t>Conclusion</w:t>
       </w:r>
-      <w:bookmarkEnd w:id="11"/>
+      <w:bookmarkEnd w:id="19"/>
     </w:p>
     <w:p>
       <w:pPr>
+        <w:pStyle w:val="Titre2"/>
+      </w:pPr>
+      <w:bookmarkStart w:id="20" w:name="_Toc198654074"/>
+      <w:r>
+        <w:t>conclusion générale</w:t>
+      </w:r>
+      <w:bookmarkEnd w:id="20"/>
+    </w:p>
+    <w:p>
+      <w:pPr>
+        <w:pStyle w:val="Titre2"/>
+      </w:pPr>
+      <w:bookmarkStart w:id="21" w:name="_Toc198654075"/>
+      <w:r>
+        <w:t>conclusion personnelle</w:t>
+      </w:r>
+      <w:bookmarkEnd w:id="21"/>
+    </w:p>
+    <w:p>
+      <w:pPr>
+        <w:pStyle w:val="Titre2"/>
+      </w:pPr>
+      <w:bookmarkStart w:id="22" w:name="_Toc198654076"/>
+      <w:r>
+        <w:t>critique constructive sur la planification du projet</w:t>
+      </w:r>
+      <w:bookmarkEnd w:id="22"/>
+    </w:p>
+    <w:p>
+      <w:pPr>
+        <w:pStyle w:val="Retraitcorpsdetexte"/>
+      </w:pPr>
+    </w:p>
+    <w:p>
+      <w:pPr>
         <w:pStyle w:val="Titre1"/>
       </w:pPr>
-      <w:bookmarkStart w:id="12" w:name="_Toc181370766"/>
-      <w:bookmarkStart w:id="13" w:name="_Toc198653217"/>
+      <w:bookmarkStart w:id="23" w:name="_Toc181370766"/>
+      <w:bookmarkStart w:id="24" w:name="_Toc198654077"/>
       <w:r>
         <w:t>Webographie</w:t>
       </w:r>
-      <w:bookmarkEnd w:id="12"/>
-      <w:bookmarkEnd w:id="13"/>
+      <w:bookmarkEnd w:id="23"/>
+      <w:bookmarkEnd w:id="24"/>
     </w:p>
     <w:p>
       <w:pPr>
@@ -3792,6 +5151,155 @@
     </w:lvl>
   </w:abstractNum>
   <w:abstractNum w:abstractNumId="18" w15:restartNumberingAfterBreak="0">
+    <w:nsid w:val="1A557357"/>
+    <w:multiLevelType w:val="multilevel"/>
+    <w:tmpl w:val="49F6B5CE"/>
+    <w:lvl w:ilvl="0">
+      <w:start w:val="1"/>
+      <w:numFmt w:val="bullet"/>
+      <w:lvlText w:val=""/>
+      <w:lvlJc w:val="left"/>
+      <w:pPr>
+        <w:tabs>
+          <w:tab w:val="num" w:pos="720"/>
+        </w:tabs>
+        <w:ind w:left="720" w:hanging="360"/>
+      </w:pPr>
+      <w:rPr>
+        <w:rFonts w:ascii="Symbol" w:hAnsi="Symbol" w:hint="default"/>
+        <w:sz w:val="20"/>
+      </w:rPr>
+    </w:lvl>
+    <w:lvl w:ilvl="1" w:tentative="1">
+      <w:start w:val="1"/>
+      <w:numFmt w:val="bullet"/>
+      <w:lvlText w:val="o"/>
+      <w:lvlJc w:val="left"/>
+      <w:pPr>
+        <w:tabs>
+          <w:tab w:val="num" w:pos="1440"/>
+        </w:tabs>
+        <w:ind w:left="1440" w:hanging="360"/>
+      </w:pPr>
+      <w:rPr>
+        <w:rFonts w:ascii="Courier New" w:hAnsi="Courier New" w:hint="default"/>
+        <w:sz w:val="20"/>
+      </w:rPr>
+    </w:lvl>
+    <w:lvl w:ilvl="2" w:tentative="1">
+      <w:start w:val="1"/>
+      <w:numFmt w:val="bullet"/>
+      <w:lvlText w:val=""/>
+      <w:lvlJc w:val="left"/>
+      <w:pPr>
+        <w:tabs>
+          <w:tab w:val="num" w:pos="2160"/>
+        </w:tabs>
+        <w:ind w:left="2160" w:hanging="360"/>
+      </w:pPr>
+      <w:rPr>
+        <w:rFonts w:ascii="Wingdings" w:hAnsi="Wingdings" w:hint="default"/>
+        <w:sz w:val="20"/>
+      </w:rPr>
+    </w:lvl>
+    <w:lvl w:ilvl="3" w:tentative="1">
+      <w:start w:val="1"/>
+      <w:numFmt w:val="bullet"/>
+      <w:lvlText w:val=""/>
+      <w:lvlJc w:val="left"/>
+      <w:pPr>
+        <w:tabs>
+          <w:tab w:val="num" w:pos="2880"/>
+        </w:tabs>
+        <w:ind w:left="2880" w:hanging="360"/>
+      </w:pPr>
+      <w:rPr>
+        <w:rFonts w:ascii="Wingdings" w:hAnsi="Wingdings" w:hint="default"/>
+        <w:sz w:val="20"/>
+      </w:rPr>
+    </w:lvl>
+    <w:lvl w:ilvl="4" w:tentative="1">
+      <w:start w:val="1"/>
+      <w:numFmt w:val="bullet"/>
+      <w:lvlText w:val=""/>
+      <w:lvlJc w:val="left"/>
+      <w:pPr>
+        <w:tabs>
+          <w:tab w:val="num" w:pos="3600"/>
+        </w:tabs>
+        <w:ind w:left="3600" w:hanging="360"/>
+      </w:pPr>
+      <w:rPr>
+        <w:rFonts w:ascii="Wingdings" w:hAnsi="Wingdings" w:hint="default"/>
+        <w:sz w:val="20"/>
+      </w:rPr>
+    </w:lvl>
+    <w:lvl w:ilvl="5" w:tentative="1">
+      <w:start w:val="1"/>
+      <w:numFmt w:val="bullet"/>
+      <w:lvlText w:val=""/>
+      <w:lvlJc w:val="left"/>
+      <w:pPr>
+        <w:tabs>
+          <w:tab w:val="num" w:pos="4320"/>
+        </w:tabs>
+        <w:ind w:left="4320" w:hanging="360"/>
+      </w:pPr>
+      <w:rPr>
+        <w:rFonts w:ascii="Wingdings" w:hAnsi="Wingdings" w:hint="default"/>
+        <w:sz w:val="20"/>
+      </w:rPr>
+    </w:lvl>
+    <w:lvl w:ilvl="6" w:tentative="1">
+      <w:start w:val="1"/>
+      <w:numFmt w:val="bullet"/>
+      <w:lvlText w:val=""/>
+      <w:lvlJc w:val="left"/>
+      <w:pPr>
+        <w:tabs>
+          <w:tab w:val="num" w:pos="5040"/>
+        </w:tabs>
+        <w:ind w:left="5040" w:hanging="360"/>
+      </w:pPr>
+      <w:rPr>
+        <w:rFonts w:ascii="Wingdings" w:hAnsi="Wingdings" w:hint="default"/>
+        <w:sz w:val="20"/>
+      </w:rPr>
+    </w:lvl>
+    <w:lvl w:ilvl="7" w:tentative="1">
+      <w:start w:val="1"/>
+      <w:numFmt w:val="bullet"/>
+      <w:lvlText w:val=""/>
+      <w:lvlJc w:val="left"/>
+      <w:pPr>
+        <w:tabs>
+          <w:tab w:val="num" w:pos="5760"/>
+        </w:tabs>
+        <w:ind w:left="5760" w:hanging="360"/>
+      </w:pPr>
+      <w:rPr>
+        <w:rFonts w:ascii="Wingdings" w:hAnsi="Wingdings" w:hint="default"/>
+        <w:sz w:val="20"/>
+      </w:rPr>
+    </w:lvl>
+    <w:lvl w:ilvl="8" w:tentative="1">
+      <w:start w:val="1"/>
+      <w:numFmt w:val="bullet"/>
+      <w:lvlText w:val=""/>
+      <w:lvlJc w:val="left"/>
+      <w:pPr>
+        <w:tabs>
+          <w:tab w:val="num" w:pos="6480"/>
+        </w:tabs>
+        <w:ind w:left="6480" w:hanging="360"/>
+      </w:pPr>
+      <w:rPr>
+        <w:rFonts w:ascii="Wingdings" w:hAnsi="Wingdings" w:hint="default"/>
+        <w:sz w:val="20"/>
+      </w:rPr>
+    </w:lvl>
+  </w:abstractNum>
+  <w:abstractNum w:abstractNumId="19" w15:restartNumberingAfterBreak="0">
     <w:nsid w:val="1B4009C4"/>
     <w:multiLevelType w:val="multilevel"/>
     <w:tmpl w:val="9B8E0480"/>
@@ -3940,7 +5448,7 @@
       </w:rPr>
     </w:lvl>
   </w:abstractNum>
-  <w:abstractNum w:abstractNumId="19" w15:restartNumberingAfterBreak="0">
+  <w:abstractNum w:abstractNumId="20" w15:restartNumberingAfterBreak="0">
     <w:nsid w:val="1CF81CA9"/>
     <w:multiLevelType w:val="multilevel"/>
     <w:tmpl w:val="7862D484"/>
@@ -4089,7 +5597,7 @@
       </w:rPr>
     </w:lvl>
   </w:abstractNum>
-  <w:abstractNum w:abstractNumId="20" w15:restartNumberingAfterBreak="0">
+  <w:abstractNum w:abstractNumId="21" w15:restartNumberingAfterBreak="0">
     <w:nsid w:val="26A66FA2"/>
     <w:multiLevelType w:val="multilevel"/>
     <w:tmpl w:val="F0A48D78"/>
@@ -4238,7 +5746,7 @@
       </w:rPr>
     </w:lvl>
   </w:abstractNum>
-  <w:abstractNum w:abstractNumId="21" w15:restartNumberingAfterBreak="0">
+  <w:abstractNum w:abstractNumId="22" w15:restartNumberingAfterBreak="0">
     <w:nsid w:val="286972F3"/>
     <w:multiLevelType w:val="hybridMultilevel"/>
     <w:tmpl w:val="625A9CBA"/>
@@ -4324,7 +5832,7 @@
       </w:pPr>
     </w:lvl>
   </w:abstractNum>
-  <w:abstractNum w:abstractNumId="22" w15:restartNumberingAfterBreak="0">
+  <w:abstractNum w:abstractNumId="23" w15:restartNumberingAfterBreak="0">
     <w:nsid w:val="2A4975AE"/>
     <w:multiLevelType w:val="hybridMultilevel"/>
     <w:tmpl w:val="AD144DB8"/>
@@ -4410,7 +5918,7 @@
       </w:pPr>
     </w:lvl>
   </w:abstractNum>
-  <w:abstractNum w:abstractNumId="23" w15:restartNumberingAfterBreak="0">
+  <w:abstractNum w:abstractNumId="24" w15:restartNumberingAfterBreak="0">
     <w:nsid w:val="2A8F67FD"/>
     <w:multiLevelType w:val="multilevel"/>
     <w:tmpl w:val="A32EB862"/>
@@ -4526,7 +6034,7 @@
       </w:pPr>
     </w:lvl>
   </w:abstractNum>
-  <w:abstractNum w:abstractNumId="24" w15:restartNumberingAfterBreak="0">
+  <w:abstractNum w:abstractNumId="25" w15:restartNumberingAfterBreak="0">
     <w:nsid w:val="2F9178C1"/>
     <w:multiLevelType w:val="multilevel"/>
     <w:tmpl w:val="C996001C"/>
@@ -4675,7 +6183,7 @@
       </w:rPr>
     </w:lvl>
   </w:abstractNum>
-  <w:abstractNum w:abstractNumId="25" w15:restartNumberingAfterBreak="0">
+  <w:abstractNum w:abstractNumId="26" w15:restartNumberingAfterBreak="0">
     <w:nsid w:val="30061AC0"/>
     <w:multiLevelType w:val="multilevel"/>
     <w:tmpl w:val="CA36010A"/>
@@ -4824,7 +6332,7 @@
       </w:rPr>
     </w:lvl>
   </w:abstractNum>
-  <w:abstractNum w:abstractNumId="26" w15:restartNumberingAfterBreak="0">
+  <w:abstractNum w:abstractNumId="27" w15:restartNumberingAfterBreak="0">
     <w:nsid w:val="352802CD"/>
     <w:multiLevelType w:val="multilevel"/>
     <w:tmpl w:val="295C0684"/>
@@ -4973,7 +6481,7 @@
       </w:rPr>
     </w:lvl>
   </w:abstractNum>
-  <w:abstractNum w:abstractNumId="27" w15:restartNumberingAfterBreak="0">
+  <w:abstractNum w:abstractNumId="28" w15:restartNumberingAfterBreak="0">
     <w:nsid w:val="3754479B"/>
     <w:multiLevelType w:val="multilevel"/>
     <w:tmpl w:val="874CD94C"/>
@@ -5122,7 +6630,7 @@
       </w:rPr>
     </w:lvl>
   </w:abstractNum>
-  <w:abstractNum w:abstractNumId="28" w15:restartNumberingAfterBreak="0">
+  <w:abstractNum w:abstractNumId="29" w15:restartNumberingAfterBreak="0">
     <w:nsid w:val="3AE80592"/>
     <w:multiLevelType w:val="multilevel"/>
     <w:tmpl w:val="E454055A"/>
@@ -5271,7 +6779,7 @@
       </w:rPr>
     </w:lvl>
   </w:abstractNum>
-  <w:abstractNum w:abstractNumId="29" w15:restartNumberingAfterBreak="0">
+  <w:abstractNum w:abstractNumId="30" w15:restartNumberingAfterBreak="0">
     <w:nsid w:val="3BD16F36"/>
     <w:multiLevelType w:val="multilevel"/>
     <w:tmpl w:val="100C0021"/>
@@ -5384,7 +6892,7 @@
       </w:rPr>
     </w:lvl>
   </w:abstractNum>
-  <w:abstractNum w:abstractNumId="30" w15:restartNumberingAfterBreak="0">
+  <w:abstractNum w:abstractNumId="31" w15:restartNumberingAfterBreak="0">
     <w:nsid w:val="3EF922F0"/>
     <w:multiLevelType w:val="multilevel"/>
     <w:tmpl w:val="100C0021"/>
@@ -5497,7 +7005,7 @@
       </w:rPr>
     </w:lvl>
   </w:abstractNum>
-  <w:abstractNum w:abstractNumId="31" w15:restartNumberingAfterBreak="0">
+  <w:abstractNum w:abstractNumId="32" w15:restartNumberingAfterBreak="0">
     <w:nsid w:val="42601ED3"/>
     <w:multiLevelType w:val="multilevel"/>
     <w:tmpl w:val="B10A766E"/>
@@ -5642,7 +7150,120 @@
       </w:rPr>
     </w:lvl>
   </w:abstractNum>
-  <w:abstractNum w:abstractNumId="32" w15:restartNumberingAfterBreak="0">
+  <w:abstractNum w:abstractNumId="33" w15:restartNumberingAfterBreak="0">
+    <w:nsid w:val="42F60F8E"/>
+    <w:multiLevelType w:val="hybridMultilevel"/>
+    <w:tmpl w:val="F4202DE4"/>
+    <w:lvl w:ilvl="0" w:tplc="100C0001">
+      <w:start w:val="1"/>
+      <w:numFmt w:val="bullet"/>
+      <w:lvlText w:val=""/>
+      <w:lvlJc w:val="left"/>
+      <w:pPr>
+        <w:ind w:left="1854" w:hanging="360"/>
+      </w:pPr>
+      <w:rPr>
+        <w:rFonts w:ascii="Symbol" w:hAnsi="Symbol" w:hint="default"/>
+      </w:rPr>
+    </w:lvl>
+    <w:lvl w:ilvl="1" w:tplc="100C0003" w:tentative="1">
+      <w:start w:val="1"/>
+      <w:numFmt w:val="bullet"/>
+      <w:lvlText w:val="o"/>
+      <w:lvlJc w:val="left"/>
+      <w:pPr>
+        <w:ind w:left="2574" w:hanging="360"/>
+      </w:pPr>
+      <w:rPr>
+        <w:rFonts w:ascii="Courier New" w:hAnsi="Courier New" w:cs="Courier New" w:hint="default"/>
+      </w:rPr>
+    </w:lvl>
+    <w:lvl w:ilvl="2" w:tplc="100C0005" w:tentative="1">
+      <w:start w:val="1"/>
+      <w:numFmt w:val="bullet"/>
+      <w:lvlText w:val=""/>
+      <w:lvlJc w:val="left"/>
+      <w:pPr>
+        <w:ind w:left="3294" w:hanging="360"/>
+      </w:pPr>
+      <w:rPr>
+        <w:rFonts w:ascii="Wingdings" w:hAnsi="Wingdings" w:hint="default"/>
+      </w:rPr>
+    </w:lvl>
+    <w:lvl w:ilvl="3" w:tplc="100C0001" w:tentative="1">
+      <w:start w:val="1"/>
+      <w:numFmt w:val="bullet"/>
+      <w:lvlText w:val=""/>
+      <w:lvlJc w:val="left"/>
+      <w:pPr>
+        <w:ind w:left="4014" w:hanging="360"/>
+      </w:pPr>
+      <w:rPr>
+        <w:rFonts w:ascii="Symbol" w:hAnsi="Symbol" w:hint="default"/>
+      </w:rPr>
+    </w:lvl>
+    <w:lvl w:ilvl="4" w:tplc="100C0003" w:tentative="1">
+      <w:start w:val="1"/>
+      <w:numFmt w:val="bullet"/>
+      <w:lvlText w:val="o"/>
+      <w:lvlJc w:val="left"/>
+      <w:pPr>
+        <w:ind w:left="4734" w:hanging="360"/>
+      </w:pPr>
+      <w:rPr>
+        <w:rFonts w:ascii="Courier New" w:hAnsi="Courier New" w:cs="Courier New" w:hint="default"/>
+      </w:rPr>
+    </w:lvl>
+    <w:lvl w:ilvl="5" w:tplc="100C0005" w:tentative="1">
+      <w:start w:val="1"/>
+      <w:numFmt w:val="bullet"/>
+      <w:lvlText w:val=""/>
+      <w:lvlJc w:val="left"/>
+      <w:pPr>
+        <w:ind w:left="5454" w:hanging="360"/>
+      </w:pPr>
+      <w:rPr>
+        <w:rFonts w:ascii="Wingdings" w:hAnsi="Wingdings" w:hint="default"/>
+      </w:rPr>
+    </w:lvl>
+    <w:lvl w:ilvl="6" w:tplc="100C0001" w:tentative="1">
+      <w:start w:val="1"/>
+      <w:numFmt w:val="bullet"/>
+      <w:lvlText w:val=""/>
+      <w:lvlJc w:val="left"/>
+      <w:pPr>
+        <w:ind w:left="6174" w:hanging="360"/>
+      </w:pPr>
+      <w:rPr>
+        <w:rFonts w:ascii="Symbol" w:hAnsi="Symbol" w:hint="default"/>
+      </w:rPr>
+    </w:lvl>
+    <w:lvl w:ilvl="7" w:tplc="100C0003" w:tentative="1">
+      <w:start w:val="1"/>
+      <w:numFmt w:val="bullet"/>
+      <w:lvlText w:val="o"/>
+      <w:lvlJc w:val="left"/>
+      <w:pPr>
+        <w:ind w:left="6894" w:hanging="360"/>
+      </w:pPr>
+      <w:rPr>
+        <w:rFonts w:ascii="Courier New" w:hAnsi="Courier New" w:cs="Courier New" w:hint="default"/>
+      </w:rPr>
+    </w:lvl>
+    <w:lvl w:ilvl="8" w:tplc="100C0005" w:tentative="1">
+      <w:start w:val="1"/>
+      <w:numFmt w:val="bullet"/>
+      <w:lvlText w:val=""/>
+      <w:lvlJc w:val="left"/>
+      <w:pPr>
+        <w:ind w:left="7614" w:hanging="360"/>
+      </w:pPr>
+      <w:rPr>
+        <w:rFonts w:ascii="Wingdings" w:hAnsi="Wingdings" w:hint="default"/>
+      </w:rPr>
+    </w:lvl>
+  </w:abstractNum>
+  <w:abstractNum w:abstractNumId="34" w15:restartNumberingAfterBreak="0">
     <w:nsid w:val="43375E5A"/>
     <w:multiLevelType w:val="hybridMultilevel"/>
     <w:tmpl w:val="09520796"/>
@@ -5755,7 +7376,7 @@
       </w:rPr>
     </w:lvl>
   </w:abstractNum>
-  <w:abstractNum w:abstractNumId="33" w15:restartNumberingAfterBreak="0">
+  <w:abstractNum w:abstractNumId="35" w15:restartNumberingAfterBreak="0">
     <w:nsid w:val="443160C6"/>
     <w:multiLevelType w:val="multilevel"/>
     <w:tmpl w:val="BB94C320"/>
@@ -5904,7 +7525,7 @@
       </w:rPr>
     </w:lvl>
   </w:abstractNum>
-  <w:abstractNum w:abstractNumId="34" w15:restartNumberingAfterBreak="0">
+  <w:abstractNum w:abstractNumId="36" w15:restartNumberingAfterBreak="0">
     <w:nsid w:val="44EF3A5B"/>
     <w:multiLevelType w:val="multilevel"/>
     <w:tmpl w:val="0EA89E0C"/>
@@ -6053,7 +7674,7 @@
       </w:rPr>
     </w:lvl>
   </w:abstractNum>
-  <w:abstractNum w:abstractNumId="35" w15:restartNumberingAfterBreak="0">
+  <w:abstractNum w:abstractNumId="37" w15:restartNumberingAfterBreak="0">
     <w:nsid w:val="45D7053A"/>
     <w:multiLevelType w:val="hybridMultilevel"/>
     <w:tmpl w:val="C94C0CC2"/>
@@ -6166,7 +7787,7 @@
       </w:rPr>
     </w:lvl>
   </w:abstractNum>
-  <w:abstractNum w:abstractNumId="36" w15:restartNumberingAfterBreak="0">
+  <w:abstractNum w:abstractNumId="38" w15:restartNumberingAfterBreak="0">
     <w:nsid w:val="466E1CC2"/>
     <w:multiLevelType w:val="multilevel"/>
     <w:tmpl w:val="03F887D8"/>
@@ -6315,7 +7936,7 @@
       </w:rPr>
     </w:lvl>
   </w:abstractNum>
-  <w:abstractNum w:abstractNumId="37" w15:restartNumberingAfterBreak="0">
+  <w:abstractNum w:abstractNumId="39" w15:restartNumberingAfterBreak="0">
     <w:nsid w:val="47013D00"/>
     <w:multiLevelType w:val="hybridMultilevel"/>
     <w:tmpl w:val="EDB283C0"/>
@@ -6401,7 +8022,7 @@
       </w:pPr>
     </w:lvl>
   </w:abstractNum>
-  <w:abstractNum w:abstractNumId="38" w15:restartNumberingAfterBreak="0">
+  <w:abstractNum w:abstractNumId="40" w15:restartNumberingAfterBreak="0">
     <w:nsid w:val="470304FF"/>
     <w:multiLevelType w:val="multilevel"/>
     <w:tmpl w:val="DB142014"/>
@@ -6518,7 +8139,7 @@
       </w:pPr>
     </w:lvl>
   </w:abstractNum>
-  <w:abstractNum w:abstractNumId="39" w15:restartNumberingAfterBreak="0">
+  <w:abstractNum w:abstractNumId="41" w15:restartNumberingAfterBreak="0">
     <w:nsid w:val="486164F4"/>
     <w:multiLevelType w:val="multilevel"/>
     <w:tmpl w:val="100C0021"/>
@@ -6631,7 +8252,7 @@
       </w:rPr>
     </w:lvl>
   </w:abstractNum>
-  <w:abstractNum w:abstractNumId="40" w15:restartNumberingAfterBreak="0">
+  <w:abstractNum w:abstractNumId="42" w15:restartNumberingAfterBreak="0">
     <w:nsid w:val="49A04187"/>
     <w:multiLevelType w:val="multilevel"/>
     <w:tmpl w:val="21BC8390"/>
@@ -6748,7 +8369,7 @@
       </w:pPr>
     </w:lvl>
   </w:abstractNum>
-  <w:abstractNum w:abstractNumId="41" w15:restartNumberingAfterBreak="0">
+  <w:abstractNum w:abstractNumId="43" w15:restartNumberingAfterBreak="0">
     <w:nsid w:val="4E880B14"/>
     <w:multiLevelType w:val="hybridMultilevel"/>
     <w:tmpl w:val="588695E2"/>
@@ -6834,7 +8455,7 @@
       </w:pPr>
     </w:lvl>
   </w:abstractNum>
-  <w:abstractNum w:abstractNumId="42" w15:restartNumberingAfterBreak="0">
+  <w:abstractNum w:abstractNumId="44" w15:restartNumberingAfterBreak="0">
     <w:nsid w:val="4EFB319D"/>
     <w:multiLevelType w:val="hybridMultilevel"/>
     <w:tmpl w:val="D70A16EC"/>
@@ -6947,7 +8568,7 @@
       </w:rPr>
     </w:lvl>
   </w:abstractNum>
-  <w:abstractNum w:abstractNumId="43" w15:restartNumberingAfterBreak="0">
+  <w:abstractNum w:abstractNumId="45" w15:restartNumberingAfterBreak="0">
     <w:nsid w:val="4FF40332"/>
     <w:multiLevelType w:val="hybridMultilevel"/>
     <w:tmpl w:val="AE8471CE"/>
@@ -7060,7 +8681,7 @@
       </w:rPr>
     </w:lvl>
   </w:abstractNum>
-  <w:abstractNum w:abstractNumId="44" w15:restartNumberingAfterBreak="0">
+  <w:abstractNum w:abstractNumId="46" w15:restartNumberingAfterBreak="0">
     <w:nsid w:val="50D72083"/>
     <w:multiLevelType w:val="multilevel"/>
     <w:tmpl w:val="F73AFD5C"/>
@@ -7205,7 +8826,7 @@
       </w:rPr>
     </w:lvl>
   </w:abstractNum>
-  <w:abstractNum w:abstractNumId="45" w15:restartNumberingAfterBreak="0">
+  <w:abstractNum w:abstractNumId="47" w15:restartNumberingAfterBreak="0">
     <w:nsid w:val="51876E89"/>
     <w:multiLevelType w:val="multilevel"/>
     <w:tmpl w:val="AE00E0CE"/>
@@ -7354,7 +8975,7 @@
       </w:rPr>
     </w:lvl>
   </w:abstractNum>
-  <w:abstractNum w:abstractNumId="46" w15:restartNumberingAfterBreak="0">
+  <w:abstractNum w:abstractNumId="48" w15:restartNumberingAfterBreak="0">
     <w:nsid w:val="52AB4161"/>
     <w:multiLevelType w:val="multilevel"/>
     <w:tmpl w:val="BFCC9260"/>
@@ -7471,7 +9092,7 @@
       </w:pPr>
     </w:lvl>
   </w:abstractNum>
-  <w:abstractNum w:abstractNumId="47" w15:restartNumberingAfterBreak="0">
+  <w:abstractNum w:abstractNumId="49" w15:restartNumberingAfterBreak="0">
     <w:nsid w:val="572B450E"/>
     <w:multiLevelType w:val="hybridMultilevel"/>
     <w:tmpl w:val="1818C56A"/>
@@ -7584,7 +9205,7 @@
       </w:rPr>
     </w:lvl>
   </w:abstractNum>
-  <w:abstractNum w:abstractNumId="48" w15:restartNumberingAfterBreak="0">
+  <w:abstractNum w:abstractNumId="50" w15:restartNumberingAfterBreak="0">
     <w:nsid w:val="58BB3E46"/>
     <w:multiLevelType w:val="multilevel"/>
     <w:tmpl w:val="9A7AE602"/>
@@ -7733,7 +9354,7 @@
       </w:rPr>
     </w:lvl>
   </w:abstractNum>
-  <w:abstractNum w:abstractNumId="49" w15:restartNumberingAfterBreak="0">
+  <w:abstractNum w:abstractNumId="51" w15:restartNumberingAfterBreak="0">
     <w:nsid w:val="595A1A91"/>
     <w:multiLevelType w:val="multilevel"/>
     <w:tmpl w:val="B494260A"/>
@@ -7882,7 +9503,7 @@
       </w:rPr>
     </w:lvl>
   </w:abstractNum>
-  <w:abstractNum w:abstractNumId="50" w15:restartNumberingAfterBreak="0">
+  <w:abstractNum w:abstractNumId="52" w15:restartNumberingAfterBreak="0">
     <w:nsid w:val="5A1353C9"/>
     <w:multiLevelType w:val="hybridMultilevel"/>
     <w:tmpl w:val="40B84EF0"/>
@@ -7968,7 +9589,7 @@
       </w:pPr>
     </w:lvl>
   </w:abstractNum>
-  <w:abstractNum w:abstractNumId="51" w15:restartNumberingAfterBreak="0">
+  <w:abstractNum w:abstractNumId="53" w15:restartNumberingAfterBreak="0">
     <w:nsid w:val="5B6337DC"/>
     <w:multiLevelType w:val="multilevel"/>
     <w:tmpl w:val="68341AF2"/>
@@ -8117,7 +9738,7 @@
       </w:rPr>
     </w:lvl>
   </w:abstractNum>
-  <w:abstractNum w:abstractNumId="52" w15:restartNumberingAfterBreak="0">
+  <w:abstractNum w:abstractNumId="54" w15:restartNumberingAfterBreak="0">
     <w:nsid w:val="5C0C1455"/>
     <w:multiLevelType w:val="multilevel"/>
     <w:tmpl w:val="5E3A69CE"/>
@@ -8266,7 +9887,7 @@
       </w:rPr>
     </w:lvl>
   </w:abstractNum>
-  <w:abstractNum w:abstractNumId="53" w15:restartNumberingAfterBreak="0">
+  <w:abstractNum w:abstractNumId="55" w15:restartNumberingAfterBreak="0">
     <w:nsid w:val="5C877673"/>
     <w:multiLevelType w:val="multilevel"/>
     <w:tmpl w:val="100C0021"/>
@@ -8379,7 +10000,7 @@
       </w:rPr>
     </w:lvl>
   </w:abstractNum>
-  <w:abstractNum w:abstractNumId="54" w15:restartNumberingAfterBreak="0">
+  <w:abstractNum w:abstractNumId="56" w15:restartNumberingAfterBreak="0">
     <w:nsid w:val="5EB75F87"/>
     <w:multiLevelType w:val="multilevel"/>
     <w:tmpl w:val="1612F80A"/>
@@ -8500,7 +10121,7 @@
       </w:pPr>
     </w:lvl>
   </w:abstractNum>
-  <w:abstractNum w:abstractNumId="55" w15:restartNumberingAfterBreak="0">
+  <w:abstractNum w:abstractNumId="57" w15:restartNumberingAfterBreak="0">
     <w:nsid w:val="606E216E"/>
     <w:multiLevelType w:val="multilevel"/>
     <w:tmpl w:val="F73AFD5C"/>
@@ -8645,7 +10266,7 @@
       </w:rPr>
     </w:lvl>
   </w:abstractNum>
-  <w:abstractNum w:abstractNumId="56" w15:restartNumberingAfterBreak="0">
+  <w:abstractNum w:abstractNumId="58" w15:restartNumberingAfterBreak="0">
     <w:nsid w:val="64CD52AC"/>
     <w:multiLevelType w:val="multilevel"/>
     <w:tmpl w:val="9466875A"/>
@@ -8794,7 +10415,7 @@
       </w:rPr>
     </w:lvl>
   </w:abstractNum>
-  <w:abstractNum w:abstractNumId="57" w15:restartNumberingAfterBreak="0">
+  <w:abstractNum w:abstractNumId="59" w15:restartNumberingAfterBreak="0">
     <w:nsid w:val="656770F6"/>
     <w:multiLevelType w:val="hybridMultilevel"/>
     <w:tmpl w:val="B75AA2EC"/>
@@ -8880,7 +10501,156 @@
       </w:pPr>
     </w:lvl>
   </w:abstractNum>
-  <w:abstractNum w:abstractNumId="58" w15:restartNumberingAfterBreak="0">
+  <w:abstractNum w:abstractNumId="60" w15:restartNumberingAfterBreak="0">
+    <w:nsid w:val="67E92066"/>
+    <w:multiLevelType w:val="multilevel"/>
+    <w:tmpl w:val="24148CF6"/>
+    <w:lvl w:ilvl="0">
+      <w:start w:val="1"/>
+      <w:numFmt w:val="bullet"/>
+      <w:lvlText w:val=""/>
+      <w:lvlJc w:val="left"/>
+      <w:pPr>
+        <w:tabs>
+          <w:tab w:val="num" w:pos="720"/>
+        </w:tabs>
+        <w:ind w:left="720" w:hanging="360"/>
+      </w:pPr>
+      <w:rPr>
+        <w:rFonts w:ascii="Symbol" w:hAnsi="Symbol" w:hint="default"/>
+        <w:sz w:val="20"/>
+      </w:rPr>
+    </w:lvl>
+    <w:lvl w:ilvl="1" w:tentative="1">
+      <w:start w:val="1"/>
+      <w:numFmt w:val="bullet"/>
+      <w:lvlText w:val="o"/>
+      <w:lvlJc w:val="left"/>
+      <w:pPr>
+        <w:tabs>
+          <w:tab w:val="num" w:pos="1440"/>
+        </w:tabs>
+        <w:ind w:left="1440" w:hanging="360"/>
+      </w:pPr>
+      <w:rPr>
+        <w:rFonts w:ascii="Courier New" w:hAnsi="Courier New" w:hint="default"/>
+        <w:sz w:val="20"/>
+      </w:rPr>
+    </w:lvl>
+    <w:lvl w:ilvl="2" w:tentative="1">
+      <w:start w:val="1"/>
+      <w:numFmt w:val="bullet"/>
+      <w:lvlText w:val=""/>
+      <w:lvlJc w:val="left"/>
+      <w:pPr>
+        <w:tabs>
+          <w:tab w:val="num" w:pos="2160"/>
+        </w:tabs>
+        <w:ind w:left="2160" w:hanging="360"/>
+      </w:pPr>
+      <w:rPr>
+        <w:rFonts w:ascii="Wingdings" w:hAnsi="Wingdings" w:hint="default"/>
+        <w:sz w:val="20"/>
+      </w:rPr>
+    </w:lvl>
+    <w:lvl w:ilvl="3" w:tentative="1">
+      <w:start w:val="1"/>
+      <w:numFmt w:val="bullet"/>
+      <w:lvlText w:val=""/>
+      <w:lvlJc w:val="left"/>
+      <w:pPr>
+        <w:tabs>
+          <w:tab w:val="num" w:pos="2880"/>
+        </w:tabs>
+        <w:ind w:left="2880" w:hanging="360"/>
+      </w:pPr>
+      <w:rPr>
+        <w:rFonts w:ascii="Wingdings" w:hAnsi="Wingdings" w:hint="default"/>
+        <w:sz w:val="20"/>
+      </w:rPr>
+    </w:lvl>
+    <w:lvl w:ilvl="4" w:tentative="1">
+      <w:start w:val="1"/>
+      <w:numFmt w:val="bullet"/>
+      <w:lvlText w:val=""/>
+      <w:lvlJc w:val="left"/>
+      <w:pPr>
+        <w:tabs>
+          <w:tab w:val="num" w:pos="3600"/>
+        </w:tabs>
+        <w:ind w:left="3600" w:hanging="360"/>
+      </w:pPr>
+      <w:rPr>
+        <w:rFonts w:ascii="Wingdings" w:hAnsi="Wingdings" w:hint="default"/>
+        <w:sz w:val="20"/>
+      </w:rPr>
+    </w:lvl>
+    <w:lvl w:ilvl="5" w:tentative="1">
+      <w:start w:val="1"/>
+      <w:numFmt w:val="bullet"/>
+      <w:lvlText w:val=""/>
+      <w:lvlJc w:val="left"/>
+      <w:pPr>
+        <w:tabs>
+          <w:tab w:val="num" w:pos="4320"/>
+        </w:tabs>
+        <w:ind w:left="4320" w:hanging="360"/>
+      </w:pPr>
+      <w:rPr>
+        <w:rFonts w:ascii="Wingdings" w:hAnsi="Wingdings" w:hint="default"/>
+        <w:sz w:val="20"/>
+      </w:rPr>
+    </w:lvl>
+    <w:lvl w:ilvl="6" w:tentative="1">
+      <w:start w:val="1"/>
+      <w:numFmt w:val="bullet"/>
+      <w:lvlText w:val=""/>
+      <w:lvlJc w:val="left"/>
+      <w:pPr>
+        <w:tabs>
+          <w:tab w:val="num" w:pos="5040"/>
+        </w:tabs>
+        <w:ind w:left="5040" w:hanging="360"/>
+      </w:pPr>
+      <w:rPr>
+        <w:rFonts w:ascii="Wingdings" w:hAnsi="Wingdings" w:hint="default"/>
+        <w:sz w:val="20"/>
+      </w:rPr>
+    </w:lvl>
+    <w:lvl w:ilvl="7" w:tentative="1">
+      <w:start w:val="1"/>
+      <w:numFmt w:val="bullet"/>
+      <w:lvlText w:val=""/>
+      <w:lvlJc w:val="left"/>
+      <w:pPr>
+        <w:tabs>
+          <w:tab w:val="num" w:pos="5760"/>
+        </w:tabs>
+        <w:ind w:left="5760" w:hanging="360"/>
+      </w:pPr>
+      <w:rPr>
+        <w:rFonts w:ascii="Wingdings" w:hAnsi="Wingdings" w:hint="default"/>
+        <w:sz w:val="20"/>
+      </w:rPr>
+    </w:lvl>
+    <w:lvl w:ilvl="8" w:tentative="1">
+      <w:start w:val="1"/>
+      <w:numFmt w:val="bullet"/>
+      <w:lvlText w:val=""/>
+      <w:lvlJc w:val="left"/>
+      <w:pPr>
+        <w:tabs>
+          <w:tab w:val="num" w:pos="6480"/>
+        </w:tabs>
+        <w:ind w:left="6480" w:hanging="360"/>
+      </w:pPr>
+      <w:rPr>
+        <w:rFonts w:ascii="Wingdings" w:hAnsi="Wingdings" w:hint="default"/>
+        <w:sz w:val="20"/>
+      </w:rPr>
+    </w:lvl>
+  </w:abstractNum>
+  <w:abstractNum w:abstractNumId="61" w15:restartNumberingAfterBreak="0">
     <w:nsid w:val="67FA2FB8"/>
     <w:multiLevelType w:val="multilevel"/>
     <w:tmpl w:val="E21E3B8A"/>
@@ -9029,7 +10799,7 @@
       </w:rPr>
     </w:lvl>
   </w:abstractNum>
-  <w:abstractNum w:abstractNumId="59" w15:restartNumberingAfterBreak="0">
+  <w:abstractNum w:abstractNumId="62" w15:restartNumberingAfterBreak="0">
     <w:nsid w:val="689854E7"/>
     <w:multiLevelType w:val="hybridMultilevel"/>
     <w:tmpl w:val="C4B28D26"/>
@@ -9142,7 +10912,7 @@
       </w:rPr>
     </w:lvl>
   </w:abstractNum>
-  <w:abstractNum w:abstractNumId="60" w15:restartNumberingAfterBreak="0">
+  <w:abstractNum w:abstractNumId="63" w15:restartNumberingAfterBreak="0">
     <w:nsid w:val="6B305FF5"/>
     <w:multiLevelType w:val="multilevel"/>
     <w:tmpl w:val="0694BF10"/>
@@ -9291,7 +11061,7 @@
       </w:rPr>
     </w:lvl>
   </w:abstractNum>
-  <w:abstractNum w:abstractNumId="61" w15:restartNumberingAfterBreak="0">
+  <w:abstractNum w:abstractNumId="64" w15:restartNumberingAfterBreak="0">
     <w:nsid w:val="6EC667E1"/>
     <w:multiLevelType w:val="hybridMultilevel"/>
     <w:tmpl w:val="0F1C05AA"/>
@@ -9404,7 +11174,7 @@
       </w:rPr>
     </w:lvl>
   </w:abstractNum>
-  <w:abstractNum w:abstractNumId="62" w15:restartNumberingAfterBreak="0">
+  <w:abstractNum w:abstractNumId="65" w15:restartNumberingAfterBreak="0">
     <w:nsid w:val="6F8E7937"/>
     <w:multiLevelType w:val="multilevel"/>
     <w:tmpl w:val="2618C62C"/>
@@ -9553,7 +11323,7 @@
       </w:rPr>
     </w:lvl>
   </w:abstractNum>
-  <w:abstractNum w:abstractNumId="63" w15:restartNumberingAfterBreak="0">
+  <w:abstractNum w:abstractNumId="66" w15:restartNumberingAfterBreak="0">
     <w:nsid w:val="705A7A56"/>
     <w:multiLevelType w:val="multilevel"/>
     <w:tmpl w:val="FFDAE2A6"/>
@@ -9702,7 +11472,7 @@
       </w:rPr>
     </w:lvl>
   </w:abstractNum>
-  <w:abstractNum w:abstractNumId="64" w15:restartNumberingAfterBreak="0">
+  <w:abstractNum w:abstractNumId="67" w15:restartNumberingAfterBreak="0">
     <w:nsid w:val="72185589"/>
     <w:multiLevelType w:val="multilevel"/>
     <w:tmpl w:val="5C7A424E"/>
@@ -9851,7 +11621,7 @@
       </w:rPr>
     </w:lvl>
   </w:abstractNum>
-  <w:abstractNum w:abstractNumId="65" w15:restartNumberingAfterBreak="0">
+  <w:abstractNum w:abstractNumId="68" w15:restartNumberingAfterBreak="0">
     <w:nsid w:val="732773D2"/>
     <w:multiLevelType w:val="multilevel"/>
     <w:tmpl w:val="B10A766E"/>
@@ -9996,7 +11766,7 @@
       </w:rPr>
     </w:lvl>
   </w:abstractNum>
-  <w:abstractNum w:abstractNumId="66" w15:restartNumberingAfterBreak="0">
+  <w:abstractNum w:abstractNumId="69" w15:restartNumberingAfterBreak="0">
     <w:nsid w:val="73E13F6B"/>
     <w:multiLevelType w:val="hybridMultilevel"/>
     <w:tmpl w:val="A5D21806"/>
@@ -10109,7 +11879,7 @@
       </w:rPr>
     </w:lvl>
   </w:abstractNum>
-  <w:abstractNum w:abstractNumId="67" w15:restartNumberingAfterBreak="0">
+  <w:abstractNum w:abstractNumId="70" w15:restartNumberingAfterBreak="0">
     <w:nsid w:val="743C6B91"/>
     <w:multiLevelType w:val="multilevel"/>
     <w:tmpl w:val="C8D87FC4"/>
@@ -10258,7 +12028,7 @@
       </w:rPr>
     </w:lvl>
   </w:abstractNum>
-  <w:abstractNum w:abstractNumId="68" w15:restartNumberingAfterBreak="0">
+  <w:abstractNum w:abstractNumId="71" w15:restartNumberingAfterBreak="0">
     <w:nsid w:val="77AD7629"/>
     <w:multiLevelType w:val="multilevel"/>
     <w:tmpl w:val="9BAA795A"/>
@@ -10407,7 +12177,7 @@
       </w:rPr>
     </w:lvl>
   </w:abstractNum>
-  <w:abstractNum w:abstractNumId="69" w15:restartNumberingAfterBreak="0">
+  <w:abstractNum w:abstractNumId="72" w15:restartNumberingAfterBreak="0">
     <w:nsid w:val="7802400F"/>
     <w:multiLevelType w:val="multilevel"/>
     <w:tmpl w:val="A2029AC2"/>
@@ -10556,7 +12326,7 @@
       </w:rPr>
     </w:lvl>
   </w:abstractNum>
-  <w:abstractNum w:abstractNumId="70" w15:restartNumberingAfterBreak="0">
+  <w:abstractNum w:abstractNumId="73" w15:restartNumberingAfterBreak="0">
     <w:nsid w:val="78A81255"/>
     <w:multiLevelType w:val="multilevel"/>
     <w:tmpl w:val="14B25418"/>
@@ -10705,7 +12475,7 @@
       </w:rPr>
     </w:lvl>
   </w:abstractNum>
-  <w:abstractNum w:abstractNumId="71" w15:restartNumberingAfterBreak="0">
+  <w:abstractNum w:abstractNumId="74" w15:restartNumberingAfterBreak="0">
     <w:nsid w:val="79306A20"/>
     <w:multiLevelType w:val="multilevel"/>
     <w:tmpl w:val="3B3CEBEC"/>
@@ -10854,7 +12624,7 @@
       </w:rPr>
     </w:lvl>
   </w:abstractNum>
-  <w:abstractNum w:abstractNumId="72" w15:restartNumberingAfterBreak="0">
+  <w:abstractNum w:abstractNumId="75" w15:restartNumberingAfterBreak="0">
     <w:nsid w:val="7A683687"/>
     <w:multiLevelType w:val="multilevel"/>
     <w:tmpl w:val="F73AFD5C"/>
@@ -10999,7 +12769,7 @@
       </w:rPr>
     </w:lvl>
   </w:abstractNum>
-  <w:abstractNum w:abstractNumId="73" w15:restartNumberingAfterBreak="0">
+  <w:abstractNum w:abstractNumId="76" w15:restartNumberingAfterBreak="0">
     <w:nsid w:val="7C2B5F1F"/>
     <w:multiLevelType w:val="multilevel"/>
     <w:tmpl w:val="D9227486"/>
@@ -11148,7 +12918,7 @@
       </w:rPr>
     </w:lvl>
   </w:abstractNum>
-  <w:abstractNum w:abstractNumId="74" w15:restartNumberingAfterBreak="0">
+  <w:abstractNum w:abstractNumId="77" w15:restartNumberingAfterBreak="0">
     <w:nsid w:val="7E1137AC"/>
     <w:multiLevelType w:val="hybridMultilevel"/>
     <w:tmpl w:val="DF4AA514"/>
@@ -11234,7 +13004,7 @@
       </w:pPr>
     </w:lvl>
   </w:abstractNum>
-  <w:abstractNum w:abstractNumId="75" w15:restartNumberingAfterBreak="0">
+  <w:abstractNum w:abstractNumId="78" w15:restartNumberingAfterBreak="0">
     <w:nsid w:val="7E4B5B66"/>
     <w:multiLevelType w:val="multilevel"/>
     <w:tmpl w:val="2DD2493A"/>
@@ -11383,7 +13153,7 @@
       </w:rPr>
     </w:lvl>
   </w:abstractNum>
-  <w:abstractNum w:abstractNumId="76" w15:restartNumberingAfterBreak="0">
+  <w:abstractNum w:abstractNumId="79" w15:restartNumberingAfterBreak="0">
     <w:nsid w:val="7F053DF4"/>
     <w:multiLevelType w:val="hybridMultilevel"/>
     <w:tmpl w:val="CEFACCCA"/>
@@ -11497,19 +13267,19 @@
     </w:lvl>
   </w:abstractNum>
   <w:num w:numId="1" w16cid:durableId="401492678">
-    <w:abstractNumId w:val="23"/>
+    <w:abstractNumId w:val="24"/>
   </w:num>
   <w:num w:numId="2" w16cid:durableId="1425683647">
-    <w:abstractNumId w:val="53"/>
+    <w:abstractNumId w:val="55"/>
   </w:num>
   <w:num w:numId="3" w16cid:durableId="969819765">
-    <w:abstractNumId w:val="39"/>
+    <w:abstractNumId w:val="41"/>
   </w:num>
   <w:num w:numId="4" w16cid:durableId="1165972880">
-    <w:abstractNumId w:val="30"/>
+    <w:abstractNumId w:val="31"/>
   </w:num>
   <w:num w:numId="5" w16cid:durableId="1192498471">
-    <w:abstractNumId w:val="29"/>
+    <w:abstractNumId w:val="30"/>
   </w:num>
   <w:num w:numId="6" w16cid:durableId="1027293449">
     <w:abstractNumId w:val="6"/>
@@ -11518,175 +13288,175 @@
     <w:abstractNumId w:val="13"/>
   </w:num>
   <w:num w:numId="8" w16cid:durableId="2116553527">
-    <w:abstractNumId w:val="37"/>
+    <w:abstractNumId w:val="39"/>
   </w:num>
   <w:num w:numId="9" w16cid:durableId="2054190808">
-    <w:abstractNumId w:val="43"/>
+    <w:abstractNumId w:val="45"/>
   </w:num>
   <w:num w:numId="10" w16cid:durableId="361367619">
-    <w:abstractNumId w:val="59"/>
+    <w:abstractNumId w:val="62"/>
   </w:num>
   <w:num w:numId="11" w16cid:durableId="631521416">
-    <w:abstractNumId w:val="21"/>
+    <w:abstractNumId w:val="22"/>
   </w:num>
   <w:num w:numId="12" w16cid:durableId="1837070714">
-    <w:abstractNumId w:val="31"/>
+    <w:abstractNumId w:val="32"/>
   </w:num>
   <w:num w:numId="13" w16cid:durableId="355236561">
-    <w:abstractNumId w:val="26"/>
+    <w:abstractNumId w:val="27"/>
   </w:num>
   <w:num w:numId="14" w16cid:durableId="1861703874">
-    <w:abstractNumId w:val="52"/>
+    <w:abstractNumId w:val="54"/>
   </w:num>
   <w:num w:numId="15" w16cid:durableId="1483962153">
     <w:abstractNumId w:val="8"/>
   </w:num>
   <w:num w:numId="16" w16cid:durableId="1024138830">
-    <w:abstractNumId w:val="48"/>
+    <w:abstractNumId w:val="50"/>
   </w:num>
   <w:num w:numId="17" w16cid:durableId="1115096640">
     <w:abstractNumId w:val="7"/>
   </w:num>
   <w:num w:numId="18" w16cid:durableId="1730182888">
-    <w:abstractNumId w:val="62"/>
+    <w:abstractNumId w:val="65"/>
   </w:num>
   <w:num w:numId="19" w16cid:durableId="1841895485">
-    <w:abstractNumId w:val="24"/>
+    <w:abstractNumId w:val="25"/>
   </w:num>
   <w:num w:numId="20" w16cid:durableId="569927713">
-    <w:abstractNumId w:val="45"/>
+    <w:abstractNumId w:val="47"/>
   </w:num>
   <w:num w:numId="21" w16cid:durableId="25182164">
-    <w:abstractNumId w:val="40"/>
+    <w:abstractNumId w:val="42"/>
   </w:num>
   <w:num w:numId="22" w16cid:durableId="1734503633">
     <w:abstractNumId w:val="3"/>
   </w:num>
   <w:num w:numId="23" w16cid:durableId="1393579624">
-    <w:abstractNumId w:val="35"/>
+    <w:abstractNumId w:val="37"/>
   </w:num>
   <w:num w:numId="24" w16cid:durableId="529802780">
     <w:abstractNumId w:val="17"/>
   </w:num>
   <w:num w:numId="25" w16cid:durableId="1009716527">
-    <w:abstractNumId w:val="57"/>
+    <w:abstractNumId w:val="59"/>
   </w:num>
   <w:num w:numId="26" w16cid:durableId="1803109818">
     <w:abstractNumId w:val="11"/>
   </w:num>
   <w:num w:numId="27" w16cid:durableId="1153568286">
-    <w:abstractNumId w:val="41"/>
+    <w:abstractNumId w:val="43"/>
   </w:num>
   <w:num w:numId="28" w16cid:durableId="1269850232">
-    <w:abstractNumId w:val="22"/>
+    <w:abstractNumId w:val="23"/>
   </w:num>
   <w:num w:numId="29" w16cid:durableId="865482755">
-    <w:abstractNumId w:val="74"/>
+    <w:abstractNumId w:val="77"/>
   </w:num>
   <w:num w:numId="30" w16cid:durableId="128667884">
     <w:abstractNumId w:val="4"/>
   </w:num>
   <w:num w:numId="31" w16cid:durableId="1055591606">
-    <w:abstractNumId w:val="50"/>
+    <w:abstractNumId w:val="52"/>
   </w:num>
   <w:num w:numId="32" w16cid:durableId="1455560741">
-    <w:abstractNumId w:val="49"/>
+    <w:abstractNumId w:val="51"/>
   </w:num>
   <w:num w:numId="33" w16cid:durableId="1977880186">
-    <w:abstractNumId w:val="70"/>
+    <w:abstractNumId w:val="73"/>
   </w:num>
   <w:num w:numId="34" w16cid:durableId="165289367">
-    <w:abstractNumId w:val="76"/>
+    <w:abstractNumId w:val="79"/>
   </w:num>
   <w:num w:numId="35" w16cid:durableId="1357655090">
-    <w:abstractNumId w:val="47"/>
+    <w:abstractNumId w:val="49"/>
   </w:num>
   <w:num w:numId="36" w16cid:durableId="1068966224">
     <w:abstractNumId w:val="10"/>
   </w:num>
   <w:num w:numId="37" w16cid:durableId="559630263">
-    <w:abstractNumId w:val="32"/>
+    <w:abstractNumId w:val="34"/>
   </w:num>
   <w:num w:numId="38" w16cid:durableId="219441423">
-    <w:abstractNumId w:val="66"/>
+    <w:abstractNumId w:val="69"/>
   </w:num>
   <w:num w:numId="39" w16cid:durableId="581574493">
-    <w:abstractNumId w:val="61"/>
+    <w:abstractNumId w:val="64"/>
   </w:num>
   <w:num w:numId="40" w16cid:durableId="1478643207">
-    <w:abstractNumId w:val="42"/>
+    <w:abstractNumId w:val="44"/>
   </w:num>
   <w:num w:numId="41" w16cid:durableId="816413178">
-    <w:abstractNumId w:val="72"/>
+    <w:abstractNumId w:val="75"/>
   </w:num>
   <w:num w:numId="42" w16cid:durableId="879365290">
-    <w:abstractNumId w:val="55"/>
+    <w:abstractNumId w:val="57"/>
   </w:num>
   <w:num w:numId="43" w16cid:durableId="256332733">
     <w:abstractNumId w:val="14"/>
   </w:num>
   <w:num w:numId="44" w16cid:durableId="958417952">
-    <w:abstractNumId w:val="65"/>
+    <w:abstractNumId w:val="68"/>
   </w:num>
   <w:num w:numId="45" w16cid:durableId="739714405">
-    <w:abstractNumId w:val="44"/>
+    <w:abstractNumId w:val="46"/>
   </w:num>
   <w:num w:numId="46" w16cid:durableId="1090663949">
     <w:abstractNumId w:val="2"/>
   </w:num>
   <w:num w:numId="47" w16cid:durableId="1066996378">
-    <w:abstractNumId w:val="28"/>
+    <w:abstractNumId w:val="29"/>
   </w:num>
   <w:num w:numId="48" w16cid:durableId="1637293962">
-    <w:abstractNumId w:val="34"/>
+    <w:abstractNumId w:val="36"/>
   </w:num>
   <w:num w:numId="49" w16cid:durableId="658966665">
+    <w:abstractNumId w:val="66"/>
+  </w:num>
+  <w:num w:numId="50" w16cid:durableId="730739043">
+    <w:abstractNumId w:val="74"/>
+  </w:num>
+  <w:num w:numId="51" w16cid:durableId="1361395958">
+    <w:abstractNumId w:val="38"/>
+  </w:num>
+  <w:num w:numId="52" w16cid:durableId="1585603859">
     <w:abstractNumId w:val="63"/>
   </w:num>
-  <w:num w:numId="50" w16cid:durableId="730739043">
-    <w:abstractNumId w:val="71"/>
-  </w:num>
-  <w:num w:numId="51" w16cid:durableId="1361395958">
-    <w:abstractNumId w:val="36"/>
-  </w:num>
-  <w:num w:numId="52" w16cid:durableId="1585603859">
-    <w:abstractNumId w:val="60"/>
-  </w:num>
   <w:num w:numId="53" w16cid:durableId="1245456023">
-    <w:abstractNumId w:val="58"/>
+    <w:abstractNumId w:val="61"/>
   </w:num>
   <w:num w:numId="54" w16cid:durableId="726415147">
-    <w:abstractNumId w:val="75"/>
+    <w:abstractNumId w:val="78"/>
   </w:num>
   <w:num w:numId="55" w16cid:durableId="471217994">
-    <w:abstractNumId w:val="18"/>
+    <w:abstractNumId w:val="19"/>
   </w:num>
   <w:num w:numId="56" w16cid:durableId="1111359962">
-    <w:abstractNumId w:val="67"/>
+    <w:abstractNumId w:val="70"/>
   </w:num>
   <w:num w:numId="57" w16cid:durableId="682174154">
-    <w:abstractNumId w:val="33"/>
+    <w:abstractNumId w:val="35"/>
   </w:num>
   <w:num w:numId="58" w16cid:durableId="993460229">
-    <w:abstractNumId w:val="69"/>
+    <w:abstractNumId w:val="72"/>
   </w:num>
   <w:num w:numId="59" w16cid:durableId="1612778526">
     <w:abstractNumId w:val="9"/>
   </w:num>
   <w:num w:numId="60" w16cid:durableId="184637057">
-    <w:abstractNumId w:val="46"/>
+    <w:abstractNumId w:val="48"/>
   </w:num>
   <w:num w:numId="61" w16cid:durableId="1657807602">
-    <w:abstractNumId w:val="38"/>
+    <w:abstractNumId w:val="40"/>
   </w:num>
   <w:num w:numId="62" w16cid:durableId="1486580873">
-    <w:abstractNumId w:val="54"/>
+    <w:abstractNumId w:val="56"/>
   </w:num>
   <w:num w:numId="63" w16cid:durableId="101800978">
-    <w:abstractNumId w:val="51"/>
+    <w:abstractNumId w:val="53"/>
   </w:num>
   <w:num w:numId="64" w16cid:durableId="1838496560">
-    <w:abstractNumId w:val="56"/>
+    <w:abstractNumId w:val="58"/>
   </w:num>
   <w:num w:numId="65" w16cid:durableId="1606309814">
     <w:abstractNumId w:val="1"/>
@@ -11695,37 +13465,46 @@
     <w:abstractNumId w:val="0"/>
   </w:num>
   <w:num w:numId="67" w16cid:durableId="1602106308">
-    <w:abstractNumId w:val="27"/>
+    <w:abstractNumId w:val="28"/>
   </w:num>
   <w:num w:numId="68" w16cid:durableId="509418428">
-    <w:abstractNumId w:val="73"/>
+    <w:abstractNumId w:val="76"/>
   </w:num>
   <w:num w:numId="69" w16cid:durableId="1060712400">
-    <w:abstractNumId w:val="68"/>
+    <w:abstractNumId w:val="71"/>
   </w:num>
   <w:num w:numId="70" w16cid:durableId="186604655">
     <w:abstractNumId w:val="16"/>
   </w:num>
   <w:num w:numId="71" w16cid:durableId="1362126248">
-    <w:abstractNumId w:val="64"/>
+    <w:abstractNumId w:val="67"/>
   </w:num>
   <w:num w:numId="72" w16cid:durableId="547685254">
     <w:abstractNumId w:val="5"/>
   </w:num>
   <w:num w:numId="73" w16cid:durableId="1558930994">
-    <w:abstractNumId w:val="20"/>
+    <w:abstractNumId w:val="21"/>
   </w:num>
   <w:num w:numId="74" w16cid:durableId="1571691474">
-    <w:abstractNumId w:val="25"/>
+    <w:abstractNumId w:val="26"/>
   </w:num>
   <w:num w:numId="75" w16cid:durableId="1917157331">
-    <w:abstractNumId w:val="19"/>
+    <w:abstractNumId w:val="20"/>
   </w:num>
   <w:num w:numId="76" w16cid:durableId="146213322">
     <w:abstractNumId w:val="15"/>
   </w:num>
   <w:num w:numId="77" w16cid:durableId="1912040523">
     <w:abstractNumId w:val="12"/>
+  </w:num>
+  <w:num w:numId="78" w16cid:durableId="489752627">
+    <w:abstractNumId w:val="33"/>
+  </w:num>
+  <w:num w:numId="79" w16cid:durableId="53744689">
+    <w:abstractNumId w:val="18"/>
+  </w:num>
+  <w:num w:numId="80" w16cid:durableId="1594507617">
+    <w:abstractNumId w:val="60"/>
   </w:num>
 </w:numbering>
 </file>

</xml_diff>

<commit_message>
Rapprot + "uploads" folder + diagram.png
</commit_message>
<xml_diff>
--- a/documentation/rapport.docx
+++ b/documentation/rapport.docx
@@ -2311,14 +2311,14 @@
         <w:pStyle w:val="Titre2"/>
       </w:pPr>
       <w:bookmarkStart w:id="2" w:name="_Toc181370746"/>
-      <w:bookmarkStart w:id="3" w:name="_Toc532179969"/>
-      <w:bookmarkStart w:id="4" w:name="_Toc165969639"/>
-      <w:bookmarkStart w:id="5" w:name="_Toc198654060"/>
+      <w:bookmarkStart w:id="3" w:name="_Toc198654060"/>
+      <w:bookmarkStart w:id="4" w:name="_Toc532179969"/>
+      <w:bookmarkStart w:id="5" w:name="_Toc165969639"/>
       <w:r>
         <w:t>Titre</w:t>
       </w:r>
       <w:bookmarkEnd w:id="2"/>
-      <w:bookmarkEnd w:id="5"/>
+      <w:bookmarkEnd w:id="3"/>
     </w:p>
     <w:p>
       <w:pPr>
@@ -2357,8 +2357,8 @@
         <w:t xml:space="preserve"> s’inscrit dans le cadre du module ETML P_WEB294 et vise à développer le frontend d’une application web destinée aux passionnés de lecture. Cette application permet aux utilisateurs de consulter des ouvrages, d’échanger leurs avis et de contribuer à une base de données collaborative autour du livre. Après avoir posé les bases techniques lors du module précédent (P_WEB295) — incluant la conception de la maquette, de la base de données et du backend — ce projet se concentre sur l’intégration complète du frontend avec Vue.js. Il met également l’accent sur la structuration du code, la documentation, l’écoconception ainsi qu’une gestion de projet rigoureuse grâce à des outils collaboratifs comme GitHub Projects.</w:t>
       </w:r>
     </w:p>
-    <w:bookmarkEnd w:id="3"/>
     <w:bookmarkEnd w:id="4"/>
+    <w:bookmarkEnd w:id="5"/>
     <w:p>
       <w:pPr>
         <w:pStyle w:val="Corpsdetexte"/>
@@ -2542,7 +2542,13 @@
         <w:spacing w:before="100" w:beforeAutospacing="1" w:after="100" w:afterAutospacing="1"/>
       </w:pPr>
       <w:r>
-        <w:t>Des réunions régulières (rapides check-ins hebdomadaires) ont permis de mettre à jour le tableau et d’ajuster les priorités. Cet outil a joué un rôle central dans la fluidité du travail en équipe et dans le respect des délais impartis.</w:t>
+        <w:t xml:space="preserve">Des réunions régulières (rapides </w:t>
+      </w:r>
+      <w:r>
+        <w:t xml:space="preserve">«Daily Scrum» </w:t>
+      </w:r>
+      <w:r>
+        <w:t>hebdomadaires) ont permis de mettre à jour le tableau et d’ajuster les priorités. Cet outil a joué un rôle central dans la fluidité du travail en équipe et dans le respect des délais impartis.</w:t>
       </w:r>
     </w:p>
     <w:p>

</xml_diff>

<commit_message>
Rapprot(2.4 Schéma de l’architecture représentant les interactions entre le frontend et le backend )
</commit_message>
<xml_diff>
--- a/documentation/rapport.docx
+++ b/documentation/rapport.docx
@@ -434,7 +434,7 @@
               <w:tab w:val="right" w:leader="dot" w:pos="9062"/>
             </w:tabs>
             <w:rPr>
-              <w:rFonts w:asciiTheme="minorHAnsi" w:eastAsiaTheme="minorEastAsia" w:hAnsiTheme="minorHAnsi" w:cstheme="minorBidi"/>
+              <w:rFonts w:eastAsiaTheme="minorEastAsia" w:cstheme="minorBidi"/>
               <w:b w:val="0"/>
               <w:bCs w:val="0"/>
               <w:caps w:val="0"/>
@@ -464,7 +464,7 @@
             </w:r>
             <w:r>
               <w:rPr>
-                <w:rFonts w:asciiTheme="minorHAnsi" w:eastAsiaTheme="minorEastAsia" w:hAnsiTheme="minorHAnsi" w:cstheme="minorBidi"/>
+                <w:rFonts w:eastAsiaTheme="minorEastAsia" w:cstheme="minorBidi"/>
                 <w:b w:val="0"/>
                 <w:bCs w:val="0"/>
                 <w:caps w:val="0"/>
@@ -541,7 +541,7 @@
               <w:tab w:val="right" w:leader="dot" w:pos="9062"/>
             </w:tabs>
             <w:rPr>
-              <w:rFonts w:asciiTheme="minorHAnsi" w:eastAsiaTheme="minorEastAsia" w:hAnsiTheme="minorHAnsi" w:cstheme="minorBidi"/>
+              <w:rFonts w:eastAsiaTheme="minorEastAsia" w:cstheme="minorBidi"/>
               <w:smallCaps w:val="0"/>
               <w:noProof/>
               <w:kern w:val="2"/>
@@ -560,7 +560,7 @@
             </w:r>
             <w:r>
               <w:rPr>
-                <w:rFonts w:asciiTheme="minorHAnsi" w:eastAsiaTheme="minorEastAsia" w:hAnsiTheme="minorHAnsi" w:cstheme="minorBidi"/>
+                <w:rFonts w:eastAsiaTheme="minorEastAsia" w:cstheme="minorBidi"/>
                 <w:smallCaps w:val="0"/>
                 <w:noProof/>
                 <w:kern w:val="2"/>
@@ -635,7 +635,7 @@
               <w:tab w:val="right" w:leader="dot" w:pos="9062"/>
             </w:tabs>
             <w:rPr>
-              <w:rFonts w:asciiTheme="minorHAnsi" w:eastAsiaTheme="minorEastAsia" w:hAnsiTheme="minorHAnsi" w:cstheme="minorBidi"/>
+              <w:rFonts w:eastAsiaTheme="minorEastAsia" w:cstheme="minorBidi"/>
               <w:smallCaps w:val="0"/>
               <w:noProof/>
               <w:kern w:val="2"/>
@@ -654,7 +654,7 @@
             </w:r>
             <w:r>
               <w:rPr>
-                <w:rFonts w:asciiTheme="minorHAnsi" w:eastAsiaTheme="minorEastAsia" w:hAnsiTheme="minorHAnsi" w:cstheme="minorBidi"/>
+                <w:rFonts w:eastAsiaTheme="minorEastAsia" w:cstheme="minorBidi"/>
                 <w:smallCaps w:val="0"/>
                 <w:noProof/>
                 <w:kern w:val="2"/>
@@ -729,7 +729,7 @@
               <w:tab w:val="right" w:leader="dot" w:pos="9062"/>
             </w:tabs>
             <w:rPr>
-              <w:rFonts w:asciiTheme="minorHAnsi" w:eastAsiaTheme="minorEastAsia" w:hAnsiTheme="minorHAnsi" w:cstheme="minorBidi"/>
+              <w:rFonts w:eastAsiaTheme="minorEastAsia" w:cstheme="minorBidi"/>
               <w:b w:val="0"/>
               <w:bCs w:val="0"/>
               <w:caps w:val="0"/>
@@ -750,7 +750,7 @@
             </w:r>
             <w:r>
               <w:rPr>
-                <w:rFonts w:asciiTheme="minorHAnsi" w:eastAsiaTheme="minorEastAsia" w:hAnsiTheme="minorHAnsi" w:cstheme="minorBidi"/>
+                <w:rFonts w:eastAsiaTheme="minorEastAsia" w:cstheme="minorBidi"/>
                 <w:b w:val="0"/>
                 <w:bCs w:val="0"/>
                 <w:caps w:val="0"/>
@@ -827,7 +827,7 @@
               <w:tab w:val="right" w:leader="dot" w:pos="9062"/>
             </w:tabs>
             <w:rPr>
-              <w:rFonts w:asciiTheme="minorHAnsi" w:eastAsiaTheme="minorEastAsia" w:hAnsiTheme="minorHAnsi" w:cstheme="minorBidi"/>
+              <w:rFonts w:eastAsiaTheme="minorEastAsia" w:cstheme="minorBidi"/>
               <w:smallCaps w:val="0"/>
               <w:noProof/>
               <w:kern w:val="2"/>
@@ -846,7 +846,7 @@
             </w:r>
             <w:r>
               <w:rPr>
-                <w:rFonts w:asciiTheme="minorHAnsi" w:eastAsiaTheme="minorEastAsia" w:hAnsiTheme="minorHAnsi" w:cstheme="minorBidi"/>
+                <w:rFonts w:eastAsiaTheme="minorEastAsia" w:cstheme="minorBidi"/>
                 <w:smallCaps w:val="0"/>
                 <w:noProof/>
                 <w:kern w:val="2"/>
@@ -921,7 +921,7 @@
               <w:tab w:val="right" w:leader="dot" w:pos="9062"/>
             </w:tabs>
             <w:rPr>
-              <w:rFonts w:asciiTheme="minorHAnsi" w:eastAsiaTheme="minorEastAsia" w:hAnsiTheme="minorHAnsi" w:cstheme="minorBidi"/>
+              <w:rFonts w:eastAsiaTheme="minorEastAsia" w:cstheme="minorBidi"/>
               <w:smallCaps w:val="0"/>
               <w:noProof/>
               <w:kern w:val="2"/>
@@ -940,7 +940,7 @@
             </w:r>
             <w:r>
               <w:rPr>
-                <w:rFonts w:asciiTheme="minorHAnsi" w:eastAsiaTheme="minorEastAsia" w:hAnsiTheme="minorHAnsi" w:cstheme="minorBidi"/>
+                <w:rFonts w:eastAsiaTheme="minorEastAsia" w:cstheme="minorBidi"/>
                 <w:smallCaps w:val="0"/>
                 <w:noProof/>
                 <w:kern w:val="2"/>
@@ -1015,7 +1015,7 @@
               <w:tab w:val="right" w:leader="dot" w:pos="9062"/>
             </w:tabs>
             <w:rPr>
-              <w:rFonts w:asciiTheme="minorHAnsi" w:eastAsiaTheme="minorEastAsia" w:hAnsiTheme="minorHAnsi" w:cstheme="minorBidi"/>
+              <w:rFonts w:eastAsiaTheme="minorEastAsia" w:cstheme="minorBidi"/>
               <w:smallCaps w:val="0"/>
               <w:noProof/>
               <w:kern w:val="2"/>
@@ -1034,7 +1034,7 @@
             </w:r>
             <w:r>
               <w:rPr>
-                <w:rFonts w:asciiTheme="minorHAnsi" w:eastAsiaTheme="minorEastAsia" w:hAnsiTheme="minorHAnsi" w:cstheme="minorBidi"/>
+                <w:rFonts w:eastAsiaTheme="minorEastAsia" w:cstheme="minorBidi"/>
                 <w:smallCaps w:val="0"/>
                 <w:noProof/>
                 <w:kern w:val="2"/>
@@ -1109,7 +1109,7 @@
               <w:tab w:val="right" w:leader="dot" w:pos="9062"/>
             </w:tabs>
             <w:rPr>
-              <w:rFonts w:asciiTheme="minorHAnsi" w:eastAsiaTheme="minorEastAsia" w:hAnsiTheme="minorHAnsi" w:cstheme="minorBidi"/>
+              <w:rFonts w:eastAsiaTheme="minorEastAsia" w:cstheme="minorBidi"/>
               <w:smallCaps w:val="0"/>
               <w:noProof/>
               <w:kern w:val="2"/>
@@ -1128,7 +1128,7 @@
             </w:r>
             <w:r>
               <w:rPr>
-                <w:rFonts w:asciiTheme="minorHAnsi" w:eastAsiaTheme="minorEastAsia" w:hAnsiTheme="minorHAnsi" w:cstheme="minorBidi"/>
+                <w:rFonts w:eastAsiaTheme="minorEastAsia" w:cstheme="minorBidi"/>
                 <w:smallCaps w:val="0"/>
                 <w:noProof/>
                 <w:kern w:val="2"/>
@@ -1203,7 +1203,7 @@
               <w:tab w:val="right" w:leader="dot" w:pos="9062"/>
             </w:tabs>
             <w:rPr>
-              <w:rFonts w:asciiTheme="minorHAnsi" w:eastAsiaTheme="minorEastAsia" w:hAnsiTheme="minorHAnsi" w:cstheme="minorBidi"/>
+              <w:rFonts w:eastAsiaTheme="minorEastAsia" w:cstheme="minorBidi"/>
               <w:b w:val="0"/>
               <w:bCs w:val="0"/>
               <w:caps w:val="0"/>
@@ -1224,7 +1224,7 @@
             </w:r>
             <w:r>
               <w:rPr>
-                <w:rFonts w:asciiTheme="minorHAnsi" w:eastAsiaTheme="minorEastAsia" w:hAnsiTheme="minorHAnsi" w:cstheme="minorBidi"/>
+                <w:rFonts w:eastAsiaTheme="minorEastAsia" w:cstheme="minorBidi"/>
                 <w:b w:val="0"/>
                 <w:bCs w:val="0"/>
                 <w:caps w:val="0"/>
@@ -1301,7 +1301,7 @@
               <w:tab w:val="right" w:leader="dot" w:pos="9062"/>
             </w:tabs>
             <w:rPr>
-              <w:rFonts w:asciiTheme="minorHAnsi" w:eastAsiaTheme="minorEastAsia" w:hAnsiTheme="minorHAnsi" w:cstheme="minorBidi"/>
+              <w:rFonts w:eastAsiaTheme="minorEastAsia" w:cstheme="minorBidi"/>
               <w:smallCaps w:val="0"/>
               <w:noProof/>
               <w:kern w:val="2"/>
@@ -1320,7 +1320,7 @@
             </w:r>
             <w:r>
               <w:rPr>
-                <w:rFonts w:asciiTheme="minorHAnsi" w:eastAsiaTheme="minorEastAsia" w:hAnsiTheme="minorHAnsi" w:cstheme="minorBidi"/>
+                <w:rFonts w:eastAsiaTheme="minorEastAsia" w:cstheme="minorBidi"/>
                 <w:smallCaps w:val="0"/>
                 <w:noProof/>
                 <w:kern w:val="2"/>
@@ -1395,7 +1395,7 @@
               <w:tab w:val="right" w:leader="dot" w:pos="9062"/>
             </w:tabs>
             <w:rPr>
-              <w:rFonts w:asciiTheme="minorHAnsi" w:eastAsiaTheme="minorEastAsia" w:hAnsiTheme="minorHAnsi" w:cstheme="minorBidi"/>
+              <w:rFonts w:eastAsiaTheme="minorEastAsia" w:cstheme="minorBidi"/>
               <w:smallCaps w:val="0"/>
               <w:noProof/>
               <w:kern w:val="2"/>
@@ -1414,7 +1414,7 @@
             </w:r>
             <w:r>
               <w:rPr>
-                <w:rFonts w:asciiTheme="minorHAnsi" w:eastAsiaTheme="minorEastAsia" w:hAnsiTheme="minorHAnsi" w:cstheme="minorBidi"/>
+                <w:rFonts w:eastAsiaTheme="minorEastAsia" w:cstheme="minorBidi"/>
                 <w:smallCaps w:val="0"/>
                 <w:noProof/>
                 <w:kern w:val="2"/>
@@ -1489,7 +1489,7 @@
               <w:tab w:val="right" w:leader="dot" w:pos="9062"/>
             </w:tabs>
             <w:rPr>
-              <w:rFonts w:asciiTheme="minorHAnsi" w:eastAsiaTheme="minorEastAsia" w:hAnsiTheme="minorHAnsi" w:cstheme="minorBidi"/>
+              <w:rFonts w:eastAsiaTheme="minorEastAsia" w:cstheme="minorBidi"/>
               <w:smallCaps w:val="0"/>
               <w:noProof/>
               <w:kern w:val="2"/>
@@ -1508,7 +1508,7 @@
             </w:r>
             <w:r>
               <w:rPr>
-                <w:rFonts w:asciiTheme="minorHAnsi" w:eastAsiaTheme="minorEastAsia" w:hAnsiTheme="minorHAnsi" w:cstheme="minorBidi"/>
+                <w:rFonts w:eastAsiaTheme="minorEastAsia" w:cstheme="minorBidi"/>
                 <w:smallCaps w:val="0"/>
                 <w:noProof/>
                 <w:kern w:val="2"/>
@@ -1583,7 +1583,7 @@
               <w:tab w:val="right" w:leader="dot" w:pos="9062"/>
             </w:tabs>
             <w:rPr>
-              <w:rFonts w:asciiTheme="minorHAnsi" w:eastAsiaTheme="minorEastAsia" w:hAnsiTheme="minorHAnsi" w:cstheme="minorBidi"/>
+              <w:rFonts w:eastAsiaTheme="minorEastAsia" w:cstheme="minorBidi"/>
               <w:b w:val="0"/>
               <w:bCs w:val="0"/>
               <w:caps w:val="0"/>
@@ -1604,7 +1604,7 @@
             </w:r>
             <w:r>
               <w:rPr>
-                <w:rFonts w:asciiTheme="minorHAnsi" w:eastAsiaTheme="minorEastAsia" w:hAnsiTheme="minorHAnsi" w:cstheme="minorBidi"/>
+                <w:rFonts w:eastAsiaTheme="minorEastAsia" w:cstheme="minorBidi"/>
                 <w:b w:val="0"/>
                 <w:bCs w:val="0"/>
                 <w:caps w:val="0"/>
@@ -1681,7 +1681,7 @@
               <w:tab w:val="right" w:leader="dot" w:pos="9062"/>
             </w:tabs>
             <w:rPr>
-              <w:rFonts w:asciiTheme="minorHAnsi" w:eastAsiaTheme="minorEastAsia" w:hAnsiTheme="minorHAnsi" w:cstheme="minorBidi"/>
+              <w:rFonts w:eastAsiaTheme="minorEastAsia" w:cstheme="minorBidi"/>
               <w:smallCaps w:val="0"/>
               <w:noProof/>
               <w:kern w:val="2"/>
@@ -1700,7 +1700,7 @@
             </w:r>
             <w:r>
               <w:rPr>
-                <w:rFonts w:asciiTheme="minorHAnsi" w:eastAsiaTheme="minorEastAsia" w:hAnsiTheme="minorHAnsi" w:cstheme="minorBidi"/>
+                <w:rFonts w:eastAsiaTheme="minorEastAsia" w:cstheme="minorBidi"/>
                 <w:smallCaps w:val="0"/>
                 <w:noProof/>
                 <w:kern w:val="2"/>
@@ -1775,7 +1775,7 @@
               <w:tab w:val="right" w:leader="dot" w:pos="9062"/>
             </w:tabs>
             <w:rPr>
-              <w:rFonts w:asciiTheme="minorHAnsi" w:eastAsiaTheme="minorEastAsia" w:hAnsiTheme="minorHAnsi" w:cstheme="minorBidi"/>
+              <w:rFonts w:eastAsiaTheme="minorEastAsia" w:cstheme="minorBidi"/>
               <w:b w:val="0"/>
               <w:bCs w:val="0"/>
               <w:caps w:val="0"/>
@@ -1797,7 +1797,7 @@
             </w:r>
             <w:r>
               <w:rPr>
-                <w:rFonts w:asciiTheme="minorHAnsi" w:eastAsiaTheme="minorEastAsia" w:hAnsiTheme="minorHAnsi" w:cstheme="minorBidi"/>
+                <w:rFonts w:eastAsiaTheme="minorEastAsia" w:cstheme="minorBidi"/>
                 <w:b w:val="0"/>
                 <w:bCs w:val="0"/>
                 <w:caps w:val="0"/>
@@ -1875,7 +1875,7 @@
               <w:tab w:val="right" w:leader="dot" w:pos="9062"/>
             </w:tabs>
             <w:rPr>
-              <w:rFonts w:asciiTheme="minorHAnsi" w:eastAsiaTheme="minorEastAsia" w:hAnsiTheme="minorHAnsi" w:cstheme="minorBidi"/>
+              <w:rFonts w:eastAsiaTheme="minorEastAsia" w:cstheme="minorBidi"/>
               <w:smallCaps w:val="0"/>
               <w:noProof/>
               <w:kern w:val="2"/>
@@ -1894,7 +1894,7 @@
             </w:r>
             <w:r>
               <w:rPr>
-                <w:rFonts w:asciiTheme="minorHAnsi" w:eastAsiaTheme="minorEastAsia" w:hAnsiTheme="minorHAnsi" w:cstheme="minorBidi"/>
+                <w:rFonts w:eastAsiaTheme="minorEastAsia" w:cstheme="minorBidi"/>
                 <w:smallCaps w:val="0"/>
                 <w:noProof/>
                 <w:kern w:val="2"/>
@@ -1969,7 +1969,7 @@
               <w:tab w:val="right" w:leader="dot" w:pos="9062"/>
             </w:tabs>
             <w:rPr>
-              <w:rFonts w:asciiTheme="minorHAnsi" w:eastAsiaTheme="minorEastAsia" w:hAnsiTheme="minorHAnsi" w:cstheme="minorBidi"/>
+              <w:rFonts w:eastAsiaTheme="minorEastAsia" w:cstheme="minorBidi"/>
               <w:smallCaps w:val="0"/>
               <w:noProof/>
               <w:kern w:val="2"/>
@@ -1988,7 +1988,7 @@
             </w:r>
             <w:r>
               <w:rPr>
-                <w:rFonts w:asciiTheme="minorHAnsi" w:eastAsiaTheme="minorEastAsia" w:hAnsiTheme="minorHAnsi" w:cstheme="minorBidi"/>
+                <w:rFonts w:eastAsiaTheme="minorEastAsia" w:cstheme="minorBidi"/>
                 <w:smallCaps w:val="0"/>
                 <w:noProof/>
                 <w:kern w:val="2"/>
@@ -2063,7 +2063,7 @@
               <w:tab w:val="right" w:leader="dot" w:pos="9062"/>
             </w:tabs>
             <w:rPr>
-              <w:rFonts w:asciiTheme="minorHAnsi" w:eastAsiaTheme="minorEastAsia" w:hAnsiTheme="minorHAnsi" w:cstheme="minorBidi"/>
+              <w:rFonts w:eastAsiaTheme="minorEastAsia" w:cstheme="minorBidi"/>
               <w:smallCaps w:val="0"/>
               <w:noProof/>
               <w:kern w:val="2"/>
@@ -2082,7 +2082,7 @@
             </w:r>
             <w:r>
               <w:rPr>
-                <w:rFonts w:asciiTheme="minorHAnsi" w:eastAsiaTheme="minorEastAsia" w:hAnsiTheme="minorHAnsi" w:cstheme="minorBidi"/>
+                <w:rFonts w:eastAsiaTheme="minorEastAsia" w:cstheme="minorBidi"/>
                 <w:smallCaps w:val="0"/>
                 <w:noProof/>
                 <w:kern w:val="2"/>
@@ -2157,7 +2157,7 @@
               <w:tab w:val="right" w:leader="dot" w:pos="9062"/>
             </w:tabs>
             <w:rPr>
-              <w:rFonts w:asciiTheme="minorHAnsi" w:eastAsiaTheme="minorEastAsia" w:hAnsiTheme="minorHAnsi" w:cstheme="minorBidi"/>
+              <w:rFonts w:eastAsiaTheme="minorEastAsia" w:cstheme="minorBidi"/>
               <w:b w:val="0"/>
               <w:bCs w:val="0"/>
               <w:caps w:val="0"/>
@@ -2178,7 +2178,7 @@
             </w:r>
             <w:r>
               <w:rPr>
-                <w:rFonts w:asciiTheme="minorHAnsi" w:eastAsiaTheme="minorEastAsia" w:hAnsiTheme="minorHAnsi" w:cstheme="minorBidi"/>
+                <w:rFonts w:eastAsiaTheme="minorEastAsia" w:cstheme="minorBidi"/>
                 <w:b w:val="0"/>
                 <w:bCs w:val="0"/>
                 <w:caps w:val="0"/>
@@ -2563,6 +2563,7 @@
       </w:pPr>
       <w:bookmarkStart w:id="10" w:name="_Toc198654064"/>
       <w:r>
+        <w:lastRenderedPageBreak/>
         <w:t>l’analyse de de la base de données à réaliser (MCD, MLD, MPD</w:t>
       </w:r>
       <w:bookmarkEnd w:id="10"/>
@@ -2585,6 +2586,67 @@
         <w:pStyle w:val="Titre2"/>
       </w:pPr>
       <w:bookmarkStart w:id="12" w:name="_Toc198654066"/>
+      <w:r>
+        <w:rPr>
+          <w:noProof/>
+        </w:rPr>
+        <w:drawing>
+          <wp:anchor distT="0" distB="0" distL="114300" distR="114300" simplePos="0" relativeHeight="251658240" behindDoc="0" locked="0" layoutInCell="1" allowOverlap="1" wp14:anchorId="04C44C51" wp14:editId="205EAC6C">
+            <wp:simplePos x="0" y="0"/>
+            <wp:positionH relativeFrom="column">
+              <wp:posOffset>1013991</wp:posOffset>
+            </wp:positionH>
+            <wp:positionV relativeFrom="paragraph">
+              <wp:posOffset>475305</wp:posOffset>
+            </wp:positionV>
+            <wp:extent cx="3508744" cy="5063158"/>
+            <wp:effectExtent l="0" t="0" r="0" b="4445"/>
+            <wp:wrapSquare wrapText="bothSides"/>
+            <wp:docPr id="1" name="Image 1"/>
+            <wp:cNvGraphicFramePr>
+              <a:graphicFrameLocks xmlns:a="http://schemas.openxmlformats.org/drawingml/2006/main" noChangeAspect="1"/>
+            </wp:cNvGraphicFramePr>
+            <a:graphic xmlns:a="http://schemas.openxmlformats.org/drawingml/2006/main">
+              <a:graphicData uri="http://schemas.openxmlformats.org/drawingml/2006/picture">
+                <pic:pic xmlns:pic="http://schemas.openxmlformats.org/drawingml/2006/picture">
+                  <pic:nvPicPr>
+                    <pic:cNvPr id="0" name="Picture 1"/>
+                    <pic:cNvPicPr>
+                      <a:picLocks noChangeAspect="1" noChangeArrowheads="1"/>
+                    </pic:cNvPicPr>
+                  </pic:nvPicPr>
+                  <pic:blipFill>
+                    <a:blip r:embed="rId9" cstate="print">
+                      <a:extLst>
+                        <a:ext uri="{28A0092B-C50C-407E-A947-70E740481C1C}">
+                          <a14:useLocalDpi xmlns:a14="http://schemas.microsoft.com/office/drawing/2010/main" val="0"/>
+                        </a:ext>
+                      </a:extLst>
+                    </a:blip>
+                    <a:srcRect/>
+                    <a:stretch>
+                      <a:fillRect/>
+                    </a:stretch>
+                  </pic:blipFill>
+                  <pic:spPr bwMode="auto">
+                    <a:xfrm>
+                      <a:off x="0" y="0"/>
+                      <a:ext cx="3508744" cy="5063158"/>
+                    </a:xfrm>
+                    <a:prstGeom prst="rect">
+                      <a:avLst/>
+                    </a:prstGeom>
+                    <a:noFill/>
+                    <a:ln>
+                      <a:noFill/>
+                    </a:ln>
+                  </pic:spPr>
+                </pic:pic>
+              </a:graphicData>
+            </a:graphic>
+          </wp:anchor>
+        </w:drawing>
+      </w:r>
       <w:r>
         <w:t>Schéma de l’architecture représentant les interactions entre le frontend et le backend</w:t>
       </w:r>
@@ -2600,11 +2662,408 @@
     </w:p>
     <w:p>
       <w:pPr>
+        <w:pStyle w:val="Retraitcorpsdetexte"/>
+      </w:pPr>
+    </w:p>
+    <w:p>
+      <w:pPr>
+        <w:pStyle w:val="Retraitcorpsdetexte"/>
+      </w:pPr>
+    </w:p>
+    <w:p>
+      <w:pPr>
+        <w:pStyle w:val="Retraitcorpsdetexte"/>
+      </w:pPr>
+    </w:p>
+    <w:p>
+      <w:pPr>
+        <w:pStyle w:val="Retraitcorpsdetexte"/>
+      </w:pPr>
+    </w:p>
+    <w:p>
+      <w:pPr>
+        <w:pStyle w:val="Retraitcorpsdetexte"/>
+      </w:pPr>
+    </w:p>
+    <w:p>
+      <w:pPr>
+        <w:pStyle w:val="Retraitcorpsdetexte"/>
+      </w:pPr>
+    </w:p>
+    <w:p>
+      <w:pPr>
+        <w:pStyle w:val="Retraitcorpsdetexte"/>
+      </w:pPr>
+    </w:p>
+    <w:p>
+      <w:pPr>
+        <w:pStyle w:val="Retraitcorpsdetexte"/>
+      </w:pPr>
+    </w:p>
+    <w:p>
+      <w:pPr>
+        <w:pStyle w:val="Retraitcorpsdetexte"/>
+      </w:pPr>
+    </w:p>
+    <w:p>
+      <w:pPr>
+        <w:pStyle w:val="Retraitcorpsdetexte"/>
+      </w:pPr>
+    </w:p>
+    <w:p>
+      <w:pPr>
+        <w:pStyle w:val="Retraitcorpsdetexte"/>
+      </w:pPr>
+    </w:p>
+    <w:p>
+      <w:pPr>
+        <w:pStyle w:val="Retraitcorpsdetexte"/>
+      </w:pPr>
+    </w:p>
+    <w:p>
+      <w:pPr>
+        <w:pStyle w:val="Retraitcorpsdetexte"/>
+      </w:pPr>
+    </w:p>
+    <w:p>
+      <w:pPr>
+        <w:pStyle w:val="Retraitcorpsdetexte"/>
+      </w:pPr>
+    </w:p>
+    <w:p>
+      <w:pPr>
+        <w:pStyle w:val="Retraitcorpsdetexte"/>
+      </w:pPr>
+    </w:p>
+    <w:p>
+      <w:pPr>
+        <w:pStyle w:val="Retraitcorpsdetexte"/>
+      </w:pPr>
+    </w:p>
+    <w:p>
+      <w:pPr>
+        <w:pStyle w:val="Retraitcorpsdetexte"/>
+      </w:pPr>
+    </w:p>
+    <w:p>
+      <w:pPr>
+        <w:pStyle w:val="Retraitcorpsdetexte"/>
+      </w:pPr>
+    </w:p>
+    <w:p>
+      <w:pPr>
+        <w:pStyle w:val="Retraitcorpsdetexte"/>
+      </w:pPr>
+    </w:p>
+    <w:p>
+      <w:pPr>
+        <w:pStyle w:val="Retraitcorpsdetexte"/>
+      </w:pPr>
+    </w:p>
+    <w:p>
+      <w:pPr>
+        <w:pStyle w:val="Retraitcorpsdetexte"/>
+      </w:pPr>
+    </w:p>
+    <w:p>
+      <w:pPr>
+        <w:pStyle w:val="Retraitcorpsdetexte"/>
+      </w:pPr>
+    </w:p>
+    <w:p>
+      <w:pPr>
+        <w:pStyle w:val="Retraitcorpsdetexte"/>
+      </w:pPr>
+    </w:p>
+    <w:p>
+      <w:pPr>
+        <w:pStyle w:val="Retraitcorpsdetexte"/>
+      </w:pPr>
+    </w:p>
+    <w:p>
+      <w:pPr>
+        <w:pStyle w:val="Retraitcorpsdetexte"/>
+      </w:pPr>
+    </w:p>
+    <w:p>
+      <w:pPr>
+        <w:pStyle w:val="Retraitcorpsdetexte"/>
+      </w:pPr>
+    </w:p>
+    <w:p>
+      <w:pPr>
+        <w:pStyle w:val="Retraitcorpsdetexte"/>
+      </w:pPr>
+    </w:p>
+    <w:p>
+      <w:pPr>
+        <w:pStyle w:val="Retraitcorpsdetexte"/>
+      </w:pPr>
+    </w:p>
+    <w:p>
+      <w:pPr>
+        <w:pStyle w:val="Retraitcorpsdetexte"/>
+      </w:pPr>
+    </w:p>
+    <w:p>
+      <w:pPr>
+        <w:pStyle w:val="Retraitcorpsdetexte"/>
+      </w:pPr>
+    </w:p>
+    <w:p>
+      <w:pPr>
+        <w:pStyle w:val="Retraitcorpsdetexte"/>
+      </w:pPr>
+    </w:p>
+    <w:p>
+      <w:pPr>
+        <w:pStyle w:val="Retraitcorpsdetexte"/>
+      </w:pPr>
+    </w:p>
+    <w:p>
+      <w:pPr>
+        <w:pStyle w:val="Retraitcorpsdetexte"/>
+      </w:pPr>
+    </w:p>
+    <w:p>
+      <w:pPr>
+        <w:pStyle w:val="NormalWeb"/>
+        <w:jc w:val="both"/>
+        <w:rPr>
+          <w:rFonts w:ascii="Bookman Old Style" w:hAnsi="Bookman Old Style"/>
+        </w:rPr>
+      </w:pPr>
+      <w:r>
+        <w:rPr>
+          <w:rFonts w:ascii="Bookman Old Style" w:hAnsi="Bookman Old Style"/>
+        </w:rPr>
+        <w:t xml:space="preserve">Ce schéma illustre le fonctionnement global de l’application </w:t>
+      </w:r>
+      <w:r>
+        <w:rPr>
+          <w:rStyle w:val="lev"/>
+          <w:rFonts w:ascii="Bookman Old Style" w:hAnsi="Bookman Old Style"/>
+        </w:rPr>
+        <w:t>Passion Lecture</w:t>
+      </w:r>
+      <w:r>
+        <w:rPr>
+          <w:rFonts w:ascii="Bookman Old Style" w:hAnsi="Bookman Old Style"/>
+        </w:rPr>
+        <w:t>, en mettant en évidence les différentes couches techniques et la manière dont elles interagissent entre elles, du point de vue de l’utilisateur jusqu’à la base de données.</w:t>
+      </w:r>
+    </w:p>
+    <w:p>
+      <w:pPr>
+        <w:pStyle w:val="NormalWeb"/>
+        <w:numPr>
+          <w:ilvl w:val="0"/>
+          <w:numId w:val="81"/>
+        </w:numPr>
+        <w:rPr>
+          <w:rFonts w:ascii="Bookman Old Style" w:hAnsi="Bookman Old Style"/>
+        </w:rPr>
+      </w:pPr>
+      <w:r>
+        <w:rPr>
+          <w:rStyle w:val="lev"/>
+          <w:rFonts w:ascii="Bookman Old Style" w:hAnsi="Bookman Old Style"/>
+        </w:rPr>
+        <w:t>Utilisateur (Navigateur)</w:t>
+      </w:r>
+      <w:r>
+        <w:rPr>
+          <w:rFonts w:ascii="Bookman Old Style" w:hAnsi="Bookman Old Style"/>
+        </w:rPr>
+        <w:br/>
+        <w:t>L'utilisateur interagit avec l'application via son navigateur. Lorsqu'il effectue une action (comme cliquer sur un lien ou soumettre un formulaire), cela déclenche un enchaînement de processus côté frontend.</w:t>
+      </w:r>
+    </w:p>
+    <w:p>
+      <w:pPr>
+        <w:pStyle w:val="NormalWeb"/>
+        <w:numPr>
+          <w:ilvl w:val="0"/>
+          <w:numId w:val="81"/>
+        </w:numPr>
+        <w:rPr>
+          <w:rFonts w:ascii="Bookman Old Style" w:hAnsi="Bookman Old Style"/>
+        </w:rPr>
+      </w:pPr>
+      <w:r>
+        <w:rPr>
+          <w:rStyle w:val="lev"/>
+          <w:rFonts w:ascii="Bookman Old Style" w:hAnsi="Bookman Old Style"/>
+        </w:rPr>
+        <w:t>Frontend Vue.js</w:t>
+      </w:r>
+      <w:r>
+        <w:rPr>
+          <w:rFonts w:ascii="Bookman Old Style" w:hAnsi="Bookman Old Style"/>
+        </w:rPr>
+        <w:br/>
+        <w:t xml:space="preserve">Le code côté client est développé en Vue.js. Il gère l’affichage </w:t>
+      </w:r>
+      <w:r>
+        <w:rPr>
+          <w:rFonts w:ascii="Bookman Old Style" w:hAnsi="Bookman Old Style"/>
+        </w:rPr>
+        <w:lastRenderedPageBreak/>
+        <w:t>dynamique des composants, les transitions entre pages (via Vue Router), et les appels aux données.</w:t>
+      </w:r>
+    </w:p>
+    <w:p>
+      <w:pPr>
+        <w:pStyle w:val="NormalWeb"/>
+        <w:numPr>
+          <w:ilvl w:val="1"/>
+          <w:numId w:val="81"/>
+        </w:numPr>
+        <w:rPr>
+          <w:rFonts w:ascii="Bookman Old Style" w:hAnsi="Bookman Old Style"/>
+        </w:rPr>
+      </w:pPr>
+      <w:r>
+        <w:rPr>
+          <w:rStyle w:val="lev"/>
+          <w:rFonts w:ascii="Bookman Old Style" w:hAnsi="Bookman Old Style"/>
+        </w:rPr>
+        <w:t>Vue Router</w:t>
+      </w:r>
+      <w:r>
+        <w:rPr>
+          <w:rFonts w:ascii="Bookman Old Style" w:hAnsi="Bookman Old Style"/>
+        </w:rPr>
+        <w:t xml:space="preserve"> : gère la navigation entre les différentes vues de l’application (ex. : page d’accueil, détails d’un livre, formulaire d’inscription).</w:t>
+      </w:r>
+    </w:p>
+    <w:p>
+      <w:pPr>
+        <w:pStyle w:val="NormalWeb"/>
+        <w:numPr>
+          <w:ilvl w:val="1"/>
+          <w:numId w:val="81"/>
+        </w:numPr>
+        <w:rPr>
+          <w:rFonts w:ascii="Bookman Old Style" w:hAnsi="Bookman Old Style"/>
+        </w:rPr>
+      </w:pPr>
+      <w:r>
+        <w:rPr>
+          <w:rStyle w:val="lev"/>
+          <w:rFonts w:ascii="Bookman Old Style" w:hAnsi="Bookman Old Style"/>
+        </w:rPr>
+        <w:t>Appels HTTP (Fetch)</w:t>
+      </w:r>
+      <w:r>
+        <w:rPr>
+          <w:rFonts w:ascii="Bookman Old Style" w:hAnsi="Bookman Old Style"/>
+        </w:rPr>
+        <w:t xml:space="preserve"> : Vue.js utilise l’API Fetch pour envoyer des requêtes HTTP vers le backend. Ces appels sont généralement de type GET (lecture), POST (création), PUT/PATCH (modification) ou DELETE (suppression).</w:t>
+      </w:r>
+    </w:p>
+    <w:p>
+      <w:pPr>
+        <w:pStyle w:val="NormalWeb"/>
+        <w:numPr>
+          <w:ilvl w:val="0"/>
+          <w:numId w:val="81"/>
+        </w:numPr>
+        <w:rPr>
+          <w:rFonts w:ascii="Bookman Old Style" w:hAnsi="Bookman Old Style"/>
+        </w:rPr>
+      </w:pPr>
+      <w:r>
+        <w:rPr>
+          <w:rStyle w:val="lev"/>
+          <w:rFonts w:ascii="Bookman Old Style" w:hAnsi="Bookman Old Style"/>
+        </w:rPr>
+        <w:t>API REST (Backend Node.js)</w:t>
+      </w:r>
+      <w:r>
+        <w:rPr>
+          <w:rFonts w:ascii="Bookman Old Style" w:hAnsi="Bookman Old Style"/>
+        </w:rPr>
+        <w:br/>
+        <w:t xml:space="preserve">Le backend est implémenté en Node.js et expose une </w:t>
+      </w:r>
+      <w:r>
+        <w:rPr>
+          <w:rStyle w:val="lev"/>
+          <w:rFonts w:ascii="Bookman Old Style" w:hAnsi="Bookman Old Style"/>
+        </w:rPr>
+        <w:t>API REST</w:t>
+      </w:r>
+      <w:r>
+        <w:rPr>
+          <w:rFonts w:ascii="Bookman Old Style" w:hAnsi="Bookman Old Style"/>
+        </w:rPr>
+        <w:t>. Il reçoit les requêtes HTTP envoyées par le frontend, traite les données, applique la logique métier, puis interagit avec la base de données.</w:t>
+      </w:r>
+    </w:p>
+    <w:p>
+      <w:pPr>
+        <w:pStyle w:val="NormalWeb"/>
+        <w:numPr>
+          <w:ilvl w:val="0"/>
+          <w:numId w:val="81"/>
+        </w:numPr>
+        <w:rPr>
+          <w:rFonts w:ascii="Bookman Old Style" w:hAnsi="Bookman Old Style"/>
+        </w:rPr>
+      </w:pPr>
+      <w:r>
+        <w:rPr>
+          <w:rStyle w:val="lev"/>
+          <w:rFonts w:ascii="Bookman Old Style" w:hAnsi="Bookman Old Style"/>
+        </w:rPr>
+        <w:t>ORM Sequelize</w:t>
+      </w:r>
+      <w:r>
+        <w:rPr>
+          <w:rFonts w:ascii="Bookman Old Style" w:hAnsi="Bookman Old Style"/>
+        </w:rPr>
+        <w:br/>
+        <w:t>L'API utilise Sequelize comme ORM (Object Relational Mapping), ce qui permet de manipuler les données sous forme d'objets JavaScript au lieu de requêtes SQL brutes. Sequelize traduit les opérations en requêtes SQL compatibles avec MySQL.</w:t>
+      </w:r>
+    </w:p>
+    <w:p>
+      <w:pPr>
+        <w:pStyle w:val="NormalWeb"/>
+        <w:numPr>
+          <w:ilvl w:val="0"/>
+          <w:numId w:val="81"/>
+        </w:numPr>
+        <w:rPr>
+          <w:rFonts w:ascii="Bookman Old Style" w:hAnsi="Bookman Old Style"/>
+        </w:rPr>
+      </w:pPr>
+      <w:r>
+        <w:rPr>
+          <w:rStyle w:val="lev"/>
+          <w:rFonts w:ascii="Bookman Old Style" w:hAnsi="Bookman Old Style"/>
+        </w:rPr>
+        <w:t>Base de données MySQL</w:t>
+      </w:r>
+      <w:r>
+        <w:rPr>
+          <w:rFonts w:ascii="Bookman Old Style" w:hAnsi="Bookman Old Style"/>
+        </w:rPr>
+        <w:br/>
+        <w:t>Les données sont stockées dans une base MySQL. Il s’agit des informations relatives aux utilisateurs, aux livres, aux avis, aux catégories, etc. C’est le niveau final du traitement, qui renvoie les données demandées (ou confirme une modification) à l’ORM, puis jusqu’au frontend pour affichage.</w:t>
+      </w:r>
+    </w:p>
+    <w:p>
+      <w:pPr>
+        <w:pStyle w:val="Retraitcorpsdetexte"/>
+      </w:pPr>
+    </w:p>
+    <w:p>
+      <w:pPr>
         <w:pStyle w:val="Titre1"/>
       </w:pPr>
       <w:bookmarkStart w:id="13" w:name="_Toc198654067"/>
       <w:r>
-        <w:lastRenderedPageBreak/>
         <w:t>Réalisation</w:t>
       </w:r>
       <w:bookmarkEnd w:id="13"/>
@@ -2727,6 +3186,7 @@
       <w:bookmarkStart w:id="23" w:name="_Toc181370766"/>
       <w:bookmarkStart w:id="24" w:name="_Toc198654077"/>
       <w:r>
+        <w:lastRenderedPageBreak/>
         <w:t>Webographie</w:t>
       </w:r>
       <w:bookmarkEnd w:id="23"/>
@@ -7532,6 +7992,123 @@
     </w:lvl>
   </w:abstractNum>
   <w:abstractNum w:abstractNumId="36" w15:restartNumberingAfterBreak="0">
+    <w:nsid w:val="44716BF9"/>
+    <w:multiLevelType w:val="multilevel"/>
+    <w:tmpl w:val="01404C1C"/>
+    <w:lvl w:ilvl="0">
+      <w:start w:val="1"/>
+      <w:numFmt w:val="decimal"/>
+      <w:lvlText w:val="%1."/>
+      <w:lvlJc w:val="left"/>
+      <w:pPr>
+        <w:tabs>
+          <w:tab w:val="num" w:pos="720"/>
+        </w:tabs>
+        <w:ind w:left="720" w:hanging="360"/>
+      </w:pPr>
+    </w:lvl>
+    <w:lvl w:ilvl="1">
+      <w:start w:val="1"/>
+      <w:numFmt w:val="bullet"/>
+      <w:lvlText w:val="o"/>
+      <w:lvlJc w:val="left"/>
+      <w:pPr>
+        <w:tabs>
+          <w:tab w:val="num" w:pos="1440"/>
+        </w:tabs>
+        <w:ind w:left="1440" w:hanging="360"/>
+      </w:pPr>
+      <w:rPr>
+        <w:rFonts w:ascii="Courier New" w:hAnsi="Courier New" w:hint="default"/>
+        <w:sz w:val="20"/>
+      </w:rPr>
+    </w:lvl>
+    <w:lvl w:ilvl="2" w:tentative="1">
+      <w:start w:val="1"/>
+      <w:numFmt w:val="decimal"/>
+      <w:lvlText w:val="%3."/>
+      <w:lvlJc w:val="left"/>
+      <w:pPr>
+        <w:tabs>
+          <w:tab w:val="num" w:pos="2160"/>
+        </w:tabs>
+        <w:ind w:left="2160" w:hanging="360"/>
+      </w:pPr>
+    </w:lvl>
+    <w:lvl w:ilvl="3" w:tentative="1">
+      <w:start w:val="1"/>
+      <w:numFmt w:val="decimal"/>
+      <w:lvlText w:val="%4."/>
+      <w:lvlJc w:val="left"/>
+      <w:pPr>
+        <w:tabs>
+          <w:tab w:val="num" w:pos="2880"/>
+        </w:tabs>
+        <w:ind w:left="2880" w:hanging="360"/>
+      </w:pPr>
+    </w:lvl>
+    <w:lvl w:ilvl="4" w:tentative="1">
+      <w:start w:val="1"/>
+      <w:numFmt w:val="decimal"/>
+      <w:lvlText w:val="%5."/>
+      <w:lvlJc w:val="left"/>
+      <w:pPr>
+        <w:tabs>
+          <w:tab w:val="num" w:pos="3600"/>
+        </w:tabs>
+        <w:ind w:left="3600" w:hanging="360"/>
+      </w:pPr>
+    </w:lvl>
+    <w:lvl w:ilvl="5" w:tentative="1">
+      <w:start w:val="1"/>
+      <w:numFmt w:val="decimal"/>
+      <w:lvlText w:val="%6."/>
+      <w:lvlJc w:val="left"/>
+      <w:pPr>
+        <w:tabs>
+          <w:tab w:val="num" w:pos="4320"/>
+        </w:tabs>
+        <w:ind w:left="4320" w:hanging="360"/>
+      </w:pPr>
+    </w:lvl>
+    <w:lvl w:ilvl="6" w:tentative="1">
+      <w:start w:val="1"/>
+      <w:numFmt w:val="decimal"/>
+      <w:lvlText w:val="%7."/>
+      <w:lvlJc w:val="left"/>
+      <w:pPr>
+        <w:tabs>
+          <w:tab w:val="num" w:pos="5040"/>
+        </w:tabs>
+        <w:ind w:left="5040" w:hanging="360"/>
+      </w:pPr>
+    </w:lvl>
+    <w:lvl w:ilvl="7" w:tentative="1">
+      <w:start w:val="1"/>
+      <w:numFmt w:val="decimal"/>
+      <w:lvlText w:val="%8."/>
+      <w:lvlJc w:val="left"/>
+      <w:pPr>
+        <w:tabs>
+          <w:tab w:val="num" w:pos="5760"/>
+        </w:tabs>
+        <w:ind w:left="5760" w:hanging="360"/>
+      </w:pPr>
+    </w:lvl>
+    <w:lvl w:ilvl="8" w:tentative="1">
+      <w:start w:val="1"/>
+      <w:numFmt w:val="decimal"/>
+      <w:lvlText w:val="%9."/>
+      <w:lvlJc w:val="left"/>
+      <w:pPr>
+        <w:tabs>
+          <w:tab w:val="num" w:pos="6480"/>
+        </w:tabs>
+        <w:ind w:left="6480" w:hanging="360"/>
+      </w:pPr>
+    </w:lvl>
+  </w:abstractNum>
+  <w:abstractNum w:abstractNumId="37" w15:restartNumberingAfterBreak="0">
     <w:nsid w:val="44EF3A5B"/>
     <w:multiLevelType w:val="multilevel"/>
     <w:tmpl w:val="0EA89E0C"/>
@@ -7680,7 +8257,7 @@
       </w:rPr>
     </w:lvl>
   </w:abstractNum>
-  <w:abstractNum w:abstractNumId="37" w15:restartNumberingAfterBreak="0">
+  <w:abstractNum w:abstractNumId="38" w15:restartNumberingAfterBreak="0">
     <w:nsid w:val="45D7053A"/>
     <w:multiLevelType w:val="hybridMultilevel"/>
     <w:tmpl w:val="C94C0CC2"/>
@@ -7793,7 +8370,7 @@
       </w:rPr>
     </w:lvl>
   </w:abstractNum>
-  <w:abstractNum w:abstractNumId="38" w15:restartNumberingAfterBreak="0">
+  <w:abstractNum w:abstractNumId="39" w15:restartNumberingAfterBreak="0">
     <w:nsid w:val="466E1CC2"/>
     <w:multiLevelType w:val="multilevel"/>
     <w:tmpl w:val="03F887D8"/>
@@ -7942,7 +8519,7 @@
       </w:rPr>
     </w:lvl>
   </w:abstractNum>
-  <w:abstractNum w:abstractNumId="39" w15:restartNumberingAfterBreak="0">
+  <w:abstractNum w:abstractNumId="40" w15:restartNumberingAfterBreak="0">
     <w:nsid w:val="47013D00"/>
     <w:multiLevelType w:val="hybridMultilevel"/>
     <w:tmpl w:val="EDB283C0"/>
@@ -8028,7 +8605,7 @@
       </w:pPr>
     </w:lvl>
   </w:abstractNum>
-  <w:abstractNum w:abstractNumId="40" w15:restartNumberingAfterBreak="0">
+  <w:abstractNum w:abstractNumId="41" w15:restartNumberingAfterBreak="0">
     <w:nsid w:val="470304FF"/>
     <w:multiLevelType w:val="multilevel"/>
     <w:tmpl w:val="DB142014"/>
@@ -8145,7 +8722,7 @@
       </w:pPr>
     </w:lvl>
   </w:abstractNum>
-  <w:abstractNum w:abstractNumId="41" w15:restartNumberingAfterBreak="0">
+  <w:abstractNum w:abstractNumId="42" w15:restartNumberingAfterBreak="0">
     <w:nsid w:val="486164F4"/>
     <w:multiLevelType w:val="multilevel"/>
     <w:tmpl w:val="100C0021"/>
@@ -8258,7 +8835,7 @@
       </w:rPr>
     </w:lvl>
   </w:abstractNum>
-  <w:abstractNum w:abstractNumId="42" w15:restartNumberingAfterBreak="0">
+  <w:abstractNum w:abstractNumId="43" w15:restartNumberingAfterBreak="0">
     <w:nsid w:val="49A04187"/>
     <w:multiLevelType w:val="multilevel"/>
     <w:tmpl w:val="21BC8390"/>
@@ -8375,7 +8952,7 @@
       </w:pPr>
     </w:lvl>
   </w:abstractNum>
-  <w:abstractNum w:abstractNumId="43" w15:restartNumberingAfterBreak="0">
+  <w:abstractNum w:abstractNumId="44" w15:restartNumberingAfterBreak="0">
     <w:nsid w:val="4E880B14"/>
     <w:multiLevelType w:val="hybridMultilevel"/>
     <w:tmpl w:val="588695E2"/>
@@ -8461,7 +9038,7 @@
       </w:pPr>
     </w:lvl>
   </w:abstractNum>
-  <w:abstractNum w:abstractNumId="44" w15:restartNumberingAfterBreak="0">
+  <w:abstractNum w:abstractNumId="45" w15:restartNumberingAfterBreak="0">
     <w:nsid w:val="4EFB319D"/>
     <w:multiLevelType w:val="hybridMultilevel"/>
     <w:tmpl w:val="D70A16EC"/>
@@ -8574,7 +9151,7 @@
       </w:rPr>
     </w:lvl>
   </w:abstractNum>
-  <w:abstractNum w:abstractNumId="45" w15:restartNumberingAfterBreak="0">
+  <w:abstractNum w:abstractNumId="46" w15:restartNumberingAfterBreak="0">
     <w:nsid w:val="4FF40332"/>
     <w:multiLevelType w:val="hybridMultilevel"/>
     <w:tmpl w:val="AE8471CE"/>
@@ -8687,7 +9264,7 @@
       </w:rPr>
     </w:lvl>
   </w:abstractNum>
-  <w:abstractNum w:abstractNumId="46" w15:restartNumberingAfterBreak="0">
+  <w:abstractNum w:abstractNumId="47" w15:restartNumberingAfterBreak="0">
     <w:nsid w:val="50D72083"/>
     <w:multiLevelType w:val="multilevel"/>
     <w:tmpl w:val="F73AFD5C"/>
@@ -8832,7 +9409,7 @@
       </w:rPr>
     </w:lvl>
   </w:abstractNum>
-  <w:abstractNum w:abstractNumId="47" w15:restartNumberingAfterBreak="0">
+  <w:abstractNum w:abstractNumId="48" w15:restartNumberingAfterBreak="0">
     <w:nsid w:val="51876E89"/>
     <w:multiLevelType w:val="multilevel"/>
     <w:tmpl w:val="AE00E0CE"/>
@@ -8981,7 +9558,7 @@
       </w:rPr>
     </w:lvl>
   </w:abstractNum>
-  <w:abstractNum w:abstractNumId="48" w15:restartNumberingAfterBreak="0">
+  <w:abstractNum w:abstractNumId="49" w15:restartNumberingAfterBreak="0">
     <w:nsid w:val="52AB4161"/>
     <w:multiLevelType w:val="multilevel"/>
     <w:tmpl w:val="BFCC9260"/>
@@ -9098,7 +9675,7 @@
       </w:pPr>
     </w:lvl>
   </w:abstractNum>
-  <w:abstractNum w:abstractNumId="49" w15:restartNumberingAfterBreak="0">
+  <w:abstractNum w:abstractNumId="50" w15:restartNumberingAfterBreak="0">
     <w:nsid w:val="572B450E"/>
     <w:multiLevelType w:val="hybridMultilevel"/>
     <w:tmpl w:val="1818C56A"/>
@@ -9211,7 +9788,7 @@
       </w:rPr>
     </w:lvl>
   </w:abstractNum>
-  <w:abstractNum w:abstractNumId="50" w15:restartNumberingAfterBreak="0">
+  <w:abstractNum w:abstractNumId="51" w15:restartNumberingAfterBreak="0">
     <w:nsid w:val="58BB3E46"/>
     <w:multiLevelType w:val="multilevel"/>
     <w:tmpl w:val="9A7AE602"/>
@@ -9360,7 +9937,7 @@
       </w:rPr>
     </w:lvl>
   </w:abstractNum>
-  <w:abstractNum w:abstractNumId="51" w15:restartNumberingAfterBreak="0">
+  <w:abstractNum w:abstractNumId="52" w15:restartNumberingAfterBreak="0">
     <w:nsid w:val="595A1A91"/>
     <w:multiLevelType w:val="multilevel"/>
     <w:tmpl w:val="B494260A"/>
@@ -9509,7 +10086,7 @@
       </w:rPr>
     </w:lvl>
   </w:abstractNum>
-  <w:abstractNum w:abstractNumId="52" w15:restartNumberingAfterBreak="0">
+  <w:abstractNum w:abstractNumId="53" w15:restartNumberingAfterBreak="0">
     <w:nsid w:val="5A1353C9"/>
     <w:multiLevelType w:val="hybridMultilevel"/>
     <w:tmpl w:val="40B84EF0"/>
@@ -9595,7 +10172,7 @@
       </w:pPr>
     </w:lvl>
   </w:abstractNum>
-  <w:abstractNum w:abstractNumId="53" w15:restartNumberingAfterBreak="0">
+  <w:abstractNum w:abstractNumId="54" w15:restartNumberingAfterBreak="0">
     <w:nsid w:val="5B6337DC"/>
     <w:multiLevelType w:val="multilevel"/>
     <w:tmpl w:val="68341AF2"/>
@@ -9744,7 +10321,7 @@
       </w:rPr>
     </w:lvl>
   </w:abstractNum>
-  <w:abstractNum w:abstractNumId="54" w15:restartNumberingAfterBreak="0">
+  <w:abstractNum w:abstractNumId="55" w15:restartNumberingAfterBreak="0">
     <w:nsid w:val="5C0C1455"/>
     <w:multiLevelType w:val="multilevel"/>
     <w:tmpl w:val="5E3A69CE"/>
@@ -9893,7 +10470,7 @@
       </w:rPr>
     </w:lvl>
   </w:abstractNum>
-  <w:abstractNum w:abstractNumId="55" w15:restartNumberingAfterBreak="0">
+  <w:abstractNum w:abstractNumId="56" w15:restartNumberingAfterBreak="0">
     <w:nsid w:val="5C877673"/>
     <w:multiLevelType w:val="multilevel"/>
     <w:tmpl w:val="100C0021"/>
@@ -10006,7 +10583,7 @@
       </w:rPr>
     </w:lvl>
   </w:abstractNum>
-  <w:abstractNum w:abstractNumId="56" w15:restartNumberingAfterBreak="0">
+  <w:abstractNum w:abstractNumId="57" w15:restartNumberingAfterBreak="0">
     <w:nsid w:val="5EB75F87"/>
     <w:multiLevelType w:val="multilevel"/>
     <w:tmpl w:val="1612F80A"/>
@@ -10127,7 +10704,7 @@
       </w:pPr>
     </w:lvl>
   </w:abstractNum>
-  <w:abstractNum w:abstractNumId="57" w15:restartNumberingAfterBreak="0">
+  <w:abstractNum w:abstractNumId="58" w15:restartNumberingAfterBreak="0">
     <w:nsid w:val="606E216E"/>
     <w:multiLevelType w:val="multilevel"/>
     <w:tmpl w:val="F73AFD5C"/>
@@ -10272,7 +10849,7 @@
       </w:rPr>
     </w:lvl>
   </w:abstractNum>
-  <w:abstractNum w:abstractNumId="58" w15:restartNumberingAfterBreak="0">
+  <w:abstractNum w:abstractNumId="59" w15:restartNumberingAfterBreak="0">
     <w:nsid w:val="64CD52AC"/>
     <w:multiLevelType w:val="multilevel"/>
     <w:tmpl w:val="9466875A"/>
@@ -10421,7 +10998,7 @@
       </w:rPr>
     </w:lvl>
   </w:abstractNum>
-  <w:abstractNum w:abstractNumId="59" w15:restartNumberingAfterBreak="0">
+  <w:abstractNum w:abstractNumId="60" w15:restartNumberingAfterBreak="0">
     <w:nsid w:val="656770F6"/>
     <w:multiLevelType w:val="hybridMultilevel"/>
     <w:tmpl w:val="B75AA2EC"/>
@@ -10507,7 +11084,7 @@
       </w:pPr>
     </w:lvl>
   </w:abstractNum>
-  <w:abstractNum w:abstractNumId="60" w15:restartNumberingAfterBreak="0">
+  <w:abstractNum w:abstractNumId="61" w15:restartNumberingAfterBreak="0">
     <w:nsid w:val="67E92066"/>
     <w:multiLevelType w:val="multilevel"/>
     <w:tmpl w:val="24148CF6"/>
@@ -10656,7 +11233,7 @@
       </w:rPr>
     </w:lvl>
   </w:abstractNum>
-  <w:abstractNum w:abstractNumId="61" w15:restartNumberingAfterBreak="0">
+  <w:abstractNum w:abstractNumId="62" w15:restartNumberingAfterBreak="0">
     <w:nsid w:val="67FA2FB8"/>
     <w:multiLevelType w:val="multilevel"/>
     <w:tmpl w:val="E21E3B8A"/>
@@ -10805,7 +11382,7 @@
       </w:rPr>
     </w:lvl>
   </w:abstractNum>
-  <w:abstractNum w:abstractNumId="62" w15:restartNumberingAfterBreak="0">
+  <w:abstractNum w:abstractNumId="63" w15:restartNumberingAfterBreak="0">
     <w:nsid w:val="689854E7"/>
     <w:multiLevelType w:val="hybridMultilevel"/>
     <w:tmpl w:val="C4B28D26"/>
@@ -10918,7 +11495,7 @@
       </w:rPr>
     </w:lvl>
   </w:abstractNum>
-  <w:abstractNum w:abstractNumId="63" w15:restartNumberingAfterBreak="0">
+  <w:abstractNum w:abstractNumId="64" w15:restartNumberingAfterBreak="0">
     <w:nsid w:val="6B305FF5"/>
     <w:multiLevelType w:val="multilevel"/>
     <w:tmpl w:val="0694BF10"/>
@@ -11067,7 +11644,7 @@
       </w:rPr>
     </w:lvl>
   </w:abstractNum>
-  <w:abstractNum w:abstractNumId="64" w15:restartNumberingAfterBreak="0">
+  <w:abstractNum w:abstractNumId="65" w15:restartNumberingAfterBreak="0">
     <w:nsid w:val="6EC667E1"/>
     <w:multiLevelType w:val="hybridMultilevel"/>
     <w:tmpl w:val="0F1C05AA"/>
@@ -11180,7 +11757,7 @@
       </w:rPr>
     </w:lvl>
   </w:abstractNum>
-  <w:abstractNum w:abstractNumId="65" w15:restartNumberingAfterBreak="0">
+  <w:abstractNum w:abstractNumId="66" w15:restartNumberingAfterBreak="0">
     <w:nsid w:val="6F8E7937"/>
     <w:multiLevelType w:val="multilevel"/>
     <w:tmpl w:val="2618C62C"/>
@@ -11329,7 +11906,7 @@
       </w:rPr>
     </w:lvl>
   </w:abstractNum>
-  <w:abstractNum w:abstractNumId="66" w15:restartNumberingAfterBreak="0">
+  <w:abstractNum w:abstractNumId="67" w15:restartNumberingAfterBreak="0">
     <w:nsid w:val="705A7A56"/>
     <w:multiLevelType w:val="multilevel"/>
     <w:tmpl w:val="FFDAE2A6"/>
@@ -11478,7 +12055,7 @@
       </w:rPr>
     </w:lvl>
   </w:abstractNum>
-  <w:abstractNum w:abstractNumId="67" w15:restartNumberingAfterBreak="0">
+  <w:abstractNum w:abstractNumId="68" w15:restartNumberingAfterBreak="0">
     <w:nsid w:val="72185589"/>
     <w:multiLevelType w:val="multilevel"/>
     <w:tmpl w:val="5C7A424E"/>
@@ -11627,7 +12204,7 @@
       </w:rPr>
     </w:lvl>
   </w:abstractNum>
-  <w:abstractNum w:abstractNumId="68" w15:restartNumberingAfterBreak="0">
+  <w:abstractNum w:abstractNumId="69" w15:restartNumberingAfterBreak="0">
     <w:nsid w:val="732773D2"/>
     <w:multiLevelType w:val="multilevel"/>
     <w:tmpl w:val="B10A766E"/>
@@ -11772,7 +12349,7 @@
       </w:rPr>
     </w:lvl>
   </w:abstractNum>
-  <w:abstractNum w:abstractNumId="69" w15:restartNumberingAfterBreak="0">
+  <w:abstractNum w:abstractNumId="70" w15:restartNumberingAfterBreak="0">
     <w:nsid w:val="73E13F6B"/>
     <w:multiLevelType w:val="hybridMultilevel"/>
     <w:tmpl w:val="A5D21806"/>
@@ -11885,7 +12462,7 @@
       </w:rPr>
     </w:lvl>
   </w:abstractNum>
-  <w:abstractNum w:abstractNumId="70" w15:restartNumberingAfterBreak="0">
+  <w:abstractNum w:abstractNumId="71" w15:restartNumberingAfterBreak="0">
     <w:nsid w:val="743C6B91"/>
     <w:multiLevelType w:val="multilevel"/>
     <w:tmpl w:val="C8D87FC4"/>
@@ -12034,7 +12611,7 @@
       </w:rPr>
     </w:lvl>
   </w:abstractNum>
-  <w:abstractNum w:abstractNumId="71" w15:restartNumberingAfterBreak="0">
+  <w:abstractNum w:abstractNumId="72" w15:restartNumberingAfterBreak="0">
     <w:nsid w:val="77AD7629"/>
     <w:multiLevelType w:val="multilevel"/>
     <w:tmpl w:val="9BAA795A"/>
@@ -12183,7 +12760,7 @@
       </w:rPr>
     </w:lvl>
   </w:abstractNum>
-  <w:abstractNum w:abstractNumId="72" w15:restartNumberingAfterBreak="0">
+  <w:abstractNum w:abstractNumId="73" w15:restartNumberingAfterBreak="0">
     <w:nsid w:val="7802400F"/>
     <w:multiLevelType w:val="multilevel"/>
     <w:tmpl w:val="A2029AC2"/>
@@ -12332,7 +12909,7 @@
       </w:rPr>
     </w:lvl>
   </w:abstractNum>
-  <w:abstractNum w:abstractNumId="73" w15:restartNumberingAfterBreak="0">
+  <w:abstractNum w:abstractNumId="74" w15:restartNumberingAfterBreak="0">
     <w:nsid w:val="78A81255"/>
     <w:multiLevelType w:val="multilevel"/>
     <w:tmpl w:val="14B25418"/>
@@ -12481,7 +13058,7 @@
       </w:rPr>
     </w:lvl>
   </w:abstractNum>
-  <w:abstractNum w:abstractNumId="74" w15:restartNumberingAfterBreak="0">
+  <w:abstractNum w:abstractNumId="75" w15:restartNumberingAfterBreak="0">
     <w:nsid w:val="79306A20"/>
     <w:multiLevelType w:val="multilevel"/>
     <w:tmpl w:val="3B3CEBEC"/>
@@ -12630,7 +13207,7 @@
       </w:rPr>
     </w:lvl>
   </w:abstractNum>
-  <w:abstractNum w:abstractNumId="75" w15:restartNumberingAfterBreak="0">
+  <w:abstractNum w:abstractNumId="76" w15:restartNumberingAfterBreak="0">
     <w:nsid w:val="7A683687"/>
     <w:multiLevelType w:val="multilevel"/>
     <w:tmpl w:val="F73AFD5C"/>
@@ -12775,7 +13352,7 @@
       </w:rPr>
     </w:lvl>
   </w:abstractNum>
-  <w:abstractNum w:abstractNumId="76" w15:restartNumberingAfterBreak="0">
+  <w:abstractNum w:abstractNumId="77" w15:restartNumberingAfterBreak="0">
     <w:nsid w:val="7C2B5F1F"/>
     <w:multiLevelType w:val="multilevel"/>
     <w:tmpl w:val="D9227486"/>
@@ -12924,7 +13501,7 @@
       </w:rPr>
     </w:lvl>
   </w:abstractNum>
-  <w:abstractNum w:abstractNumId="77" w15:restartNumberingAfterBreak="0">
+  <w:abstractNum w:abstractNumId="78" w15:restartNumberingAfterBreak="0">
     <w:nsid w:val="7E1137AC"/>
     <w:multiLevelType w:val="hybridMultilevel"/>
     <w:tmpl w:val="DF4AA514"/>
@@ -13010,7 +13587,7 @@
       </w:pPr>
     </w:lvl>
   </w:abstractNum>
-  <w:abstractNum w:abstractNumId="78" w15:restartNumberingAfterBreak="0">
+  <w:abstractNum w:abstractNumId="79" w15:restartNumberingAfterBreak="0">
     <w:nsid w:val="7E4B5B66"/>
     <w:multiLevelType w:val="multilevel"/>
     <w:tmpl w:val="2DD2493A"/>
@@ -13159,7 +13736,7 @@
       </w:rPr>
     </w:lvl>
   </w:abstractNum>
-  <w:abstractNum w:abstractNumId="79" w15:restartNumberingAfterBreak="0">
+  <w:abstractNum w:abstractNumId="80" w15:restartNumberingAfterBreak="0">
     <w:nsid w:val="7F053DF4"/>
     <w:multiLevelType w:val="hybridMultilevel"/>
     <w:tmpl w:val="CEFACCCA"/>
@@ -13276,10 +13853,10 @@
     <w:abstractNumId w:val="24"/>
   </w:num>
   <w:num w:numId="2" w16cid:durableId="1425683647">
-    <w:abstractNumId w:val="55"/>
+    <w:abstractNumId w:val="56"/>
   </w:num>
   <w:num w:numId="3" w16cid:durableId="969819765">
-    <w:abstractNumId w:val="41"/>
+    <w:abstractNumId w:val="42"/>
   </w:num>
   <w:num w:numId="4" w16cid:durableId="1165972880">
     <w:abstractNumId w:val="31"/>
@@ -13294,13 +13871,13 @@
     <w:abstractNumId w:val="13"/>
   </w:num>
   <w:num w:numId="8" w16cid:durableId="2116553527">
-    <w:abstractNumId w:val="39"/>
+    <w:abstractNumId w:val="40"/>
   </w:num>
   <w:num w:numId="9" w16cid:durableId="2054190808">
-    <w:abstractNumId w:val="45"/>
+    <w:abstractNumId w:val="46"/>
   </w:num>
   <w:num w:numId="10" w16cid:durableId="361367619">
-    <w:abstractNumId w:val="62"/>
+    <w:abstractNumId w:val="63"/>
   </w:num>
   <w:num w:numId="11" w16cid:durableId="631521416">
     <w:abstractNumId w:val="22"/>
@@ -13312,70 +13889,70 @@
     <w:abstractNumId w:val="27"/>
   </w:num>
   <w:num w:numId="14" w16cid:durableId="1861703874">
-    <w:abstractNumId w:val="54"/>
+    <w:abstractNumId w:val="55"/>
   </w:num>
   <w:num w:numId="15" w16cid:durableId="1483962153">
     <w:abstractNumId w:val="8"/>
   </w:num>
   <w:num w:numId="16" w16cid:durableId="1024138830">
-    <w:abstractNumId w:val="50"/>
+    <w:abstractNumId w:val="51"/>
   </w:num>
   <w:num w:numId="17" w16cid:durableId="1115096640">
     <w:abstractNumId w:val="7"/>
   </w:num>
   <w:num w:numId="18" w16cid:durableId="1730182888">
-    <w:abstractNumId w:val="65"/>
+    <w:abstractNumId w:val="66"/>
   </w:num>
   <w:num w:numId="19" w16cid:durableId="1841895485">
     <w:abstractNumId w:val="25"/>
   </w:num>
   <w:num w:numId="20" w16cid:durableId="569927713">
-    <w:abstractNumId w:val="47"/>
+    <w:abstractNumId w:val="48"/>
   </w:num>
   <w:num w:numId="21" w16cid:durableId="25182164">
-    <w:abstractNumId w:val="42"/>
+    <w:abstractNumId w:val="43"/>
   </w:num>
   <w:num w:numId="22" w16cid:durableId="1734503633">
     <w:abstractNumId w:val="3"/>
   </w:num>
   <w:num w:numId="23" w16cid:durableId="1393579624">
-    <w:abstractNumId w:val="37"/>
+    <w:abstractNumId w:val="38"/>
   </w:num>
   <w:num w:numId="24" w16cid:durableId="529802780">
     <w:abstractNumId w:val="17"/>
   </w:num>
   <w:num w:numId="25" w16cid:durableId="1009716527">
-    <w:abstractNumId w:val="59"/>
+    <w:abstractNumId w:val="60"/>
   </w:num>
   <w:num w:numId="26" w16cid:durableId="1803109818">
     <w:abstractNumId w:val="11"/>
   </w:num>
   <w:num w:numId="27" w16cid:durableId="1153568286">
-    <w:abstractNumId w:val="43"/>
+    <w:abstractNumId w:val="44"/>
   </w:num>
   <w:num w:numId="28" w16cid:durableId="1269850232">
     <w:abstractNumId w:val="23"/>
   </w:num>
   <w:num w:numId="29" w16cid:durableId="865482755">
-    <w:abstractNumId w:val="77"/>
+    <w:abstractNumId w:val="78"/>
   </w:num>
   <w:num w:numId="30" w16cid:durableId="128667884">
     <w:abstractNumId w:val="4"/>
   </w:num>
   <w:num w:numId="31" w16cid:durableId="1055591606">
+    <w:abstractNumId w:val="53"/>
+  </w:num>
+  <w:num w:numId="32" w16cid:durableId="1455560741">
     <w:abstractNumId w:val="52"/>
   </w:num>
-  <w:num w:numId="32" w16cid:durableId="1455560741">
-    <w:abstractNumId w:val="51"/>
-  </w:num>
   <w:num w:numId="33" w16cid:durableId="1977880186">
-    <w:abstractNumId w:val="73"/>
+    <w:abstractNumId w:val="74"/>
   </w:num>
   <w:num w:numId="34" w16cid:durableId="165289367">
-    <w:abstractNumId w:val="79"/>
+    <w:abstractNumId w:val="80"/>
   </w:num>
   <w:num w:numId="35" w16cid:durableId="1357655090">
-    <w:abstractNumId w:val="49"/>
+    <w:abstractNumId w:val="50"/>
   </w:num>
   <w:num w:numId="36" w16cid:durableId="1068966224">
     <w:abstractNumId w:val="10"/>
@@ -13384,28 +13961,28 @@
     <w:abstractNumId w:val="34"/>
   </w:num>
   <w:num w:numId="38" w16cid:durableId="219441423">
-    <w:abstractNumId w:val="69"/>
+    <w:abstractNumId w:val="70"/>
   </w:num>
   <w:num w:numId="39" w16cid:durableId="581574493">
-    <w:abstractNumId w:val="64"/>
+    <w:abstractNumId w:val="65"/>
   </w:num>
   <w:num w:numId="40" w16cid:durableId="1478643207">
-    <w:abstractNumId w:val="44"/>
+    <w:abstractNumId w:val="45"/>
   </w:num>
   <w:num w:numId="41" w16cid:durableId="816413178">
-    <w:abstractNumId w:val="75"/>
+    <w:abstractNumId w:val="76"/>
   </w:num>
   <w:num w:numId="42" w16cid:durableId="879365290">
-    <w:abstractNumId w:val="57"/>
+    <w:abstractNumId w:val="58"/>
   </w:num>
   <w:num w:numId="43" w16cid:durableId="256332733">
     <w:abstractNumId w:val="14"/>
   </w:num>
   <w:num w:numId="44" w16cid:durableId="958417952">
-    <w:abstractNumId w:val="68"/>
+    <w:abstractNumId w:val="69"/>
   </w:num>
   <w:num w:numId="45" w16cid:durableId="739714405">
-    <w:abstractNumId w:val="46"/>
+    <w:abstractNumId w:val="47"/>
   </w:num>
   <w:num w:numId="46" w16cid:durableId="1090663949">
     <w:abstractNumId w:val="2"/>
@@ -13414,55 +13991,55 @@
     <w:abstractNumId w:val="29"/>
   </w:num>
   <w:num w:numId="48" w16cid:durableId="1637293962">
-    <w:abstractNumId w:val="36"/>
+    <w:abstractNumId w:val="37"/>
   </w:num>
   <w:num w:numId="49" w16cid:durableId="658966665">
-    <w:abstractNumId w:val="66"/>
+    <w:abstractNumId w:val="67"/>
   </w:num>
   <w:num w:numId="50" w16cid:durableId="730739043">
-    <w:abstractNumId w:val="74"/>
+    <w:abstractNumId w:val="75"/>
   </w:num>
   <w:num w:numId="51" w16cid:durableId="1361395958">
-    <w:abstractNumId w:val="38"/>
+    <w:abstractNumId w:val="39"/>
   </w:num>
   <w:num w:numId="52" w16cid:durableId="1585603859">
-    <w:abstractNumId w:val="63"/>
+    <w:abstractNumId w:val="64"/>
   </w:num>
   <w:num w:numId="53" w16cid:durableId="1245456023">
-    <w:abstractNumId w:val="61"/>
+    <w:abstractNumId w:val="62"/>
   </w:num>
   <w:num w:numId="54" w16cid:durableId="726415147">
-    <w:abstractNumId w:val="78"/>
+    <w:abstractNumId w:val="79"/>
   </w:num>
   <w:num w:numId="55" w16cid:durableId="471217994">
     <w:abstractNumId w:val="19"/>
   </w:num>
   <w:num w:numId="56" w16cid:durableId="1111359962">
-    <w:abstractNumId w:val="70"/>
+    <w:abstractNumId w:val="71"/>
   </w:num>
   <w:num w:numId="57" w16cid:durableId="682174154">
     <w:abstractNumId w:val="35"/>
   </w:num>
   <w:num w:numId="58" w16cid:durableId="993460229">
-    <w:abstractNumId w:val="72"/>
+    <w:abstractNumId w:val="73"/>
   </w:num>
   <w:num w:numId="59" w16cid:durableId="1612778526">
     <w:abstractNumId w:val="9"/>
   </w:num>
   <w:num w:numId="60" w16cid:durableId="184637057">
-    <w:abstractNumId w:val="48"/>
+    <w:abstractNumId w:val="49"/>
   </w:num>
   <w:num w:numId="61" w16cid:durableId="1657807602">
-    <w:abstractNumId w:val="40"/>
+    <w:abstractNumId w:val="41"/>
   </w:num>
   <w:num w:numId="62" w16cid:durableId="1486580873">
-    <w:abstractNumId w:val="56"/>
+    <w:abstractNumId w:val="57"/>
   </w:num>
   <w:num w:numId="63" w16cid:durableId="101800978">
-    <w:abstractNumId w:val="53"/>
+    <w:abstractNumId w:val="54"/>
   </w:num>
   <w:num w:numId="64" w16cid:durableId="1838496560">
-    <w:abstractNumId w:val="58"/>
+    <w:abstractNumId w:val="59"/>
   </w:num>
   <w:num w:numId="65" w16cid:durableId="1606309814">
     <w:abstractNumId w:val="1"/>
@@ -13474,16 +14051,16 @@
     <w:abstractNumId w:val="28"/>
   </w:num>
   <w:num w:numId="68" w16cid:durableId="509418428">
-    <w:abstractNumId w:val="76"/>
+    <w:abstractNumId w:val="77"/>
   </w:num>
   <w:num w:numId="69" w16cid:durableId="1060712400">
-    <w:abstractNumId w:val="71"/>
+    <w:abstractNumId w:val="72"/>
   </w:num>
   <w:num w:numId="70" w16cid:durableId="186604655">
     <w:abstractNumId w:val="16"/>
   </w:num>
   <w:num w:numId="71" w16cid:durableId="1362126248">
-    <w:abstractNumId w:val="67"/>
+    <w:abstractNumId w:val="68"/>
   </w:num>
   <w:num w:numId="72" w16cid:durableId="547685254">
     <w:abstractNumId w:val="5"/>
@@ -13510,7 +14087,10 @@
     <w:abstractNumId w:val="18"/>
   </w:num>
   <w:num w:numId="80" w16cid:durableId="1594507617">
-    <w:abstractNumId w:val="60"/>
+    <w:abstractNumId w:val="61"/>
+  </w:num>
+  <w:num w:numId="81" w16cid:durableId="434712669">
+    <w:abstractNumId w:val="36"/>
   </w:num>
 </w:numbering>
 </file>

</xml_diff>

<commit_message>
5.2	conclusion personnelle ; 5.3	Critique constructive sur la planification du projet
</commit_message>
<xml_diff>
--- a/documentation/rapport.docx
+++ b/documentation/rapport.docx
@@ -381,11 +381,11 @@
       <w:pPr>
         <w:rPr>
           <w:rFonts w:cs="Arial"/>
-          <w:sz w:val="24"/>
           <w:szCs w:val="24"/>
         </w:rPr>
       </w:pPr>
       <w:r>
+        <w:lastRenderedPageBreak/>
         <w:br w:type="page"/>
       </w:r>
     </w:p>
@@ -408,6 +408,7 @@
         <w:rPr>
           <w:b/>
           <w:bCs/>
+          <w:sz w:val="24"/>
         </w:rPr>
       </w:sdtEndPr>
       <w:sdtContent>
@@ -2263,7 +2264,6 @@
       <w:pPr>
         <w:rPr>
           <w:rFonts w:cs="Arial"/>
-          <w:sz w:val="24"/>
           <w:szCs w:val="24"/>
         </w:rPr>
       </w:pPr>
@@ -2272,14 +2272,12 @@
       <w:pPr>
         <w:rPr>
           <w:rFonts w:cs="Arial"/>
-          <w:sz w:val="24"/>
           <w:szCs w:val="24"/>
         </w:rPr>
       </w:pPr>
       <w:r>
         <w:rPr>
           <w:rFonts w:cs="Arial"/>
-          <w:sz w:val="24"/>
           <w:szCs w:val="24"/>
         </w:rPr>
         <w:br w:type="page"/>
@@ -2617,7 +2615,6 @@
       </w:pPr>
       <w:bookmarkStart w:id="10" w:name="_Toc198654064"/>
       <w:r>
-        <w:lastRenderedPageBreak/>
         <w:t>l’analyse de de la base de données à réaliser (MCD, MLD, MPD</w:t>
       </w:r>
       <w:bookmarkEnd w:id="10"/>
@@ -2855,6 +2852,7 @@
         </w:numPr>
       </w:pPr>
       <w:r>
+        <w:lastRenderedPageBreak/>
         <w:t xml:space="preserve">Un </w:t>
       </w:r>
       <w:r>
@@ -3041,7 +3039,6 @@
         <w:rPr>
           <w:noProof/>
         </w:rPr>
-        <w:lastRenderedPageBreak/>
         <w:drawing>
           <wp:anchor distT="0" distB="0" distL="114300" distR="114300" simplePos="0" relativeHeight="251660288" behindDoc="0" locked="0" layoutInCell="1" allowOverlap="1" wp14:anchorId="64CA082A" wp14:editId="7ACAFF12">
             <wp:simplePos x="0" y="0"/>
@@ -3285,6 +3282,7 @@
           <w:sz w:val="22"/>
           <w:szCs w:val="22"/>
         </w:rPr>
+        <w:lastRenderedPageBreak/>
         <w:t xml:space="preserve">MPD </w:t>
       </w:r>
       <w:r>
@@ -3808,6 +3806,1742 @@
           <w:szCs w:val="21"/>
           <w:lang w:val="en-US"/>
         </w:rPr>
+        <w:t>   </w:t>
+      </w:r>
+      <w:r>
+        <w:rPr>
+          <w:rFonts w:ascii="Consolas" w:hAnsi="Consolas"/>
+          <w:color w:val="569CD6"/>
+          <w:sz w:val="21"/>
+          <w:szCs w:val="21"/>
+          <w:lang w:val="en-US"/>
+        </w:rPr>
+        <w:t>PRIMARY KEY</w:t>
+      </w:r>
+      <w:r>
+        <w:rPr>
+          <w:rFonts w:ascii="Consolas" w:hAnsi="Consolas"/>
+          <w:color w:val="D4D4D4"/>
+          <w:sz w:val="21"/>
+          <w:szCs w:val="21"/>
+          <w:lang w:val="en-US"/>
+        </w:rPr>
+        <w:t>(utilisateur_id),</w:t>
+      </w:r>
+    </w:p>
+    <w:p>
+      <w:pPr>
+        <w:shd w:val="clear" w:color="auto" w:fill="1E1E1E"/>
+        <w:spacing w:line="285" w:lineRule="atLeast"/>
+        <w:rPr>
+          <w:rFonts w:ascii="Consolas" w:hAnsi="Consolas"/>
+          <w:color w:val="D4D4D4"/>
+          <w:sz w:val="21"/>
+          <w:szCs w:val="21"/>
+          <w:lang w:val="en-US"/>
+        </w:rPr>
+      </w:pPr>
+      <w:r>
+        <w:rPr>
+          <w:rFonts w:ascii="Consolas" w:hAnsi="Consolas"/>
+          <w:color w:val="D4D4D4"/>
+          <w:sz w:val="21"/>
+          <w:szCs w:val="21"/>
+          <w:lang w:val="en-US"/>
+        </w:rPr>
+        <w:t>   </w:t>
+      </w:r>
+      <w:r>
+        <w:rPr>
+          <w:rFonts w:ascii="Consolas" w:hAnsi="Consolas"/>
+          <w:color w:val="569CD6"/>
+          <w:sz w:val="21"/>
+          <w:szCs w:val="21"/>
+          <w:lang w:val="en-US"/>
+        </w:rPr>
+        <w:t>UNIQUE</w:t>
+      </w:r>
+      <w:r>
+        <w:rPr>
+          <w:rFonts w:ascii="Consolas" w:hAnsi="Consolas"/>
+          <w:color w:val="D4D4D4"/>
+          <w:sz w:val="21"/>
+          <w:szCs w:val="21"/>
+          <w:lang w:val="en-US"/>
+        </w:rPr>
+        <w:t>(hashed_password),</w:t>
+      </w:r>
+    </w:p>
+    <w:p>
+      <w:pPr>
+        <w:shd w:val="clear" w:color="auto" w:fill="1E1E1E"/>
+        <w:spacing w:line="285" w:lineRule="atLeast"/>
+        <w:rPr>
+          <w:rFonts w:ascii="Consolas" w:hAnsi="Consolas"/>
+          <w:color w:val="D4D4D4"/>
+          <w:sz w:val="21"/>
+          <w:szCs w:val="21"/>
+        </w:rPr>
+      </w:pPr>
+      <w:r>
+        <w:rPr>
+          <w:rFonts w:ascii="Consolas" w:hAnsi="Consolas"/>
+          <w:color w:val="D4D4D4"/>
+          <w:sz w:val="21"/>
+          <w:szCs w:val="21"/>
+          <w:lang w:val="en-US"/>
+        </w:rPr>
+        <w:t>   </w:t>
+      </w:r>
+      <w:r>
+        <w:rPr>
+          <w:rFonts w:ascii="Consolas" w:hAnsi="Consolas"/>
+          <w:color w:val="569CD6"/>
+          <w:sz w:val="21"/>
+          <w:szCs w:val="21"/>
+        </w:rPr>
+        <w:t>UNIQUE</w:t>
+      </w:r>
+      <w:r>
+        <w:rPr>
+          <w:rFonts w:ascii="Consolas" w:hAnsi="Consolas"/>
+          <w:color w:val="D4D4D4"/>
+          <w:sz w:val="21"/>
+          <w:szCs w:val="21"/>
+        </w:rPr>
+        <w:t>(username)</w:t>
+      </w:r>
+    </w:p>
+    <w:p>
+      <w:pPr>
+        <w:shd w:val="clear" w:color="auto" w:fill="1E1E1E"/>
+        <w:spacing w:line="285" w:lineRule="atLeast"/>
+        <w:rPr>
+          <w:rFonts w:ascii="Consolas" w:hAnsi="Consolas"/>
+          <w:color w:val="D4D4D4"/>
+          <w:sz w:val="21"/>
+          <w:szCs w:val="21"/>
+        </w:rPr>
+      </w:pPr>
+      <w:r>
+        <w:rPr>
+          <w:rFonts w:ascii="Consolas" w:hAnsi="Consolas"/>
+          <w:color w:val="D4D4D4"/>
+          <w:sz w:val="21"/>
+          <w:szCs w:val="21"/>
+        </w:rPr>
+        <w:t>);</w:t>
+      </w:r>
+    </w:p>
+    <w:p>
+      <w:pPr>
+        <w:shd w:val="clear" w:color="auto" w:fill="1E1E1E"/>
+        <w:spacing w:line="285" w:lineRule="atLeast"/>
+        <w:rPr>
+          <w:rFonts w:ascii="Consolas" w:hAnsi="Consolas"/>
+          <w:color w:val="D4D4D4"/>
+          <w:sz w:val="21"/>
+          <w:szCs w:val="21"/>
+        </w:rPr>
+      </w:pPr>
+    </w:p>
+    <w:p>
+      <w:pPr>
+        <w:shd w:val="clear" w:color="auto" w:fill="1E1E1E"/>
+        <w:spacing w:line="285" w:lineRule="atLeast"/>
+        <w:rPr>
+          <w:rFonts w:ascii="Consolas" w:hAnsi="Consolas"/>
+          <w:color w:val="D4D4D4"/>
+          <w:sz w:val="21"/>
+          <w:szCs w:val="21"/>
+        </w:rPr>
+      </w:pPr>
+      <w:r>
+        <w:rPr>
+          <w:rFonts w:ascii="Consolas" w:hAnsi="Consolas"/>
+          <w:color w:val="569CD6"/>
+          <w:sz w:val="21"/>
+          <w:szCs w:val="21"/>
+        </w:rPr>
+        <w:t>CREATE</w:t>
+      </w:r>
+      <w:r>
+        <w:rPr>
+          <w:rFonts w:ascii="Consolas" w:hAnsi="Consolas"/>
+          <w:color w:val="D4D4D4"/>
+          <w:sz w:val="21"/>
+          <w:szCs w:val="21"/>
+        </w:rPr>
+        <w:t xml:space="preserve"> </w:t>
+      </w:r>
+      <w:r>
+        <w:rPr>
+          <w:rFonts w:ascii="Consolas" w:hAnsi="Consolas"/>
+          <w:color w:val="569CD6"/>
+          <w:sz w:val="21"/>
+          <w:szCs w:val="21"/>
+        </w:rPr>
+        <w:t>TABLE</w:t>
+      </w:r>
+      <w:r>
+        <w:rPr>
+          <w:rFonts w:ascii="Consolas" w:hAnsi="Consolas"/>
+          <w:color w:val="D4D4D4"/>
+          <w:sz w:val="21"/>
+          <w:szCs w:val="21"/>
+        </w:rPr>
+        <w:t xml:space="preserve"> </w:t>
+      </w:r>
+      <w:r>
+        <w:rPr>
+          <w:rFonts w:ascii="Consolas" w:hAnsi="Consolas"/>
+          <w:color w:val="DCDCAA"/>
+          <w:sz w:val="21"/>
+          <w:szCs w:val="21"/>
+        </w:rPr>
+        <w:t>t_ecrivain</w:t>
+      </w:r>
+      <w:r>
+        <w:rPr>
+          <w:rFonts w:ascii="Consolas" w:hAnsi="Consolas"/>
+          <w:color w:val="D4D4D4"/>
+          <w:sz w:val="21"/>
+          <w:szCs w:val="21"/>
+        </w:rPr>
+        <w:t>(</w:t>
+      </w:r>
+    </w:p>
+    <w:p>
+      <w:pPr>
+        <w:shd w:val="clear" w:color="auto" w:fill="1E1E1E"/>
+        <w:spacing w:line="285" w:lineRule="atLeast"/>
+        <w:rPr>
+          <w:rFonts w:ascii="Consolas" w:hAnsi="Consolas"/>
+          <w:color w:val="D4D4D4"/>
+          <w:sz w:val="21"/>
+          <w:szCs w:val="21"/>
+        </w:rPr>
+      </w:pPr>
+      <w:r>
+        <w:rPr>
+          <w:rFonts w:ascii="Consolas" w:hAnsi="Consolas"/>
+          <w:color w:val="D4D4D4"/>
+          <w:sz w:val="21"/>
+          <w:szCs w:val="21"/>
+        </w:rPr>
+        <w:t xml:space="preserve">   ecrivain_id </w:t>
+      </w:r>
+      <w:r>
+        <w:rPr>
+          <w:rFonts w:ascii="Consolas" w:hAnsi="Consolas"/>
+          <w:color w:val="569CD6"/>
+          <w:sz w:val="21"/>
+          <w:szCs w:val="21"/>
+        </w:rPr>
+        <w:t>INT</w:t>
+      </w:r>
+      <w:r>
+        <w:rPr>
+          <w:rFonts w:ascii="Consolas" w:hAnsi="Consolas"/>
+          <w:color w:val="D4D4D4"/>
+          <w:sz w:val="21"/>
+          <w:szCs w:val="21"/>
+        </w:rPr>
+        <w:t xml:space="preserve"> AUTO_INCREMENT,</w:t>
+      </w:r>
+    </w:p>
+    <w:p>
+      <w:pPr>
+        <w:shd w:val="clear" w:color="auto" w:fill="1E1E1E"/>
+        <w:spacing w:line="285" w:lineRule="atLeast"/>
+        <w:rPr>
+          <w:rFonts w:ascii="Consolas" w:hAnsi="Consolas"/>
+          <w:color w:val="D4D4D4"/>
+          <w:sz w:val="21"/>
+          <w:szCs w:val="21"/>
+        </w:rPr>
+      </w:pPr>
+      <w:r>
+        <w:rPr>
+          <w:rFonts w:ascii="Consolas" w:hAnsi="Consolas"/>
+          <w:color w:val="D4D4D4"/>
+          <w:sz w:val="21"/>
+          <w:szCs w:val="21"/>
+        </w:rPr>
+        <w:t xml:space="preserve">   prenom </w:t>
+      </w:r>
+      <w:r>
+        <w:rPr>
+          <w:rFonts w:ascii="Consolas" w:hAnsi="Consolas"/>
+          <w:color w:val="569CD6"/>
+          <w:sz w:val="21"/>
+          <w:szCs w:val="21"/>
+        </w:rPr>
+        <w:t>VARCHAR</w:t>
+      </w:r>
+      <w:r>
+        <w:rPr>
+          <w:rFonts w:ascii="Consolas" w:hAnsi="Consolas"/>
+          <w:color w:val="D4D4D4"/>
+          <w:sz w:val="21"/>
+          <w:szCs w:val="21"/>
+        </w:rPr>
+        <w:t>(</w:t>
+      </w:r>
+      <w:r>
+        <w:rPr>
+          <w:rFonts w:ascii="Consolas" w:hAnsi="Consolas"/>
+          <w:color w:val="B5CEA8"/>
+          <w:sz w:val="21"/>
+          <w:szCs w:val="21"/>
+        </w:rPr>
+        <w:t>30</w:t>
+      </w:r>
+      <w:r>
+        <w:rPr>
+          <w:rFonts w:ascii="Consolas" w:hAnsi="Consolas"/>
+          <w:color w:val="D4D4D4"/>
+          <w:sz w:val="21"/>
+          <w:szCs w:val="21"/>
+        </w:rPr>
+        <w:t>),</w:t>
+      </w:r>
+    </w:p>
+    <w:p>
+      <w:pPr>
+        <w:shd w:val="clear" w:color="auto" w:fill="1E1E1E"/>
+        <w:spacing w:line="285" w:lineRule="atLeast"/>
+        <w:rPr>
+          <w:rFonts w:ascii="Consolas" w:hAnsi="Consolas"/>
+          <w:color w:val="D4D4D4"/>
+          <w:sz w:val="21"/>
+          <w:szCs w:val="21"/>
+        </w:rPr>
+      </w:pPr>
+      <w:r>
+        <w:rPr>
+          <w:rFonts w:ascii="Consolas" w:hAnsi="Consolas"/>
+          <w:color w:val="D4D4D4"/>
+          <w:sz w:val="21"/>
+          <w:szCs w:val="21"/>
+        </w:rPr>
+        <w:t xml:space="preserve">   nom_de_famille </w:t>
+      </w:r>
+      <w:r>
+        <w:rPr>
+          <w:rFonts w:ascii="Consolas" w:hAnsi="Consolas"/>
+          <w:color w:val="569CD6"/>
+          <w:sz w:val="21"/>
+          <w:szCs w:val="21"/>
+        </w:rPr>
+        <w:t>VARCHAR</w:t>
+      </w:r>
+      <w:r>
+        <w:rPr>
+          <w:rFonts w:ascii="Consolas" w:hAnsi="Consolas"/>
+          <w:color w:val="D4D4D4"/>
+          <w:sz w:val="21"/>
+          <w:szCs w:val="21"/>
+        </w:rPr>
+        <w:t>(</w:t>
+      </w:r>
+      <w:r>
+        <w:rPr>
+          <w:rFonts w:ascii="Consolas" w:hAnsi="Consolas"/>
+          <w:color w:val="B5CEA8"/>
+          <w:sz w:val="21"/>
+          <w:szCs w:val="21"/>
+        </w:rPr>
+        <w:t>30</w:t>
+      </w:r>
+      <w:r>
+        <w:rPr>
+          <w:rFonts w:ascii="Consolas" w:hAnsi="Consolas"/>
+          <w:color w:val="D4D4D4"/>
+          <w:sz w:val="21"/>
+          <w:szCs w:val="21"/>
+        </w:rPr>
+        <w:t>),</w:t>
+      </w:r>
+    </w:p>
+    <w:p>
+      <w:pPr>
+        <w:shd w:val="clear" w:color="auto" w:fill="1E1E1E"/>
+        <w:spacing w:line="285" w:lineRule="atLeast"/>
+        <w:rPr>
+          <w:rFonts w:ascii="Consolas" w:hAnsi="Consolas"/>
+          <w:color w:val="D4D4D4"/>
+          <w:sz w:val="21"/>
+          <w:szCs w:val="21"/>
+        </w:rPr>
+      </w:pPr>
+      <w:r>
+        <w:rPr>
+          <w:rFonts w:ascii="Consolas" w:hAnsi="Consolas"/>
+          <w:color w:val="D4D4D4"/>
+          <w:sz w:val="21"/>
+          <w:szCs w:val="21"/>
+        </w:rPr>
+        <w:t>   </w:t>
+      </w:r>
+      <w:r>
+        <w:rPr>
+          <w:rFonts w:ascii="Consolas" w:hAnsi="Consolas"/>
+          <w:color w:val="569CD6"/>
+          <w:sz w:val="21"/>
+          <w:szCs w:val="21"/>
+        </w:rPr>
+        <w:t>PRIMARY KEY</w:t>
+      </w:r>
+      <w:r>
+        <w:rPr>
+          <w:rFonts w:ascii="Consolas" w:hAnsi="Consolas"/>
+          <w:color w:val="D4D4D4"/>
+          <w:sz w:val="21"/>
+          <w:szCs w:val="21"/>
+        </w:rPr>
+        <w:t>(ecrivain_id)</w:t>
+      </w:r>
+    </w:p>
+    <w:p>
+      <w:pPr>
+        <w:shd w:val="clear" w:color="auto" w:fill="1E1E1E"/>
+        <w:spacing w:line="285" w:lineRule="atLeast"/>
+        <w:rPr>
+          <w:rFonts w:ascii="Consolas" w:hAnsi="Consolas"/>
+          <w:color w:val="D4D4D4"/>
+          <w:sz w:val="21"/>
+          <w:szCs w:val="21"/>
+          <w:lang w:val="en-US"/>
+        </w:rPr>
+      </w:pPr>
+      <w:r>
+        <w:rPr>
+          <w:rFonts w:ascii="Consolas" w:hAnsi="Consolas"/>
+          <w:color w:val="D4D4D4"/>
+          <w:sz w:val="21"/>
+          <w:szCs w:val="21"/>
+          <w:lang w:val="en-US"/>
+        </w:rPr>
+        <w:t>);</w:t>
+      </w:r>
+    </w:p>
+    <w:p>
+      <w:pPr>
+        <w:shd w:val="clear" w:color="auto" w:fill="1E1E1E"/>
+        <w:spacing w:line="285" w:lineRule="atLeast"/>
+        <w:rPr>
+          <w:rFonts w:ascii="Consolas" w:hAnsi="Consolas"/>
+          <w:color w:val="D4D4D4"/>
+          <w:sz w:val="21"/>
+          <w:szCs w:val="21"/>
+          <w:lang w:val="en-US"/>
+        </w:rPr>
+      </w:pPr>
+    </w:p>
+    <w:p>
+      <w:pPr>
+        <w:shd w:val="clear" w:color="auto" w:fill="1E1E1E"/>
+        <w:spacing w:line="285" w:lineRule="atLeast"/>
+        <w:rPr>
+          <w:rFonts w:ascii="Consolas" w:hAnsi="Consolas"/>
+          <w:color w:val="D4D4D4"/>
+          <w:sz w:val="21"/>
+          <w:szCs w:val="21"/>
+          <w:lang w:val="en-US"/>
+        </w:rPr>
+      </w:pPr>
+      <w:r>
+        <w:rPr>
+          <w:rFonts w:ascii="Consolas" w:hAnsi="Consolas"/>
+          <w:color w:val="569CD6"/>
+          <w:sz w:val="21"/>
+          <w:szCs w:val="21"/>
+          <w:lang w:val="en-US"/>
+        </w:rPr>
+        <w:t>CREATE</w:t>
+      </w:r>
+      <w:r>
+        <w:rPr>
+          <w:rFonts w:ascii="Consolas" w:hAnsi="Consolas"/>
+          <w:color w:val="D4D4D4"/>
+          <w:sz w:val="21"/>
+          <w:szCs w:val="21"/>
+          <w:lang w:val="en-US"/>
+        </w:rPr>
+        <w:t xml:space="preserve"> </w:t>
+      </w:r>
+      <w:r>
+        <w:rPr>
+          <w:rFonts w:ascii="Consolas" w:hAnsi="Consolas"/>
+          <w:color w:val="569CD6"/>
+          <w:sz w:val="21"/>
+          <w:szCs w:val="21"/>
+          <w:lang w:val="en-US"/>
+        </w:rPr>
+        <w:t>TABLE</w:t>
+      </w:r>
+      <w:r>
+        <w:rPr>
+          <w:rFonts w:ascii="Consolas" w:hAnsi="Consolas"/>
+          <w:color w:val="D4D4D4"/>
+          <w:sz w:val="21"/>
+          <w:szCs w:val="21"/>
+          <w:lang w:val="en-US"/>
+        </w:rPr>
+        <w:t xml:space="preserve"> </w:t>
+      </w:r>
+      <w:r>
+        <w:rPr>
+          <w:rFonts w:ascii="Consolas" w:hAnsi="Consolas"/>
+          <w:color w:val="DCDCAA"/>
+          <w:sz w:val="21"/>
+          <w:szCs w:val="21"/>
+          <w:lang w:val="en-US"/>
+        </w:rPr>
+        <w:t>t_categorie</w:t>
+      </w:r>
+      <w:r>
+        <w:rPr>
+          <w:rFonts w:ascii="Consolas" w:hAnsi="Consolas"/>
+          <w:color w:val="D4D4D4"/>
+          <w:sz w:val="21"/>
+          <w:szCs w:val="21"/>
+          <w:lang w:val="en-US"/>
+        </w:rPr>
+        <w:t>(</w:t>
+      </w:r>
+    </w:p>
+    <w:p>
+      <w:pPr>
+        <w:shd w:val="clear" w:color="auto" w:fill="1E1E1E"/>
+        <w:spacing w:line="285" w:lineRule="atLeast"/>
+        <w:rPr>
+          <w:rFonts w:ascii="Consolas" w:hAnsi="Consolas"/>
+          <w:color w:val="D4D4D4"/>
+          <w:sz w:val="21"/>
+          <w:szCs w:val="21"/>
+          <w:lang w:val="en-US"/>
+        </w:rPr>
+      </w:pPr>
+      <w:r>
+        <w:rPr>
+          <w:rFonts w:ascii="Consolas" w:hAnsi="Consolas"/>
+          <w:color w:val="D4D4D4"/>
+          <w:sz w:val="21"/>
+          <w:szCs w:val="21"/>
+          <w:lang w:val="en-US"/>
+        </w:rPr>
+        <w:t xml:space="preserve">   categorie_id </w:t>
+      </w:r>
+      <w:r>
+        <w:rPr>
+          <w:rFonts w:ascii="Consolas" w:hAnsi="Consolas"/>
+          <w:color w:val="569CD6"/>
+          <w:sz w:val="21"/>
+          <w:szCs w:val="21"/>
+          <w:lang w:val="en-US"/>
+        </w:rPr>
+        <w:t>INT</w:t>
+      </w:r>
+      <w:r>
+        <w:rPr>
+          <w:rFonts w:ascii="Consolas" w:hAnsi="Consolas"/>
+          <w:color w:val="D4D4D4"/>
+          <w:sz w:val="21"/>
+          <w:szCs w:val="21"/>
+          <w:lang w:val="en-US"/>
+        </w:rPr>
+        <w:t xml:space="preserve"> AUTO_INCREMENT,</w:t>
+      </w:r>
+    </w:p>
+    <w:p>
+      <w:pPr>
+        <w:shd w:val="clear" w:color="auto" w:fill="1E1E1E"/>
+        <w:spacing w:line="285" w:lineRule="atLeast"/>
+        <w:rPr>
+          <w:rFonts w:ascii="Consolas" w:hAnsi="Consolas"/>
+          <w:color w:val="D4D4D4"/>
+          <w:sz w:val="21"/>
+          <w:szCs w:val="21"/>
+          <w:lang w:val="en-US"/>
+        </w:rPr>
+      </w:pPr>
+      <w:r>
+        <w:rPr>
+          <w:rFonts w:ascii="Consolas" w:hAnsi="Consolas"/>
+          <w:color w:val="D4D4D4"/>
+          <w:sz w:val="21"/>
+          <w:szCs w:val="21"/>
+          <w:lang w:val="en-US"/>
+        </w:rPr>
+        <w:t xml:space="preserve">   nom </w:t>
+      </w:r>
+      <w:r>
+        <w:rPr>
+          <w:rFonts w:ascii="Consolas" w:hAnsi="Consolas"/>
+          <w:color w:val="569CD6"/>
+          <w:sz w:val="21"/>
+          <w:szCs w:val="21"/>
+          <w:lang w:val="en-US"/>
+        </w:rPr>
+        <w:t>VARCHAR</w:t>
+      </w:r>
+      <w:r>
+        <w:rPr>
+          <w:rFonts w:ascii="Consolas" w:hAnsi="Consolas"/>
+          <w:color w:val="D4D4D4"/>
+          <w:sz w:val="21"/>
+          <w:szCs w:val="21"/>
+          <w:lang w:val="en-US"/>
+        </w:rPr>
+        <w:t>(</w:t>
+      </w:r>
+      <w:r>
+        <w:rPr>
+          <w:rFonts w:ascii="Consolas" w:hAnsi="Consolas"/>
+          <w:color w:val="B5CEA8"/>
+          <w:sz w:val="21"/>
+          <w:szCs w:val="21"/>
+          <w:lang w:val="en-US"/>
+        </w:rPr>
+        <w:t>50</w:t>
+      </w:r>
+      <w:r>
+        <w:rPr>
+          <w:rFonts w:ascii="Consolas" w:hAnsi="Consolas"/>
+          <w:color w:val="D4D4D4"/>
+          <w:sz w:val="21"/>
+          <w:szCs w:val="21"/>
+          <w:lang w:val="en-US"/>
+        </w:rPr>
+        <w:t xml:space="preserve">) </w:t>
+      </w:r>
+      <w:r>
+        <w:rPr>
+          <w:rFonts w:ascii="Consolas" w:hAnsi="Consolas"/>
+          <w:color w:val="569CD6"/>
+          <w:sz w:val="21"/>
+          <w:szCs w:val="21"/>
+          <w:lang w:val="en-US"/>
+        </w:rPr>
+        <w:t>NOT NULL</w:t>
+      </w:r>
+      <w:r>
+        <w:rPr>
+          <w:rFonts w:ascii="Consolas" w:hAnsi="Consolas"/>
+          <w:color w:val="D4D4D4"/>
+          <w:sz w:val="21"/>
+          <w:szCs w:val="21"/>
+          <w:lang w:val="en-US"/>
+        </w:rPr>
+        <w:t>,</w:t>
+      </w:r>
+    </w:p>
+    <w:p>
+      <w:pPr>
+        <w:shd w:val="clear" w:color="auto" w:fill="1E1E1E"/>
+        <w:spacing w:line="285" w:lineRule="atLeast"/>
+        <w:rPr>
+          <w:rFonts w:ascii="Consolas" w:hAnsi="Consolas"/>
+          <w:color w:val="D4D4D4"/>
+          <w:sz w:val="21"/>
+          <w:szCs w:val="21"/>
+          <w:lang w:val="en-US"/>
+        </w:rPr>
+      </w:pPr>
+      <w:r>
+        <w:rPr>
+          <w:rFonts w:ascii="Consolas" w:hAnsi="Consolas"/>
+          <w:color w:val="D4D4D4"/>
+          <w:sz w:val="21"/>
+          <w:szCs w:val="21"/>
+          <w:lang w:val="en-US"/>
+        </w:rPr>
+        <w:t>   </w:t>
+      </w:r>
+      <w:r>
+        <w:rPr>
+          <w:rFonts w:ascii="Consolas" w:hAnsi="Consolas"/>
+          <w:color w:val="569CD6"/>
+          <w:sz w:val="21"/>
+          <w:szCs w:val="21"/>
+          <w:lang w:val="en-US"/>
+        </w:rPr>
+        <w:t>PRIMARY KEY</w:t>
+      </w:r>
+      <w:r>
+        <w:rPr>
+          <w:rFonts w:ascii="Consolas" w:hAnsi="Consolas"/>
+          <w:color w:val="D4D4D4"/>
+          <w:sz w:val="21"/>
+          <w:szCs w:val="21"/>
+          <w:lang w:val="en-US"/>
+        </w:rPr>
+        <w:t>(categorie_id),</w:t>
+      </w:r>
+    </w:p>
+    <w:p>
+      <w:pPr>
+        <w:shd w:val="clear" w:color="auto" w:fill="1E1E1E"/>
+        <w:spacing w:line="285" w:lineRule="atLeast"/>
+        <w:rPr>
+          <w:rFonts w:ascii="Consolas" w:hAnsi="Consolas"/>
+          <w:color w:val="D4D4D4"/>
+          <w:sz w:val="21"/>
+          <w:szCs w:val="21"/>
+        </w:rPr>
+      </w:pPr>
+      <w:r>
+        <w:rPr>
+          <w:rFonts w:ascii="Consolas" w:hAnsi="Consolas"/>
+          <w:color w:val="D4D4D4"/>
+          <w:sz w:val="21"/>
+          <w:szCs w:val="21"/>
+          <w:lang w:val="en-US"/>
+        </w:rPr>
+        <w:t>   </w:t>
+      </w:r>
+      <w:r>
+        <w:rPr>
+          <w:rFonts w:ascii="Consolas" w:hAnsi="Consolas"/>
+          <w:color w:val="569CD6"/>
+          <w:sz w:val="21"/>
+          <w:szCs w:val="21"/>
+        </w:rPr>
+        <w:t>UNIQUE</w:t>
+      </w:r>
+      <w:r>
+        <w:rPr>
+          <w:rFonts w:ascii="Consolas" w:hAnsi="Consolas"/>
+          <w:color w:val="D4D4D4"/>
+          <w:sz w:val="21"/>
+          <w:szCs w:val="21"/>
+        </w:rPr>
+        <w:t>(nom)</w:t>
+      </w:r>
+    </w:p>
+    <w:p>
+      <w:pPr>
+        <w:shd w:val="clear" w:color="auto" w:fill="1E1E1E"/>
+        <w:spacing w:line="285" w:lineRule="atLeast"/>
+        <w:rPr>
+          <w:rFonts w:ascii="Consolas" w:hAnsi="Consolas"/>
+          <w:color w:val="D4D4D4"/>
+          <w:sz w:val="21"/>
+          <w:szCs w:val="21"/>
+        </w:rPr>
+      </w:pPr>
+      <w:r>
+        <w:rPr>
+          <w:rFonts w:ascii="Consolas" w:hAnsi="Consolas"/>
+          <w:color w:val="D4D4D4"/>
+          <w:sz w:val="21"/>
+          <w:szCs w:val="21"/>
+        </w:rPr>
+        <w:t>);</w:t>
+      </w:r>
+    </w:p>
+    <w:p>
+      <w:pPr>
+        <w:shd w:val="clear" w:color="auto" w:fill="1E1E1E"/>
+        <w:spacing w:line="285" w:lineRule="atLeast"/>
+        <w:rPr>
+          <w:rFonts w:ascii="Consolas" w:hAnsi="Consolas"/>
+          <w:color w:val="D4D4D4"/>
+          <w:sz w:val="21"/>
+          <w:szCs w:val="21"/>
+        </w:rPr>
+      </w:pPr>
+    </w:p>
+    <w:p>
+      <w:pPr>
+        <w:shd w:val="clear" w:color="auto" w:fill="1E1E1E"/>
+        <w:spacing w:line="285" w:lineRule="atLeast"/>
+        <w:rPr>
+          <w:rFonts w:ascii="Consolas" w:hAnsi="Consolas"/>
+          <w:color w:val="D4D4D4"/>
+          <w:sz w:val="21"/>
+          <w:szCs w:val="21"/>
+        </w:rPr>
+      </w:pPr>
+      <w:r>
+        <w:rPr>
+          <w:rFonts w:ascii="Consolas" w:hAnsi="Consolas"/>
+          <w:color w:val="569CD6"/>
+          <w:sz w:val="21"/>
+          <w:szCs w:val="21"/>
+        </w:rPr>
+        <w:t>CREATE</w:t>
+      </w:r>
+      <w:r>
+        <w:rPr>
+          <w:rFonts w:ascii="Consolas" w:hAnsi="Consolas"/>
+          <w:color w:val="D4D4D4"/>
+          <w:sz w:val="21"/>
+          <w:szCs w:val="21"/>
+        </w:rPr>
+        <w:t xml:space="preserve"> </w:t>
+      </w:r>
+      <w:r>
+        <w:rPr>
+          <w:rFonts w:ascii="Consolas" w:hAnsi="Consolas"/>
+          <w:color w:val="569CD6"/>
+          <w:sz w:val="21"/>
+          <w:szCs w:val="21"/>
+        </w:rPr>
+        <w:t>TABLE</w:t>
+      </w:r>
+      <w:r>
+        <w:rPr>
+          <w:rFonts w:ascii="Consolas" w:hAnsi="Consolas"/>
+          <w:color w:val="D4D4D4"/>
+          <w:sz w:val="21"/>
+          <w:szCs w:val="21"/>
+        </w:rPr>
+        <w:t xml:space="preserve"> </w:t>
+      </w:r>
+      <w:r>
+        <w:rPr>
+          <w:rFonts w:ascii="Consolas" w:hAnsi="Consolas"/>
+          <w:color w:val="DCDCAA"/>
+          <w:sz w:val="21"/>
+          <w:szCs w:val="21"/>
+        </w:rPr>
+        <w:t>t_livre</w:t>
+      </w:r>
+      <w:r>
+        <w:rPr>
+          <w:rFonts w:ascii="Consolas" w:hAnsi="Consolas"/>
+          <w:color w:val="D4D4D4"/>
+          <w:sz w:val="21"/>
+          <w:szCs w:val="21"/>
+        </w:rPr>
+        <w:t>(</w:t>
+      </w:r>
+    </w:p>
+    <w:p>
+      <w:pPr>
+        <w:shd w:val="clear" w:color="auto" w:fill="1E1E1E"/>
+        <w:spacing w:line="285" w:lineRule="atLeast"/>
+        <w:rPr>
+          <w:rFonts w:ascii="Consolas" w:hAnsi="Consolas"/>
+          <w:color w:val="D4D4D4"/>
+          <w:sz w:val="21"/>
+          <w:szCs w:val="21"/>
+          <w:lang w:val="en-US"/>
+        </w:rPr>
+      </w:pPr>
+      <w:r>
+        <w:rPr>
+          <w:rFonts w:ascii="Consolas" w:hAnsi="Consolas"/>
+          <w:color w:val="D4D4D4"/>
+          <w:sz w:val="21"/>
+          <w:szCs w:val="21"/>
+        </w:rPr>
+        <w:t>   </w:t>
+      </w:r>
+      <w:r>
+        <w:rPr>
+          <w:rFonts w:ascii="Consolas" w:hAnsi="Consolas"/>
+          <w:color w:val="D4D4D4"/>
+          <w:sz w:val="21"/>
+          <w:szCs w:val="21"/>
+          <w:lang w:val="en-US"/>
+        </w:rPr>
+        <w:t xml:space="preserve">livre_id </w:t>
+      </w:r>
+      <w:r>
+        <w:rPr>
+          <w:rFonts w:ascii="Consolas" w:hAnsi="Consolas"/>
+          <w:color w:val="569CD6"/>
+          <w:sz w:val="21"/>
+          <w:szCs w:val="21"/>
+          <w:lang w:val="en-US"/>
+        </w:rPr>
+        <w:t>INT</w:t>
+      </w:r>
+      <w:r>
+        <w:rPr>
+          <w:rFonts w:ascii="Consolas" w:hAnsi="Consolas"/>
+          <w:color w:val="D4D4D4"/>
+          <w:sz w:val="21"/>
+          <w:szCs w:val="21"/>
+          <w:lang w:val="en-US"/>
+        </w:rPr>
+        <w:t xml:space="preserve"> AUTO_INCREMENT,</w:t>
+      </w:r>
+    </w:p>
+    <w:p>
+      <w:pPr>
+        <w:shd w:val="clear" w:color="auto" w:fill="1E1E1E"/>
+        <w:spacing w:line="285" w:lineRule="atLeast"/>
+        <w:rPr>
+          <w:rFonts w:ascii="Consolas" w:hAnsi="Consolas"/>
+          <w:color w:val="D4D4D4"/>
+          <w:sz w:val="21"/>
+          <w:szCs w:val="21"/>
+          <w:lang w:val="en-US"/>
+        </w:rPr>
+      </w:pPr>
+      <w:r>
+        <w:rPr>
+          <w:rFonts w:ascii="Consolas" w:hAnsi="Consolas"/>
+          <w:color w:val="D4D4D4"/>
+          <w:sz w:val="21"/>
+          <w:szCs w:val="21"/>
+          <w:lang w:val="en-US"/>
+        </w:rPr>
+        <w:t xml:space="preserve">   titre </w:t>
+      </w:r>
+      <w:r>
+        <w:rPr>
+          <w:rFonts w:ascii="Consolas" w:hAnsi="Consolas"/>
+          <w:color w:val="569CD6"/>
+          <w:sz w:val="21"/>
+          <w:szCs w:val="21"/>
+          <w:lang w:val="en-US"/>
+        </w:rPr>
+        <w:t>VARCHAR</w:t>
+      </w:r>
+      <w:r>
+        <w:rPr>
+          <w:rFonts w:ascii="Consolas" w:hAnsi="Consolas"/>
+          <w:color w:val="D4D4D4"/>
+          <w:sz w:val="21"/>
+          <w:szCs w:val="21"/>
+          <w:lang w:val="en-US"/>
+        </w:rPr>
+        <w:t>(</w:t>
+      </w:r>
+      <w:r>
+        <w:rPr>
+          <w:rFonts w:ascii="Consolas" w:hAnsi="Consolas"/>
+          <w:color w:val="B5CEA8"/>
+          <w:sz w:val="21"/>
+          <w:szCs w:val="21"/>
+          <w:lang w:val="en-US"/>
+        </w:rPr>
+        <w:t>250</w:t>
+      </w:r>
+      <w:r>
+        <w:rPr>
+          <w:rFonts w:ascii="Consolas" w:hAnsi="Consolas"/>
+          <w:color w:val="D4D4D4"/>
+          <w:sz w:val="21"/>
+          <w:szCs w:val="21"/>
+          <w:lang w:val="en-US"/>
+        </w:rPr>
+        <w:t xml:space="preserve">) </w:t>
+      </w:r>
+      <w:r>
+        <w:rPr>
+          <w:rFonts w:ascii="Consolas" w:hAnsi="Consolas"/>
+          <w:color w:val="569CD6"/>
+          <w:sz w:val="21"/>
+          <w:szCs w:val="21"/>
+          <w:lang w:val="en-US"/>
+        </w:rPr>
+        <w:t>NOT NULL</w:t>
+      </w:r>
+      <w:r>
+        <w:rPr>
+          <w:rFonts w:ascii="Consolas" w:hAnsi="Consolas"/>
+          <w:color w:val="D4D4D4"/>
+          <w:sz w:val="21"/>
+          <w:szCs w:val="21"/>
+          <w:lang w:val="en-US"/>
+        </w:rPr>
+        <w:t>,</w:t>
+      </w:r>
+    </w:p>
+    <w:p>
+      <w:pPr>
+        <w:shd w:val="clear" w:color="auto" w:fill="1E1E1E"/>
+        <w:spacing w:line="285" w:lineRule="atLeast"/>
+        <w:rPr>
+          <w:rFonts w:ascii="Consolas" w:hAnsi="Consolas"/>
+          <w:color w:val="D4D4D4"/>
+          <w:sz w:val="21"/>
+          <w:szCs w:val="21"/>
+          <w:lang w:val="en-US"/>
+        </w:rPr>
+      </w:pPr>
+      <w:r>
+        <w:rPr>
+          <w:rFonts w:ascii="Consolas" w:hAnsi="Consolas"/>
+          <w:color w:val="D4D4D4"/>
+          <w:sz w:val="21"/>
+          <w:szCs w:val="21"/>
+          <w:lang w:val="en-US"/>
+        </w:rPr>
+        <w:t xml:space="preserve">   annee_edition </w:t>
+      </w:r>
+      <w:r>
+        <w:rPr>
+          <w:rFonts w:ascii="Consolas" w:hAnsi="Consolas"/>
+          <w:color w:val="569CD6"/>
+          <w:sz w:val="21"/>
+          <w:szCs w:val="21"/>
+          <w:lang w:val="en-US"/>
+        </w:rPr>
+        <w:t>DATE</w:t>
+      </w:r>
+      <w:r>
+        <w:rPr>
+          <w:rFonts w:ascii="Consolas" w:hAnsi="Consolas"/>
+          <w:color w:val="D4D4D4"/>
+          <w:sz w:val="21"/>
+          <w:szCs w:val="21"/>
+          <w:lang w:val="en-US"/>
+        </w:rPr>
+        <w:t>,</w:t>
+      </w:r>
+    </w:p>
+    <w:p>
+      <w:pPr>
+        <w:shd w:val="clear" w:color="auto" w:fill="1E1E1E"/>
+        <w:spacing w:line="285" w:lineRule="atLeast"/>
+        <w:rPr>
+          <w:rFonts w:ascii="Consolas" w:hAnsi="Consolas"/>
+          <w:color w:val="D4D4D4"/>
+          <w:sz w:val="21"/>
+          <w:szCs w:val="21"/>
+        </w:rPr>
+      </w:pPr>
+      <w:r>
+        <w:rPr>
+          <w:rFonts w:ascii="Consolas" w:hAnsi="Consolas"/>
+          <w:color w:val="D4D4D4"/>
+          <w:sz w:val="21"/>
+          <w:szCs w:val="21"/>
+          <w:lang w:val="en-US"/>
+        </w:rPr>
+        <w:t>   </w:t>
+      </w:r>
+      <w:r>
+        <w:rPr>
+          <w:rFonts w:ascii="Consolas" w:hAnsi="Consolas"/>
+          <w:color w:val="D4D4D4"/>
+          <w:sz w:val="21"/>
+          <w:szCs w:val="21"/>
+        </w:rPr>
+        <w:t xml:space="preserve">lien_image </w:t>
+      </w:r>
+      <w:r>
+        <w:rPr>
+          <w:rFonts w:ascii="Consolas" w:hAnsi="Consolas"/>
+          <w:color w:val="569CD6"/>
+          <w:sz w:val="21"/>
+          <w:szCs w:val="21"/>
+        </w:rPr>
+        <w:t>VARCHAR</w:t>
+      </w:r>
+      <w:r>
+        <w:rPr>
+          <w:rFonts w:ascii="Consolas" w:hAnsi="Consolas"/>
+          <w:color w:val="D4D4D4"/>
+          <w:sz w:val="21"/>
+          <w:szCs w:val="21"/>
+        </w:rPr>
+        <w:t>(</w:t>
+      </w:r>
+      <w:r>
+        <w:rPr>
+          <w:rFonts w:ascii="Consolas" w:hAnsi="Consolas"/>
+          <w:color w:val="B5CEA8"/>
+          <w:sz w:val="21"/>
+          <w:szCs w:val="21"/>
+        </w:rPr>
+        <w:t>150</w:t>
+      </w:r>
+      <w:r>
+        <w:rPr>
+          <w:rFonts w:ascii="Consolas" w:hAnsi="Consolas"/>
+          <w:color w:val="D4D4D4"/>
+          <w:sz w:val="21"/>
+          <w:szCs w:val="21"/>
+        </w:rPr>
+        <w:t>),</w:t>
+      </w:r>
+    </w:p>
+    <w:p>
+      <w:pPr>
+        <w:shd w:val="clear" w:color="auto" w:fill="1E1E1E"/>
+        <w:spacing w:line="285" w:lineRule="atLeast"/>
+        <w:rPr>
+          <w:rFonts w:ascii="Consolas" w:hAnsi="Consolas"/>
+          <w:color w:val="D4D4D4"/>
+          <w:sz w:val="21"/>
+          <w:szCs w:val="21"/>
+        </w:rPr>
+      </w:pPr>
+      <w:r>
+        <w:rPr>
+          <w:rFonts w:ascii="Consolas" w:hAnsi="Consolas"/>
+          <w:color w:val="D4D4D4"/>
+          <w:sz w:val="21"/>
+          <w:szCs w:val="21"/>
+        </w:rPr>
+        <w:t xml:space="preserve">   lien_pdf </w:t>
+      </w:r>
+      <w:r>
+        <w:rPr>
+          <w:rFonts w:ascii="Consolas" w:hAnsi="Consolas"/>
+          <w:color w:val="569CD6"/>
+          <w:sz w:val="21"/>
+          <w:szCs w:val="21"/>
+        </w:rPr>
+        <w:t>VARCHAR</w:t>
+      </w:r>
+      <w:r>
+        <w:rPr>
+          <w:rFonts w:ascii="Consolas" w:hAnsi="Consolas"/>
+          <w:color w:val="D4D4D4"/>
+          <w:sz w:val="21"/>
+          <w:szCs w:val="21"/>
+        </w:rPr>
+        <w:t>(</w:t>
+      </w:r>
+      <w:r>
+        <w:rPr>
+          <w:rFonts w:ascii="Consolas" w:hAnsi="Consolas"/>
+          <w:color w:val="B5CEA8"/>
+          <w:sz w:val="21"/>
+          <w:szCs w:val="21"/>
+        </w:rPr>
+        <w:t>150</w:t>
+      </w:r>
+      <w:r>
+        <w:rPr>
+          <w:rFonts w:ascii="Consolas" w:hAnsi="Consolas"/>
+          <w:color w:val="D4D4D4"/>
+          <w:sz w:val="21"/>
+          <w:szCs w:val="21"/>
+        </w:rPr>
+        <w:t>),</w:t>
+      </w:r>
+    </w:p>
+    <w:p>
+      <w:pPr>
+        <w:shd w:val="clear" w:color="auto" w:fill="1E1E1E"/>
+        <w:spacing w:line="285" w:lineRule="atLeast"/>
+        <w:rPr>
+          <w:rFonts w:ascii="Consolas" w:hAnsi="Consolas"/>
+          <w:color w:val="D4D4D4"/>
+          <w:sz w:val="21"/>
+          <w:szCs w:val="21"/>
+        </w:rPr>
+      </w:pPr>
+      <w:r>
+        <w:rPr>
+          <w:rFonts w:ascii="Consolas" w:hAnsi="Consolas"/>
+          <w:color w:val="D4D4D4"/>
+          <w:sz w:val="21"/>
+          <w:szCs w:val="21"/>
+        </w:rPr>
+        <w:t>   </w:t>
+      </w:r>
+      <w:r>
+        <w:rPr>
+          <w:rFonts w:ascii="Consolas" w:hAnsi="Consolas"/>
+          <w:color w:val="569CD6"/>
+          <w:sz w:val="21"/>
+          <w:szCs w:val="21"/>
+        </w:rPr>
+        <w:t>resume</w:t>
+      </w:r>
+      <w:r>
+        <w:rPr>
+          <w:rFonts w:ascii="Consolas" w:hAnsi="Consolas"/>
+          <w:color w:val="D4D4D4"/>
+          <w:sz w:val="21"/>
+          <w:szCs w:val="21"/>
+        </w:rPr>
+        <w:t xml:space="preserve"> </w:t>
+      </w:r>
+      <w:r>
+        <w:rPr>
+          <w:rFonts w:ascii="Consolas" w:hAnsi="Consolas"/>
+          <w:color w:val="569CD6"/>
+          <w:sz w:val="21"/>
+          <w:szCs w:val="21"/>
+        </w:rPr>
+        <w:t>TEXT</w:t>
+      </w:r>
+      <w:r>
+        <w:rPr>
+          <w:rFonts w:ascii="Consolas" w:hAnsi="Consolas"/>
+          <w:color w:val="D4D4D4"/>
+          <w:sz w:val="21"/>
+          <w:szCs w:val="21"/>
+        </w:rPr>
+        <w:t>,</w:t>
+      </w:r>
+    </w:p>
+    <w:p>
+      <w:pPr>
+        <w:shd w:val="clear" w:color="auto" w:fill="1E1E1E"/>
+        <w:spacing w:line="285" w:lineRule="atLeast"/>
+        <w:rPr>
+          <w:rFonts w:ascii="Consolas" w:hAnsi="Consolas"/>
+          <w:color w:val="D4D4D4"/>
+          <w:sz w:val="21"/>
+          <w:szCs w:val="21"/>
+        </w:rPr>
+      </w:pPr>
+      <w:r>
+        <w:rPr>
+          <w:rFonts w:ascii="Consolas" w:hAnsi="Consolas"/>
+          <w:color w:val="D4D4D4"/>
+          <w:sz w:val="21"/>
+          <w:szCs w:val="21"/>
+        </w:rPr>
+        <w:t xml:space="preserve">   editeur </w:t>
+      </w:r>
+      <w:r>
+        <w:rPr>
+          <w:rFonts w:ascii="Consolas" w:hAnsi="Consolas"/>
+          <w:color w:val="569CD6"/>
+          <w:sz w:val="21"/>
+          <w:szCs w:val="21"/>
+        </w:rPr>
+        <w:t>VARCHAR</w:t>
+      </w:r>
+      <w:r>
+        <w:rPr>
+          <w:rFonts w:ascii="Consolas" w:hAnsi="Consolas"/>
+          <w:color w:val="D4D4D4"/>
+          <w:sz w:val="21"/>
+          <w:szCs w:val="21"/>
+        </w:rPr>
+        <w:t>(</w:t>
+      </w:r>
+      <w:r>
+        <w:rPr>
+          <w:rFonts w:ascii="Consolas" w:hAnsi="Consolas"/>
+          <w:color w:val="B5CEA8"/>
+          <w:sz w:val="21"/>
+          <w:szCs w:val="21"/>
+        </w:rPr>
+        <w:t>50</w:t>
+      </w:r>
+      <w:r>
+        <w:rPr>
+          <w:rFonts w:ascii="Consolas" w:hAnsi="Consolas"/>
+          <w:color w:val="D4D4D4"/>
+          <w:sz w:val="21"/>
+          <w:szCs w:val="21"/>
+        </w:rPr>
+        <w:t>),</w:t>
+      </w:r>
+    </w:p>
+    <w:p>
+      <w:pPr>
+        <w:shd w:val="clear" w:color="auto" w:fill="1E1E1E"/>
+        <w:spacing w:line="285" w:lineRule="atLeast"/>
+        <w:rPr>
+          <w:rFonts w:ascii="Consolas" w:hAnsi="Consolas"/>
+          <w:color w:val="D4D4D4"/>
+          <w:sz w:val="21"/>
+          <w:szCs w:val="21"/>
+        </w:rPr>
+      </w:pPr>
+      <w:r>
+        <w:rPr>
+          <w:rFonts w:ascii="Consolas" w:hAnsi="Consolas"/>
+          <w:color w:val="D4D4D4"/>
+          <w:sz w:val="21"/>
+          <w:szCs w:val="21"/>
+        </w:rPr>
+        <w:t xml:space="preserve">   nombre_de_page </w:t>
+      </w:r>
+      <w:r>
+        <w:rPr>
+          <w:rFonts w:ascii="Consolas" w:hAnsi="Consolas"/>
+          <w:color w:val="569CD6"/>
+          <w:sz w:val="21"/>
+          <w:szCs w:val="21"/>
+        </w:rPr>
+        <w:t>INT</w:t>
+      </w:r>
+      <w:r>
+        <w:rPr>
+          <w:rFonts w:ascii="Consolas" w:hAnsi="Consolas"/>
+          <w:color w:val="D4D4D4"/>
+          <w:sz w:val="21"/>
+          <w:szCs w:val="21"/>
+        </w:rPr>
+        <w:t xml:space="preserve"> </w:t>
+      </w:r>
+      <w:r>
+        <w:rPr>
+          <w:rFonts w:ascii="Consolas" w:hAnsi="Consolas"/>
+          <w:color w:val="569CD6"/>
+          <w:sz w:val="21"/>
+          <w:szCs w:val="21"/>
+        </w:rPr>
+        <w:t>NOT NULL</w:t>
+      </w:r>
+      <w:r>
+        <w:rPr>
+          <w:rFonts w:ascii="Consolas" w:hAnsi="Consolas"/>
+          <w:color w:val="D4D4D4"/>
+          <w:sz w:val="21"/>
+          <w:szCs w:val="21"/>
+        </w:rPr>
+        <w:t>,</w:t>
+      </w:r>
+    </w:p>
+    <w:p>
+      <w:pPr>
+        <w:shd w:val="clear" w:color="auto" w:fill="1E1E1E"/>
+        <w:spacing w:line="285" w:lineRule="atLeast"/>
+        <w:rPr>
+          <w:rFonts w:ascii="Consolas" w:hAnsi="Consolas"/>
+          <w:color w:val="D4D4D4"/>
+          <w:sz w:val="21"/>
+          <w:szCs w:val="21"/>
+        </w:rPr>
+      </w:pPr>
+      <w:r>
+        <w:rPr>
+          <w:rFonts w:ascii="Consolas" w:hAnsi="Consolas"/>
+          <w:color w:val="D4D4D4"/>
+          <w:sz w:val="21"/>
+          <w:szCs w:val="21"/>
+        </w:rPr>
+        <w:t xml:space="preserve">   utilisateur_fk </w:t>
+      </w:r>
+      <w:r>
+        <w:rPr>
+          <w:rFonts w:ascii="Consolas" w:hAnsi="Consolas"/>
+          <w:color w:val="569CD6"/>
+          <w:sz w:val="21"/>
+          <w:szCs w:val="21"/>
+        </w:rPr>
+        <w:t>INT</w:t>
+      </w:r>
+      <w:r>
+        <w:rPr>
+          <w:rFonts w:ascii="Consolas" w:hAnsi="Consolas"/>
+          <w:color w:val="D4D4D4"/>
+          <w:sz w:val="21"/>
+          <w:szCs w:val="21"/>
+        </w:rPr>
+        <w:t xml:space="preserve"> </w:t>
+      </w:r>
+      <w:r>
+        <w:rPr>
+          <w:rFonts w:ascii="Consolas" w:hAnsi="Consolas"/>
+          <w:color w:val="569CD6"/>
+          <w:sz w:val="21"/>
+          <w:szCs w:val="21"/>
+        </w:rPr>
+        <w:t>NOT NULL</w:t>
+      </w:r>
+      <w:r>
+        <w:rPr>
+          <w:rFonts w:ascii="Consolas" w:hAnsi="Consolas"/>
+          <w:color w:val="D4D4D4"/>
+          <w:sz w:val="21"/>
+          <w:szCs w:val="21"/>
+        </w:rPr>
+        <w:t>,</w:t>
+      </w:r>
+    </w:p>
+    <w:p>
+      <w:pPr>
+        <w:shd w:val="clear" w:color="auto" w:fill="1E1E1E"/>
+        <w:spacing w:line="285" w:lineRule="atLeast"/>
+        <w:rPr>
+          <w:rFonts w:ascii="Consolas" w:hAnsi="Consolas"/>
+          <w:color w:val="D4D4D4"/>
+          <w:sz w:val="21"/>
+          <w:szCs w:val="21"/>
+          <w:lang w:val="en-US"/>
+        </w:rPr>
+      </w:pPr>
+      <w:r>
+        <w:rPr>
+          <w:rFonts w:ascii="Consolas" w:hAnsi="Consolas"/>
+          <w:color w:val="D4D4D4"/>
+          <w:sz w:val="21"/>
+          <w:szCs w:val="21"/>
+        </w:rPr>
+        <w:t>   </w:t>
+      </w:r>
+      <w:r>
+        <w:rPr>
+          <w:rFonts w:ascii="Consolas" w:hAnsi="Consolas"/>
+          <w:color w:val="D4D4D4"/>
+          <w:sz w:val="21"/>
+          <w:szCs w:val="21"/>
+          <w:lang w:val="en-US"/>
+        </w:rPr>
+        <w:t xml:space="preserve">ecrivain_fk </w:t>
+      </w:r>
+      <w:r>
+        <w:rPr>
+          <w:rFonts w:ascii="Consolas" w:hAnsi="Consolas"/>
+          <w:color w:val="569CD6"/>
+          <w:sz w:val="21"/>
+          <w:szCs w:val="21"/>
+          <w:lang w:val="en-US"/>
+        </w:rPr>
+        <w:t>INT</w:t>
+      </w:r>
+      <w:r>
+        <w:rPr>
+          <w:rFonts w:ascii="Consolas" w:hAnsi="Consolas"/>
+          <w:color w:val="D4D4D4"/>
+          <w:sz w:val="21"/>
+          <w:szCs w:val="21"/>
+          <w:lang w:val="en-US"/>
+        </w:rPr>
+        <w:t xml:space="preserve"> </w:t>
+      </w:r>
+      <w:r>
+        <w:rPr>
+          <w:rFonts w:ascii="Consolas" w:hAnsi="Consolas"/>
+          <w:color w:val="569CD6"/>
+          <w:sz w:val="21"/>
+          <w:szCs w:val="21"/>
+          <w:lang w:val="en-US"/>
+        </w:rPr>
+        <w:t>NOT NULL</w:t>
+      </w:r>
+      <w:r>
+        <w:rPr>
+          <w:rFonts w:ascii="Consolas" w:hAnsi="Consolas"/>
+          <w:color w:val="D4D4D4"/>
+          <w:sz w:val="21"/>
+          <w:szCs w:val="21"/>
+          <w:lang w:val="en-US"/>
+        </w:rPr>
+        <w:t>,</w:t>
+      </w:r>
+    </w:p>
+    <w:p>
+      <w:pPr>
+        <w:shd w:val="clear" w:color="auto" w:fill="1E1E1E"/>
+        <w:spacing w:line="285" w:lineRule="atLeast"/>
+        <w:rPr>
+          <w:rFonts w:ascii="Consolas" w:hAnsi="Consolas"/>
+          <w:color w:val="D4D4D4"/>
+          <w:sz w:val="21"/>
+          <w:szCs w:val="21"/>
+          <w:lang w:val="en-US"/>
+        </w:rPr>
+      </w:pPr>
+      <w:r>
+        <w:rPr>
+          <w:rFonts w:ascii="Consolas" w:hAnsi="Consolas"/>
+          <w:color w:val="D4D4D4"/>
+          <w:sz w:val="21"/>
+          <w:szCs w:val="21"/>
+          <w:lang w:val="en-US"/>
+        </w:rPr>
+        <w:t xml:space="preserve">   categorie_fk </w:t>
+      </w:r>
+      <w:r>
+        <w:rPr>
+          <w:rFonts w:ascii="Consolas" w:hAnsi="Consolas"/>
+          <w:color w:val="569CD6"/>
+          <w:sz w:val="21"/>
+          <w:szCs w:val="21"/>
+          <w:lang w:val="en-US"/>
+        </w:rPr>
+        <w:t>INT</w:t>
+      </w:r>
+      <w:r>
+        <w:rPr>
+          <w:rFonts w:ascii="Consolas" w:hAnsi="Consolas"/>
+          <w:color w:val="D4D4D4"/>
+          <w:sz w:val="21"/>
+          <w:szCs w:val="21"/>
+          <w:lang w:val="en-US"/>
+        </w:rPr>
+        <w:t xml:space="preserve"> </w:t>
+      </w:r>
+      <w:r>
+        <w:rPr>
+          <w:rFonts w:ascii="Consolas" w:hAnsi="Consolas"/>
+          <w:color w:val="569CD6"/>
+          <w:sz w:val="21"/>
+          <w:szCs w:val="21"/>
+          <w:lang w:val="en-US"/>
+        </w:rPr>
+        <w:t>NOT NULL</w:t>
+      </w:r>
+      <w:r>
+        <w:rPr>
+          <w:rFonts w:ascii="Consolas" w:hAnsi="Consolas"/>
+          <w:color w:val="D4D4D4"/>
+          <w:sz w:val="21"/>
+          <w:szCs w:val="21"/>
+          <w:lang w:val="en-US"/>
+        </w:rPr>
+        <w:t>,</w:t>
+      </w:r>
+    </w:p>
+    <w:p>
+      <w:pPr>
+        <w:shd w:val="clear" w:color="auto" w:fill="1E1E1E"/>
+        <w:spacing w:line="285" w:lineRule="atLeast"/>
+        <w:rPr>
+          <w:rFonts w:ascii="Consolas" w:hAnsi="Consolas"/>
+          <w:color w:val="D4D4D4"/>
+          <w:sz w:val="21"/>
+          <w:szCs w:val="21"/>
+        </w:rPr>
+      </w:pPr>
+      <w:r>
+        <w:rPr>
+          <w:rFonts w:ascii="Consolas" w:hAnsi="Consolas"/>
+          <w:color w:val="D4D4D4"/>
+          <w:sz w:val="21"/>
+          <w:szCs w:val="21"/>
+          <w:lang w:val="en-US"/>
+        </w:rPr>
+        <w:t>   </w:t>
+      </w:r>
+      <w:r>
+        <w:rPr>
+          <w:rFonts w:ascii="Consolas" w:hAnsi="Consolas"/>
+          <w:color w:val="569CD6"/>
+          <w:sz w:val="21"/>
+          <w:szCs w:val="21"/>
+        </w:rPr>
+        <w:t>PRIMARY KEY</w:t>
+      </w:r>
+      <w:r>
+        <w:rPr>
+          <w:rFonts w:ascii="Consolas" w:hAnsi="Consolas"/>
+          <w:color w:val="D4D4D4"/>
+          <w:sz w:val="21"/>
+          <w:szCs w:val="21"/>
+        </w:rPr>
+        <w:t>(livre_id),</w:t>
+      </w:r>
+    </w:p>
+    <w:p>
+      <w:pPr>
+        <w:shd w:val="clear" w:color="auto" w:fill="1E1E1E"/>
+        <w:spacing w:line="285" w:lineRule="atLeast"/>
+        <w:rPr>
+          <w:rFonts w:ascii="Consolas" w:hAnsi="Consolas"/>
+          <w:color w:val="D4D4D4"/>
+          <w:sz w:val="21"/>
+          <w:szCs w:val="21"/>
+        </w:rPr>
+      </w:pPr>
+      <w:r>
+        <w:rPr>
+          <w:rFonts w:ascii="Consolas" w:hAnsi="Consolas"/>
+          <w:color w:val="D4D4D4"/>
+          <w:sz w:val="21"/>
+          <w:szCs w:val="21"/>
+        </w:rPr>
+        <w:t>   </w:t>
+      </w:r>
+      <w:r>
+        <w:rPr>
+          <w:rFonts w:ascii="Consolas" w:hAnsi="Consolas"/>
+          <w:color w:val="569CD6"/>
+          <w:sz w:val="21"/>
+          <w:szCs w:val="21"/>
+        </w:rPr>
+        <w:t>UNIQUE</w:t>
+      </w:r>
+      <w:r>
+        <w:rPr>
+          <w:rFonts w:ascii="Consolas" w:hAnsi="Consolas"/>
+          <w:color w:val="D4D4D4"/>
+          <w:sz w:val="21"/>
+          <w:szCs w:val="21"/>
+        </w:rPr>
+        <w:t>(titre),</w:t>
+      </w:r>
+    </w:p>
+    <w:p>
+      <w:pPr>
+        <w:shd w:val="clear" w:color="auto" w:fill="1E1E1E"/>
+        <w:spacing w:line="285" w:lineRule="atLeast"/>
+        <w:rPr>
+          <w:rFonts w:ascii="Consolas" w:hAnsi="Consolas"/>
+          <w:color w:val="D4D4D4"/>
+          <w:sz w:val="21"/>
+          <w:szCs w:val="21"/>
+        </w:rPr>
+      </w:pPr>
+      <w:r>
+        <w:rPr>
+          <w:rFonts w:ascii="Consolas" w:hAnsi="Consolas"/>
+          <w:color w:val="D4D4D4"/>
+          <w:sz w:val="21"/>
+          <w:szCs w:val="21"/>
+        </w:rPr>
+        <w:t>   </w:t>
+      </w:r>
+      <w:r>
+        <w:rPr>
+          <w:rFonts w:ascii="Consolas" w:hAnsi="Consolas"/>
+          <w:color w:val="569CD6"/>
+          <w:sz w:val="21"/>
+          <w:szCs w:val="21"/>
+        </w:rPr>
+        <w:t>UNIQUE</w:t>
+      </w:r>
+      <w:r>
+        <w:rPr>
+          <w:rFonts w:ascii="Consolas" w:hAnsi="Consolas"/>
+          <w:color w:val="D4D4D4"/>
+          <w:sz w:val="21"/>
+          <w:szCs w:val="21"/>
+        </w:rPr>
+        <w:t>(lien_pdf),</w:t>
+      </w:r>
+    </w:p>
+    <w:p>
+      <w:pPr>
+        <w:shd w:val="clear" w:color="auto" w:fill="1E1E1E"/>
+        <w:spacing w:line="285" w:lineRule="atLeast"/>
+        <w:rPr>
+          <w:rFonts w:ascii="Consolas" w:hAnsi="Consolas"/>
+          <w:color w:val="D4D4D4"/>
+          <w:sz w:val="21"/>
+          <w:szCs w:val="21"/>
+        </w:rPr>
+      </w:pPr>
+      <w:r>
+        <w:rPr>
+          <w:rFonts w:ascii="Consolas" w:hAnsi="Consolas"/>
+          <w:color w:val="D4D4D4"/>
+          <w:sz w:val="21"/>
+          <w:szCs w:val="21"/>
+        </w:rPr>
+        <w:t>   </w:t>
+      </w:r>
+      <w:r>
+        <w:rPr>
+          <w:rFonts w:ascii="Consolas" w:hAnsi="Consolas"/>
+          <w:color w:val="569CD6"/>
+          <w:sz w:val="21"/>
+          <w:szCs w:val="21"/>
+        </w:rPr>
+        <w:t>FOREIGN KEY</w:t>
+      </w:r>
+      <w:r>
+        <w:rPr>
+          <w:rFonts w:ascii="Consolas" w:hAnsi="Consolas"/>
+          <w:color w:val="D4D4D4"/>
+          <w:sz w:val="21"/>
+          <w:szCs w:val="21"/>
+        </w:rPr>
+        <w:t xml:space="preserve">(utilisateur_fk) </w:t>
+      </w:r>
+      <w:r>
+        <w:rPr>
+          <w:rFonts w:ascii="Consolas" w:hAnsi="Consolas"/>
+          <w:color w:val="569CD6"/>
+          <w:sz w:val="21"/>
+          <w:szCs w:val="21"/>
+        </w:rPr>
+        <w:t>REFERENCES</w:t>
+      </w:r>
+      <w:r>
+        <w:rPr>
+          <w:rFonts w:ascii="Consolas" w:hAnsi="Consolas"/>
+          <w:color w:val="D4D4D4"/>
+          <w:sz w:val="21"/>
+          <w:szCs w:val="21"/>
+        </w:rPr>
+        <w:t xml:space="preserve"> t_utilisateur(utilisateur_id),</w:t>
+      </w:r>
+    </w:p>
+    <w:p>
+      <w:pPr>
+        <w:shd w:val="clear" w:color="auto" w:fill="1E1E1E"/>
+        <w:spacing w:line="285" w:lineRule="atLeast"/>
+        <w:rPr>
+          <w:rFonts w:ascii="Consolas" w:hAnsi="Consolas"/>
+          <w:color w:val="D4D4D4"/>
+          <w:sz w:val="21"/>
+          <w:szCs w:val="21"/>
+          <w:lang w:val="en-US"/>
+        </w:rPr>
+      </w:pPr>
+      <w:r>
+        <w:rPr>
+          <w:rFonts w:ascii="Consolas" w:hAnsi="Consolas"/>
+          <w:color w:val="D4D4D4"/>
+          <w:sz w:val="21"/>
+          <w:szCs w:val="21"/>
+        </w:rPr>
+        <w:t>   </w:t>
+      </w:r>
+      <w:r>
+        <w:rPr>
+          <w:rFonts w:ascii="Consolas" w:hAnsi="Consolas"/>
+          <w:color w:val="569CD6"/>
+          <w:sz w:val="21"/>
+          <w:szCs w:val="21"/>
+          <w:lang w:val="en-US"/>
+        </w:rPr>
+        <w:t>FOREIGN KEY</w:t>
+      </w:r>
+      <w:r>
+        <w:rPr>
+          <w:rFonts w:ascii="Consolas" w:hAnsi="Consolas"/>
+          <w:color w:val="D4D4D4"/>
+          <w:sz w:val="21"/>
+          <w:szCs w:val="21"/>
+          <w:lang w:val="en-US"/>
+        </w:rPr>
+        <w:t xml:space="preserve">(ecrivain_fk) </w:t>
+      </w:r>
+      <w:r>
+        <w:rPr>
+          <w:rFonts w:ascii="Consolas" w:hAnsi="Consolas"/>
+          <w:color w:val="569CD6"/>
+          <w:sz w:val="21"/>
+          <w:szCs w:val="21"/>
+          <w:lang w:val="en-US"/>
+        </w:rPr>
+        <w:t>REFERENCES</w:t>
+      </w:r>
+      <w:r>
+        <w:rPr>
+          <w:rFonts w:ascii="Consolas" w:hAnsi="Consolas"/>
+          <w:color w:val="D4D4D4"/>
+          <w:sz w:val="21"/>
+          <w:szCs w:val="21"/>
+          <w:lang w:val="en-US"/>
+        </w:rPr>
+        <w:t xml:space="preserve"> t_ecrivain(ecrivain_id),</w:t>
+      </w:r>
+    </w:p>
+    <w:p>
+      <w:pPr>
+        <w:shd w:val="clear" w:color="auto" w:fill="1E1E1E"/>
+        <w:spacing w:line="285" w:lineRule="atLeast"/>
+        <w:rPr>
+          <w:rFonts w:ascii="Consolas" w:hAnsi="Consolas"/>
+          <w:color w:val="D4D4D4"/>
+          <w:sz w:val="21"/>
+          <w:szCs w:val="21"/>
+          <w:lang w:val="en-US"/>
+        </w:rPr>
+      </w:pPr>
+      <w:r>
+        <w:rPr>
+          <w:rFonts w:ascii="Consolas" w:hAnsi="Consolas"/>
+          <w:color w:val="D4D4D4"/>
+          <w:sz w:val="21"/>
+          <w:szCs w:val="21"/>
+          <w:lang w:val="en-US"/>
+        </w:rPr>
         <w:lastRenderedPageBreak/>
         <w:t>   </w:t>
       </w:r>
@@ -3819,7 +5553,7 @@
           <w:szCs w:val="21"/>
           <w:lang w:val="en-US"/>
         </w:rPr>
-        <w:t>PRIMARY KEY</w:t>
+        <w:t>FOREIGN KEY</w:t>
       </w:r>
       <w:r>
         <w:rPr>
@@ -3829,7 +5563,27 @@
           <w:szCs w:val="21"/>
           <w:lang w:val="en-US"/>
         </w:rPr>
-        <w:t>(utilisateur_id),</w:t>
+        <w:t xml:space="preserve">(categorie_fk) </w:t>
+      </w:r>
+      <w:r>
+        <w:rPr>
+          <w:rFonts w:ascii="Consolas" w:hAnsi="Consolas"/>
+          <w:color w:val="569CD6"/>
+          <w:sz w:val="21"/>
+          <w:szCs w:val="21"/>
+          <w:lang w:val="en-US"/>
+        </w:rPr>
+        <w:t>REFERENCES</w:t>
+      </w:r>
+      <w:r>
+        <w:rPr>
+          <w:rFonts w:ascii="Consolas" w:hAnsi="Consolas"/>
+          <w:color w:val="D4D4D4"/>
+          <w:sz w:val="21"/>
+          <w:szCs w:val="21"/>
+          <w:lang w:val="en-US"/>
+        </w:rPr>
+        <w:t xml:space="preserve"> t_categorie(categorie_id)</w:t>
       </w:r>
     </w:p>
     <w:p>
@@ -3841,7 +5595,6 @@
           <w:color w:val="D4D4D4"/>
           <w:sz w:val="21"/>
           <w:szCs w:val="21"/>
-          <w:lang w:val="en-US"/>
         </w:rPr>
       </w:pPr>
       <w:r>
@@ -3850,29 +5603,8 @@
           <w:color w:val="D4D4D4"/>
           <w:sz w:val="21"/>
           <w:szCs w:val="21"/>
-          <w:lang w:val="en-US"/>
-        </w:rPr>
-        <w:t>   </w:t>
-      </w:r>
-      <w:r>
-        <w:rPr>
-          <w:rFonts w:ascii="Consolas" w:hAnsi="Consolas"/>
-          <w:color w:val="569CD6"/>
-          <w:sz w:val="21"/>
-          <w:szCs w:val="21"/>
-          <w:lang w:val="en-US"/>
-        </w:rPr>
-        <w:t>UNIQUE</w:t>
-      </w:r>
-      <w:r>
-        <w:rPr>
-          <w:rFonts w:ascii="Consolas" w:hAnsi="Consolas"/>
-          <w:color w:val="D4D4D4"/>
-          <w:sz w:val="21"/>
-          <w:szCs w:val="21"/>
-          <w:lang w:val="en-US"/>
-        </w:rPr>
-        <w:t>(hashed_password),</w:t>
+        </w:rPr>
+        <w:t>);</w:t>
       </w:r>
     </w:p>
     <w:p>
@@ -3886,34 +5618,6 @@
           <w:szCs w:val="21"/>
         </w:rPr>
       </w:pPr>
-      <w:r>
-        <w:rPr>
-          <w:rFonts w:ascii="Consolas" w:hAnsi="Consolas"/>
-          <w:color w:val="D4D4D4"/>
-          <w:sz w:val="21"/>
-          <w:szCs w:val="21"/>
-          <w:lang w:val="en-US"/>
-        </w:rPr>
-        <w:t>   </w:t>
-      </w:r>
-      <w:r>
-        <w:rPr>
-          <w:rFonts w:ascii="Consolas" w:hAnsi="Consolas"/>
-          <w:color w:val="569CD6"/>
-          <w:sz w:val="21"/>
-          <w:szCs w:val="21"/>
-        </w:rPr>
-        <w:t>UNIQUE</w:t>
-      </w:r>
-      <w:r>
-        <w:rPr>
-          <w:rFonts w:ascii="Consolas" w:hAnsi="Consolas"/>
-          <w:color w:val="D4D4D4"/>
-          <w:sz w:val="21"/>
-          <w:szCs w:val="21"/>
-        </w:rPr>
-        <w:t>(username)</w:t>
-      </w:r>
     </w:p>
     <w:p>
       <w:pPr>
@@ -3929,11 +5633,56 @@
       <w:r>
         <w:rPr>
           <w:rFonts w:ascii="Consolas" w:hAnsi="Consolas"/>
+          <w:color w:val="569CD6"/>
+          <w:sz w:val="21"/>
+          <w:szCs w:val="21"/>
+        </w:rPr>
+        <w:t>CREATE</w:t>
+      </w:r>
+      <w:r>
+        <w:rPr>
+          <w:rFonts w:ascii="Consolas" w:hAnsi="Consolas"/>
           <w:color w:val="D4D4D4"/>
           <w:sz w:val="21"/>
           <w:szCs w:val="21"/>
         </w:rPr>
-        <w:t>);</w:t>
+        <w:t xml:space="preserve"> </w:t>
+      </w:r>
+      <w:r>
+        <w:rPr>
+          <w:rFonts w:ascii="Consolas" w:hAnsi="Consolas"/>
+          <w:color w:val="569CD6"/>
+          <w:sz w:val="21"/>
+          <w:szCs w:val="21"/>
+        </w:rPr>
+        <w:t>TABLE</w:t>
+      </w:r>
+      <w:r>
+        <w:rPr>
+          <w:rFonts w:ascii="Consolas" w:hAnsi="Consolas"/>
+          <w:color w:val="D4D4D4"/>
+          <w:sz w:val="21"/>
+          <w:szCs w:val="21"/>
+        </w:rPr>
+        <w:t xml:space="preserve"> </w:t>
+      </w:r>
+      <w:r>
+        <w:rPr>
+          <w:rFonts w:ascii="Consolas" w:hAnsi="Consolas"/>
+          <w:color w:val="DCDCAA"/>
+          <w:sz w:val="21"/>
+          <w:szCs w:val="21"/>
+        </w:rPr>
+        <w:t>t_evaluer</w:t>
+      </w:r>
+      <w:r>
+        <w:rPr>
+          <w:rFonts w:ascii="Consolas" w:hAnsi="Consolas"/>
+          <w:color w:val="D4D4D4"/>
+          <w:sz w:val="21"/>
+          <w:szCs w:val="21"/>
+        </w:rPr>
+        <w:t>(</w:t>
       </w:r>
     </w:p>
     <w:p>
@@ -3947,6 +5696,33 @@
           <w:szCs w:val="21"/>
         </w:rPr>
       </w:pPr>
+      <w:r>
+        <w:rPr>
+          <w:rFonts w:ascii="Consolas" w:hAnsi="Consolas"/>
+          <w:color w:val="D4D4D4"/>
+          <w:sz w:val="21"/>
+          <w:szCs w:val="21"/>
+        </w:rPr>
+        <w:t xml:space="preserve">   utilisateur_fk </w:t>
+      </w:r>
+      <w:r>
+        <w:rPr>
+          <w:rFonts w:ascii="Consolas" w:hAnsi="Consolas"/>
+          <w:color w:val="569CD6"/>
+          <w:sz w:val="21"/>
+          <w:szCs w:val="21"/>
+        </w:rPr>
+        <w:t>INT</w:t>
+      </w:r>
+      <w:r>
+        <w:rPr>
+          <w:rFonts w:ascii="Consolas" w:hAnsi="Consolas"/>
+          <w:color w:val="D4D4D4"/>
+          <w:sz w:val="21"/>
+          <w:szCs w:val="21"/>
+        </w:rPr>
+        <w:t>,</w:t>
+      </w:r>
     </w:p>
     <w:p>
       <w:pPr>
@@ -3962,11 +5738,20 @@
       <w:r>
         <w:rPr>
           <w:rFonts w:ascii="Consolas" w:hAnsi="Consolas"/>
+          <w:color w:val="D4D4D4"/>
+          <w:sz w:val="21"/>
+          <w:szCs w:val="21"/>
+        </w:rPr>
+        <w:t xml:space="preserve">   livre_fk </w:t>
+      </w:r>
+      <w:r>
+        <w:rPr>
+          <w:rFonts w:ascii="Consolas" w:hAnsi="Consolas"/>
           <w:color w:val="569CD6"/>
           <w:sz w:val="21"/>
           <w:szCs w:val="21"/>
         </w:rPr>
-        <w:t>CREATE</w:t>
+        <w:t>INT</w:t>
       </w:r>
       <w:r>
         <w:rPr>
@@ -3975,43 +5760,7 @@
           <w:sz w:val="21"/>
           <w:szCs w:val="21"/>
         </w:rPr>
-        <w:t xml:space="preserve"> </w:t>
-      </w:r>
-      <w:r>
-        <w:rPr>
-          <w:rFonts w:ascii="Consolas" w:hAnsi="Consolas"/>
-          <w:color w:val="569CD6"/>
-          <w:sz w:val="21"/>
-          <w:szCs w:val="21"/>
-        </w:rPr>
-        <w:t>TABLE</w:t>
-      </w:r>
-      <w:r>
-        <w:rPr>
-          <w:rFonts w:ascii="Consolas" w:hAnsi="Consolas"/>
-          <w:color w:val="D4D4D4"/>
-          <w:sz w:val="21"/>
-          <w:szCs w:val="21"/>
-        </w:rPr>
-        <w:t xml:space="preserve"> </w:t>
-      </w:r>
-      <w:r>
-        <w:rPr>
-          <w:rFonts w:ascii="Consolas" w:hAnsi="Consolas"/>
-          <w:color w:val="DCDCAA"/>
-          <w:sz w:val="21"/>
-          <w:szCs w:val="21"/>
-        </w:rPr>
-        <w:t>t_ecrivain</w:t>
-      </w:r>
-      <w:r>
-        <w:rPr>
-          <w:rFonts w:ascii="Consolas" w:hAnsi="Consolas"/>
-          <w:color w:val="D4D4D4"/>
-          <w:sz w:val="21"/>
-          <w:szCs w:val="21"/>
-        </w:rPr>
-        <w:t>(</w:t>
+        <w:t>,</w:t>
       </w:r>
     </w:p>
     <w:p>
@@ -4032,7 +5781,7 @@
           <w:sz w:val="21"/>
           <w:szCs w:val="21"/>
         </w:rPr>
-        <w:t xml:space="preserve">   ecrivain_id </w:t>
+        <w:t xml:space="preserve">   commentaire </w:t>
       </w:r>
       <w:r>
         <w:rPr>
@@ -4041,7 +5790,7 @@
           <w:sz w:val="21"/>
           <w:szCs w:val="21"/>
         </w:rPr>
-        <w:t>INT</w:t>
+        <w:t>VARCHAR</w:t>
       </w:r>
       <w:r>
         <w:rPr>
@@ -4050,7 +5799,25 @@
           <w:sz w:val="21"/>
           <w:szCs w:val="21"/>
         </w:rPr>
-        <w:t xml:space="preserve"> AUTO_INCREMENT,</w:t>
+        <w:t>(</w:t>
+      </w:r>
+      <w:r>
+        <w:rPr>
+          <w:rFonts w:ascii="Consolas" w:hAnsi="Consolas"/>
+          <w:color w:val="B5CEA8"/>
+          <w:sz w:val="21"/>
+          <w:szCs w:val="21"/>
+        </w:rPr>
+        <w:t>500</w:t>
+      </w:r>
+      <w:r>
+        <w:rPr>
+          <w:rFonts w:ascii="Consolas" w:hAnsi="Consolas"/>
+          <w:color w:val="D4D4D4"/>
+          <w:sz w:val="21"/>
+          <w:szCs w:val="21"/>
+        </w:rPr>
+        <w:t>),</w:t>
       </w:r>
     </w:p>
     <w:p>
@@ -4062,6 +5829,7 @@
           <w:color w:val="D4D4D4"/>
           <w:sz w:val="21"/>
           <w:szCs w:val="21"/>
+          <w:lang w:val="en-US"/>
         </w:rPr>
       </w:pPr>
       <w:r>
@@ -4071,7 +5839,17 @@
           <w:sz w:val="21"/>
           <w:szCs w:val="21"/>
         </w:rPr>
-        <w:t xml:space="preserve">   prenom </w:t>
+        <w:t>   </w:t>
+      </w:r>
+      <w:r>
+        <w:rPr>
+          <w:rFonts w:ascii="Consolas" w:hAnsi="Consolas"/>
+          <w:color w:val="D4D4D4"/>
+          <w:sz w:val="21"/>
+          <w:szCs w:val="21"/>
+          <w:lang w:val="en-US"/>
+        </w:rPr>
+        <w:t xml:space="preserve">note </w:t>
       </w:r>
       <w:r>
         <w:rPr>
@@ -4079,8 +5857,9 @@
           <w:color w:val="569CD6"/>
           <w:sz w:val="21"/>
           <w:szCs w:val="21"/>
-        </w:rPr>
-        <w:t>VARCHAR</w:t>
+          <w:lang w:val="en-US"/>
+        </w:rPr>
+        <w:t>INT</w:t>
       </w:r>
       <w:r>
         <w:rPr>
@@ -4088,8 +5867,49 @@
           <w:color w:val="D4D4D4"/>
           <w:sz w:val="21"/>
           <w:szCs w:val="21"/>
-        </w:rPr>
-        <w:t>(</w:t>
+          <w:lang w:val="en-US"/>
+        </w:rPr>
+        <w:t xml:space="preserve"> </w:t>
+      </w:r>
+      <w:r>
+        <w:rPr>
+          <w:rFonts w:ascii="Consolas" w:hAnsi="Consolas"/>
+          <w:color w:val="569CD6"/>
+          <w:sz w:val="21"/>
+          <w:szCs w:val="21"/>
+          <w:lang w:val="en-US"/>
+        </w:rPr>
+        <w:t>NOT NULL</w:t>
+      </w:r>
+      <w:r>
+        <w:rPr>
+          <w:rFonts w:ascii="Consolas" w:hAnsi="Consolas"/>
+          <w:color w:val="D4D4D4"/>
+          <w:sz w:val="21"/>
+          <w:szCs w:val="21"/>
+          <w:lang w:val="en-US"/>
+        </w:rPr>
+        <w:t xml:space="preserve"> </w:t>
+      </w:r>
+      <w:r>
+        <w:rPr>
+          <w:rFonts w:ascii="Consolas" w:hAnsi="Consolas"/>
+          <w:color w:val="569CD6"/>
+          <w:sz w:val="21"/>
+          <w:szCs w:val="21"/>
+          <w:lang w:val="en-US"/>
+        </w:rPr>
+        <w:t>CHECK</w:t>
+      </w:r>
+      <w:r>
+        <w:rPr>
+          <w:rFonts w:ascii="Consolas" w:hAnsi="Consolas"/>
+          <w:color w:val="D4D4D4"/>
+          <w:sz w:val="21"/>
+          <w:szCs w:val="21"/>
+          <w:lang w:val="en-US"/>
+        </w:rPr>
+        <w:t xml:space="preserve"> (note &gt;= </w:t>
       </w:r>
       <w:r>
         <w:rPr>
@@ -4097,8 +5917,9 @@
           <w:color w:val="B5CEA8"/>
           <w:sz w:val="21"/>
           <w:szCs w:val="21"/>
-        </w:rPr>
-        <w:t>30</w:t>
+          <w:lang w:val="en-US"/>
+        </w:rPr>
+        <w:t>0</w:t>
       </w:r>
       <w:r>
         <w:rPr>
@@ -4106,6 +5927,47 @@
           <w:color w:val="D4D4D4"/>
           <w:sz w:val="21"/>
           <w:szCs w:val="21"/>
+          <w:lang w:val="en-US"/>
+        </w:rPr>
+        <w:t xml:space="preserve"> </w:t>
+      </w:r>
+      <w:r>
+        <w:rPr>
+          <w:rFonts w:ascii="Consolas" w:hAnsi="Consolas"/>
+          <w:color w:val="569CD6"/>
+          <w:sz w:val="21"/>
+          <w:szCs w:val="21"/>
+          <w:lang w:val="en-US"/>
+        </w:rPr>
+        <w:t>AND</w:t>
+      </w:r>
+      <w:r>
+        <w:rPr>
+          <w:rFonts w:ascii="Consolas" w:hAnsi="Consolas"/>
+          <w:color w:val="D4D4D4"/>
+          <w:sz w:val="21"/>
+          <w:szCs w:val="21"/>
+          <w:lang w:val="en-US"/>
+        </w:rPr>
+        <w:t xml:space="preserve"> note &lt;= </w:t>
+      </w:r>
+      <w:r>
+        <w:rPr>
+          <w:rFonts w:ascii="Consolas" w:hAnsi="Consolas"/>
+          <w:color w:val="B5CEA8"/>
+          <w:sz w:val="21"/>
+          <w:szCs w:val="21"/>
+          <w:lang w:val="en-US"/>
+        </w:rPr>
+        <w:t>10</w:t>
+      </w:r>
+      <w:r>
+        <w:rPr>
+          <w:rFonts w:ascii="Consolas" w:hAnsi="Consolas"/>
+          <w:color w:val="D4D4D4"/>
+          <w:sz w:val="21"/>
+          <w:szCs w:val="21"/>
+          <w:lang w:val="en-US"/>
         </w:rPr>
         <w:t>),</w:t>
       </w:r>
@@ -4127,8 +5989,9 @@
           <w:color w:val="D4D4D4"/>
           <w:sz w:val="21"/>
           <w:szCs w:val="21"/>
-        </w:rPr>
-        <w:t xml:space="preserve">   nom_de_famille </w:t>
+          <w:lang w:val="en-US"/>
+        </w:rPr>
+        <w:t>   </w:t>
       </w:r>
       <w:r>
         <w:rPr>
@@ -4137,7 +6000,7 @@
           <w:sz w:val="21"/>
           <w:szCs w:val="21"/>
         </w:rPr>
-        <w:t>VARCHAR</w:t>
+        <w:t>PRIMARY KEY</w:t>
       </w:r>
       <w:r>
         <w:rPr>
@@ -4146,25 +6009,7 @@
           <w:sz w:val="21"/>
           <w:szCs w:val="21"/>
         </w:rPr>
-        <w:t>(</w:t>
-      </w:r>
-      <w:r>
-        <w:rPr>
-          <w:rFonts w:ascii="Consolas" w:hAnsi="Consolas"/>
-          <w:color w:val="B5CEA8"/>
-          <w:sz w:val="21"/>
-          <w:szCs w:val="21"/>
-        </w:rPr>
-        <w:t>30</w:t>
-      </w:r>
-      <w:r>
-        <w:rPr>
-          <w:rFonts w:ascii="Consolas" w:hAnsi="Consolas"/>
-          <w:color w:val="D4D4D4"/>
-          <w:sz w:val="21"/>
-          <w:szCs w:val="21"/>
-        </w:rPr>
-        <w:t>),</w:t>
+        <w:t>(utilisateur_fk, livre_fk),</w:t>
       </w:r>
     </w:p>
     <w:p>
@@ -4194,7 +6039,7 @@
           <w:sz w:val="21"/>
           <w:szCs w:val="21"/>
         </w:rPr>
-        <w:t>PRIMARY KEY</w:t>
+        <w:t>FOREIGN KEY</w:t>
       </w:r>
       <w:r>
         <w:rPr>
@@ -4203,7 +6048,25 @@
           <w:sz w:val="21"/>
           <w:szCs w:val="21"/>
         </w:rPr>
-        <w:t>(ecrivain_id)</w:t>
+        <w:t xml:space="preserve">(utilisateur_fk) </w:t>
+      </w:r>
+      <w:r>
+        <w:rPr>
+          <w:rFonts w:ascii="Consolas" w:hAnsi="Consolas"/>
+          <w:color w:val="569CD6"/>
+          <w:sz w:val="21"/>
+          <w:szCs w:val="21"/>
+        </w:rPr>
+        <w:t>REFERENCES</w:t>
+      </w:r>
+      <w:r>
+        <w:rPr>
+          <w:rFonts w:ascii="Consolas" w:hAnsi="Consolas"/>
+          <w:color w:val="D4D4D4"/>
+          <w:sz w:val="21"/>
+          <w:szCs w:val="21"/>
+        </w:rPr>
+        <w:t xml:space="preserve"> t_utilisateur(utilisateur_id),</w:t>
       </w:r>
     </w:p>
     <w:p>
@@ -4215,7 +6078,6 @@
           <w:color w:val="D4D4D4"/>
           <w:sz w:val="21"/>
           <w:szCs w:val="21"/>
-          <w:lang w:val="en-US"/>
         </w:rPr>
       </w:pPr>
       <w:r>
@@ -4224,9 +6086,44 @@
           <w:color w:val="D4D4D4"/>
           <w:sz w:val="21"/>
           <w:szCs w:val="21"/>
-          <w:lang w:val="en-US"/>
-        </w:rPr>
-        <w:t>);</w:t>
+        </w:rPr>
+        <w:t>   </w:t>
+      </w:r>
+      <w:r>
+        <w:rPr>
+          <w:rFonts w:ascii="Consolas" w:hAnsi="Consolas"/>
+          <w:color w:val="569CD6"/>
+          <w:sz w:val="21"/>
+          <w:szCs w:val="21"/>
+        </w:rPr>
+        <w:t>FOREIGN KEY</w:t>
+      </w:r>
+      <w:r>
+        <w:rPr>
+          <w:rFonts w:ascii="Consolas" w:hAnsi="Consolas"/>
+          <w:color w:val="D4D4D4"/>
+          <w:sz w:val="21"/>
+          <w:szCs w:val="21"/>
+        </w:rPr>
+        <w:t xml:space="preserve">(livre_fk) </w:t>
+      </w:r>
+      <w:r>
+        <w:rPr>
+          <w:rFonts w:ascii="Consolas" w:hAnsi="Consolas"/>
+          <w:color w:val="569CD6"/>
+          <w:sz w:val="21"/>
+          <w:szCs w:val="21"/>
+        </w:rPr>
+        <w:t>REFERENCES</w:t>
+      </w:r>
+      <w:r>
+        <w:rPr>
+          <w:rFonts w:ascii="Consolas" w:hAnsi="Consolas"/>
+          <w:color w:val="D4D4D4"/>
+          <w:sz w:val="21"/>
+          <w:szCs w:val="21"/>
+        </w:rPr>
+        <w:t xml:space="preserve"> t_livre(livre_id)</w:t>
       </w:r>
     </w:p>
     <w:p>
@@ -4238,1923 +6135,23 @@
           <w:color w:val="D4D4D4"/>
           <w:sz w:val="21"/>
           <w:szCs w:val="21"/>
-          <w:lang w:val="en-US"/>
-        </w:rPr>
-      </w:pPr>
-    </w:p>
-    <w:p>
-      <w:pPr>
-        <w:shd w:val="clear" w:color="auto" w:fill="1E1E1E"/>
-        <w:spacing w:line="285" w:lineRule="atLeast"/>
+        </w:rPr>
+      </w:pPr>
+      <w:r>
         <w:rPr>
           <w:rFonts w:ascii="Consolas" w:hAnsi="Consolas"/>
           <w:color w:val="D4D4D4"/>
           <w:sz w:val="21"/>
           <w:szCs w:val="21"/>
-          <w:lang w:val="en-US"/>
-        </w:rPr>
-      </w:pPr>
-      <w:r>
-        <w:rPr>
-          <w:rFonts w:ascii="Consolas" w:hAnsi="Consolas"/>
-          <w:color w:val="569CD6"/>
-          <w:sz w:val="21"/>
-          <w:szCs w:val="21"/>
-          <w:lang w:val="en-US"/>
-        </w:rPr>
-        <w:t>CREATE</w:t>
-      </w:r>
-      <w:r>
-        <w:rPr>
-          <w:rFonts w:ascii="Consolas" w:hAnsi="Consolas"/>
-          <w:color w:val="D4D4D4"/>
-          <w:sz w:val="21"/>
-          <w:szCs w:val="21"/>
-          <w:lang w:val="en-US"/>
-        </w:rPr>
-        <w:t xml:space="preserve"> </w:t>
-      </w:r>
-      <w:r>
-        <w:rPr>
-          <w:rFonts w:ascii="Consolas" w:hAnsi="Consolas"/>
-          <w:color w:val="569CD6"/>
-          <w:sz w:val="21"/>
-          <w:szCs w:val="21"/>
-          <w:lang w:val="en-US"/>
-        </w:rPr>
-        <w:t>TABLE</w:t>
-      </w:r>
-      <w:r>
-        <w:rPr>
-          <w:rFonts w:ascii="Consolas" w:hAnsi="Consolas"/>
-          <w:color w:val="D4D4D4"/>
-          <w:sz w:val="21"/>
-          <w:szCs w:val="21"/>
-          <w:lang w:val="en-US"/>
-        </w:rPr>
-        <w:t xml:space="preserve"> </w:t>
-      </w:r>
-      <w:r>
-        <w:rPr>
-          <w:rFonts w:ascii="Consolas" w:hAnsi="Consolas"/>
-          <w:color w:val="DCDCAA"/>
-          <w:sz w:val="21"/>
-          <w:szCs w:val="21"/>
-          <w:lang w:val="en-US"/>
-        </w:rPr>
-        <w:t>t_categorie</w:t>
-      </w:r>
-      <w:r>
-        <w:rPr>
-          <w:rFonts w:ascii="Consolas" w:hAnsi="Consolas"/>
-          <w:color w:val="D4D4D4"/>
-          <w:sz w:val="21"/>
-          <w:szCs w:val="21"/>
-          <w:lang w:val="en-US"/>
-        </w:rPr>
-        <w:t>(</w:t>
-      </w:r>
-    </w:p>
-    <w:p>
-      <w:pPr>
-        <w:shd w:val="clear" w:color="auto" w:fill="1E1E1E"/>
-        <w:spacing w:line="285" w:lineRule="atLeast"/>
-        <w:rPr>
-          <w:rFonts w:ascii="Consolas" w:hAnsi="Consolas"/>
-          <w:color w:val="D4D4D4"/>
-          <w:sz w:val="21"/>
-          <w:szCs w:val="21"/>
-          <w:lang w:val="en-US"/>
-        </w:rPr>
-      </w:pPr>
-      <w:r>
-        <w:rPr>
-          <w:rFonts w:ascii="Consolas" w:hAnsi="Consolas"/>
-          <w:color w:val="D4D4D4"/>
-          <w:sz w:val="21"/>
-          <w:szCs w:val="21"/>
-          <w:lang w:val="en-US"/>
-        </w:rPr>
-        <w:t xml:space="preserve">   categorie_id </w:t>
-      </w:r>
-      <w:r>
-        <w:rPr>
-          <w:rFonts w:ascii="Consolas" w:hAnsi="Consolas"/>
-          <w:color w:val="569CD6"/>
-          <w:sz w:val="21"/>
-          <w:szCs w:val="21"/>
-          <w:lang w:val="en-US"/>
-        </w:rPr>
-        <w:t>INT</w:t>
-      </w:r>
-      <w:r>
-        <w:rPr>
-          <w:rFonts w:ascii="Consolas" w:hAnsi="Consolas"/>
-          <w:color w:val="D4D4D4"/>
-          <w:sz w:val="21"/>
-          <w:szCs w:val="21"/>
-          <w:lang w:val="en-US"/>
-        </w:rPr>
-        <w:t xml:space="preserve"> AUTO_INCREMENT,</w:t>
-      </w:r>
-    </w:p>
-    <w:p>
-      <w:pPr>
-        <w:shd w:val="clear" w:color="auto" w:fill="1E1E1E"/>
-        <w:spacing w:line="285" w:lineRule="atLeast"/>
-        <w:rPr>
-          <w:rFonts w:ascii="Consolas" w:hAnsi="Consolas"/>
-          <w:color w:val="D4D4D4"/>
-          <w:sz w:val="21"/>
-          <w:szCs w:val="21"/>
-          <w:lang w:val="en-US"/>
-        </w:rPr>
-      </w:pPr>
-      <w:r>
-        <w:rPr>
-          <w:rFonts w:ascii="Consolas" w:hAnsi="Consolas"/>
-          <w:color w:val="D4D4D4"/>
-          <w:sz w:val="21"/>
-          <w:szCs w:val="21"/>
-          <w:lang w:val="en-US"/>
-        </w:rPr>
-        <w:t xml:space="preserve">   nom </w:t>
-      </w:r>
-      <w:r>
-        <w:rPr>
-          <w:rFonts w:ascii="Consolas" w:hAnsi="Consolas"/>
-          <w:color w:val="569CD6"/>
-          <w:sz w:val="21"/>
-          <w:szCs w:val="21"/>
-          <w:lang w:val="en-US"/>
-        </w:rPr>
-        <w:t>VARCHAR</w:t>
-      </w:r>
-      <w:r>
-        <w:rPr>
-          <w:rFonts w:ascii="Consolas" w:hAnsi="Consolas"/>
-          <w:color w:val="D4D4D4"/>
-          <w:sz w:val="21"/>
-          <w:szCs w:val="21"/>
-          <w:lang w:val="en-US"/>
-        </w:rPr>
-        <w:t>(</w:t>
-      </w:r>
-      <w:r>
-        <w:rPr>
-          <w:rFonts w:ascii="Consolas" w:hAnsi="Consolas"/>
-          <w:color w:val="B5CEA8"/>
-          <w:sz w:val="21"/>
-          <w:szCs w:val="21"/>
-          <w:lang w:val="en-US"/>
-        </w:rPr>
-        <w:t>50</w:t>
-      </w:r>
-      <w:r>
-        <w:rPr>
-          <w:rFonts w:ascii="Consolas" w:hAnsi="Consolas"/>
-          <w:color w:val="D4D4D4"/>
-          <w:sz w:val="21"/>
-          <w:szCs w:val="21"/>
-          <w:lang w:val="en-US"/>
-        </w:rPr>
-        <w:t xml:space="preserve">) </w:t>
-      </w:r>
-      <w:r>
-        <w:rPr>
-          <w:rFonts w:ascii="Consolas" w:hAnsi="Consolas"/>
-          <w:color w:val="569CD6"/>
-          <w:sz w:val="21"/>
-          <w:szCs w:val="21"/>
-          <w:lang w:val="en-US"/>
-        </w:rPr>
-        <w:t>NOT NULL</w:t>
-      </w:r>
-      <w:r>
-        <w:rPr>
-          <w:rFonts w:ascii="Consolas" w:hAnsi="Consolas"/>
-          <w:color w:val="D4D4D4"/>
-          <w:sz w:val="21"/>
-          <w:szCs w:val="21"/>
-          <w:lang w:val="en-US"/>
-        </w:rPr>
-        <w:t>,</w:t>
-      </w:r>
-    </w:p>
-    <w:p>
-      <w:pPr>
-        <w:shd w:val="clear" w:color="auto" w:fill="1E1E1E"/>
-        <w:spacing w:line="285" w:lineRule="atLeast"/>
-        <w:rPr>
-          <w:rFonts w:ascii="Consolas" w:hAnsi="Consolas"/>
-          <w:color w:val="D4D4D4"/>
-          <w:sz w:val="21"/>
-          <w:szCs w:val="21"/>
-          <w:lang w:val="en-US"/>
-        </w:rPr>
-      </w:pPr>
-      <w:r>
-        <w:rPr>
-          <w:rFonts w:ascii="Consolas" w:hAnsi="Consolas"/>
-          <w:color w:val="D4D4D4"/>
-          <w:sz w:val="21"/>
-          <w:szCs w:val="21"/>
-          <w:lang w:val="en-US"/>
-        </w:rPr>
-        <w:t>   </w:t>
-      </w:r>
-      <w:r>
-        <w:rPr>
-          <w:rFonts w:ascii="Consolas" w:hAnsi="Consolas"/>
-          <w:color w:val="569CD6"/>
-          <w:sz w:val="21"/>
-          <w:szCs w:val="21"/>
-          <w:lang w:val="en-US"/>
-        </w:rPr>
-        <w:t>PRIMARY KEY</w:t>
-      </w:r>
-      <w:r>
-        <w:rPr>
-          <w:rFonts w:ascii="Consolas" w:hAnsi="Consolas"/>
-          <w:color w:val="D4D4D4"/>
-          <w:sz w:val="21"/>
-          <w:szCs w:val="21"/>
-          <w:lang w:val="en-US"/>
-        </w:rPr>
-        <w:t>(categorie_id),</w:t>
-      </w:r>
-    </w:p>
-    <w:p>
-      <w:pPr>
-        <w:shd w:val="clear" w:color="auto" w:fill="1E1E1E"/>
-        <w:spacing w:line="285" w:lineRule="atLeast"/>
-        <w:rPr>
-          <w:rFonts w:ascii="Consolas" w:hAnsi="Consolas"/>
-          <w:color w:val="D4D4D4"/>
-          <w:sz w:val="21"/>
-          <w:szCs w:val="21"/>
-        </w:rPr>
-      </w:pPr>
-      <w:r>
-        <w:rPr>
-          <w:rFonts w:ascii="Consolas" w:hAnsi="Consolas"/>
-          <w:color w:val="D4D4D4"/>
-          <w:sz w:val="21"/>
-          <w:szCs w:val="21"/>
-          <w:lang w:val="en-US"/>
-        </w:rPr>
-        <w:t>   </w:t>
-      </w:r>
-      <w:r>
-        <w:rPr>
-          <w:rFonts w:ascii="Consolas" w:hAnsi="Consolas"/>
-          <w:color w:val="569CD6"/>
-          <w:sz w:val="21"/>
-          <w:szCs w:val="21"/>
-        </w:rPr>
-        <w:t>UNIQUE</w:t>
-      </w:r>
-      <w:r>
-        <w:rPr>
-          <w:rFonts w:ascii="Consolas" w:hAnsi="Consolas"/>
-          <w:color w:val="D4D4D4"/>
-          <w:sz w:val="21"/>
-          <w:szCs w:val="21"/>
-        </w:rPr>
-        <w:t>(nom)</w:t>
-      </w:r>
-    </w:p>
-    <w:p>
-      <w:pPr>
-        <w:shd w:val="clear" w:color="auto" w:fill="1E1E1E"/>
-        <w:spacing w:line="285" w:lineRule="atLeast"/>
-        <w:rPr>
-          <w:rFonts w:ascii="Consolas" w:hAnsi="Consolas"/>
-          <w:color w:val="D4D4D4"/>
-          <w:sz w:val="21"/>
-          <w:szCs w:val="21"/>
-        </w:rPr>
-      </w:pPr>
-      <w:r>
-        <w:rPr>
-          <w:rFonts w:ascii="Consolas" w:hAnsi="Consolas"/>
-          <w:color w:val="D4D4D4"/>
-          <w:sz w:val="21"/>
-          <w:szCs w:val="21"/>
         </w:rPr>
         <w:t>);</w:t>
       </w:r>
     </w:p>
     <w:p>
       <w:pPr>
-        <w:shd w:val="clear" w:color="auto" w:fill="1E1E1E"/>
-        <w:spacing w:line="285" w:lineRule="atLeast"/>
-        <w:rPr>
-          <w:rFonts w:ascii="Consolas" w:hAnsi="Consolas"/>
-          <w:color w:val="D4D4D4"/>
-          <w:sz w:val="21"/>
-          <w:szCs w:val="21"/>
-        </w:rPr>
-      </w:pPr>
-    </w:p>
-    <w:p>
-      <w:pPr>
-        <w:shd w:val="clear" w:color="auto" w:fill="1E1E1E"/>
-        <w:spacing w:line="285" w:lineRule="atLeast"/>
-        <w:rPr>
-          <w:rFonts w:ascii="Consolas" w:hAnsi="Consolas"/>
-          <w:color w:val="D4D4D4"/>
-          <w:sz w:val="21"/>
-          <w:szCs w:val="21"/>
-        </w:rPr>
-      </w:pPr>
-      <w:r>
-        <w:rPr>
-          <w:rFonts w:ascii="Consolas" w:hAnsi="Consolas"/>
-          <w:color w:val="569CD6"/>
-          <w:sz w:val="21"/>
-          <w:szCs w:val="21"/>
-        </w:rPr>
-        <w:t>CREATE</w:t>
-      </w:r>
-      <w:r>
-        <w:rPr>
-          <w:rFonts w:ascii="Consolas" w:hAnsi="Consolas"/>
-          <w:color w:val="D4D4D4"/>
-          <w:sz w:val="21"/>
-          <w:szCs w:val="21"/>
-        </w:rPr>
-        <w:t xml:space="preserve"> </w:t>
-      </w:r>
-      <w:r>
-        <w:rPr>
-          <w:rFonts w:ascii="Consolas" w:hAnsi="Consolas"/>
-          <w:color w:val="569CD6"/>
-          <w:sz w:val="21"/>
-          <w:szCs w:val="21"/>
-        </w:rPr>
-        <w:t>TABLE</w:t>
-      </w:r>
-      <w:r>
-        <w:rPr>
-          <w:rFonts w:ascii="Consolas" w:hAnsi="Consolas"/>
-          <w:color w:val="D4D4D4"/>
-          <w:sz w:val="21"/>
-          <w:szCs w:val="21"/>
-        </w:rPr>
-        <w:t xml:space="preserve"> </w:t>
-      </w:r>
-      <w:r>
-        <w:rPr>
-          <w:rFonts w:ascii="Consolas" w:hAnsi="Consolas"/>
-          <w:color w:val="DCDCAA"/>
-          <w:sz w:val="21"/>
-          <w:szCs w:val="21"/>
-        </w:rPr>
-        <w:t>t_livre</w:t>
-      </w:r>
-      <w:r>
-        <w:rPr>
-          <w:rFonts w:ascii="Consolas" w:hAnsi="Consolas"/>
-          <w:color w:val="D4D4D4"/>
-          <w:sz w:val="21"/>
-          <w:szCs w:val="21"/>
-        </w:rPr>
-        <w:t>(</w:t>
-      </w:r>
-    </w:p>
-    <w:p>
-      <w:pPr>
-        <w:shd w:val="clear" w:color="auto" w:fill="1E1E1E"/>
-        <w:spacing w:line="285" w:lineRule="atLeast"/>
-        <w:rPr>
-          <w:rFonts w:ascii="Consolas" w:hAnsi="Consolas"/>
-          <w:color w:val="D4D4D4"/>
-          <w:sz w:val="21"/>
-          <w:szCs w:val="21"/>
-          <w:lang w:val="en-US"/>
-        </w:rPr>
-      </w:pPr>
-      <w:r>
-        <w:rPr>
-          <w:rFonts w:ascii="Consolas" w:hAnsi="Consolas"/>
-          <w:color w:val="D4D4D4"/>
-          <w:sz w:val="21"/>
-          <w:szCs w:val="21"/>
-        </w:rPr>
-        <w:t>   </w:t>
-      </w:r>
-      <w:r>
-        <w:rPr>
-          <w:rFonts w:ascii="Consolas" w:hAnsi="Consolas"/>
-          <w:color w:val="D4D4D4"/>
-          <w:sz w:val="21"/>
-          <w:szCs w:val="21"/>
-          <w:lang w:val="en-US"/>
-        </w:rPr>
-        <w:t xml:space="preserve">livre_id </w:t>
-      </w:r>
-      <w:r>
-        <w:rPr>
-          <w:rFonts w:ascii="Consolas" w:hAnsi="Consolas"/>
-          <w:color w:val="569CD6"/>
-          <w:sz w:val="21"/>
-          <w:szCs w:val="21"/>
-          <w:lang w:val="en-US"/>
-        </w:rPr>
-        <w:t>INT</w:t>
-      </w:r>
-      <w:r>
-        <w:rPr>
-          <w:rFonts w:ascii="Consolas" w:hAnsi="Consolas"/>
-          <w:color w:val="D4D4D4"/>
-          <w:sz w:val="21"/>
-          <w:szCs w:val="21"/>
-          <w:lang w:val="en-US"/>
-        </w:rPr>
-        <w:t xml:space="preserve"> AUTO_INCREMENT,</w:t>
-      </w:r>
-    </w:p>
-    <w:p>
-      <w:pPr>
-        <w:shd w:val="clear" w:color="auto" w:fill="1E1E1E"/>
-        <w:spacing w:line="285" w:lineRule="atLeast"/>
-        <w:rPr>
-          <w:rFonts w:ascii="Consolas" w:hAnsi="Consolas"/>
-          <w:color w:val="D4D4D4"/>
-          <w:sz w:val="21"/>
-          <w:szCs w:val="21"/>
-          <w:lang w:val="en-US"/>
-        </w:rPr>
-      </w:pPr>
-      <w:r>
-        <w:rPr>
-          <w:rFonts w:ascii="Consolas" w:hAnsi="Consolas"/>
-          <w:color w:val="D4D4D4"/>
-          <w:sz w:val="21"/>
-          <w:szCs w:val="21"/>
-          <w:lang w:val="en-US"/>
-        </w:rPr>
-        <w:t xml:space="preserve">   titre </w:t>
-      </w:r>
-      <w:r>
-        <w:rPr>
-          <w:rFonts w:ascii="Consolas" w:hAnsi="Consolas"/>
-          <w:color w:val="569CD6"/>
-          <w:sz w:val="21"/>
-          <w:szCs w:val="21"/>
-          <w:lang w:val="en-US"/>
-        </w:rPr>
-        <w:t>VARCHAR</w:t>
-      </w:r>
-      <w:r>
-        <w:rPr>
-          <w:rFonts w:ascii="Consolas" w:hAnsi="Consolas"/>
-          <w:color w:val="D4D4D4"/>
-          <w:sz w:val="21"/>
-          <w:szCs w:val="21"/>
-          <w:lang w:val="en-US"/>
-        </w:rPr>
-        <w:t>(</w:t>
-      </w:r>
-      <w:r>
-        <w:rPr>
-          <w:rFonts w:ascii="Consolas" w:hAnsi="Consolas"/>
-          <w:color w:val="B5CEA8"/>
-          <w:sz w:val="21"/>
-          <w:szCs w:val="21"/>
-          <w:lang w:val="en-US"/>
-        </w:rPr>
-        <w:t>250</w:t>
-      </w:r>
-      <w:r>
-        <w:rPr>
-          <w:rFonts w:ascii="Consolas" w:hAnsi="Consolas"/>
-          <w:color w:val="D4D4D4"/>
-          <w:sz w:val="21"/>
-          <w:szCs w:val="21"/>
-          <w:lang w:val="en-US"/>
-        </w:rPr>
-        <w:t xml:space="preserve">) </w:t>
-      </w:r>
-      <w:r>
-        <w:rPr>
-          <w:rFonts w:ascii="Consolas" w:hAnsi="Consolas"/>
-          <w:color w:val="569CD6"/>
-          <w:sz w:val="21"/>
-          <w:szCs w:val="21"/>
-          <w:lang w:val="en-US"/>
-        </w:rPr>
-        <w:t>NOT NULL</w:t>
-      </w:r>
-      <w:r>
-        <w:rPr>
-          <w:rFonts w:ascii="Consolas" w:hAnsi="Consolas"/>
-          <w:color w:val="D4D4D4"/>
-          <w:sz w:val="21"/>
-          <w:szCs w:val="21"/>
-          <w:lang w:val="en-US"/>
-        </w:rPr>
-        <w:t>,</w:t>
-      </w:r>
-    </w:p>
-    <w:p>
-      <w:pPr>
-        <w:shd w:val="clear" w:color="auto" w:fill="1E1E1E"/>
-        <w:spacing w:line="285" w:lineRule="atLeast"/>
-        <w:rPr>
-          <w:rFonts w:ascii="Consolas" w:hAnsi="Consolas"/>
-          <w:color w:val="D4D4D4"/>
-          <w:sz w:val="21"/>
-          <w:szCs w:val="21"/>
-          <w:lang w:val="en-US"/>
-        </w:rPr>
-      </w:pPr>
-      <w:r>
-        <w:rPr>
-          <w:rFonts w:ascii="Consolas" w:hAnsi="Consolas"/>
-          <w:color w:val="D4D4D4"/>
-          <w:sz w:val="21"/>
-          <w:szCs w:val="21"/>
-          <w:lang w:val="en-US"/>
-        </w:rPr>
-        <w:t xml:space="preserve">   annee_edition </w:t>
-      </w:r>
-      <w:r>
-        <w:rPr>
-          <w:rFonts w:ascii="Consolas" w:hAnsi="Consolas"/>
-          <w:color w:val="569CD6"/>
-          <w:sz w:val="21"/>
-          <w:szCs w:val="21"/>
-          <w:lang w:val="en-US"/>
-        </w:rPr>
-        <w:t>DATE</w:t>
-      </w:r>
-      <w:r>
-        <w:rPr>
-          <w:rFonts w:ascii="Consolas" w:hAnsi="Consolas"/>
-          <w:color w:val="D4D4D4"/>
-          <w:sz w:val="21"/>
-          <w:szCs w:val="21"/>
-          <w:lang w:val="en-US"/>
-        </w:rPr>
-        <w:t>,</w:t>
-      </w:r>
-    </w:p>
-    <w:p>
-      <w:pPr>
-        <w:shd w:val="clear" w:color="auto" w:fill="1E1E1E"/>
-        <w:spacing w:line="285" w:lineRule="atLeast"/>
-        <w:rPr>
-          <w:rFonts w:ascii="Consolas" w:hAnsi="Consolas"/>
-          <w:color w:val="D4D4D4"/>
-          <w:sz w:val="21"/>
-          <w:szCs w:val="21"/>
-        </w:rPr>
-      </w:pPr>
-      <w:r>
-        <w:rPr>
-          <w:rFonts w:ascii="Consolas" w:hAnsi="Consolas"/>
-          <w:color w:val="D4D4D4"/>
-          <w:sz w:val="21"/>
-          <w:szCs w:val="21"/>
-          <w:lang w:val="en-US"/>
-        </w:rPr>
-        <w:t>   </w:t>
-      </w:r>
-      <w:r>
-        <w:rPr>
-          <w:rFonts w:ascii="Consolas" w:hAnsi="Consolas"/>
-          <w:color w:val="D4D4D4"/>
-          <w:sz w:val="21"/>
-          <w:szCs w:val="21"/>
-        </w:rPr>
-        <w:t xml:space="preserve">lien_image </w:t>
-      </w:r>
-      <w:r>
-        <w:rPr>
-          <w:rFonts w:ascii="Consolas" w:hAnsi="Consolas"/>
-          <w:color w:val="569CD6"/>
-          <w:sz w:val="21"/>
-          <w:szCs w:val="21"/>
-        </w:rPr>
-        <w:t>VARCHAR</w:t>
-      </w:r>
-      <w:r>
-        <w:rPr>
-          <w:rFonts w:ascii="Consolas" w:hAnsi="Consolas"/>
-          <w:color w:val="D4D4D4"/>
-          <w:sz w:val="21"/>
-          <w:szCs w:val="21"/>
-        </w:rPr>
-        <w:t>(</w:t>
-      </w:r>
-      <w:r>
-        <w:rPr>
-          <w:rFonts w:ascii="Consolas" w:hAnsi="Consolas"/>
-          <w:color w:val="B5CEA8"/>
-          <w:sz w:val="21"/>
-          <w:szCs w:val="21"/>
-        </w:rPr>
-        <w:t>150</w:t>
-      </w:r>
-      <w:r>
-        <w:rPr>
-          <w:rFonts w:ascii="Consolas" w:hAnsi="Consolas"/>
-          <w:color w:val="D4D4D4"/>
-          <w:sz w:val="21"/>
-          <w:szCs w:val="21"/>
-        </w:rPr>
-        <w:t>),</w:t>
-      </w:r>
-    </w:p>
-    <w:p>
-      <w:pPr>
-        <w:shd w:val="clear" w:color="auto" w:fill="1E1E1E"/>
-        <w:spacing w:line="285" w:lineRule="atLeast"/>
-        <w:rPr>
-          <w:rFonts w:ascii="Consolas" w:hAnsi="Consolas"/>
-          <w:color w:val="D4D4D4"/>
-          <w:sz w:val="21"/>
-          <w:szCs w:val="21"/>
-        </w:rPr>
-      </w:pPr>
-      <w:r>
-        <w:rPr>
-          <w:rFonts w:ascii="Consolas" w:hAnsi="Consolas"/>
-          <w:color w:val="D4D4D4"/>
-          <w:sz w:val="21"/>
-          <w:szCs w:val="21"/>
-        </w:rPr>
-        <w:t xml:space="preserve">   lien_pdf </w:t>
-      </w:r>
-      <w:r>
-        <w:rPr>
-          <w:rFonts w:ascii="Consolas" w:hAnsi="Consolas"/>
-          <w:color w:val="569CD6"/>
-          <w:sz w:val="21"/>
-          <w:szCs w:val="21"/>
-        </w:rPr>
-        <w:t>VARCHAR</w:t>
-      </w:r>
-      <w:r>
-        <w:rPr>
-          <w:rFonts w:ascii="Consolas" w:hAnsi="Consolas"/>
-          <w:color w:val="D4D4D4"/>
-          <w:sz w:val="21"/>
-          <w:szCs w:val="21"/>
-        </w:rPr>
-        <w:t>(</w:t>
-      </w:r>
-      <w:r>
-        <w:rPr>
-          <w:rFonts w:ascii="Consolas" w:hAnsi="Consolas"/>
-          <w:color w:val="B5CEA8"/>
-          <w:sz w:val="21"/>
-          <w:szCs w:val="21"/>
-        </w:rPr>
-        <w:t>150</w:t>
-      </w:r>
-      <w:r>
-        <w:rPr>
-          <w:rFonts w:ascii="Consolas" w:hAnsi="Consolas"/>
-          <w:color w:val="D4D4D4"/>
-          <w:sz w:val="21"/>
-          <w:szCs w:val="21"/>
-        </w:rPr>
-        <w:t>),</w:t>
-      </w:r>
-    </w:p>
-    <w:p>
-      <w:pPr>
-        <w:shd w:val="clear" w:color="auto" w:fill="1E1E1E"/>
-        <w:spacing w:line="285" w:lineRule="atLeast"/>
-        <w:rPr>
-          <w:rFonts w:ascii="Consolas" w:hAnsi="Consolas"/>
-          <w:color w:val="D4D4D4"/>
-          <w:sz w:val="21"/>
-          <w:szCs w:val="21"/>
-        </w:rPr>
-      </w:pPr>
-      <w:r>
-        <w:rPr>
-          <w:rFonts w:ascii="Consolas" w:hAnsi="Consolas"/>
-          <w:color w:val="D4D4D4"/>
-          <w:sz w:val="21"/>
-          <w:szCs w:val="21"/>
-        </w:rPr>
-        <w:t>   </w:t>
-      </w:r>
-      <w:r>
-        <w:rPr>
-          <w:rFonts w:ascii="Consolas" w:hAnsi="Consolas"/>
-          <w:color w:val="569CD6"/>
-          <w:sz w:val="21"/>
-          <w:szCs w:val="21"/>
-        </w:rPr>
-        <w:t>resume</w:t>
-      </w:r>
-      <w:r>
-        <w:rPr>
-          <w:rFonts w:ascii="Consolas" w:hAnsi="Consolas"/>
-          <w:color w:val="D4D4D4"/>
-          <w:sz w:val="21"/>
-          <w:szCs w:val="21"/>
-        </w:rPr>
-        <w:t xml:space="preserve"> </w:t>
-      </w:r>
-      <w:r>
-        <w:rPr>
-          <w:rFonts w:ascii="Consolas" w:hAnsi="Consolas"/>
-          <w:color w:val="569CD6"/>
-          <w:sz w:val="21"/>
-          <w:szCs w:val="21"/>
-        </w:rPr>
-        <w:t>TEXT</w:t>
-      </w:r>
-      <w:r>
-        <w:rPr>
-          <w:rFonts w:ascii="Consolas" w:hAnsi="Consolas"/>
-          <w:color w:val="D4D4D4"/>
-          <w:sz w:val="21"/>
-          <w:szCs w:val="21"/>
-        </w:rPr>
-        <w:t>,</w:t>
-      </w:r>
-    </w:p>
-    <w:p>
-      <w:pPr>
-        <w:shd w:val="clear" w:color="auto" w:fill="1E1E1E"/>
-        <w:spacing w:line="285" w:lineRule="atLeast"/>
-        <w:rPr>
-          <w:rFonts w:ascii="Consolas" w:hAnsi="Consolas"/>
-          <w:color w:val="D4D4D4"/>
-          <w:sz w:val="21"/>
-          <w:szCs w:val="21"/>
-        </w:rPr>
-      </w:pPr>
-      <w:r>
-        <w:rPr>
-          <w:rFonts w:ascii="Consolas" w:hAnsi="Consolas"/>
-          <w:color w:val="D4D4D4"/>
-          <w:sz w:val="21"/>
-          <w:szCs w:val="21"/>
-        </w:rPr>
-        <w:t xml:space="preserve">   editeur </w:t>
-      </w:r>
-      <w:r>
-        <w:rPr>
-          <w:rFonts w:ascii="Consolas" w:hAnsi="Consolas"/>
-          <w:color w:val="569CD6"/>
-          <w:sz w:val="21"/>
-          <w:szCs w:val="21"/>
-        </w:rPr>
-        <w:t>VARCHAR</w:t>
-      </w:r>
-      <w:r>
-        <w:rPr>
-          <w:rFonts w:ascii="Consolas" w:hAnsi="Consolas"/>
-          <w:color w:val="D4D4D4"/>
-          <w:sz w:val="21"/>
-          <w:szCs w:val="21"/>
-        </w:rPr>
-        <w:t>(</w:t>
-      </w:r>
-      <w:r>
-        <w:rPr>
-          <w:rFonts w:ascii="Consolas" w:hAnsi="Consolas"/>
-          <w:color w:val="B5CEA8"/>
-          <w:sz w:val="21"/>
-          <w:szCs w:val="21"/>
-        </w:rPr>
-        <w:t>50</w:t>
-      </w:r>
-      <w:r>
-        <w:rPr>
-          <w:rFonts w:ascii="Consolas" w:hAnsi="Consolas"/>
-          <w:color w:val="D4D4D4"/>
-          <w:sz w:val="21"/>
-          <w:szCs w:val="21"/>
-        </w:rPr>
-        <w:t>),</w:t>
-      </w:r>
-    </w:p>
-    <w:p>
-      <w:pPr>
-        <w:shd w:val="clear" w:color="auto" w:fill="1E1E1E"/>
-        <w:spacing w:line="285" w:lineRule="atLeast"/>
-        <w:rPr>
-          <w:rFonts w:ascii="Consolas" w:hAnsi="Consolas"/>
-          <w:color w:val="D4D4D4"/>
-          <w:sz w:val="21"/>
-          <w:szCs w:val="21"/>
-        </w:rPr>
-      </w:pPr>
-      <w:r>
-        <w:rPr>
-          <w:rFonts w:ascii="Consolas" w:hAnsi="Consolas"/>
-          <w:color w:val="D4D4D4"/>
-          <w:sz w:val="21"/>
-          <w:szCs w:val="21"/>
-        </w:rPr>
-        <w:t xml:space="preserve">   nombre_de_page </w:t>
-      </w:r>
-      <w:r>
-        <w:rPr>
-          <w:rFonts w:ascii="Consolas" w:hAnsi="Consolas"/>
-          <w:color w:val="569CD6"/>
-          <w:sz w:val="21"/>
-          <w:szCs w:val="21"/>
-        </w:rPr>
-        <w:t>INT</w:t>
-      </w:r>
-      <w:r>
-        <w:rPr>
-          <w:rFonts w:ascii="Consolas" w:hAnsi="Consolas"/>
-          <w:color w:val="D4D4D4"/>
-          <w:sz w:val="21"/>
-          <w:szCs w:val="21"/>
-        </w:rPr>
-        <w:t xml:space="preserve"> </w:t>
-      </w:r>
-      <w:r>
-        <w:rPr>
-          <w:rFonts w:ascii="Consolas" w:hAnsi="Consolas"/>
-          <w:color w:val="569CD6"/>
-          <w:sz w:val="21"/>
-          <w:szCs w:val="21"/>
-        </w:rPr>
-        <w:t>NOT NULL</w:t>
-      </w:r>
-      <w:r>
-        <w:rPr>
-          <w:rFonts w:ascii="Consolas" w:hAnsi="Consolas"/>
-          <w:color w:val="D4D4D4"/>
-          <w:sz w:val="21"/>
-          <w:szCs w:val="21"/>
-        </w:rPr>
-        <w:t>,</w:t>
-      </w:r>
-    </w:p>
-    <w:p>
-      <w:pPr>
-        <w:shd w:val="clear" w:color="auto" w:fill="1E1E1E"/>
-        <w:spacing w:line="285" w:lineRule="atLeast"/>
-        <w:rPr>
-          <w:rFonts w:ascii="Consolas" w:hAnsi="Consolas"/>
-          <w:color w:val="D4D4D4"/>
-          <w:sz w:val="21"/>
-          <w:szCs w:val="21"/>
-        </w:rPr>
-      </w:pPr>
-      <w:r>
-        <w:rPr>
-          <w:rFonts w:ascii="Consolas" w:hAnsi="Consolas"/>
-          <w:color w:val="D4D4D4"/>
-          <w:sz w:val="21"/>
-          <w:szCs w:val="21"/>
-        </w:rPr>
-        <w:t xml:space="preserve">   utilisateur_fk </w:t>
-      </w:r>
-      <w:r>
-        <w:rPr>
-          <w:rFonts w:ascii="Consolas" w:hAnsi="Consolas"/>
-          <w:color w:val="569CD6"/>
-          <w:sz w:val="21"/>
-          <w:szCs w:val="21"/>
-        </w:rPr>
-        <w:t>INT</w:t>
-      </w:r>
-      <w:r>
-        <w:rPr>
-          <w:rFonts w:ascii="Consolas" w:hAnsi="Consolas"/>
-          <w:color w:val="D4D4D4"/>
-          <w:sz w:val="21"/>
-          <w:szCs w:val="21"/>
-        </w:rPr>
-        <w:t xml:space="preserve"> </w:t>
-      </w:r>
-      <w:r>
-        <w:rPr>
-          <w:rFonts w:ascii="Consolas" w:hAnsi="Consolas"/>
-          <w:color w:val="569CD6"/>
-          <w:sz w:val="21"/>
-          <w:szCs w:val="21"/>
-        </w:rPr>
-        <w:t>NOT NULL</w:t>
-      </w:r>
-      <w:r>
-        <w:rPr>
-          <w:rFonts w:ascii="Consolas" w:hAnsi="Consolas"/>
-          <w:color w:val="D4D4D4"/>
-          <w:sz w:val="21"/>
-          <w:szCs w:val="21"/>
-        </w:rPr>
-        <w:t>,</w:t>
-      </w:r>
-    </w:p>
-    <w:p>
-      <w:pPr>
-        <w:shd w:val="clear" w:color="auto" w:fill="1E1E1E"/>
-        <w:spacing w:line="285" w:lineRule="atLeast"/>
-        <w:rPr>
-          <w:rFonts w:ascii="Consolas" w:hAnsi="Consolas"/>
-          <w:color w:val="D4D4D4"/>
-          <w:sz w:val="21"/>
-          <w:szCs w:val="21"/>
-          <w:lang w:val="en-US"/>
-        </w:rPr>
-      </w:pPr>
-      <w:r>
-        <w:rPr>
-          <w:rFonts w:ascii="Consolas" w:hAnsi="Consolas"/>
-          <w:color w:val="D4D4D4"/>
-          <w:sz w:val="21"/>
-          <w:szCs w:val="21"/>
-        </w:rPr>
-        <w:t>   </w:t>
-      </w:r>
-      <w:r>
-        <w:rPr>
-          <w:rFonts w:ascii="Consolas" w:hAnsi="Consolas"/>
-          <w:color w:val="D4D4D4"/>
-          <w:sz w:val="21"/>
-          <w:szCs w:val="21"/>
-          <w:lang w:val="en-US"/>
-        </w:rPr>
-        <w:t xml:space="preserve">ecrivain_fk </w:t>
-      </w:r>
-      <w:r>
-        <w:rPr>
-          <w:rFonts w:ascii="Consolas" w:hAnsi="Consolas"/>
-          <w:color w:val="569CD6"/>
-          <w:sz w:val="21"/>
-          <w:szCs w:val="21"/>
-          <w:lang w:val="en-US"/>
-        </w:rPr>
-        <w:t>INT</w:t>
-      </w:r>
-      <w:r>
-        <w:rPr>
-          <w:rFonts w:ascii="Consolas" w:hAnsi="Consolas"/>
-          <w:color w:val="D4D4D4"/>
-          <w:sz w:val="21"/>
-          <w:szCs w:val="21"/>
-          <w:lang w:val="en-US"/>
-        </w:rPr>
-        <w:t xml:space="preserve"> </w:t>
-      </w:r>
-      <w:r>
-        <w:rPr>
-          <w:rFonts w:ascii="Consolas" w:hAnsi="Consolas"/>
-          <w:color w:val="569CD6"/>
-          <w:sz w:val="21"/>
-          <w:szCs w:val="21"/>
-          <w:lang w:val="en-US"/>
-        </w:rPr>
-        <w:t>NOT NULL</w:t>
-      </w:r>
-      <w:r>
-        <w:rPr>
-          <w:rFonts w:ascii="Consolas" w:hAnsi="Consolas"/>
-          <w:color w:val="D4D4D4"/>
-          <w:sz w:val="21"/>
-          <w:szCs w:val="21"/>
-          <w:lang w:val="en-US"/>
-        </w:rPr>
-        <w:t>,</w:t>
-      </w:r>
-    </w:p>
-    <w:p>
-      <w:pPr>
-        <w:shd w:val="clear" w:color="auto" w:fill="1E1E1E"/>
-        <w:spacing w:line="285" w:lineRule="atLeast"/>
-        <w:rPr>
-          <w:rFonts w:ascii="Consolas" w:hAnsi="Consolas"/>
-          <w:color w:val="D4D4D4"/>
-          <w:sz w:val="21"/>
-          <w:szCs w:val="21"/>
-          <w:lang w:val="en-US"/>
-        </w:rPr>
-      </w:pPr>
-      <w:r>
-        <w:rPr>
-          <w:rFonts w:ascii="Consolas" w:hAnsi="Consolas"/>
-          <w:color w:val="D4D4D4"/>
-          <w:sz w:val="21"/>
-          <w:szCs w:val="21"/>
-          <w:lang w:val="en-US"/>
-        </w:rPr>
-        <w:t xml:space="preserve">   categorie_fk </w:t>
-      </w:r>
-      <w:r>
-        <w:rPr>
-          <w:rFonts w:ascii="Consolas" w:hAnsi="Consolas"/>
-          <w:color w:val="569CD6"/>
-          <w:sz w:val="21"/>
-          <w:szCs w:val="21"/>
-          <w:lang w:val="en-US"/>
-        </w:rPr>
-        <w:t>INT</w:t>
-      </w:r>
-      <w:r>
-        <w:rPr>
-          <w:rFonts w:ascii="Consolas" w:hAnsi="Consolas"/>
-          <w:color w:val="D4D4D4"/>
-          <w:sz w:val="21"/>
-          <w:szCs w:val="21"/>
-          <w:lang w:val="en-US"/>
-        </w:rPr>
-        <w:t xml:space="preserve"> </w:t>
-      </w:r>
-      <w:r>
-        <w:rPr>
-          <w:rFonts w:ascii="Consolas" w:hAnsi="Consolas"/>
-          <w:color w:val="569CD6"/>
-          <w:sz w:val="21"/>
-          <w:szCs w:val="21"/>
-          <w:lang w:val="en-US"/>
-        </w:rPr>
-        <w:t>NOT NULL</w:t>
-      </w:r>
-      <w:r>
-        <w:rPr>
-          <w:rFonts w:ascii="Consolas" w:hAnsi="Consolas"/>
-          <w:color w:val="D4D4D4"/>
-          <w:sz w:val="21"/>
-          <w:szCs w:val="21"/>
-          <w:lang w:val="en-US"/>
-        </w:rPr>
-        <w:t>,</w:t>
-      </w:r>
-    </w:p>
-    <w:p>
-      <w:pPr>
-        <w:shd w:val="clear" w:color="auto" w:fill="1E1E1E"/>
-        <w:spacing w:line="285" w:lineRule="atLeast"/>
-        <w:rPr>
-          <w:rFonts w:ascii="Consolas" w:hAnsi="Consolas"/>
-          <w:color w:val="D4D4D4"/>
-          <w:sz w:val="21"/>
-          <w:szCs w:val="21"/>
-        </w:rPr>
-      </w:pPr>
-      <w:r>
-        <w:rPr>
-          <w:rFonts w:ascii="Consolas" w:hAnsi="Consolas"/>
-          <w:color w:val="D4D4D4"/>
-          <w:sz w:val="21"/>
-          <w:szCs w:val="21"/>
-          <w:lang w:val="en-US"/>
-        </w:rPr>
-        <w:t>   </w:t>
-      </w:r>
-      <w:r>
-        <w:rPr>
-          <w:rFonts w:ascii="Consolas" w:hAnsi="Consolas"/>
-          <w:color w:val="569CD6"/>
-          <w:sz w:val="21"/>
-          <w:szCs w:val="21"/>
-        </w:rPr>
-        <w:t>PRIMARY KEY</w:t>
-      </w:r>
-      <w:r>
-        <w:rPr>
-          <w:rFonts w:ascii="Consolas" w:hAnsi="Consolas"/>
-          <w:color w:val="D4D4D4"/>
-          <w:sz w:val="21"/>
-          <w:szCs w:val="21"/>
-        </w:rPr>
-        <w:t>(livre_id),</w:t>
-      </w:r>
-    </w:p>
-    <w:p>
-      <w:pPr>
-        <w:shd w:val="clear" w:color="auto" w:fill="1E1E1E"/>
-        <w:spacing w:line="285" w:lineRule="atLeast"/>
-        <w:rPr>
-          <w:rFonts w:ascii="Consolas" w:hAnsi="Consolas"/>
-          <w:color w:val="D4D4D4"/>
-          <w:sz w:val="21"/>
-          <w:szCs w:val="21"/>
-        </w:rPr>
-      </w:pPr>
-      <w:r>
-        <w:rPr>
-          <w:rFonts w:ascii="Consolas" w:hAnsi="Consolas"/>
-          <w:color w:val="D4D4D4"/>
-          <w:sz w:val="21"/>
-          <w:szCs w:val="21"/>
-        </w:rPr>
-        <w:t>   </w:t>
-      </w:r>
-      <w:r>
-        <w:rPr>
-          <w:rFonts w:ascii="Consolas" w:hAnsi="Consolas"/>
-          <w:color w:val="569CD6"/>
-          <w:sz w:val="21"/>
-          <w:szCs w:val="21"/>
-        </w:rPr>
-        <w:t>UNIQUE</w:t>
-      </w:r>
-      <w:r>
-        <w:rPr>
-          <w:rFonts w:ascii="Consolas" w:hAnsi="Consolas"/>
-          <w:color w:val="D4D4D4"/>
-          <w:sz w:val="21"/>
-          <w:szCs w:val="21"/>
-        </w:rPr>
-        <w:t>(titre),</w:t>
-      </w:r>
-    </w:p>
-    <w:p>
-      <w:pPr>
-        <w:shd w:val="clear" w:color="auto" w:fill="1E1E1E"/>
-        <w:spacing w:line="285" w:lineRule="atLeast"/>
-        <w:rPr>
-          <w:rFonts w:ascii="Consolas" w:hAnsi="Consolas"/>
-          <w:color w:val="D4D4D4"/>
-          <w:sz w:val="21"/>
-          <w:szCs w:val="21"/>
-        </w:rPr>
-      </w:pPr>
-      <w:r>
-        <w:rPr>
-          <w:rFonts w:ascii="Consolas" w:hAnsi="Consolas"/>
-          <w:color w:val="D4D4D4"/>
-          <w:sz w:val="21"/>
-          <w:szCs w:val="21"/>
-        </w:rPr>
-        <w:t>   </w:t>
-      </w:r>
-      <w:r>
-        <w:rPr>
-          <w:rFonts w:ascii="Consolas" w:hAnsi="Consolas"/>
-          <w:color w:val="569CD6"/>
-          <w:sz w:val="21"/>
-          <w:szCs w:val="21"/>
-        </w:rPr>
-        <w:t>UNIQUE</w:t>
-      </w:r>
-      <w:r>
-        <w:rPr>
-          <w:rFonts w:ascii="Consolas" w:hAnsi="Consolas"/>
-          <w:color w:val="D4D4D4"/>
-          <w:sz w:val="21"/>
-          <w:szCs w:val="21"/>
-        </w:rPr>
-        <w:t>(lien_pdf),</w:t>
-      </w:r>
-    </w:p>
-    <w:p>
-      <w:pPr>
-        <w:shd w:val="clear" w:color="auto" w:fill="1E1E1E"/>
-        <w:spacing w:line="285" w:lineRule="atLeast"/>
-        <w:rPr>
-          <w:rFonts w:ascii="Consolas" w:hAnsi="Consolas"/>
-          <w:color w:val="D4D4D4"/>
-          <w:sz w:val="21"/>
-          <w:szCs w:val="21"/>
-        </w:rPr>
-      </w:pPr>
-      <w:r>
-        <w:rPr>
-          <w:rFonts w:ascii="Consolas" w:hAnsi="Consolas"/>
-          <w:color w:val="D4D4D4"/>
-          <w:sz w:val="21"/>
-          <w:szCs w:val="21"/>
-        </w:rPr>
-        <w:t>   </w:t>
-      </w:r>
-      <w:r>
-        <w:rPr>
-          <w:rFonts w:ascii="Consolas" w:hAnsi="Consolas"/>
-          <w:color w:val="569CD6"/>
-          <w:sz w:val="21"/>
-          <w:szCs w:val="21"/>
-        </w:rPr>
-        <w:t>FOREIGN KEY</w:t>
-      </w:r>
-      <w:r>
-        <w:rPr>
-          <w:rFonts w:ascii="Consolas" w:hAnsi="Consolas"/>
-          <w:color w:val="D4D4D4"/>
-          <w:sz w:val="21"/>
-          <w:szCs w:val="21"/>
-        </w:rPr>
-        <w:t xml:space="preserve">(utilisateur_fk) </w:t>
-      </w:r>
-      <w:r>
-        <w:rPr>
-          <w:rFonts w:ascii="Consolas" w:hAnsi="Consolas"/>
-          <w:color w:val="569CD6"/>
-          <w:sz w:val="21"/>
-          <w:szCs w:val="21"/>
-        </w:rPr>
-        <w:t>REFERENCES</w:t>
-      </w:r>
-      <w:r>
-        <w:rPr>
-          <w:rFonts w:ascii="Consolas" w:hAnsi="Consolas"/>
-          <w:color w:val="D4D4D4"/>
-          <w:sz w:val="21"/>
-          <w:szCs w:val="21"/>
-        </w:rPr>
-        <w:t xml:space="preserve"> t_utilisateur(utilisateur_id),</w:t>
-      </w:r>
-    </w:p>
-    <w:p>
-      <w:pPr>
-        <w:shd w:val="clear" w:color="auto" w:fill="1E1E1E"/>
-        <w:spacing w:line="285" w:lineRule="atLeast"/>
-        <w:rPr>
-          <w:rFonts w:ascii="Consolas" w:hAnsi="Consolas"/>
-          <w:color w:val="D4D4D4"/>
-          <w:sz w:val="21"/>
-          <w:szCs w:val="21"/>
-          <w:lang w:val="en-US"/>
-        </w:rPr>
-      </w:pPr>
-      <w:r>
-        <w:rPr>
-          <w:rFonts w:ascii="Consolas" w:hAnsi="Consolas"/>
-          <w:color w:val="D4D4D4"/>
-          <w:sz w:val="21"/>
-          <w:szCs w:val="21"/>
-        </w:rPr>
-        <w:t>   </w:t>
-      </w:r>
-      <w:r>
-        <w:rPr>
-          <w:rFonts w:ascii="Consolas" w:hAnsi="Consolas"/>
-          <w:color w:val="569CD6"/>
-          <w:sz w:val="21"/>
-          <w:szCs w:val="21"/>
-          <w:lang w:val="en-US"/>
-        </w:rPr>
-        <w:t>FOREIGN KEY</w:t>
-      </w:r>
-      <w:r>
-        <w:rPr>
-          <w:rFonts w:ascii="Consolas" w:hAnsi="Consolas"/>
-          <w:color w:val="D4D4D4"/>
-          <w:sz w:val="21"/>
-          <w:szCs w:val="21"/>
-          <w:lang w:val="en-US"/>
-        </w:rPr>
-        <w:t xml:space="preserve">(ecrivain_fk) </w:t>
-      </w:r>
-      <w:r>
-        <w:rPr>
-          <w:rFonts w:ascii="Consolas" w:hAnsi="Consolas"/>
-          <w:color w:val="569CD6"/>
-          <w:sz w:val="21"/>
-          <w:szCs w:val="21"/>
-          <w:lang w:val="en-US"/>
-        </w:rPr>
-        <w:t>REFERENCES</w:t>
-      </w:r>
-      <w:r>
-        <w:rPr>
-          <w:rFonts w:ascii="Consolas" w:hAnsi="Consolas"/>
-          <w:color w:val="D4D4D4"/>
-          <w:sz w:val="21"/>
-          <w:szCs w:val="21"/>
-          <w:lang w:val="en-US"/>
-        </w:rPr>
-        <w:t xml:space="preserve"> t_ecrivain(ecrivain_id),</w:t>
-      </w:r>
-    </w:p>
-    <w:p>
-      <w:pPr>
-        <w:shd w:val="clear" w:color="auto" w:fill="1E1E1E"/>
-        <w:spacing w:line="285" w:lineRule="atLeast"/>
-        <w:rPr>
-          <w:rFonts w:ascii="Consolas" w:hAnsi="Consolas"/>
-          <w:color w:val="D4D4D4"/>
-          <w:sz w:val="21"/>
-          <w:szCs w:val="21"/>
-          <w:lang w:val="en-US"/>
-        </w:rPr>
-      </w:pPr>
-      <w:r>
-        <w:rPr>
-          <w:rFonts w:ascii="Consolas" w:hAnsi="Consolas"/>
-          <w:color w:val="D4D4D4"/>
-          <w:sz w:val="21"/>
-          <w:szCs w:val="21"/>
-          <w:lang w:val="en-US"/>
-        </w:rPr>
-        <w:t>   </w:t>
-      </w:r>
-      <w:r>
-        <w:rPr>
-          <w:rFonts w:ascii="Consolas" w:hAnsi="Consolas"/>
-          <w:color w:val="569CD6"/>
-          <w:sz w:val="21"/>
-          <w:szCs w:val="21"/>
-          <w:lang w:val="en-US"/>
-        </w:rPr>
-        <w:t>FOREIGN KEY</w:t>
-      </w:r>
-      <w:r>
-        <w:rPr>
-          <w:rFonts w:ascii="Consolas" w:hAnsi="Consolas"/>
-          <w:color w:val="D4D4D4"/>
-          <w:sz w:val="21"/>
-          <w:szCs w:val="21"/>
-          <w:lang w:val="en-US"/>
-        </w:rPr>
-        <w:t xml:space="preserve">(categorie_fk) </w:t>
-      </w:r>
-      <w:r>
-        <w:rPr>
-          <w:rFonts w:ascii="Consolas" w:hAnsi="Consolas"/>
-          <w:color w:val="569CD6"/>
-          <w:sz w:val="21"/>
-          <w:szCs w:val="21"/>
-          <w:lang w:val="en-US"/>
-        </w:rPr>
-        <w:t>REFERENCES</w:t>
-      </w:r>
-      <w:r>
-        <w:rPr>
-          <w:rFonts w:ascii="Consolas" w:hAnsi="Consolas"/>
-          <w:color w:val="D4D4D4"/>
-          <w:sz w:val="21"/>
-          <w:szCs w:val="21"/>
-          <w:lang w:val="en-US"/>
-        </w:rPr>
-        <w:t xml:space="preserve"> t_categorie(categorie_id)</w:t>
-      </w:r>
-    </w:p>
-    <w:p>
-      <w:pPr>
-        <w:shd w:val="clear" w:color="auto" w:fill="1E1E1E"/>
-        <w:spacing w:line="285" w:lineRule="atLeast"/>
-        <w:rPr>
-          <w:rFonts w:ascii="Consolas" w:hAnsi="Consolas"/>
-          <w:color w:val="D4D4D4"/>
-          <w:sz w:val="21"/>
-          <w:szCs w:val="21"/>
-        </w:rPr>
-      </w:pPr>
-      <w:r>
-        <w:rPr>
-          <w:rFonts w:ascii="Consolas" w:hAnsi="Consolas"/>
-          <w:color w:val="D4D4D4"/>
-          <w:sz w:val="21"/>
-          <w:szCs w:val="21"/>
-        </w:rPr>
-        <w:t>);</w:t>
-      </w:r>
-    </w:p>
-    <w:p>
-      <w:pPr>
-        <w:shd w:val="clear" w:color="auto" w:fill="1E1E1E"/>
-        <w:spacing w:line="285" w:lineRule="atLeast"/>
-        <w:rPr>
-          <w:rFonts w:ascii="Consolas" w:hAnsi="Consolas"/>
-          <w:color w:val="D4D4D4"/>
-          <w:sz w:val="21"/>
-          <w:szCs w:val="21"/>
-        </w:rPr>
-      </w:pPr>
-    </w:p>
-    <w:p>
-      <w:pPr>
-        <w:shd w:val="clear" w:color="auto" w:fill="1E1E1E"/>
-        <w:spacing w:line="285" w:lineRule="atLeast"/>
-        <w:rPr>
-          <w:rFonts w:ascii="Consolas" w:hAnsi="Consolas"/>
-          <w:color w:val="D4D4D4"/>
-          <w:sz w:val="21"/>
-          <w:szCs w:val="21"/>
-        </w:rPr>
-      </w:pPr>
-      <w:r>
-        <w:rPr>
-          <w:rFonts w:ascii="Consolas" w:hAnsi="Consolas"/>
-          <w:color w:val="569CD6"/>
-          <w:sz w:val="21"/>
-          <w:szCs w:val="21"/>
-        </w:rPr>
-        <w:t>CREATE</w:t>
-      </w:r>
-      <w:r>
-        <w:rPr>
-          <w:rFonts w:ascii="Consolas" w:hAnsi="Consolas"/>
-          <w:color w:val="D4D4D4"/>
-          <w:sz w:val="21"/>
-          <w:szCs w:val="21"/>
-        </w:rPr>
-        <w:t xml:space="preserve"> </w:t>
-      </w:r>
-      <w:r>
-        <w:rPr>
-          <w:rFonts w:ascii="Consolas" w:hAnsi="Consolas"/>
-          <w:color w:val="569CD6"/>
-          <w:sz w:val="21"/>
-          <w:szCs w:val="21"/>
-        </w:rPr>
-        <w:t>TABLE</w:t>
-      </w:r>
-      <w:r>
-        <w:rPr>
-          <w:rFonts w:ascii="Consolas" w:hAnsi="Consolas"/>
-          <w:color w:val="D4D4D4"/>
-          <w:sz w:val="21"/>
-          <w:szCs w:val="21"/>
-        </w:rPr>
-        <w:t xml:space="preserve"> </w:t>
-      </w:r>
-      <w:r>
-        <w:rPr>
-          <w:rFonts w:ascii="Consolas" w:hAnsi="Consolas"/>
-          <w:color w:val="DCDCAA"/>
-          <w:sz w:val="21"/>
-          <w:szCs w:val="21"/>
-        </w:rPr>
-        <w:t>t_evaluer</w:t>
-      </w:r>
-      <w:r>
-        <w:rPr>
-          <w:rFonts w:ascii="Consolas" w:hAnsi="Consolas"/>
-          <w:color w:val="D4D4D4"/>
-          <w:sz w:val="21"/>
-          <w:szCs w:val="21"/>
-        </w:rPr>
-        <w:t>(</w:t>
-      </w:r>
-    </w:p>
-    <w:p>
-      <w:pPr>
-        <w:shd w:val="clear" w:color="auto" w:fill="1E1E1E"/>
-        <w:spacing w:line="285" w:lineRule="atLeast"/>
-        <w:rPr>
-          <w:rFonts w:ascii="Consolas" w:hAnsi="Consolas"/>
-          <w:color w:val="D4D4D4"/>
-          <w:sz w:val="21"/>
-          <w:szCs w:val="21"/>
-        </w:rPr>
-      </w:pPr>
-      <w:r>
-        <w:rPr>
-          <w:rFonts w:ascii="Consolas" w:hAnsi="Consolas"/>
-          <w:color w:val="D4D4D4"/>
-          <w:sz w:val="21"/>
-          <w:szCs w:val="21"/>
-        </w:rPr>
-        <w:t xml:space="preserve">   utilisateur_fk </w:t>
-      </w:r>
-      <w:r>
-        <w:rPr>
-          <w:rFonts w:ascii="Consolas" w:hAnsi="Consolas"/>
-          <w:color w:val="569CD6"/>
-          <w:sz w:val="21"/>
-          <w:szCs w:val="21"/>
-        </w:rPr>
-        <w:t>INT</w:t>
-      </w:r>
-      <w:r>
-        <w:rPr>
-          <w:rFonts w:ascii="Consolas" w:hAnsi="Consolas"/>
-          <w:color w:val="D4D4D4"/>
-          <w:sz w:val="21"/>
-          <w:szCs w:val="21"/>
-        </w:rPr>
-        <w:t>,</w:t>
-      </w:r>
-    </w:p>
-    <w:p>
-      <w:pPr>
-        <w:shd w:val="clear" w:color="auto" w:fill="1E1E1E"/>
-        <w:spacing w:line="285" w:lineRule="atLeast"/>
-        <w:rPr>
-          <w:rFonts w:ascii="Consolas" w:hAnsi="Consolas"/>
-          <w:color w:val="D4D4D4"/>
-          <w:sz w:val="21"/>
-          <w:szCs w:val="21"/>
-        </w:rPr>
-      </w:pPr>
-      <w:r>
-        <w:rPr>
-          <w:rFonts w:ascii="Consolas" w:hAnsi="Consolas"/>
-          <w:color w:val="D4D4D4"/>
-          <w:sz w:val="21"/>
-          <w:szCs w:val="21"/>
-        </w:rPr>
-        <w:t xml:space="preserve">   livre_fk </w:t>
-      </w:r>
-      <w:r>
-        <w:rPr>
-          <w:rFonts w:ascii="Consolas" w:hAnsi="Consolas"/>
-          <w:color w:val="569CD6"/>
-          <w:sz w:val="21"/>
-          <w:szCs w:val="21"/>
-        </w:rPr>
-        <w:t>INT</w:t>
-      </w:r>
-      <w:r>
-        <w:rPr>
-          <w:rFonts w:ascii="Consolas" w:hAnsi="Consolas"/>
-          <w:color w:val="D4D4D4"/>
-          <w:sz w:val="21"/>
-          <w:szCs w:val="21"/>
-        </w:rPr>
-        <w:t>,</w:t>
-      </w:r>
-    </w:p>
-    <w:p>
-      <w:pPr>
-        <w:shd w:val="clear" w:color="auto" w:fill="1E1E1E"/>
-        <w:spacing w:line="285" w:lineRule="atLeast"/>
-        <w:rPr>
-          <w:rFonts w:ascii="Consolas" w:hAnsi="Consolas"/>
-          <w:color w:val="D4D4D4"/>
-          <w:sz w:val="21"/>
-          <w:szCs w:val="21"/>
-        </w:rPr>
-      </w:pPr>
-      <w:r>
-        <w:rPr>
-          <w:rFonts w:ascii="Consolas" w:hAnsi="Consolas"/>
-          <w:color w:val="D4D4D4"/>
-          <w:sz w:val="21"/>
-          <w:szCs w:val="21"/>
-        </w:rPr>
-        <w:t xml:space="preserve">   commentaire </w:t>
-      </w:r>
-      <w:r>
-        <w:rPr>
-          <w:rFonts w:ascii="Consolas" w:hAnsi="Consolas"/>
-          <w:color w:val="569CD6"/>
-          <w:sz w:val="21"/>
-          <w:szCs w:val="21"/>
-        </w:rPr>
-        <w:t>VARCHAR</w:t>
-      </w:r>
-      <w:r>
-        <w:rPr>
-          <w:rFonts w:ascii="Consolas" w:hAnsi="Consolas"/>
-          <w:color w:val="D4D4D4"/>
-          <w:sz w:val="21"/>
-          <w:szCs w:val="21"/>
-        </w:rPr>
-        <w:t>(</w:t>
-      </w:r>
-      <w:r>
-        <w:rPr>
-          <w:rFonts w:ascii="Consolas" w:hAnsi="Consolas"/>
-          <w:color w:val="B5CEA8"/>
-          <w:sz w:val="21"/>
-          <w:szCs w:val="21"/>
-        </w:rPr>
-        <w:t>500</w:t>
-      </w:r>
-      <w:r>
-        <w:rPr>
-          <w:rFonts w:ascii="Consolas" w:hAnsi="Consolas"/>
-          <w:color w:val="D4D4D4"/>
-          <w:sz w:val="21"/>
-          <w:szCs w:val="21"/>
-        </w:rPr>
-        <w:t>),</w:t>
-      </w:r>
-    </w:p>
-    <w:p>
-      <w:pPr>
-        <w:shd w:val="clear" w:color="auto" w:fill="1E1E1E"/>
-        <w:spacing w:line="285" w:lineRule="atLeast"/>
-        <w:rPr>
-          <w:rFonts w:ascii="Consolas" w:hAnsi="Consolas"/>
-          <w:color w:val="D4D4D4"/>
-          <w:sz w:val="21"/>
-          <w:szCs w:val="21"/>
-          <w:lang w:val="en-US"/>
-        </w:rPr>
-      </w:pPr>
-      <w:r>
-        <w:rPr>
-          <w:rFonts w:ascii="Consolas" w:hAnsi="Consolas"/>
-          <w:color w:val="D4D4D4"/>
-          <w:sz w:val="21"/>
-          <w:szCs w:val="21"/>
-        </w:rPr>
-        <w:t>   </w:t>
-      </w:r>
-      <w:r>
-        <w:rPr>
-          <w:rFonts w:ascii="Consolas" w:hAnsi="Consolas"/>
-          <w:color w:val="D4D4D4"/>
-          <w:sz w:val="21"/>
-          <w:szCs w:val="21"/>
-          <w:lang w:val="en-US"/>
-        </w:rPr>
-        <w:t xml:space="preserve">note </w:t>
-      </w:r>
-      <w:r>
-        <w:rPr>
-          <w:rFonts w:ascii="Consolas" w:hAnsi="Consolas"/>
-          <w:color w:val="569CD6"/>
-          <w:sz w:val="21"/>
-          <w:szCs w:val="21"/>
-          <w:lang w:val="en-US"/>
-        </w:rPr>
-        <w:t>INT</w:t>
-      </w:r>
-      <w:r>
-        <w:rPr>
-          <w:rFonts w:ascii="Consolas" w:hAnsi="Consolas"/>
-          <w:color w:val="D4D4D4"/>
-          <w:sz w:val="21"/>
-          <w:szCs w:val="21"/>
-          <w:lang w:val="en-US"/>
-        </w:rPr>
-        <w:t xml:space="preserve"> </w:t>
-      </w:r>
-      <w:r>
-        <w:rPr>
-          <w:rFonts w:ascii="Consolas" w:hAnsi="Consolas"/>
-          <w:color w:val="569CD6"/>
-          <w:sz w:val="21"/>
-          <w:szCs w:val="21"/>
-          <w:lang w:val="en-US"/>
-        </w:rPr>
-        <w:t>NOT NULL</w:t>
-      </w:r>
-      <w:r>
-        <w:rPr>
-          <w:rFonts w:ascii="Consolas" w:hAnsi="Consolas"/>
-          <w:color w:val="D4D4D4"/>
-          <w:sz w:val="21"/>
-          <w:szCs w:val="21"/>
-          <w:lang w:val="en-US"/>
-        </w:rPr>
-        <w:t xml:space="preserve"> </w:t>
-      </w:r>
-      <w:r>
-        <w:rPr>
-          <w:rFonts w:ascii="Consolas" w:hAnsi="Consolas"/>
-          <w:color w:val="569CD6"/>
-          <w:sz w:val="21"/>
-          <w:szCs w:val="21"/>
-          <w:lang w:val="en-US"/>
-        </w:rPr>
-        <w:t>CHECK</w:t>
-      </w:r>
-      <w:r>
-        <w:rPr>
-          <w:rFonts w:ascii="Consolas" w:hAnsi="Consolas"/>
-          <w:color w:val="D4D4D4"/>
-          <w:sz w:val="21"/>
-          <w:szCs w:val="21"/>
-          <w:lang w:val="en-US"/>
-        </w:rPr>
-        <w:t xml:space="preserve"> (note &gt;= </w:t>
-      </w:r>
-      <w:r>
-        <w:rPr>
-          <w:rFonts w:ascii="Consolas" w:hAnsi="Consolas"/>
-          <w:color w:val="B5CEA8"/>
-          <w:sz w:val="21"/>
-          <w:szCs w:val="21"/>
-          <w:lang w:val="en-US"/>
-        </w:rPr>
-        <w:t>0</w:t>
-      </w:r>
-      <w:r>
-        <w:rPr>
-          <w:rFonts w:ascii="Consolas" w:hAnsi="Consolas"/>
-          <w:color w:val="D4D4D4"/>
-          <w:sz w:val="21"/>
-          <w:szCs w:val="21"/>
-          <w:lang w:val="en-US"/>
-        </w:rPr>
-        <w:t xml:space="preserve"> </w:t>
-      </w:r>
-      <w:r>
-        <w:rPr>
-          <w:rFonts w:ascii="Consolas" w:hAnsi="Consolas"/>
-          <w:color w:val="569CD6"/>
-          <w:sz w:val="21"/>
-          <w:szCs w:val="21"/>
-          <w:lang w:val="en-US"/>
-        </w:rPr>
-        <w:t>AND</w:t>
-      </w:r>
-      <w:r>
-        <w:rPr>
-          <w:rFonts w:ascii="Consolas" w:hAnsi="Consolas"/>
-          <w:color w:val="D4D4D4"/>
-          <w:sz w:val="21"/>
-          <w:szCs w:val="21"/>
-          <w:lang w:val="en-US"/>
-        </w:rPr>
-        <w:t xml:space="preserve"> note &lt;= </w:t>
-      </w:r>
-      <w:r>
-        <w:rPr>
-          <w:rFonts w:ascii="Consolas" w:hAnsi="Consolas"/>
-          <w:color w:val="B5CEA8"/>
-          <w:sz w:val="21"/>
-          <w:szCs w:val="21"/>
-          <w:lang w:val="en-US"/>
-        </w:rPr>
-        <w:t>10</w:t>
-      </w:r>
-      <w:r>
-        <w:rPr>
-          <w:rFonts w:ascii="Consolas" w:hAnsi="Consolas"/>
-          <w:color w:val="D4D4D4"/>
-          <w:sz w:val="21"/>
-          <w:szCs w:val="21"/>
-          <w:lang w:val="en-US"/>
-        </w:rPr>
-        <w:t>),</w:t>
-      </w:r>
-    </w:p>
-    <w:p>
-      <w:pPr>
-        <w:shd w:val="clear" w:color="auto" w:fill="1E1E1E"/>
-        <w:spacing w:line="285" w:lineRule="atLeast"/>
-        <w:rPr>
-          <w:rFonts w:ascii="Consolas" w:hAnsi="Consolas"/>
-          <w:color w:val="D4D4D4"/>
-          <w:sz w:val="21"/>
-          <w:szCs w:val="21"/>
-        </w:rPr>
-      </w:pPr>
-      <w:r>
-        <w:rPr>
-          <w:rFonts w:ascii="Consolas" w:hAnsi="Consolas"/>
-          <w:color w:val="D4D4D4"/>
-          <w:sz w:val="21"/>
-          <w:szCs w:val="21"/>
-          <w:lang w:val="en-US"/>
-        </w:rPr>
-        <w:t>   </w:t>
-      </w:r>
-      <w:r>
-        <w:rPr>
-          <w:rFonts w:ascii="Consolas" w:hAnsi="Consolas"/>
-          <w:color w:val="569CD6"/>
-          <w:sz w:val="21"/>
-          <w:szCs w:val="21"/>
-        </w:rPr>
-        <w:t>PRIMARY KEY</w:t>
-      </w:r>
-      <w:r>
-        <w:rPr>
-          <w:rFonts w:ascii="Consolas" w:hAnsi="Consolas"/>
-          <w:color w:val="D4D4D4"/>
-          <w:sz w:val="21"/>
-          <w:szCs w:val="21"/>
-        </w:rPr>
-        <w:t>(utilisateur_fk, livre_fk),</w:t>
-      </w:r>
-    </w:p>
-    <w:p>
-      <w:pPr>
-        <w:shd w:val="clear" w:color="auto" w:fill="1E1E1E"/>
-        <w:spacing w:line="285" w:lineRule="atLeast"/>
-        <w:rPr>
-          <w:rFonts w:ascii="Consolas" w:hAnsi="Consolas"/>
-          <w:color w:val="D4D4D4"/>
-          <w:sz w:val="21"/>
-          <w:szCs w:val="21"/>
-        </w:rPr>
-      </w:pPr>
-      <w:r>
-        <w:rPr>
-          <w:rFonts w:ascii="Consolas" w:hAnsi="Consolas"/>
-          <w:color w:val="D4D4D4"/>
-          <w:sz w:val="21"/>
-          <w:szCs w:val="21"/>
-        </w:rPr>
-        <w:t>   </w:t>
-      </w:r>
-      <w:r>
-        <w:rPr>
-          <w:rFonts w:ascii="Consolas" w:hAnsi="Consolas"/>
-          <w:color w:val="569CD6"/>
-          <w:sz w:val="21"/>
-          <w:szCs w:val="21"/>
-        </w:rPr>
-        <w:t>FOREIGN KEY</w:t>
-      </w:r>
-      <w:r>
-        <w:rPr>
-          <w:rFonts w:ascii="Consolas" w:hAnsi="Consolas"/>
-          <w:color w:val="D4D4D4"/>
-          <w:sz w:val="21"/>
-          <w:szCs w:val="21"/>
-        </w:rPr>
-        <w:t xml:space="preserve">(utilisateur_fk) </w:t>
-      </w:r>
-      <w:r>
-        <w:rPr>
-          <w:rFonts w:ascii="Consolas" w:hAnsi="Consolas"/>
-          <w:color w:val="569CD6"/>
-          <w:sz w:val="21"/>
-          <w:szCs w:val="21"/>
-        </w:rPr>
-        <w:t>REFERENCES</w:t>
-      </w:r>
-      <w:r>
-        <w:rPr>
-          <w:rFonts w:ascii="Consolas" w:hAnsi="Consolas"/>
-          <w:color w:val="D4D4D4"/>
-          <w:sz w:val="21"/>
-          <w:szCs w:val="21"/>
-        </w:rPr>
-        <w:t xml:space="preserve"> t_utilisateur(utilisateur_id),</w:t>
-      </w:r>
-    </w:p>
-    <w:p>
-      <w:pPr>
-        <w:shd w:val="clear" w:color="auto" w:fill="1E1E1E"/>
-        <w:spacing w:line="285" w:lineRule="atLeast"/>
-        <w:rPr>
-          <w:rFonts w:ascii="Consolas" w:hAnsi="Consolas"/>
-          <w:color w:val="D4D4D4"/>
-          <w:sz w:val="21"/>
-          <w:szCs w:val="21"/>
-        </w:rPr>
-      </w:pPr>
-      <w:r>
-        <w:rPr>
-          <w:rFonts w:ascii="Consolas" w:hAnsi="Consolas"/>
-          <w:color w:val="D4D4D4"/>
-          <w:sz w:val="21"/>
-          <w:szCs w:val="21"/>
-        </w:rPr>
-        <w:t>   </w:t>
-      </w:r>
-      <w:r>
-        <w:rPr>
-          <w:rFonts w:ascii="Consolas" w:hAnsi="Consolas"/>
-          <w:color w:val="569CD6"/>
-          <w:sz w:val="21"/>
-          <w:szCs w:val="21"/>
-        </w:rPr>
-        <w:t>FOREIGN KEY</w:t>
-      </w:r>
-      <w:r>
-        <w:rPr>
-          <w:rFonts w:ascii="Consolas" w:hAnsi="Consolas"/>
-          <w:color w:val="D4D4D4"/>
-          <w:sz w:val="21"/>
-          <w:szCs w:val="21"/>
-        </w:rPr>
-        <w:t xml:space="preserve">(livre_fk) </w:t>
-      </w:r>
-      <w:r>
-        <w:rPr>
-          <w:rFonts w:ascii="Consolas" w:hAnsi="Consolas"/>
-          <w:color w:val="569CD6"/>
-          <w:sz w:val="21"/>
-          <w:szCs w:val="21"/>
-        </w:rPr>
-        <w:t>REFERENCES</w:t>
-      </w:r>
-      <w:r>
-        <w:rPr>
-          <w:rFonts w:ascii="Consolas" w:hAnsi="Consolas"/>
-          <w:color w:val="D4D4D4"/>
-          <w:sz w:val="21"/>
-          <w:szCs w:val="21"/>
-        </w:rPr>
-        <w:t xml:space="preserve"> t_livre(livre_id)</w:t>
-      </w:r>
-    </w:p>
-    <w:p>
-      <w:pPr>
-        <w:shd w:val="clear" w:color="auto" w:fill="1E1E1E"/>
-        <w:spacing w:line="285" w:lineRule="atLeast"/>
-        <w:rPr>
-          <w:rFonts w:ascii="Consolas" w:hAnsi="Consolas"/>
-          <w:color w:val="D4D4D4"/>
-          <w:sz w:val="21"/>
-          <w:szCs w:val="21"/>
-        </w:rPr>
-      </w:pPr>
-      <w:r>
-        <w:rPr>
-          <w:rFonts w:ascii="Consolas" w:hAnsi="Consolas"/>
-          <w:color w:val="D4D4D4"/>
-          <w:sz w:val="21"/>
-          <w:szCs w:val="21"/>
-        </w:rPr>
-        <w:t>);</w:t>
-      </w:r>
-    </w:p>
-    <w:p>
-      <w:pPr>
         <w:pStyle w:val="Titre2"/>
       </w:pPr>
       <w:r>
-        <w:lastRenderedPageBreak/>
         <w:t>A</w:t>
       </w:r>
       <w:r>
@@ -6502,7 +6499,6 @@
           <w:rStyle w:val="lev"/>
           <w:rFonts w:ascii="Bookman Old Style" w:hAnsi="Bookman Old Style"/>
         </w:rPr>
-        <w:lastRenderedPageBreak/>
         <w:t>Vue Router</w:t>
       </w:r>
       <w:r>
@@ -6639,6 +6635,7 @@
       </w:pPr>
       <w:bookmarkStart w:id="13" w:name="_Toc198654067"/>
       <w:r>
+        <w:lastRenderedPageBreak/>
         <w:t>Réalisation</w:t>
       </w:r>
       <w:bookmarkEnd w:id="13"/>
@@ -6741,13 +6738,305 @@
     </w:p>
     <w:p>
       <w:pPr>
+        <w:pStyle w:val="Retraitcorpsdetexte"/>
+      </w:pPr>
+    </w:p>
+    <w:p>
+      <w:pPr>
+        <w:pStyle w:val="Style4"/>
+        <w:rPr>
+          <w:i w:val="0"/>
+          <w:iCs w:val="0"/>
+        </w:rPr>
+      </w:pPr>
+      <w:r>
+        <w:t>Yosef Nademo</w:t>
+      </w:r>
+      <w:r>
+        <w:rPr>
+          <w:i w:val="0"/>
+          <w:iCs w:val="0"/>
+        </w:rPr>
+        <w:t> :</w:t>
+      </w:r>
+      <w:r>
+        <w:t xml:space="preserve"> </w:t>
+      </w:r>
+      <w:r>
+        <w:rPr>
+          <w:i w:val="0"/>
+          <w:iCs w:val="0"/>
+        </w:rPr>
+        <w:t xml:space="preserve">Ce projet m’a énormément apporté, tant sur le plan technique que personnel. </w:t>
+      </w:r>
+      <w:r>
+        <w:rPr>
+          <w:b w:val="0"/>
+          <w:bCs/>
+          <w:i w:val="0"/>
+          <w:iCs w:val="0"/>
+        </w:rPr>
+        <w:t>J’ai renforcé mes compétences en</w:t>
+      </w:r>
+      <w:r>
+        <w:rPr>
+          <w:i w:val="0"/>
+          <w:iCs w:val="0"/>
+        </w:rPr>
+        <w:t xml:space="preserve"> </w:t>
+      </w:r>
+      <w:r>
+        <w:rPr>
+          <w:rStyle w:val="lev"/>
+          <w:i w:val="0"/>
+          <w:iCs w:val="0"/>
+        </w:rPr>
+        <w:t>programmation orientée composant (Vue.js)</w:t>
+      </w:r>
+      <w:r>
+        <w:rPr>
+          <w:b w:val="0"/>
+          <w:bCs/>
+          <w:i w:val="0"/>
+          <w:iCs w:val="0"/>
+        </w:rPr>
+        <w:t xml:space="preserve">, en </w:t>
+      </w:r>
+      <w:r>
+        <w:rPr>
+          <w:rStyle w:val="lev"/>
+          <w:i w:val="0"/>
+          <w:iCs w:val="0"/>
+        </w:rPr>
+        <w:t>gestion des API REST</w:t>
+      </w:r>
+      <w:r>
+        <w:rPr>
+          <w:b w:val="0"/>
+          <w:bCs/>
+          <w:i w:val="0"/>
+          <w:iCs w:val="0"/>
+        </w:rPr>
+        <w:t>, ainsi qu'en compréhension de fonctionnement global le frontend backend et la bases de données.</w:t>
+      </w:r>
+      <w:r>
+        <w:rPr>
+          <w:i w:val="0"/>
+          <w:iCs w:val="0"/>
+        </w:rPr>
+        <w:br/>
+      </w:r>
+      <w:r>
+        <w:rPr>
+          <w:b w:val="0"/>
+          <w:bCs/>
+          <w:i w:val="0"/>
+          <w:iCs w:val="0"/>
+        </w:rPr>
+        <w:t>Au-delà de l’aspect technique, j’ai aussi appris à mieux</w:t>
+      </w:r>
+      <w:r>
+        <w:rPr>
+          <w:i w:val="0"/>
+          <w:iCs w:val="0"/>
+        </w:rPr>
+        <w:t xml:space="preserve"> </w:t>
+      </w:r>
+      <w:r>
+        <w:rPr>
+          <w:rStyle w:val="lev"/>
+          <w:i w:val="0"/>
+          <w:iCs w:val="0"/>
+        </w:rPr>
+        <w:t>gérer mon temps</w:t>
+      </w:r>
+      <w:r>
+        <w:rPr>
+          <w:b w:val="0"/>
+          <w:bCs/>
+          <w:i w:val="0"/>
+          <w:iCs w:val="0"/>
+        </w:rPr>
+        <w:t>, à</w:t>
+      </w:r>
+      <w:r>
+        <w:rPr>
+          <w:i w:val="0"/>
+          <w:iCs w:val="0"/>
+        </w:rPr>
+        <w:t xml:space="preserve"> </w:t>
+      </w:r>
+      <w:r>
+        <w:rPr>
+          <w:rStyle w:val="lev"/>
+          <w:i w:val="0"/>
+          <w:iCs w:val="0"/>
+        </w:rPr>
+        <w:t>décomposer les tâches</w:t>
+      </w:r>
+      <w:r>
+        <w:rPr>
+          <w:i w:val="0"/>
+          <w:iCs w:val="0"/>
+        </w:rPr>
+        <w:t xml:space="preserve"> </w:t>
+      </w:r>
+      <w:r>
+        <w:rPr>
+          <w:b w:val="0"/>
+          <w:bCs/>
+          <w:i w:val="0"/>
+          <w:iCs w:val="0"/>
+        </w:rPr>
+        <w:t>et à travailler de façon plus méthodique.</w:t>
+      </w:r>
+      <w:r>
+        <w:rPr>
+          <w:i w:val="0"/>
+          <w:iCs w:val="0"/>
+        </w:rPr>
+        <w:br/>
+        <w:t>Ce travail m’a aussi permis de développer un esprit critique sur mes choix d’implémentation et sur l’importance de la clarté dans le code et dans la documentation. Je ressors de ce projet plus autonome et plus confiant dans mes capacités de développement web.</w:t>
+      </w:r>
+    </w:p>
+    <w:p>
+      <w:pPr>
+        <w:pStyle w:val="Retraitcorpsdetexte"/>
+        <w:ind w:left="0"/>
+        <w:rPr>
+          <w:i/>
+          <w:iCs/>
+          <w:szCs w:val="24"/>
+        </w:rPr>
+      </w:pPr>
+    </w:p>
+    <w:p>
+      <w:pPr>
         <w:pStyle w:val="Titre2"/>
       </w:pPr>
       <w:bookmarkStart w:id="22" w:name="_Toc198654076"/>
       <w:r>
-        <w:t>critique constructive sur la planification du projet</w:t>
+        <w:t>C</w:t>
+      </w:r>
+      <w:r>
+        <w:t>ritique constructive sur la planification du projet</w:t>
       </w:r>
       <w:bookmarkEnd w:id="22"/>
+    </w:p>
+    <w:p>
+      <w:pPr>
+        <w:ind w:left="360"/>
+      </w:pPr>
+      <w:r>
+        <w:t xml:space="preserve">Même si le projet a été mené à bien, la </w:t>
+      </w:r>
+      <w:r>
+        <w:rPr>
+          <w:rStyle w:val="lev"/>
+          <w:b w:val="0"/>
+          <w:bCs w:val="0"/>
+        </w:rPr>
+        <w:t>planification initiale présentait certaines faiblesses</w:t>
+      </w:r>
+      <w:r>
+        <w:rPr>
+          <w:b/>
+          <w:bCs/>
+        </w:rPr>
+        <w:t xml:space="preserve"> </w:t>
+      </w:r>
+      <w:r>
+        <w:t>qui ont eu un impact sur le déroulement général. Plusieurs phases manquaient de clarté ou de précision, notamment en ce qui concerne l’estimation du temps nécessaire pour certaines tâches.</w:t>
+      </w:r>
+    </w:p>
+    <w:p>
+      <w:pPr>
+        <w:ind w:left="360"/>
+      </w:pPr>
+    </w:p>
+    <w:p>
+      <w:pPr>
+        <w:pStyle w:val="Paragraphedeliste"/>
+        <w:numPr>
+          <w:ilvl w:val="0"/>
+          <w:numId w:val="80"/>
+        </w:numPr>
+      </w:pPr>
+      <w:r>
+        <w:rPr>
+          <w:rStyle w:val="lev"/>
+          <w:b w:val="0"/>
+          <w:bCs w:val="0"/>
+        </w:rPr>
+        <w:t>Certaines fonctionnalités ont été sous-estimées en termes de complexité</w:t>
+      </w:r>
+      <w:r>
+        <w:rPr>
+          <w:b/>
+          <w:bCs/>
+        </w:rPr>
+        <w:t>,</w:t>
+      </w:r>
+      <w:r>
+        <w:t xml:space="preserve"> ce qui a provoqué des retards inattendus durant le développement.</w:t>
+      </w:r>
+    </w:p>
+    <w:p>
+      <w:pPr>
+        <w:pStyle w:val="Paragraphedeliste"/>
+        <w:numPr>
+          <w:ilvl w:val="0"/>
+          <w:numId w:val="80"/>
+        </w:numPr>
+      </w:pPr>
+      <w:r>
+        <w:t>Le temps réservé aux tests a été réduit à cause de retards en phase de développement.</w:t>
+      </w:r>
+    </w:p>
+    <w:p>
+      <w:pPr>
+        <w:pStyle w:val="Paragraphedeliste"/>
+        <w:numPr>
+          <w:ilvl w:val="0"/>
+          <w:numId w:val="80"/>
+        </w:numPr>
+      </w:pPr>
+      <w:r>
+        <w:lastRenderedPageBreak/>
+        <w:t xml:space="preserve">Il y a eu un </w:t>
+      </w:r>
+      <w:r>
+        <w:rPr>
+          <w:rStyle w:val="lev"/>
+          <w:b w:val="0"/>
+          <w:bCs w:val="0"/>
+        </w:rPr>
+        <w:t>manque de flexibilité dans la gestion des imprévus</w:t>
+      </w:r>
+      <w:r>
+        <w:rPr>
+          <w:b/>
+          <w:bCs/>
+        </w:rPr>
+        <w:t>,</w:t>
+      </w:r>
+      <w:r>
+        <w:t xml:space="preserve"> ce qui a accentué le stress en fin de projet.</w:t>
+      </w:r>
+    </w:p>
+    <w:p/>
+    <w:p>
+      <w:pPr>
+        <w:pStyle w:val="Retraitcorpsdetexte"/>
+      </w:pPr>
+      <w:r>
+        <w:t>Une planification plus fine, avec des marges de sécurité et une meilleure anticipation des risques, aurait permis de gérer le temps plus efficacement, de mieux équilibrer les phases de développement et de test, et d’atteindre un résultat encore plus stable.</w:t>
+      </w:r>
+    </w:p>
+    <w:p>
+      <w:pPr>
+        <w:pStyle w:val="Retraitcorpsdetexte"/>
+      </w:pPr>
     </w:p>
     <w:p>
       <w:pPr>
@@ -6761,7 +7050,6 @@
       <w:bookmarkStart w:id="23" w:name="_Toc181370766"/>
       <w:bookmarkStart w:id="24" w:name="_Toc198654077"/>
       <w:r>
-        <w:lastRenderedPageBreak/>
         <w:t>Webographie</w:t>
       </w:r>
       <w:bookmarkEnd w:id="23"/>
@@ -6775,13 +7063,11 @@
         </w:numPr>
         <w:spacing w:before="100" w:beforeAutospacing="1" w:after="100" w:afterAutospacing="1"/>
         <w:rPr>
-          <w:sz w:val="24"/>
           <w:szCs w:val="24"/>
         </w:rPr>
       </w:pPr>
       <w:r>
         <w:rPr>
-          <w:sz w:val="24"/>
           <w:szCs w:val="24"/>
         </w:rPr>
         <w:t>https://vuejs.org/</w:t>
@@ -6795,13 +7081,11 @@
         </w:numPr>
         <w:spacing w:before="100" w:beforeAutospacing="1" w:after="100" w:afterAutospacing="1"/>
         <w:rPr>
-          <w:sz w:val="24"/>
           <w:szCs w:val="24"/>
         </w:rPr>
       </w:pPr>
       <w:r>
         <w:rPr>
-          <w:sz w:val="24"/>
           <w:szCs w:val="24"/>
         </w:rPr>
         <w:t>https://router.vuejs.org/</w:t>
@@ -6815,13 +7099,11 @@
         </w:numPr>
         <w:spacing w:before="100" w:beforeAutospacing="1" w:after="100" w:afterAutospacing="1"/>
         <w:rPr>
-          <w:sz w:val="24"/>
           <w:szCs w:val="24"/>
         </w:rPr>
       </w:pPr>
       <w:r>
         <w:rPr>
-          <w:sz w:val="24"/>
           <w:szCs w:val="24"/>
         </w:rPr>
         <w:t>https://stackoverflow.com/</w:t>
@@ -6835,13 +7117,11 @@
         </w:numPr>
         <w:spacing w:before="100" w:beforeAutospacing="1" w:after="100" w:afterAutospacing="1"/>
         <w:rPr>
-          <w:sz w:val="24"/>
           <w:szCs w:val="24"/>
         </w:rPr>
       </w:pPr>
       <w:r>
         <w:rPr>
-          <w:sz w:val="24"/>
           <w:szCs w:val="24"/>
         </w:rPr>
         <w:t>https://vitejs.dev/</w:t>
@@ -6852,7 +7132,6 @@
         <w:spacing w:beforeAutospacing="1" w:afterAutospacing="1"/>
         <w:ind w:left="720"/>
         <w:rPr>
-          <w:sz w:val="24"/>
           <w:szCs w:val="24"/>
         </w:rPr>
       </w:pPr>
@@ -10197,7 +10476,7 @@
   <w:abstractNum w:abstractNumId="26" w15:restartNumberingAfterBreak="0">
     <w:nsid w:val="2A8F67FD"/>
     <w:multiLevelType w:val="multilevel"/>
-    <w:tmpl w:val="A32EB862"/>
+    <w:tmpl w:val="AB265ADE"/>
     <w:lvl w:ilvl="0">
       <w:start w:val="1"/>
       <w:numFmt w:val="decimal"/>
@@ -18472,7 +18751,7 @@
     <w:lsdException w:name="heading 1" w:uiPriority="0" w:qFormat="1"/>
     <w:lsdException w:name="heading 2" w:semiHidden="1" w:uiPriority="0" w:unhideWhenUsed="1" w:qFormat="1"/>
     <w:lsdException w:name="heading 3" w:semiHidden="1" w:uiPriority="0" w:unhideWhenUsed="1"/>
-    <w:lsdException w:name="heading 4" w:semiHidden="1" w:uiPriority="9" w:unhideWhenUsed="1" w:qFormat="1"/>
+    <w:lsdException w:name="heading 4" w:semiHidden="1" w:uiPriority="9" w:unhideWhenUsed="1"/>
     <w:lsdException w:name="heading 5" w:semiHidden="1" w:uiPriority="9" w:unhideWhenUsed="1" w:qFormat="1"/>
     <w:lsdException w:name="heading 6" w:semiHidden="1" w:uiPriority="9" w:unhideWhenUsed="1" w:qFormat="1"/>
     <w:lsdException w:name="heading 7" w:semiHidden="1" w:uiPriority="9" w:unhideWhenUsed="1" w:qFormat="1"/>
@@ -18848,14 +19127,14 @@
   <w:style w:type="paragraph" w:default="1" w:styleId="Normal">
     <w:name w:val="Normal"/>
     <w:qFormat/>
-    <w:rsid w:val="001E4048"/>
+    <w:rsid w:val="003A2A17"/>
     <w:pPr>
       <w:spacing w:after="0" w:line="240" w:lineRule="auto"/>
     </w:pPr>
     <w:rPr>
       <w:rFonts w:ascii="Bookman Old Style" w:eastAsia="Times New Roman" w:hAnsi="Bookman Old Style" w:cs="Times New Roman"/>
       <w:kern w:val="0"/>
-      <w:sz w:val="20"/>
+      <w:sz w:val="24"/>
       <w:szCs w:val="20"/>
       <w:lang w:eastAsia="fr-CH"/>
       <w14:ligatures w14:val="none"/>
@@ -18896,7 +19175,7 @@
     <w:autoRedefine/>
     <w:unhideWhenUsed/>
     <w:qFormat/>
-    <w:rsid w:val="001E4048"/>
+    <w:rsid w:val="00D52FEA"/>
     <w:pPr>
       <w:keepNext/>
       <w:numPr>
@@ -18920,7 +19199,6 @@
     <w:basedOn w:val="Normal"/>
     <w:next w:val="Retraitcorpsdetexte3"/>
     <w:link w:val="Titre3Car"/>
-    <w:semiHidden/>
     <w:unhideWhenUsed/>
     <w:rsid w:val="00F532F5"/>
     <w:pPr>
@@ -18936,7 +19214,6 @@
       <w:rFonts w:asciiTheme="majorHAnsi" w:hAnsiTheme="majorHAnsi" w:cs="Arial"/>
       <w:bCs/>
       <w:i/>
-      <w:sz w:val="24"/>
       <w:szCs w:val="26"/>
     </w:rPr>
   </w:style>
@@ -18948,7 +19225,6 @@
     <w:uiPriority w:val="9"/>
     <w:semiHidden/>
     <w:unhideWhenUsed/>
-    <w:qFormat/>
     <w:rsid w:val="00F532F5"/>
     <w:pPr>
       <w:keepNext/>
@@ -19011,7 +19287,7 @@
     <w:name w:val="Titre 2 Car"/>
     <w:basedOn w:val="Policepardfaut"/>
     <w:link w:val="Titre2"/>
-    <w:rsid w:val="001E4048"/>
+    <w:rsid w:val="00D52FEA"/>
     <w:rPr>
       <w:rFonts w:ascii="Bookman Old Style" w:eastAsia="Times New Roman" w:hAnsi="Bookman Old Style" w:cs="Arial"/>
       <w:b/>
@@ -19028,7 +19304,6 @@
     <w:name w:val="Titre 3 Car"/>
     <w:basedOn w:val="Policepardfaut"/>
     <w:link w:val="Titre3"/>
-    <w:semiHidden/>
     <w:rsid w:val="00F532F5"/>
     <w:rPr>
       <w:rFonts w:asciiTheme="majorHAnsi" w:eastAsia="Times New Roman" w:hAnsiTheme="majorHAnsi" w:cs="Arial"/>
@@ -19256,7 +19531,6 @@
     </w:pPr>
     <w:rPr>
       <w:rFonts w:ascii="Times New Roman" w:hAnsi="Times New Roman"/>
-      <w:sz w:val="24"/>
       <w:szCs w:val="24"/>
     </w:rPr>
   </w:style>
@@ -19370,6 +19644,37 @@
       <w:caps w:val="0"/>
       <w:color w:val="2F5496" w:themeColor="accent1" w:themeShade="BF"/>
       <w:kern w:val="0"/>
+    </w:rPr>
+  </w:style>
+  <w:style w:type="paragraph" w:customStyle="1" w:styleId="Style4">
+    <w:name w:val="Style4"/>
+    <w:basedOn w:val="Titre4"/>
+    <w:link w:val="Style4Car"/>
+    <w:qFormat/>
+    <w:rsid w:val="00976E97"/>
+    <w:rPr>
+      <w:rFonts w:ascii="Bookman Old Style" w:hAnsi="Bookman Old Style"/>
+      <w:b/>
+      <w:color w:val="auto"/>
+      <w:sz w:val="26"/>
+    </w:rPr>
+  </w:style>
+  <w:style w:type="character" w:customStyle="1" w:styleId="Style4Car">
+    <w:name w:val="Style4 Car"/>
+    <w:basedOn w:val="Titre4Car"/>
+    <w:link w:val="Style4"/>
+    <w:rsid w:val="00976E97"/>
+    <w:rPr>
+      <w:rFonts w:ascii="Bookman Old Style" w:eastAsiaTheme="majorEastAsia" w:hAnsi="Bookman Old Style" w:cstheme="majorBidi"/>
+      <w:b/>
+      <w:i/>
+      <w:iCs/>
+      <w:color w:val="2F5496" w:themeColor="accent1" w:themeShade="BF"/>
+      <w:kern w:val="0"/>
+      <w:sz w:val="26"/>
+      <w:szCs w:val="20"/>
+      <w:lang w:eastAsia="fr-CH"/>
+      <w14:ligatures w14:val="none"/>
     </w:rPr>
   </w:style>
 </w:styles>

</xml_diff>

<commit_message>
Rapport(3.3	explication de l’organisation du groupe quant à la gestion du code avec git/github)
</commit_message>
<xml_diff>
--- a/documentation/rapport.docx
+++ b/documentation/rapport.docx
@@ -6981,6 +6981,661 @@
     </w:p>
     <w:p>
       <w:pPr>
+        <w:rPr>
+          <w:rFonts w:cstheme="minorHAnsi"/>
+        </w:rPr>
+      </w:pPr>
+      <w:r>
+        <w:rPr>
+          <w:rFonts w:cstheme="minorHAnsi"/>
+        </w:rPr>
+        <w:t xml:space="preserve">Pour collaborer efficacement, nous avons adopté une stratégie de gestion de code basée sur </w:t>
+      </w:r>
+      <w:r>
+        <w:rPr>
+          <w:rFonts w:cstheme="minorHAnsi"/>
+        </w:rPr>
+        <w:t xml:space="preserve">le </w:t>
+      </w:r>
+      <w:r>
+        <w:rPr>
+          <w:rStyle w:val="lev"/>
+          <w:rFonts w:cstheme="minorHAnsi"/>
+        </w:rPr>
+        <w:t>Trunk-Based Development</w:t>
+      </w:r>
+      <w:r>
+        <w:rPr>
+          <w:rFonts w:cstheme="minorHAnsi"/>
+        </w:rPr>
+        <w:t>, en utilisant Git et GitHub.</w:t>
+      </w:r>
+    </w:p>
+    <w:p>
+      <w:pPr>
+        <w:rPr>
+          <w:rFonts w:cstheme="minorHAnsi"/>
+        </w:rPr>
+      </w:pPr>
+    </w:p>
+    <w:p>
+      <w:pPr>
+        <w:pStyle w:val="Paragraphedeliste"/>
+        <w:numPr>
+          <w:ilvl w:val="0"/>
+          <w:numId w:val="95"/>
+        </w:numPr>
+        <w:rPr>
+          <w:rFonts w:cstheme="minorHAnsi"/>
+          <w:b/>
+          <w:bCs/>
+        </w:rPr>
+      </w:pPr>
+      <w:r>
+        <w:rPr>
+          <w:rFonts w:cstheme="minorHAnsi"/>
+          <w:b/>
+          <w:bCs/>
+        </w:rPr>
+        <w:t xml:space="preserve">Branche principale unique : </w:t>
+      </w:r>
+      <w:r>
+        <w:rPr>
+          <w:rStyle w:val="CodeHTML"/>
+          <w:rFonts w:asciiTheme="minorHAnsi" w:hAnsiTheme="minorHAnsi" w:cstheme="minorHAnsi"/>
+          <w:b/>
+          <w:bCs/>
+        </w:rPr>
+        <w:t>main</w:t>
+      </w:r>
+    </w:p>
+    <w:p>
+      <w:pPr>
+        <w:pStyle w:val="NormalWeb"/>
+        <w:numPr>
+          <w:ilvl w:val="0"/>
+          <w:numId w:val="93"/>
+        </w:numPr>
+        <w:rPr>
+          <w:rFonts w:asciiTheme="minorHAnsi" w:hAnsiTheme="minorHAnsi" w:cstheme="minorHAnsi"/>
+        </w:rPr>
+      </w:pPr>
+      <w:r>
+        <w:rPr>
+          <w:rFonts w:asciiTheme="minorHAnsi" w:hAnsiTheme="minorHAnsi" w:cstheme="minorHAnsi"/>
+        </w:rPr>
+        <w:t xml:space="preserve">Tout le développement se fait directement à partir de la branche </w:t>
+      </w:r>
+      <w:r>
+        <w:rPr>
+          <w:rStyle w:val="CodeHTML"/>
+          <w:rFonts w:asciiTheme="minorHAnsi" w:hAnsiTheme="minorHAnsi" w:cstheme="minorHAnsi"/>
+        </w:rPr>
+        <w:t>main</w:t>
+      </w:r>
+      <w:r>
+        <w:rPr>
+          <w:rFonts w:asciiTheme="minorHAnsi" w:hAnsiTheme="minorHAnsi" w:cstheme="minorHAnsi"/>
+        </w:rPr>
+        <w:t xml:space="preserve">, qui représente la </w:t>
+      </w:r>
+      <w:r>
+        <w:rPr>
+          <w:rStyle w:val="lev"/>
+          <w:rFonts w:asciiTheme="minorHAnsi" w:hAnsiTheme="minorHAnsi" w:cstheme="minorHAnsi"/>
+        </w:rPr>
+        <w:t>source unique de vérité</w:t>
+      </w:r>
+      <w:r>
+        <w:rPr>
+          <w:rFonts w:asciiTheme="minorHAnsi" w:hAnsiTheme="minorHAnsi" w:cstheme="minorHAnsi"/>
+        </w:rPr>
+        <w:t>.</w:t>
+      </w:r>
+    </w:p>
+    <w:p>
+      <w:pPr>
+        <w:pStyle w:val="NormalWeb"/>
+        <w:numPr>
+          <w:ilvl w:val="0"/>
+          <w:numId w:val="93"/>
+        </w:numPr>
+        <w:rPr>
+          <w:rFonts w:asciiTheme="minorHAnsi" w:hAnsiTheme="minorHAnsi" w:cstheme="minorHAnsi"/>
+        </w:rPr>
+      </w:pPr>
+      <w:r>
+        <w:rPr>
+          <w:rFonts w:asciiTheme="minorHAnsi" w:hAnsiTheme="minorHAnsi" w:cstheme="minorHAnsi"/>
+        </w:rPr>
+        <w:t xml:space="preserve">Les membres du groupe travaillent sur de </w:t>
+      </w:r>
+      <w:r>
+        <w:rPr>
+          <w:rStyle w:val="lev"/>
+          <w:rFonts w:asciiTheme="minorHAnsi" w:hAnsiTheme="minorHAnsi" w:cstheme="minorHAnsi"/>
+        </w:rPr>
+        <w:t>petites branches locales temporaires</w:t>
+      </w:r>
+      <w:r>
+        <w:rPr>
+          <w:rFonts w:asciiTheme="minorHAnsi" w:hAnsiTheme="minorHAnsi" w:cstheme="minorHAnsi"/>
+        </w:rPr>
+        <w:t>, créées uniquement pour le temps de développement d’une fonctionnalité ou d’un correctif.</w:t>
+      </w:r>
+    </w:p>
+    <w:p>
+      <w:pPr>
+        <w:pStyle w:val="Paragraphedeliste"/>
+        <w:numPr>
+          <w:ilvl w:val="0"/>
+          <w:numId w:val="95"/>
+        </w:numPr>
+        <w:rPr>
+          <w:rFonts w:cstheme="minorHAnsi"/>
+          <w:b/>
+          <w:bCs/>
+        </w:rPr>
+      </w:pPr>
+      <w:r>
+        <w:rPr>
+          <w:rFonts w:cstheme="minorHAnsi"/>
+          <w:b/>
+          <w:bCs/>
+        </w:rPr>
+        <w:t>Intégration rapide et fréquente</w:t>
+      </w:r>
+    </w:p>
+    <w:p>
+      <w:pPr>
+        <w:pStyle w:val="NormalWeb"/>
+        <w:numPr>
+          <w:ilvl w:val="0"/>
+          <w:numId w:val="96"/>
+        </w:numPr>
+        <w:rPr>
+          <w:rFonts w:asciiTheme="minorHAnsi" w:hAnsiTheme="minorHAnsi" w:cstheme="minorHAnsi"/>
+        </w:rPr>
+      </w:pPr>
+      <w:r>
+        <w:rPr>
+          <w:rFonts w:asciiTheme="minorHAnsi" w:hAnsiTheme="minorHAnsi" w:cstheme="minorHAnsi"/>
+        </w:rPr>
+        <w:t xml:space="preserve">Chaque modification est intégrée au plus vite dans </w:t>
+      </w:r>
+      <w:r>
+        <w:rPr>
+          <w:rStyle w:val="CodeHTML"/>
+          <w:rFonts w:asciiTheme="minorHAnsi" w:eastAsiaTheme="majorEastAsia" w:hAnsiTheme="minorHAnsi" w:cstheme="minorHAnsi"/>
+        </w:rPr>
+        <w:t>main</w:t>
+      </w:r>
+      <w:r>
+        <w:rPr>
+          <w:rFonts w:asciiTheme="minorHAnsi" w:hAnsiTheme="minorHAnsi" w:cstheme="minorHAnsi"/>
+        </w:rPr>
+        <w:t xml:space="preserve"> après :</w:t>
+      </w:r>
+    </w:p>
+    <w:p>
+      <w:pPr>
+        <w:pStyle w:val="NormalWeb"/>
+        <w:numPr>
+          <w:ilvl w:val="1"/>
+          <w:numId w:val="96"/>
+        </w:numPr>
+        <w:rPr>
+          <w:rFonts w:asciiTheme="minorHAnsi" w:hAnsiTheme="minorHAnsi" w:cstheme="minorHAnsi"/>
+        </w:rPr>
+      </w:pPr>
+      <w:r>
+        <w:rPr>
+          <w:rFonts w:asciiTheme="minorHAnsi" w:hAnsiTheme="minorHAnsi" w:cstheme="minorHAnsi"/>
+        </w:rPr>
+        <w:t xml:space="preserve">une </w:t>
+      </w:r>
+      <w:r>
+        <w:rPr>
+          <w:rStyle w:val="lev"/>
+          <w:rFonts w:asciiTheme="minorHAnsi" w:hAnsiTheme="minorHAnsi" w:cstheme="minorHAnsi"/>
+        </w:rPr>
+        <w:t>courte phase de développement</w:t>
+      </w:r>
+      <w:r>
+        <w:rPr>
+          <w:rFonts w:asciiTheme="minorHAnsi" w:hAnsiTheme="minorHAnsi" w:cstheme="minorHAnsi"/>
+        </w:rPr>
+        <w:t>,</w:t>
+      </w:r>
+    </w:p>
+    <w:p>
+      <w:pPr>
+        <w:pStyle w:val="NormalWeb"/>
+        <w:numPr>
+          <w:ilvl w:val="1"/>
+          <w:numId w:val="96"/>
+        </w:numPr>
+        <w:rPr>
+          <w:rFonts w:asciiTheme="minorHAnsi" w:hAnsiTheme="minorHAnsi" w:cstheme="minorHAnsi"/>
+        </w:rPr>
+      </w:pPr>
+      <w:r>
+        <w:rPr>
+          <w:rFonts w:asciiTheme="minorHAnsi" w:hAnsiTheme="minorHAnsi" w:cstheme="minorHAnsi"/>
+        </w:rPr>
+        <w:t xml:space="preserve">un </w:t>
+      </w:r>
+      <w:r>
+        <w:rPr>
+          <w:rStyle w:val="lev"/>
+          <w:rFonts w:asciiTheme="minorHAnsi" w:hAnsiTheme="minorHAnsi" w:cstheme="minorHAnsi"/>
+        </w:rPr>
+        <w:t>test local complet</w:t>
+      </w:r>
+      <w:r>
+        <w:rPr>
+          <w:rFonts w:asciiTheme="minorHAnsi" w:hAnsiTheme="minorHAnsi" w:cstheme="minorHAnsi"/>
+        </w:rPr>
+        <w:t>,</w:t>
+      </w:r>
+    </w:p>
+    <w:p>
+      <w:pPr>
+        <w:pStyle w:val="NormalWeb"/>
+        <w:numPr>
+          <w:ilvl w:val="1"/>
+          <w:numId w:val="96"/>
+        </w:numPr>
+        <w:rPr>
+          <w:rFonts w:asciiTheme="minorHAnsi" w:hAnsiTheme="minorHAnsi" w:cstheme="minorHAnsi"/>
+        </w:rPr>
+      </w:pPr>
+      <w:r>
+        <w:rPr>
+          <w:rFonts w:asciiTheme="minorHAnsi" w:hAnsiTheme="minorHAnsi" w:cstheme="minorHAnsi"/>
+        </w:rPr>
+        <w:lastRenderedPageBreak/>
+        <w:t xml:space="preserve">et une </w:t>
+      </w:r>
+      <w:r>
+        <w:rPr>
+          <w:rStyle w:val="lev"/>
+          <w:rFonts w:asciiTheme="minorHAnsi" w:hAnsiTheme="minorHAnsi" w:cstheme="minorHAnsi"/>
+        </w:rPr>
+        <w:t>pull request</w:t>
+      </w:r>
+      <w:r>
+        <w:rPr>
+          <w:rStyle w:val="lev"/>
+          <w:rFonts w:asciiTheme="minorHAnsi" w:hAnsiTheme="minorHAnsi" w:cstheme="minorHAnsi"/>
+        </w:rPr>
+        <w:t xml:space="preserve"> </w:t>
+      </w:r>
+      <w:r>
+        <w:rPr>
+          <w:rStyle w:val="lev"/>
+          <w:rFonts w:asciiTheme="minorHAnsi" w:hAnsiTheme="minorHAnsi" w:cstheme="minorHAnsi"/>
+          <w:b w:val="0"/>
+          <w:bCs w:val="0"/>
+        </w:rPr>
+        <w:t>sur GitHub</w:t>
+      </w:r>
+      <w:r>
+        <w:rPr>
+          <w:rFonts w:asciiTheme="minorHAnsi" w:hAnsiTheme="minorHAnsi" w:cstheme="minorHAnsi"/>
+        </w:rPr>
+        <w:t>.</w:t>
+      </w:r>
+    </w:p>
+    <w:p>
+      <w:pPr>
+        <w:pStyle w:val="NormalWeb"/>
+        <w:numPr>
+          <w:ilvl w:val="0"/>
+          <w:numId w:val="96"/>
+        </w:numPr>
+        <w:rPr>
+          <w:rFonts w:asciiTheme="minorHAnsi" w:hAnsiTheme="minorHAnsi" w:cstheme="minorHAnsi"/>
+        </w:rPr>
+      </w:pPr>
+      <w:r>
+        <w:rPr>
+          <w:rFonts w:asciiTheme="minorHAnsi" w:hAnsiTheme="minorHAnsi" w:cstheme="minorHAnsi"/>
+        </w:rPr>
+        <w:t>Cela évite les divergences importantes et simplifie la résolution de conflits.</w:t>
+      </w:r>
+    </w:p>
+    <w:p>
+      <w:pPr>
+        <w:pStyle w:val="Paragraphedeliste"/>
+        <w:numPr>
+          <w:ilvl w:val="0"/>
+          <w:numId w:val="95"/>
+        </w:numPr>
+        <w:rPr>
+          <w:rFonts w:cstheme="minorHAnsi"/>
+          <w:b/>
+          <w:bCs/>
+        </w:rPr>
+      </w:pPr>
+      <w:r>
+        <w:rPr>
+          <w:rFonts w:cstheme="minorHAnsi"/>
+          <w:b/>
+          <w:bCs/>
+        </w:rPr>
+        <w:t>Revue de code systématique</w:t>
+      </w:r>
+    </w:p>
+    <w:p>
+      <w:pPr>
+        <w:pStyle w:val="NormalWeb"/>
+        <w:numPr>
+          <w:ilvl w:val="0"/>
+          <w:numId w:val="90"/>
+        </w:numPr>
+        <w:rPr>
+          <w:rFonts w:asciiTheme="minorHAnsi" w:hAnsiTheme="minorHAnsi" w:cstheme="minorHAnsi"/>
+        </w:rPr>
+      </w:pPr>
+      <w:r>
+        <w:rPr>
+          <w:rFonts w:asciiTheme="minorHAnsi" w:hAnsiTheme="minorHAnsi" w:cstheme="minorHAnsi"/>
+        </w:rPr>
+        <w:t xml:space="preserve">Avant toute fusion, une </w:t>
+      </w:r>
+      <w:r>
+        <w:rPr>
+          <w:rStyle w:val="lev"/>
+          <w:rFonts w:asciiTheme="minorHAnsi" w:eastAsiaTheme="majorEastAsia" w:hAnsiTheme="minorHAnsi" w:cstheme="minorHAnsi"/>
+        </w:rPr>
+        <w:t>review (vérification du code)</w:t>
+      </w:r>
+      <w:r>
+        <w:rPr>
+          <w:rFonts w:asciiTheme="minorHAnsi" w:hAnsiTheme="minorHAnsi" w:cstheme="minorHAnsi"/>
+        </w:rPr>
+        <w:t xml:space="preserve"> était obligatoire.</w:t>
+      </w:r>
+    </w:p>
+    <w:p>
+      <w:pPr>
+        <w:pStyle w:val="NormalWeb"/>
+        <w:numPr>
+          <w:ilvl w:val="0"/>
+          <w:numId w:val="90"/>
+        </w:numPr>
+        <w:rPr>
+          <w:rFonts w:asciiTheme="minorHAnsi" w:hAnsiTheme="minorHAnsi" w:cstheme="minorHAnsi"/>
+        </w:rPr>
+      </w:pPr>
+      <w:r>
+        <w:rPr>
+          <w:rFonts w:asciiTheme="minorHAnsi" w:hAnsiTheme="minorHAnsi" w:cstheme="minorHAnsi"/>
+        </w:rPr>
+        <w:t xml:space="preserve">Un autre membre devait approuver la </w:t>
+      </w:r>
+      <w:r>
+        <w:rPr>
+          <w:rFonts w:asciiTheme="minorHAnsi" w:hAnsiTheme="minorHAnsi" w:cstheme="minorHAnsi"/>
+          <w:b/>
+          <w:bCs/>
+        </w:rPr>
+        <w:t>pull request</w:t>
+      </w:r>
+      <w:r>
+        <w:rPr>
+          <w:rFonts w:asciiTheme="minorHAnsi" w:hAnsiTheme="minorHAnsi" w:cstheme="minorHAnsi"/>
+        </w:rPr>
+        <w:t xml:space="preserve"> via GitHub, ce qui permettait :</w:t>
+      </w:r>
+    </w:p>
+    <w:p>
+      <w:pPr>
+        <w:pStyle w:val="NormalWeb"/>
+        <w:numPr>
+          <w:ilvl w:val="1"/>
+          <w:numId w:val="90"/>
+        </w:numPr>
+        <w:rPr>
+          <w:rFonts w:asciiTheme="minorHAnsi" w:hAnsiTheme="minorHAnsi" w:cstheme="minorHAnsi"/>
+        </w:rPr>
+      </w:pPr>
+      <w:r>
+        <w:rPr>
+          <w:rFonts w:asciiTheme="minorHAnsi" w:hAnsiTheme="minorHAnsi" w:cstheme="minorHAnsi"/>
+        </w:rPr>
+        <w:t>de garantir la qualité du code,</w:t>
+      </w:r>
+    </w:p>
+    <w:p>
+      <w:pPr>
+        <w:pStyle w:val="NormalWeb"/>
+        <w:numPr>
+          <w:ilvl w:val="1"/>
+          <w:numId w:val="90"/>
+        </w:numPr>
+        <w:rPr>
+          <w:rFonts w:asciiTheme="minorHAnsi" w:hAnsiTheme="minorHAnsi" w:cstheme="minorHAnsi"/>
+        </w:rPr>
+      </w:pPr>
+      <w:r>
+        <w:rPr>
+          <w:rFonts w:asciiTheme="minorHAnsi" w:hAnsiTheme="minorHAnsi" w:cstheme="minorHAnsi"/>
+        </w:rPr>
+        <w:t>de détecter les erreurs potentielles,</w:t>
+      </w:r>
+    </w:p>
+    <w:p>
+      <w:pPr>
+        <w:pStyle w:val="NormalWeb"/>
+        <w:numPr>
+          <w:ilvl w:val="1"/>
+          <w:numId w:val="90"/>
+        </w:numPr>
+        <w:rPr>
+          <w:rFonts w:asciiTheme="minorHAnsi" w:hAnsiTheme="minorHAnsi" w:cstheme="minorHAnsi"/>
+        </w:rPr>
+      </w:pPr>
+      <w:r>
+        <w:rPr>
+          <w:rFonts w:asciiTheme="minorHAnsi" w:hAnsiTheme="minorHAnsi" w:cstheme="minorHAnsi"/>
+        </w:rPr>
+        <w:t xml:space="preserve">et d’assurer le respect des conventions de codage (linting, structure, </w:t>
+      </w:r>
+      <w:r>
+        <w:rPr>
+          <w:rFonts w:asciiTheme="minorHAnsi" w:hAnsiTheme="minorHAnsi" w:cstheme="minorHAnsi"/>
+        </w:rPr>
+        <w:t>lisibilité)</w:t>
+      </w:r>
+      <w:r>
+        <w:rPr>
+          <w:rFonts w:asciiTheme="minorHAnsi" w:hAnsiTheme="minorHAnsi" w:cstheme="minorHAnsi"/>
+        </w:rPr>
+        <w:t>.</w:t>
+      </w:r>
+    </w:p>
+    <w:p>
+      <w:pPr>
+        <w:pStyle w:val="Paragraphedeliste"/>
+        <w:numPr>
+          <w:ilvl w:val="0"/>
+          <w:numId w:val="95"/>
+        </w:numPr>
+        <w:rPr>
+          <w:rFonts w:cstheme="minorHAnsi"/>
+          <w:b/>
+          <w:bCs/>
+        </w:rPr>
+      </w:pPr>
+      <w:r>
+        <w:rPr>
+          <w:rFonts w:cstheme="minorHAnsi"/>
+          <w:b/>
+          <w:bCs/>
+        </w:rPr>
+        <w:t>Outils et bonnes pratiques</w:t>
+      </w:r>
+    </w:p>
+    <w:p>
+      <w:pPr>
+        <w:pStyle w:val="NormalWeb"/>
+        <w:numPr>
+          <w:ilvl w:val="0"/>
+          <w:numId w:val="97"/>
+        </w:numPr>
+        <w:rPr>
+          <w:rFonts w:asciiTheme="minorHAnsi" w:hAnsiTheme="minorHAnsi" w:cstheme="minorHAnsi"/>
+        </w:rPr>
+      </w:pPr>
+      <w:r>
+        <w:rPr>
+          <w:rFonts w:asciiTheme="minorHAnsi" w:hAnsiTheme="minorHAnsi" w:cstheme="minorHAnsi"/>
+        </w:rPr>
+        <w:t xml:space="preserve">Utilisation de </w:t>
+      </w:r>
+      <w:r>
+        <w:rPr>
+          <w:rStyle w:val="lev"/>
+          <w:rFonts w:asciiTheme="minorHAnsi" w:eastAsiaTheme="majorEastAsia" w:hAnsiTheme="minorHAnsi" w:cstheme="minorHAnsi"/>
+        </w:rPr>
+        <w:t>GitHub</w:t>
+      </w:r>
+      <w:r>
+        <w:rPr>
+          <w:rFonts w:asciiTheme="minorHAnsi" w:hAnsiTheme="minorHAnsi" w:cstheme="minorHAnsi"/>
+        </w:rPr>
+        <w:t xml:space="preserve"> pour héberger le dépôt et gérer les pull requests.</w:t>
+      </w:r>
+    </w:p>
+    <w:p>
+      <w:pPr>
+        <w:pStyle w:val="NormalWeb"/>
+        <w:numPr>
+          <w:ilvl w:val="0"/>
+          <w:numId w:val="97"/>
+        </w:numPr>
+        <w:rPr>
+          <w:rFonts w:asciiTheme="minorHAnsi" w:hAnsiTheme="minorHAnsi" w:cstheme="minorHAnsi"/>
+        </w:rPr>
+      </w:pPr>
+      <w:r>
+        <w:rPr>
+          <w:rFonts w:asciiTheme="minorHAnsi" w:hAnsiTheme="minorHAnsi" w:cstheme="minorHAnsi"/>
+        </w:rPr>
+        <w:t xml:space="preserve">Utilisation de </w:t>
+      </w:r>
+      <w:r>
+        <w:rPr>
+          <w:rStyle w:val="lev"/>
+          <w:rFonts w:asciiTheme="minorHAnsi" w:eastAsiaTheme="majorEastAsia" w:hAnsiTheme="minorHAnsi" w:cstheme="minorHAnsi"/>
+        </w:rPr>
+        <w:t>GitHub Projects</w:t>
+      </w:r>
+      <w:r>
+        <w:rPr>
+          <w:rFonts w:asciiTheme="minorHAnsi" w:hAnsiTheme="minorHAnsi" w:cstheme="minorHAnsi"/>
+        </w:rPr>
+        <w:t xml:space="preserve"> pour suivre l’avancement des tâches.</w:t>
+      </w:r>
+    </w:p>
+    <w:p>
+      <w:pPr>
+        <w:pStyle w:val="NormalWeb"/>
+        <w:numPr>
+          <w:ilvl w:val="0"/>
+          <w:numId w:val="97"/>
+        </w:numPr>
+        <w:rPr>
+          <w:rFonts w:asciiTheme="minorHAnsi" w:hAnsiTheme="minorHAnsi" w:cstheme="minorHAnsi"/>
+        </w:rPr>
+      </w:pPr>
+      <w:r>
+        <w:rPr>
+          <w:rFonts w:asciiTheme="minorHAnsi" w:hAnsiTheme="minorHAnsi" w:cstheme="minorHAnsi"/>
+        </w:rPr>
+        <w:t xml:space="preserve">Chacun travaille dans son </w:t>
+      </w:r>
+      <w:r>
+        <w:rPr>
+          <w:rStyle w:val="lev"/>
+          <w:rFonts w:asciiTheme="minorHAnsi" w:eastAsiaTheme="majorEastAsia" w:hAnsiTheme="minorHAnsi" w:cstheme="minorHAnsi"/>
+        </w:rPr>
+        <w:t>environnement local</w:t>
+      </w:r>
+      <w:r>
+        <w:rPr>
+          <w:rFonts w:asciiTheme="minorHAnsi" w:hAnsiTheme="minorHAnsi" w:cstheme="minorHAnsi"/>
+        </w:rPr>
+        <w:t xml:space="preserve"> avec Git</w:t>
+      </w:r>
+      <w:r>
+        <w:rPr>
+          <w:rFonts w:asciiTheme="minorHAnsi" w:hAnsiTheme="minorHAnsi" w:cstheme="minorHAnsi"/>
+        </w:rPr>
+        <w:t>/GitHub-Desktop</w:t>
+      </w:r>
+      <w:r>
+        <w:rPr>
+          <w:rFonts w:asciiTheme="minorHAnsi" w:hAnsiTheme="minorHAnsi" w:cstheme="minorHAnsi"/>
+        </w:rPr>
+        <w:t xml:space="preserve">, en s’assurant de faire régulièrement des pulls depuis </w:t>
+      </w:r>
+      <w:r>
+        <w:rPr>
+          <w:rStyle w:val="CodeHTML"/>
+          <w:rFonts w:asciiTheme="minorHAnsi" w:hAnsiTheme="minorHAnsi" w:cstheme="minorHAnsi"/>
+        </w:rPr>
+        <w:t>main</w:t>
+      </w:r>
+      <w:r>
+        <w:rPr>
+          <w:rFonts w:asciiTheme="minorHAnsi" w:hAnsiTheme="minorHAnsi" w:cstheme="minorHAnsi"/>
+        </w:rPr>
+        <w:t>.</w:t>
+      </w:r>
+    </w:p>
+    <w:p>
+      <w:pPr>
+        <w:pStyle w:val="NormalWeb"/>
+        <w:numPr>
+          <w:ilvl w:val="0"/>
+          <w:numId w:val="97"/>
+        </w:numPr>
+        <w:rPr>
+          <w:rFonts w:asciiTheme="minorHAnsi" w:hAnsiTheme="minorHAnsi" w:cstheme="minorHAnsi"/>
+        </w:rPr>
+      </w:pPr>
+      <w:r>
+        <w:rPr>
+          <w:rFonts w:asciiTheme="minorHAnsi" w:hAnsiTheme="minorHAnsi" w:cstheme="minorHAnsi"/>
+        </w:rPr>
+        <w:t xml:space="preserve">Utilisation d’un fichier </w:t>
+      </w:r>
+      <w:r>
+        <w:rPr>
+          <w:rStyle w:val="CodeHTML"/>
+          <w:rFonts w:asciiTheme="minorHAnsi" w:hAnsiTheme="minorHAnsi" w:cstheme="minorHAnsi"/>
+          <w:b/>
+          <w:bCs/>
+        </w:rPr>
+        <w:t>.gitignore</w:t>
+      </w:r>
+      <w:r>
+        <w:rPr>
+          <w:rFonts w:asciiTheme="minorHAnsi" w:hAnsiTheme="minorHAnsi" w:cstheme="minorHAnsi"/>
+        </w:rPr>
+        <w:t xml:space="preserve"> pour exclure les fichiers inutiles.</w:t>
+      </w:r>
+    </w:p>
+    <w:p>
+      <w:pPr>
+        <w:pStyle w:val="Retraitcorpsdetexte"/>
+      </w:pPr>
+    </w:p>
+    <w:p>
+      <w:pPr>
         <w:pStyle w:val="Retraitcorpsdetexte"/>
       </w:pPr>
     </w:p>
@@ -7107,7 +7762,6 @@
           <w:rStyle w:val="lev"/>
           <w:rFonts w:asciiTheme="minorHAnsi" w:hAnsiTheme="minorHAnsi" w:cstheme="minorHAnsi"/>
         </w:rPr>
-        <w:lastRenderedPageBreak/>
         <w:t>Des requêtes limitées à l’essentiel</w:t>
       </w:r>
       <w:r>
@@ -7214,7 +7868,14 @@
         <w:rPr>
           <w:rFonts w:asciiTheme="minorHAnsi" w:hAnsiTheme="minorHAnsi" w:cstheme="minorHAnsi"/>
         </w:rPr>
-        <w:t xml:space="preserve"> (par exemple, lorsqu’un utilisateur accède à une page spécifique). Cela évite de charger tout le code de l’application dès le début, ce qui </w:t>
+        <w:t xml:space="preserve"> </w:t>
+      </w:r>
+      <w:r>
+        <w:rPr>
+          <w:rFonts w:asciiTheme="minorHAnsi" w:hAnsiTheme="minorHAnsi" w:cstheme="minorHAnsi"/>
+        </w:rPr>
+        <w:lastRenderedPageBreak/>
+        <w:t xml:space="preserve">(par exemple, lorsqu’un utilisateur accède à une page spécifique). Cela évite de charger tout le code de l’application dès le début, ce qui </w:t>
       </w:r>
       <w:r>
         <w:rPr>
@@ -7500,7 +8161,6 @@
           <w:rFonts w:cstheme="minorHAnsi"/>
           <w:lang w:val="en-US"/>
         </w:rPr>
-        <w:lastRenderedPageBreak/>
         <w:t>Conclusion</w:t>
       </w:r>
       <w:bookmarkEnd w:id="19"/>
@@ -7572,7 +8232,14 @@
         <w:rPr>
           <w:rFonts w:cstheme="minorHAnsi"/>
         </w:rPr>
-        <w:t>Chaque étape du projet — de la planification à la réalisation — a été abordée avec rigueur, en intégrant des outils adaptés tels que GitHub Projects pour organiser efficacement les tâches et maintenir une bonne coordination au sein du groupe. L’architecture technique mise en place assure une interaction fluide entre les différentes couches de l’application, tandis que les mesures de sécurité et les pratiques responsables en matière de performance et de sobriété numérique montrent une attention particulière portée à la qualité et à la durabilité du produit final.</w:t>
+        <w:t xml:space="preserve">Chaque étape du projet — de la planification à la réalisation — a été abordée avec rigueur, en intégrant des outils adaptés tels que GitHub Projects pour organiser efficacement les </w:t>
+      </w:r>
+      <w:r>
+        <w:rPr>
+          <w:rFonts w:cstheme="minorHAnsi"/>
+        </w:rPr>
+        <w:lastRenderedPageBreak/>
+        <w:t>tâches et maintenir une bonne coordination au sein du groupe. L’architecture technique mise en place assure une interaction fluide entre les différentes couches de l’application, tandis que les mesures de sécurité et les pratiques responsables en matière de performance et de sobriété numérique montrent une attention particulière portée à la qualité et à la durabilité du produit final.</w:t>
       </w:r>
     </w:p>
     <w:p>
@@ -7962,7 +8629,6 @@
         <w:rPr>
           <w:rFonts w:cstheme="minorHAnsi"/>
         </w:rPr>
-        <w:lastRenderedPageBreak/>
         <w:t>Le temps réservé aux tests a été réduit à cause de retards en phase de développement.</w:t>
       </w:r>
     </w:p>
@@ -8056,6 +8722,7 @@
         <w:rPr>
           <w:rFonts w:cstheme="minorHAnsi"/>
         </w:rPr>
+        <w:lastRenderedPageBreak/>
         <w:t>Webographie</w:t>
       </w:r>
       <w:bookmarkEnd w:id="23"/>
@@ -9698,6 +10365,119 @@
     </w:lvl>
   </w:abstractNum>
   <w:abstractNum w:abstractNumId="12" w15:restartNumberingAfterBreak="0">
+    <w:nsid w:val="12143962"/>
+    <w:multiLevelType w:val="hybridMultilevel"/>
+    <w:tmpl w:val="3704F608"/>
+    <w:lvl w:ilvl="0" w:tplc="100C0001">
+      <w:start w:val="1"/>
+      <w:numFmt w:val="bullet"/>
+      <w:lvlText w:val=""/>
+      <w:lvlJc w:val="left"/>
+      <w:pPr>
+        <w:ind w:left="720" w:hanging="360"/>
+      </w:pPr>
+      <w:rPr>
+        <w:rFonts w:ascii="Symbol" w:hAnsi="Symbol" w:hint="default"/>
+      </w:rPr>
+    </w:lvl>
+    <w:lvl w:ilvl="1" w:tplc="100C0003" w:tentative="1">
+      <w:start w:val="1"/>
+      <w:numFmt w:val="bullet"/>
+      <w:lvlText w:val="o"/>
+      <w:lvlJc w:val="left"/>
+      <w:pPr>
+        <w:ind w:left="1440" w:hanging="360"/>
+      </w:pPr>
+      <w:rPr>
+        <w:rFonts w:ascii="Courier New" w:hAnsi="Courier New" w:cs="Courier New" w:hint="default"/>
+      </w:rPr>
+    </w:lvl>
+    <w:lvl w:ilvl="2" w:tplc="100C0005" w:tentative="1">
+      <w:start w:val="1"/>
+      <w:numFmt w:val="bullet"/>
+      <w:lvlText w:val=""/>
+      <w:lvlJc w:val="left"/>
+      <w:pPr>
+        <w:ind w:left="2160" w:hanging="360"/>
+      </w:pPr>
+      <w:rPr>
+        <w:rFonts w:ascii="Wingdings" w:hAnsi="Wingdings" w:hint="default"/>
+      </w:rPr>
+    </w:lvl>
+    <w:lvl w:ilvl="3" w:tplc="100C0001" w:tentative="1">
+      <w:start w:val="1"/>
+      <w:numFmt w:val="bullet"/>
+      <w:lvlText w:val=""/>
+      <w:lvlJc w:val="left"/>
+      <w:pPr>
+        <w:ind w:left="2880" w:hanging="360"/>
+      </w:pPr>
+      <w:rPr>
+        <w:rFonts w:ascii="Symbol" w:hAnsi="Symbol" w:hint="default"/>
+      </w:rPr>
+    </w:lvl>
+    <w:lvl w:ilvl="4" w:tplc="100C0003" w:tentative="1">
+      <w:start w:val="1"/>
+      <w:numFmt w:val="bullet"/>
+      <w:lvlText w:val="o"/>
+      <w:lvlJc w:val="left"/>
+      <w:pPr>
+        <w:ind w:left="3600" w:hanging="360"/>
+      </w:pPr>
+      <w:rPr>
+        <w:rFonts w:ascii="Courier New" w:hAnsi="Courier New" w:cs="Courier New" w:hint="default"/>
+      </w:rPr>
+    </w:lvl>
+    <w:lvl w:ilvl="5" w:tplc="100C0005" w:tentative="1">
+      <w:start w:val="1"/>
+      <w:numFmt w:val="bullet"/>
+      <w:lvlText w:val=""/>
+      <w:lvlJc w:val="left"/>
+      <w:pPr>
+        <w:ind w:left="4320" w:hanging="360"/>
+      </w:pPr>
+      <w:rPr>
+        <w:rFonts w:ascii="Wingdings" w:hAnsi="Wingdings" w:hint="default"/>
+      </w:rPr>
+    </w:lvl>
+    <w:lvl w:ilvl="6" w:tplc="100C0001" w:tentative="1">
+      <w:start w:val="1"/>
+      <w:numFmt w:val="bullet"/>
+      <w:lvlText w:val=""/>
+      <w:lvlJc w:val="left"/>
+      <w:pPr>
+        <w:ind w:left="5040" w:hanging="360"/>
+      </w:pPr>
+      <w:rPr>
+        <w:rFonts w:ascii="Symbol" w:hAnsi="Symbol" w:hint="default"/>
+      </w:rPr>
+    </w:lvl>
+    <w:lvl w:ilvl="7" w:tplc="100C0003" w:tentative="1">
+      <w:start w:val="1"/>
+      <w:numFmt w:val="bullet"/>
+      <w:lvlText w:val="o"/>
+      <w:lvlJc w:val="left"/>
+      <w:pPr>
+        <w:ind w:left="5760" w:hanging="360"/>
+      </w:pPr>
+      <w:rPr>
+        <w:rFonts w:ascii="Courier New" w:hAnsi="Courier New" w:cs="Courier New" w:hint="default"/>
+      </w:rPr>
+    </w:lvl>
+    <w:lvl w:ilvl="8" w:tplc="100C0005" w:tentative="1">
+      <w:start w:val="1"/>
+      <w:numFmt w:val="bullet"/>
+      <w:lvlText w:val=""/>
+      <w:lvlJc w:val="left"/>
+      <w:pPr>
+        <w:ind w:left="6480" w:hanging="360"/>
+      </w:pPr>
+      <w:rPr>
+        <w:rFonts w:ascii="Wingdings" w:hAnsi="Wingdings" w:hint="default"/>
+      </w:rPr>
+    </w:lvl>
+  </w:abstractNum>
+  <w:abstractNum w:abstractNumId="13" w15:restartNumberingAfterBreak="0">
     <w:nsid w:val="12656F5C"/>
     <w:multiLevelType w:val="multilevel"/>
     <w:tmpl w:val="B60ED442"/>
@@ -9846,7 +10626,7 @@
       </w:rPr>
     </w:lvl>
   </w:abstractNum>
-  <w:abstractNum w:abstractNumId="13" w15:restartNumberingAfterBreak="0">
+  <w:abstractNum w:abstractNumId="14" w15:restartNumberingAfterBreak="0">
     <w:nsid w:val="13386E8A"/>
     <w:multiLevelType w:val="multilevel"/>
     <w:tmpl w:val="100C0021"/>
@@ -9959,7 +10739,7 @@
       </w:rPr>
     </w:lvl>
   </w:abstractNum>
-  <w:abstractNum w:abstractNumId="14" w15:restartNumberingAfterBreak="0">
+  <w:abstractNum w:abstractNumId="15" w15:restartNumberingAfterBreak="0">
     <w:nsid w:val="134D3147"/>
     <w:multiLevelType w:val="multilevel"/>
     <w:tmpl w:val="F73AFD5C"/>
@@ -10104,7 +10884,7 @@
       </w:rPr>
     </w:lvl>
   </w:abstractNum>
-  <w:abstractNum w:abstractNumId="15" w15:restartNumberingAfterBreak="0">
+  <w:abstractNum w:abstractNumId="16" w15:restartNumberingAfterBreak="0">
     <w:nsid w:val="1431616B"/>
     <w:multiLevelType w:val="multilevel"/>
     <w:tmpl w:val="20E43E96"/>
@@ -10253,7 +11033,156 @@
       </w:rPr>
     </w:lvl>
   </w:abstractNum>
-  <w:abstractNum w:abstractNumId="16" w15:restartNumberingAfterBreak="0">
+  <w:abstractNum w:abstractNumId="17" w15:restartNumberingAfterBreak="0">
+    <w:nsid w:val="14FC4DFC"/>
+    <w:multiLevelType w:val="multilevel"/>
+    <w:tmpl w:val="1374A3DE"/>
+    <w:lvl w:ilvl="0">
+      <w:start w:val="1"/>
+      <w:numFmt w:val="bullet"/>
+      <w:lvlText w:val=""/>
+      <w:lvlJc w:val="left"/>
+      <w:pPr>
+        <w:tabs>
+          <w:tab w:val="num" w:pos="720"/>
+        </w:tabs>
+        <w:ind w:left="720" w:hanging="360"/>
+      </w:pPr>
+      <w:rPr>
+        <w:rFonts w:ascii="Symbol" w:hAnsi="Symbol" w:hint="default"/>
+        <w:sz w:val="20"/>
+      </w:rPr>
+    </w:lvl>
+    <w:lvl w:ilvl="1" w:tentative="1">
+      <w:start w:val="1"/>
+      <w:numFmt w:val="bullet"/>
+      <w:lvlText w:val="o"/>
+      <w:lvlJc w:val="left"/>
+      <w:pPr>
+        <w:tabs>
+          <w:tab w:val="num" w:pos="1440"/>
+        </w:tabs>
+        <w:ind w:left="1440" w:hanging="360"/>
+      </w:pPr>
+      <w:rPr>
+        <w:rFonts w:ascii="Courier New" w:hAnsi="Courier New" w:hint="default"/>
+        <w:sz w:val="20"/>
+      </w:rPr>
+    </w:lvl>
+    <w:lvl w:ilvl="2" w:tentative="1">
+      <w:start w:val="1"/>
+      <w:numFmt w:val="bullet"/>
+      <w:lvlText w:val=""/>
+      <w:lvlJc w:val="left"/>
+      <w:pPr>
+        <w:tabs>
+          <w:tab w:val="num" w:pos="2160"/>
+        </w:tabs>
+        <w:ind w:left="2160" w:hanging="360"/>
+      </w:pPr>
+      <w:rPr>
+        <w:rFonts w:ascii="Wingdings" w:hAnsi="Wingdings" w:hint="default"/>
+        <w:sz w:val="20"/>
+      </w:rPr>
+    </w:lvl>
+    <w:lvl w:ilvl="3" w:tentative="1">
+      <w:start w:val="1"/>
+      <w:numFmt w:val="bullet"/>
+      <w:lvlText w:val=""/>
+      <w:lvlJc w:val="left"/>
+      <w:pPr>
+        <w:tabs>
+          <w:tab w:val="num" w:pos="2880"/>
+        </w:tabs>
+        <w:ind w:left="2880" w:hanging="360"/>
+      </w:pPr>
+      <w:rPr>
+        <w:rFonts w:ascii="Wingdings" w:hAnsi="Wingdings" w:hint="default"/>
+        <w:sz w:val="20"/>
+      </w:rPr>
+    </w:lvl>
+    <w:lvl w:ilvl="4" w:tentative="1">
+      <w:start w:val="1"/>
+      <w:numFmt w:val="bullet"/>
+      <w:lvlText w:val=""/>
+      <w:lvlJc w:val="left"/>
+      <w:pPr>
+        <w:tabs>
+          <w:tab w:val="num" w:pos="3600"/>
+        </w:tabs>
+        <w:ind w:left="3600" w:hanging="360"/>
+      </w:pPr>
+      <w:rPr>
+        <w:rFonts w:ascii="Wingdings" w:hAnsi="Wingdings" w:hint="default"/>
+        <w:sz w:val="20"/>
+      </w:rPr>
+    </w:lvl>
+    <w:lvl w:ilvl="5" w:tentative="1">
+      <w:start w:val="1"/>
+      <w:numFmt w:val="bullet"/>
+      <w:lvlText w:val=""/>
+      <w:lvlJc w:val="left"/>
+      <w:pPr>
+        <w:tabs>
+          <w:tab w:val="num" w:pos="4320"/>
+        </w:tabs>
+        <w:ind w:left="4320" w:hanging="360"/>
+      </w:pPr>
+      <w:rPr>
+        <w:rFonts w:ascii="Wingdings" w:hAnsi="Wingdings" w:hint="default"/>
+        <w:sz w:val="20"/>
+      </w:rPr>
+    </w:lvl>
+    <w:lvl w:ilvl="6" w:tentative="1">
+      <w:start w:val="1"/>
+      <w:numFmt w:val="bullet"/>
+      <w:lvlText w:val=""/>
+      <w:lvlJc w:val="left"/>
+      <w:pPr>
+        <w:tabs>
+          <w:tab w:val="num" w:pos="5040"/>
+        </w:tabs>
+        <w:ind w:left="5040" w:hanging="360"/>
+      </w:pPr>
+      <w:rPr>
+        <w:rFonts w:ascii="Wingdings" w:hAnsi="Wingdings" w:hint="default"/>
+        <w:sz w:val="20"/>
+      </w:rPr>
+    </w:lvl>
+    <w:lvl w:ilvl="7" w:tentative="1">
+      <w:start w:val="1"/>
+      <w:numFmt w:val="bullet"/>
+      <w:lvlText w:val=""/>
+      <w:lvlJc w:val="left"/>
+      <w:pPr>
+        <w:tabs>
+          <w:tab w:val="num" w:pos="5760"/>
+        </w:tabs>
+        <w:ind w:left="5760" w:hanging="360"/>
+      </w:pPr>
+      <w:rPr>
+        <w:rFonts w:ascii="Wingdings" w:hAnsi="Wingdings" w:hint="default"/>
+        <w:sz w:val="20"/>
+      </w:rPr>
+    </w:lvl>
+    <w:lvl w:ilvl="8" w:tentative="1">
+      <w:start w:val="1"/>
+      <w:numFmt w:val="bullet"/>
+      <w:lvlText w:val=""/>
+      <w:lvlJc w:val="left"/>
+      <w:pPr>
+        <w:tabs>
+          <w:tab w:val="num" w:pos="6480"/>
+        </w:tabs>
+        <w:ind w:left="6480" w:hanging="360"/>
+      </w:pPr>
+      <w:rPr>
+        <w:rFonts w:ascii="Wingdings" w:hAnsi="Wingdings" w:hint="default"/>
+        <w:sz w:val="20"/>
+      </w:rPr>
+    </w:lvl>
+  </w:abstractNum>
+  <w:abstractNum w:abstractNumId="18" w15:restartNumberingAfterBreak="0">
     <w:nsid w:val="1582525B"/>
     <w:multiLevelType w:val="multilevel"/>
     <w:tmpl w:val="77BE150C"/>
@@ -10402,7 +11331,7 @@
       </w:rPr>
     </w:lvl>
   </w:abstractNum>
-  <w:abstractNum w:abstractNumId="17" w15:restartNumberingAfterBreak="0">
+  <w:abstractNum w:abstractNumId="19" w15:restartNumberingAfterBreak="0">
     <w:nsid w:val="15AC1C01"/>
     <w:multiLevelType w:val="multilevel"/>
     <w:tmpl w:val="37448B88"/>
@@ -10551,7 +11480,156 @@
       </w:rPr>
     </w:lvl>
   </w:abstractNum>
-  <w:abstractNum w:abstractNumId="18" w15:restartNumberingAfterBreak="0">
+  <w:abstractNum w:abstractNumId="20" w15:restartNumberingAfterBreak="0">
+    <w:nsid w:val="18814CF8"/>
+    <w:multiLevelType w:val="multilevel"/>
+    <w:tmpl w:val="077ECA56"/>
+    <w:lvl w:ilvl="0">
+      <w:start w:val="1"/>
+      <w:numFmt w:val="bullet"/>
+      <w:lvlText w:val=""/>
+      <w:lvlJc w:val="left"/>
+      <w:pPr>
+        <w:tabs>
+          <w:tab w:val="num" w:pos="720"/>
+        </w:tabs>
+        <w:ind w:left="720" w:hanging="360"/>
+      </w:pPr>
+      <w:rPr>
+        <w:rFonts w:ascii="Symbol" w:hAnsi="Symbol" w:hint="default"/>
+        <w:sz w:val="20"/>
+      </w:rPr>
+    </w:lvl>
+    <w:lvl w:ilvl="1" w:tentative="1">
+      <w:start w:val="1"/>
+      <w:numFmt w:val="bullet"/>
+      <w:lvlText w:val="o"/>
+      <w:lvlJc w:val="left"/>
+      <w:pPr>
+        <w:tabs>
+          <w:tab w:val="num" w:pos="1440"/>
+        </w:tabs>
+        <w:ind w:left="1440" w:hanging="360"/>
+      </w:pPr>
+      <w:rPr>
+        <w:rFonts w:ascii="Courier New" w:hAnsi="Courier New" w:hint="default"/>
+        <w:sz w:val="20"/>
+      </w:rPr>
+    </w:lvl>
+    <w:lvl w:ilvl="2" w:tentative="1">
+      <w:start w:val="1"/>
+      <w:numFmt w:val="bullet"/>
+      <w:lvlText w:val=""/>
+      <w:lvlJc w:val="left"/>
+      <w:pPr>
+        <w:tabs>
+          <w:tab w:val="num" w:pos="2160"/>
+        </w:tabs>
+        <w:ind w:left="2160" w:hanging="360"/>
+      </w:pPr>
+      <w:rPr>
+        <w:rFonts w:ascii="Wingdings" w:hAnsi="Wingdings" w:hint="default"/>
+        <w:sz w:val="20"/>
+      </w:rPr>
+    </w:lvl>
+    <w:lvl w:ilvl="3" w:tentative="1">
+      <w:start w:val="1"/>
+      <w:numFmt w:val="bullet"/>
+      <w:lvlText w:val=""/>
+      <w:lvlJc w:val="left"/>
+      <w:pPr>
+        <w:tabs>
+          <w:tab w:val="num" w:pos="2880"/>
+        </w:tabs>
+        <w:ind w:left="2880" w:hanging="360"/>
+      </w:pPr>
+      <w:rPr>
+        <w:rFonts w:ascii="Wingdings" w:hAnsi="Wingdings" w:hint="default"/>
+        <w:sz w:val="20"/>
+      </w:rPr>
+    </w:lvl>
+    <w:lvl w:ilvl="4" w:tentative="1">
+      <w:start w:val="1"/>
+      <w:numFmt w:val="bullet"/>
+      <w:lvlText w:val=""/>
+      <w:lvlJc w:val="left"/>
+      <w:pPr>
+        <w:tabs>
+          <w:tab w:val="num" w:pos="3600"/>
+        </w:tabs>
+        <w:ind w:left="3600" w:hanging="360"/>
+      </w:pPr>
+      <w:rPr>
+        <w:rFonts w:ascii="Wingdings" w:hAnsi="Wingdings" w:hint="default"/>
+        <w:sz w:val="20"/>
+      </w:rPr>
+    </w:lvl>
+    <w:lvl w:ilvl="5" w:tentative="1">
+      <w:start w:val="1"/>
+      <w:numFmt w:val="bullet"/>
+      <w:lvlText w:val=""/>
+      <w:lvlJc w:val="left"/>
+      <w:pPr>
+        <w:tabs>
+          <w:tab w:val="num" w:pos="4320"/>
+        </w:tabs>
+        <w:ind w:left="4320" w:hanging="360"/>
+      </w:pPr>
+      <w:rPr>
+        <w:rFonts w:ascii="Wingdings" w:hAnsi="Wingdings" w:hint="default"/>
+        <w:sz w:val="20"/>
+      </w:rPr>
+    </w:lvl>
+    <w:lvl w:ilvl="6" w:tentative="1">
+      <w:start w:val="1"/>
+      <w:numFmt w:val="bullet"/>
+      <w:lvlText w:val=""/>
+      <w:lvlJc w:val="left"/>
+      <w:pPr>
+        <w:tabs>
+          <w:tab w:val="num" w:pos="5040"/>
+        </w:tabs>
+        <w:ind w:left="5040" w:hanging="360"/>
+      </w:pPr>
+      <w:rPr>
+        <w:rFonts w:ascii="Wingdings" w:hAnsi="Wingdings" w:hint="default"/>
+        <w:sz w:val="20"/>
+      </w:rPr>
+    </w:lvl>
+    <w:lvl w:ilvl="7" w:tentative="1">
+      <w:start w:val="1"/>
+      <w:numFmt w:val="bullet"/>
+      <w:lvlText w:val=""/>
+      <w:lvlJc w:val="left"/>
+      <w:pPr>
+        <w:tabs>
+          <w:tab w:val="num" w:pos="5760"/>
+        </w:tabs>
+        <w:ind w:left="5760" w:hanging="360"/>
+      </w:pPr>
+      <w:rPr>
+        <w:rFonts w:ascii="Wingdings" w:hAnsi="Wingdings" w:hint="default"/>
+        <w:sz w:val="20"/>
+      </w:rPr>
+    </w:lvl>
+    <w:lvl w:ilvl="8" w:tentative="1">
+      <w:start w:val="1"/>
+      <w:numFmt w:val="bullet"/>
+      <w:lvlText w:val=""/>
+      <w:lvlJc w:val="left"/>
+      <w:pPr>
+        <w:tabs>
+          <w:tab w:val="num" w:pos="6480"/>
+        </w:tabs>
+        <w:ind w:left="6480" w:hanging="360"/>
+      </w:pPr>
+      <w:rPr>
+        <w:rFonts w:ascii="Wingdings" w:hAnsi="Wingdings" w:hint="default"/>
+        <w:sz w:val="20"/>
+      </w:rPr>
+    </w:lvl>
+  </w:abstractNum>
+  <w:abstractNum w:abstractNumId="21" w15:restartNumberingAfterBreak="0">
     <w:nsid w:val="19BD1802"/>
     <w:multiLevelType w:val="hybridMultilevel"/>
     <w:tmpl w:val="4FCCBE06"/>
@@ -10637,7 +11715,7 @@
       </w:pPr>
     </w:lvl>
   </w:abstractNum>
-  <w:abstractNum w:abstractNumId="19" w15:restartNumberingAfterBreak="0">
+  <w:abstractNum w:abstractNumId="22" w15:restartNumberingAfterBreak="0">
     <w:nsid w:val="1A557357"/>
     <w:multiLevelType w:val="multilevel"/>
     <w:tmpl w:val="49F6B5CE"/>
@@ -10786,7 +11864,7 @@
       </w:rPr>
     </w:lvl>
   </w:abstractNum>
-  <w:abstractNum w:abstractNumId="20" w15:restartNumberingAfterBreak="0">
+  <w:abstractNum w:abstractNumId="23" w15:restartNumberingAfterBreak="0">
     <w:nsid w:val="1B4009C4"/>
     <w:multiLevelType w:val="multilevel"/>
     <w:tmpl w:val="9B8E0480"/>
@@ -10935,7 +12013,120 @@
       </w:rPr>
     </w:lvl>
   </w:abstractNum>
-  <w:abstractNum w:abstractNumId="21" w15:restartNumberingAfterBreak="0">
+  <w:abstractNum w:abstractNumId="24" w15:restartNumberingAfterBreak="0">
+    <w:nsid w:val="1CDC6C28"/>
+    <w:multiLevelType w:val="hybridMultilevel"/>
+    <w:tmpl w:val="FC3C1C0E"/>
+    <w:lvl w:ilvl="0" w:tplc="100C0001">
+      <w:start w:val="1"/>
+      <w:numFmt w:val="bullet"/>
+      <w:lvlText w:val=""/>
+      <w:lvlJc w:val="left"/>
+      <w:pPr>
+        <w:ind w:left="1854" w:hanging="360"/>
+      </w:pPr>
+      <w:rPr>
+        <w:rFonts w:ascii="Symbol" w:hAnsi="Symbol" w:hint="default"/>
+      </w:rPr>
+    </w:lvl>
+    <w:lvl w:ilvl="1" w:tplc="100C0003" w:tentative="1">
+      <w:start w:val="1"/>
+      <w:numFmt w:val="bullet"/>
+      <w:lvlText w:val="o"/>
+      <w:lvlJc w:val="left"/>
+      <w:pPr>
+        <w:ind w:left="2574" w:hanging="360"/>
+      </w:pPr>
+      <w:rPr>
+        <w:rFonts w:ascii="Courier New" w:hAnsi="Courier New" w:cs="Courier New" w:hint="default"/>
+      </w:rPr>
+    </w:lvl>
+    <w:lvl w:ilvl="2" w:tplc="100C0005" w:tentative="1">
+      <w:start w:val="1"/>
+      <w:numFmt w:val="bullet"/>
+      <w:lvlText w:val=""/>
+      <w:lvlJc w:val="left"/>
+      <w:pPr>
+        <w:ind w:left="3294" w:hanging="360"/>
+      </w:pPr>
+      <w:rPr>
+        <w:rFonts w:ascii="Wingdings" w:hAnsi="Wingdings" w:hint="default"/>
+      </w:rPr>
+    </w:lvl>
+    <w:lvl w:ilvl="3" w:tplc="100C0001" w:tentative="1">
+      <w:start w:val="1"/>
+      <w:numFmt w:val="bullet"/>
+      <w:lvlText w:val=""/>
+      <w:lvlJc w:val="left"/>
+      <w:pPr>
+        <w:ind w:left="4014" w:hanging="360"/>
+      </w:pPr>
+      <w:rPr>
+        <w:rFonts w:ascii="Symbol" w:hAnsi="Symbol" w:hint="default"/>
+      </w:rPr>
+    </w:lvl>
+    <w:lvl w:ilvl="4" w:tplc="100C0003" w:tentative="1">
+      <w:start w:val="1"/>
+      <w:numFmt w:val="bullet"/>
+      <w:lvlText w:val="o"/>
+      <w:lvlJc w:val="left"/>
+      <w:pPr>
+        <w:ind w:left="4734" w:hanging="360"/>
+      </w:pPr>
+      <w:rPr>
+        <w:rFonts w:ascii="Courier New" w:hAnsi="Courier New" w:cs="Courier New" w:hint="default"/>
+      </w:rPr>
+    </w:lvl>
+    <w:lvl w:ilvl="5" w:tplc="100C0005" w:tentative="1">
+      <w:start w:val="1"/>
+      <w:numFmt w:val="bullet"/>
+      <w:lvlText w:val=""/>
+      <w:lvlJc w:val="left"/>
+      <w:pPr>
+        <w:ind w:left="5454" w:hanging="360"/>
+      </w:pPr>
+      <w:rPr>
+        <w:rFonts w:ascii="Wingdings" w:hAnsi="Wingdings" w:hint="default"/>
+      </w:rPr>
+    </w:lvl>
+    <w:lvl w:ilvl="6" w:tplc="100C0001" w:tentative="1">
+      <w:start w:val="1"/>
+      <w:numFmt w:val="bullet"/>
+      <w:lvlText w:val=""/>
+      <w:lvlJc w:val="left"/>
+      <w:pPr>
+        <w:ind w:left="6174" w:hanging="360"/>
+      </w:pPr>
+      <w:rPr>
+        <w:rFonts w:ascii="Symbol" w:hAnsi="Symbol" w:hint="default"/>
+      </w:rPr>
+    </w:lvl>
+    <w:lvl w:ilvl="7" w:tplc="100C0003" w:tentative="1">
+      <w:start w:val="1"/>
+      <w:numFmt w:val="bullet"/>
+      <w:lvlText w:val="o"/>
+      <w:lvlJc w:val="left"/>
+      <w:pPr>
+        <w:ind w:left="6894" w:hanging="360"/>
+      </w:pPr>
+      <w:rPr>
+        <w:rFonts w:ascii="Courier New" w:hAnsi="Courier New" w:cs="Courier New" w:hint="default"/>
+      </w:rPr>
+    </w:lvl>
+    <w:lvl w:ilvl="8" w:tplc="100C0005" w:tentative="1">
+      <w:start w:val="1"/>
+      <w:numFmt w:val="bullet"/>
+      <w:lvlText w:val=""/>
+      <w:lvlJc w:val="left"/>
+      <w:pPr>
+        <w:ind w:left="7614" w:hanging="360"/>
+      </w:pPr>
+      <w:rPr>
+        <w:rFonts w:ascii="Wingdings" w:hAnsi="Wingdings" w:hint="default"/>
+      </w:rPr>
+    </w:lvl>
+  </w:abstractNum>
+  <w:abstractNum w:abstractNumId="25" w15:restartNumberingAfterBreak="0">
     <w:nsid w:val="1CF81CA9"/>
     <w:multiLevelType w:val="multilevel"/>
     <w:tmpl w:val="7862D484"/>
@@ -11084,7 +12275,7 @@
       </w:rPr>
     </w:lvl>
   </w:abstractNum>
-  <w:abstractNum w:abstractNumId="22" w15:restartNumberingAfterBreak="0">
+  <w:abstractNum w:abstractNumId="26" w15:restartNumberingAfterBreak="0">
     <w:nsid w:val="2401657E"/>
     <w:multiLevelType w:val="hybridMultilevel"/>
     <w:tmpl w:val="9B7445A8"/>
@@ -11170,7 +12361,7 @@
       </w:pPr>
     </w:lvl>
   </w:abstractNum>
-  <w:abstractNum w:abstractNumId="23" w15:restartNumberingAfterBreak="0">
+  <w:abstractNum w:abstractNumId="27" w15:restartNumberingAfterBreak="0">
     <w:nsid w:val="26A66FA2"/>
     <w:multiLevelType w:val="multilevel"/>
     <w:tmpl w:val="F0A48D78"/>
@@ -11319,7 +12510,7 @@
       </w:rPr>
     </w:lvl>
   </w:abstractNum>
-  <w:abstractNum w:abstractNumId="24" w15:restartNumberingAfterBreak="0">
+  <w:abstractNum w:abstractNumId="28" w15:restartNumberingAfterBreak="0">
     <w:nsid w:val="286972F3"/>
     <w:multiLevelType w:val="hybridMultilevel"/>
     <w:tmpl w:val="625A9CBA"/>
@@ -11405,7 +12596,7 @@
       </w:pPr>
     </w:lvl>
   </w:abstractNum>
-  <w:abstractNum w:abstractNumId="25" w15:restartNumberingAfterBreak="0">
+  <w:abstractNum w:abstractNumId="29" w15:restartNumberingAfterBreak="0">
     <w:nsid w:val="2A4975AE"/>
     <w:multiLevelType w:val="hybridMultilevel"/>
     <w:tmpl w:val="AD144DB8"/>
@@ -11491,7 +12682,7 @@
       </w:pPr>
     </w:lvl>
   </w:abstractNum>
-  <w:abstractNum w:abstractNumId="26" w15:restartNumberingAfterBreak="0">
+  <w:abstractNum w:abstractNumId="30" w15:restartNumberingAfterBreak="0">
     <w:nsid w:val="2A8F67FD"/>
     <w:multiLevelType w:val="multilevel"/>
     <w:tmpl w:val="AB265ADE"/>
@@ -11607,7 +12798,7 @@
       </w:pPr>
     </w:lvl>
   </w:abstractNum>
-  <w:abstractNum w:abstractNumId="27" w15:restartNumberingAfterBreak="0">
+  <w:abstractNum w:abstractNumId="31" w15:restartNumberingAfterBreak="0">
     <w:nsid w:val="2F9178C1"/>
     <w:multiLevelType w:val="multilevel"/>
     <w:tmpl w:val="C996001C"/>
@@ -11756,7 +12947,7 @@
       </w:rPr>
     </w:lvl>
   </w:abstractNum>
-  <w:abstractNum w:abstractNumId="28" w15:restartNumberingAfterBreak="0">
+  <w:abstractNum w:abstractNumId="32" w15:restartNumberingAfterBreak="0">
     <w:nsid w:val="30061AC0"/>
     <w:multiLevelType w:val="multilevel"/>
     <w:tmpl w:val="CA36010A"/>
@@ -11905,7 +13096,93 @@
       </w:rPr>
     </w:lvl>
   </w:abstractNum>
-  <w:abstractNum w:abstractNumId="29" w15:restartNumberingAfterBreak="0">
+  <w:abstractNum w:abstractNumId="33" w15:restartNumberingAfterBreak="0">
+    <w:nsid w:val="33224AE7"/>
+    <w:multiLevelType w:val="hybridMultilevel"/>
+    <w:tmpl w:val="BB5EB058"/>
+    <w:lvl w:ilvl="0" w:tplc="100C000F">
+      <w:start w:val="1"/>
+      <w:numFmt w:val="decimal"/>
+      <w:lvlText w:val="%1."/>
+      <w:lvlJc w:val="left"/>
+      <w:pPr>
+        <w:ind w:left="720" w:hanging="360"/>
+      </w:pPr>
+    </w:lvl>
+    <w:lvl w:ilvl="1" w:tplc="100C0019" w:tentative="1">
+      <w:start w:val="1"/>
+      <w:numFmt w:val="lowerLetter"/>
+      <w:lvlText w:val="%2."/>
+      <w:lvlJc w:val="left"/>
+      <w:pPr>
+        <w:ind w:left="1440" w:hanging="360"/>
+      </w:pPr>
+    </w:lvl>
+    <w:lvl w:ilvl="2" w:tplc="100C001B" w:tentative="1">
+      <w:start w:val="1"/>
+      <w:numFmt w:val="lowerRoman"/>
+      <w:lvlText w:val="%3."/>
+      <w:lvlJc w:val="right"/>
+      <w:pPr>
+        <w:ind w:left="2160" w:hanging="180"/>
+      </w:pPr>
+    </w:lvl>
+    <w:lvl w:ilvl="3" w:tplc="100C000F" w:tentative="1">
+      <w:start w:val="1"/>
+      <w:numFmt w:val="decimal"/>
+      <w:lvlText w:val="%4."/>
+      <w:lvlJc w:val="left"/>
+      <w:pPr>
+        <w:ind w:left="2880" w:hanging="360"/>
+      </w:pPr>
+    </w:lvl>
+    <w:lvl w:ilvl="4" w:tplc="100C0019" w:tentative="1">
+      <w:start w:val="1"/>
+      <w:numFmt w:val="lowerLetter"/>
+      <w:lvlText w:val="%5."/>
+      <w:lvlJc w:val="left"/>
+      <w:pPr>
+        <w:ind w:left="3600" w:hanging="360"/>
+      </w:pPr>
+    </w:lvl>
+    <w:lvl w:ilvl="5" w:tplc="100C001B" w:tentative="1">
+      <w:start w:val="1"/>
+      <w:numFmt w:val="lowerRoman"/>
+      <w:lvlText w:val="%6."/>
+      <w:lvlJc w:val="right"/>
+      <w:pPr>
+        <w:ind w:left="4320" w:hanging="180"/>
+      </w:pPr>
+    </w:lvl>
+    <w:lvl w:ilvl="6" w:tplc="100C000F" w:tentative="1">
+      <w:start w:val="1"/>
+      <w:numFmt w:val="decimal"/>
+      <w:lvlText w:val="%7."/>
+      <w:lvlJc w:val="left"/>
+      <w:pPr>
+        <w:ind w:left="5040" w:hanging="360"/>
+      </w:pPr>
+    </w:lvl>
+    <w:lvl w:ilvl="7" w:tplc="100C0019" w:tentative="1">
+      <w:start w:val="1"/>
+      <w:numFmt w:val="lowerLetter"/>
+      <w:lvlText w:val="%8."/>
+      <w:lvlJc w:val="left"/>
+      <w:pPr>
+        <w:ind w:left="5760" w:hanging="360"/>
+      </w:pPr>
+    </w:lvl>
+    <w:lvl w:ilvl="8" w:tplc="100C001B" w:tentative="1">
+      <w:start w:val="1"/>
+      <w:numFmt w:val="lowerRoman"/>
+      <w:lvlText w:val="%9."/>
+      <w:lvlJc w:val="right"/>
+      <w:pPr>
+        <w:ind w:left="6480" w:hanging="180"/>
+      </w:pPr>
+    </w:lvl>
+  </w:abstractNum>
+  <w:abstractNum w:abstractNumId="34" w15:restartNumberingAfterBreak="0">
     <w:nsid w:val="352802CD"/>
     <w:multiLevelType w:val="multilevel"/>
     <w:tmpl w:val="295C0684"/>
@@ -12054,7 +13331,7 @@
       </w:rPr>
     </w:lvl>
   </w:abstractNum>
-  <w:abstractNum w:abstractNumId="30" w15:restartNumberingAfterBreak="0">
+  <w:abstractNum w:abstractNumId="35" w15:restartNumberingAfterBreak="0">
     <w:nsid w:val="3754479B"/>
     <w:multiLevelType w:val="multilevel"/>
     <w:tmpl w:val="874CD94C"/>
@@ -12203,7 +13480,7 @@
       </w:rPr>
     </w:lvl>
   </w:abstractNum>
-  <w:abstractNum w:abstractNumId="31" w15:restartNumberingAfterBreak="0">
+  <w:abstractNum w:abstractNumId="36" w15:restartNumberingAfterBreak="0">
     <w:nsid w:val="3AE80592"/>
     <w:multiLevelType w:val="multilevel"/>
     <w:tmpl w:val="E454055A"/>
@@ -12352,7 +13629,7 @@
       </w:rPr>
     </w:lvl>
   </w:abstractNum>
-  <w:abstractNum w:abstractNumId="32" w15:restartNumberingAfterBreak="0">
+  <w:abstractNum w:abstractNumId="37" w15:restartNumberingAfterBreak="0">
     <w:nsid w:val="3BD16F36"/>
     <w:multiLevelType w:val="multilevel"/>
     <w:tmpl w:val="100C0021"/>
@@ -12465,7 +13742,7 @@
       </w:rPr>
     </w:lvl>
   </w:abstractNum>
-  <w:abstractNum w:abstractNumId="33" w15:restartNumberingAfterBreak="0">
+  <w:abstractNum w:abstractNumId="38" w15:restartNumberingAfterBreak="0">
     <w:nsid w:val="3EF922F0"/>
     <w:multiLevelType w:val="multilevel"/>
     <w:tmpl w:val="100C0021"/>
@@ -12578,7 +13855,7 @@
       </w:rPr>
     </w:lvl>
   </w:abstractNum>
-  <w:abstractNum w:abstractNumId="34" w15:restartNumberingAfterBreak="0">
+  <w:abstractNum w:abstractNumId="39" w15:restartNumberingAfterBreak="0">
     <w:nsid w:val="40413F2D"/>
     <w:multiLevelType w:val="multilevel"/>
     <w:tmpl w:val="BF582436"/>
@@ -12727,7 +14004,7 @@
       </w:rPr>
     </w:lvl>
   </w:abstractNum>
-  <w:abstractNum w:abstractNumId="35" w15:restartNumberingAfterBreak="0">
+  <w:abstractNum w:abstractNumId="40" w15:restartNumberingAfterBreak="0">
     <w:nsid w:val="42601ED3"/>
     <w:multiLevelType w:val="multilevel"/>
     <w:tmpl w:val="B10A766E"/>
@@ -12872,7 +14149,7 @@
       </w:rPr>
     </w:lvl>
   </w:abstractNum>
-  <w:abstractNum w:abstractNumId="36" w15:restartNumberingAfterBreak="0">
+  <w:abstractNum w:abstractNumId="41" w15:restartNumberingAfterBreak="0">
     <w:nsid w:val="42F60F8E"/>
     <w:multiLevelType w:val="hybridMultilevel"/>
     <w:tmpl w:val="F4202DE4"/>
@@ -12985,7 +14262,7 @@
       </w:rPr>
     </w:lvl>
   </w:abstractNum>
-  <w:abstractNum w:abstractNumId="37" w15:restartNumberingAfterBreak="0">
+  <w:abstractNum w:abstractNumId="42" w15:restartNumberingAfterBreak="0">
     <w:nsid w:val="43375E5A"/>
     <w:multiLevelType w:val="hybridMultilevel"/>
     <w:tmpl w:val="09520796"/>
@@ -13098,7 +14375,7 @@
       </w:rPr>
     </w:lvl>
   </w:abstractNum>
-  <w:abstractNum w:abstractNumId="38" w15:restartNumberingAfterBreak="0">
+  <w:abstractNum w:abstractNumId="43" w15:restartNumberingAfterBreak="0">
     <w:nsid w:val="443160C6"/>
     <w:multiLevelType w:val="multilevel"/>
     <w:tmpl w:val="BB94C320"/>
@@ -13247,7 +14524,7 @@
       </w:rPr>
     </w:lvl>
   </w:abstractNum>
-  <w:abstractNum w:abstractNumId="39" w15:restartNumberingAfterBreak="0">
+  <w:abstractNum w:abstractNumId="44" w15:restartNumberingAfterBreak="0">
     <w:nsid w:val="44716BF9"/>
     <w:multiLevelType w:val="multilevel"/>
     <w:tmpl w:val="01404C1C"/>
@@ -13364,7 +14641,7 @@
       </w:pPr>
     </w:lvl>
   </w:abstractNum>
-  <w:abstractNum w:abstractNumId="40" w15:restartNumberingAfterBreak="0">
+  <w:abstractNum w:abstractNumId="45" w15:restartNumberingAfterBreak="0">
     <w:nsid w:val="44EF3A5B"/>
     <w:multiLevelType w:val="multilevel"/>
     <w:tmpl w:val="0EA89E0C"/>
@@ -13513,7 +14790,7 @@
       </w:rPr>
     </w:lvl>
   </w:abstractNum>
-  <w:abstractNum w:abstractNumId="41" w15:restartNumberingAfterBreak="0">
+  <w:abstractNum w:abstractNumId="46" w15:restartNumberingAfterBreak="0">
     <w:nsid w:val="45D7053A"/>
     <w:multiLevelType w:val="hybridMultilevel"/>
     <w:tmpl w:val="C94C0CC2"/>
@@ -13626,7 +14903,7 @@
       </w:rPr>
     </w:lvl>
   </w:abstractNum>
-  <w:abstractNum w:abstractNumId="42" w15:restartNumberingAfterBreak="0">
+  <w:abstractNum w:abstractNumId="47" w15:restartNumberingAfterBreak="0">
     <w:nsid w:val="466E1CC2"/>
     <w:multiLevelType w:val="multilevel"/>
     <w:tmpl w:val="03F887D8"/>
@@ -13775,7 +15052,7 @@
       </w:rPr>
     </w:lvl>
   </w:abstractNum>
-  <w:abstractNum w:abstractNumId="43" w15:restartNumberingAfterBreak="0">
+  <w:abstractNum w:abstractNumId="48" w15:restartNumberingAfterBreak="0">
     <w:nsid w:val="47013D00"/>
     <w:multiLevelType w:val="hybridMultilevel"/>
     <w:tmpl w:val="EDB283C0"/>
@@ -13861,7 +15138,7 @@
       </w:pPr>
     </w:lvl>
   </w:abstractNum>
-  <w:abstractNum w:abstractNumId="44" w15:restartNumberingAfterBreak="0">
+  <w:abstractNum w:abstractNumId="49" w15:restartNumberingAfterBreak="0">
     <w:nsid w:val="470304FF"/>
     <w:multiLevelType w:val="multilevel"/>
     <w:tmpl w:val="DB142014"/>
@@ -13978,7 +15255,7 @@
       </w:pPr>
     </w:lvl>
   </w:abstractNum>
-  <w:abstractNum w:abstractNumId="45" w15:restartNumberingAfterBreak="0">
+  <w:abstractNum w:abstractNumId="50" w15:restartNumberingAfterBreak="0">
     <w:nsid w:val="486164F4"/>
     <w:multiLevelType w:val="multilevel"/>
     <w:tmpl w:val="100C0021"/>
@@ -14091,7 +15368,7 @@
       </w:rPr>
     </w:lvl>
   </w:abstractNum>
-  <w:abstractNum w:abstractNumId="46" w15:restartNumberingAfterBreak="0">
+  <w:abstractNum w:abstractNumId="51" w15:restartNumberingAfterBreak="0">
     <w:nsid w:val="49A04187"/>
     <w:multiLevelType w:val="multilevel"/>
     <w:tmpl w:val="21BC8390"/>
@@ -14208,7 +15485,120 @@
       </w:pPr>
     </w:lvl>
   </w:abstractNum>
-  <w:abstractNum w:abstractNumId="47" w15:restartNumberingAfterBreak="0">
+  <w:abstractNum w:abstractNumId="52" w15:restartNumberingAfterBreak="0">
+    <w:nsid w:val="4D613D88"/>
+    <w:multiLevelType w:val="hybridMultilevel"/>
+    <w:tmpl w:val="3762FDEE"/>
+    <w:lvl w:ilvl="0" w:tplc="100C000F">
+      <w:start w:val="1"/>
+      <w:numFmt w:val="decimal"/>
+      <w:lvlText w:val="%1."/>
+      <w:lvlJc w:val="left"/>
+      <w:pPr>
+        <w:ind w:left="720" w:hanging="360"/>
+      </w:pPr>
+      <w:rPr>
+        <w:rFonts w:hint="default"/>
+      </w:rPr>
+    </w:lvl>
+    <w:lvl w:ilvl="1" w:tplc="FFFFFFFF" w:tentative="1">
+      <w:start w:val="1"/>
+      <w:numFmt w:val="bullet"/>
+      <w:lvlText w:val="o"/>
+      <w:lvlJc w:val="left"/>
+      <w:pPr>
+        <w:ind w:left="1440" w:hanging="360"/>
+      </w:pPr>
+      <w:rPr>
+        <w:rFonts w:ascii="Courier New" w:hAnsi="Courier New" w:cs="Courier New" w:hint="default"/>
+      </w:rPr>
+    </w:lvl>
+    <w:lvl w:ilvl="2" w:tplc="FFFFFFFF" w:tentative="1">
+      <w:start w:val="1"/>
+      <w:numFmt w:val="bullet"/>
+      <w:lvlText w:val=""/>
+      <w:lvlJc w:val="left"/>
+      <w:pPr>
+        <w:ind w:left="2160" w:hanging="360"/>
+      </w:pPr>
+      <w:rPr>
+        <w:rFonts w:ascii="Wingdings" w:hAnsi="Wingdings" w:hint="default"/>
+      </w:rPr>
+    </w:lvl>
+    <w:lvl w:ilvl="3" w:tplc="FFFFFFFF" w:tentative="1">
+      <w:start w:val="1"/>
+      <w:numFmt w:val="bullet"/>
+      <w:lvlText w:val=""/>
+      <w:lvlJc w:val="left"/>
+      <w:pPr>
+        <w:ind w:left="2880" w:hanging="360"/>
+      </w:pPr>
+      <w:rPr>
+        <w:rFonts w:ascii="Symbol" w:hAnsi="Symbol" w:hint="default"/>
+      </w:rPr>
+    </w:lvl>
+    <w:lvl w:ilvl="4" w:tplc="FFFFFFFF" w:tentative="1">
+      <w:start w:val="1"/>
+      <w:numFmt w:val="bullet"/>
+      <w:lvlText w:val="o"/>
+      <w:lvlJc w:val="left"/>
+      <w:pPr>
+        <w:ind w:left="3600" w:hanging="360"/>
+      </w:pPr>
+      <w:rPr>
+        <w:rFonts w:ascii="Courier New" w:hAnsi="Courier New" w:cs="Courier New" w:hint="default"/>
+      </w:rPr>
+    </w:lvl>
+    <w:lvl w:ilvl="5" w:tplc="FFFFFFFF" w:tentative="1">
+      <w:start w:val="1"/>
+      <w:numFmt w:val="bullet"/>
+      <w:lvlText w:val=""/>
+      <w:lvlJc w:val="left"/>
+      <w:pPr>
+        <w:ind w:left="4320" w:hanging="360"/>
+      </w:pPr>
+      <w:rPr>
+        <w:rFonts w:ascii="Wingdings" w:hAnsi="Wingdings" w:hint="default"/>
+      </w:rPr>
+    </w:lvl>
+    <w:lvl w:ilvl="6" w:tplc="FFFFFFFF" w:tentative="1">
+      <w:start w:val="1"/>
+      <w:numFmt w:val="bullet"/>
+      <w:lvlText w:val=""/>
+      <w:lvlJc w:val="left"/>
+      <w:pPr>
+        <w:ind w:left="5040" w:hanging="360"/>
+      </w:pPr>
+      <w:rPr>
+        <w:rFonts w:ascii="Symbol" w:hAnsi="Symbol" w:hint="default"/>
+      </w:rPr>
+    </w:lvl>
+    <w:lvl w:ilvl="7" w:tplc="FFFFFFFF" w:tentative="1">
+      <w:start w:val="1"/>
+      <w:numFmt w:val="bullet"/>
+      <w:lvlText w:val="o"/>
+      <w:lvlJc w:val="left"/>
+      <w:pPr>
+        <w:ind w:left="5760" w:hanging="360"/>
+      </w:pPr>
+      <w:rPr>
+        <w:rFonts w:ascii="Courier New" w:hAnsi="Courier New" w:cs="Courier New" w:hint="default"/>
+      </w:rPr>
+    </w:lvl>
+    <w:lvl w:ilvl="8" w:tplc="FFFFFFFF" w:tentative="1">
+      <w:start w:val="1"/>
+      <w:numFmt w:val="bullet"/>
+      <w:lvlText w:val=""/>
+      <w:lvlJc w:val="left"/>
+      <w:pPr>
+        <w:ind w:left="6480" w:hanging="360"/>
+      </w:pPr>
+      <w:rPr>
+        <w:rFonts w:ascii="Wingdings" w:hAnsi="Wingdings" w:hint="default"/>
+      </w:rPr>
+    </w:lvl>
+  </w:abstractNum>
+  <w:abstractNum w:abstractNumId="53" w15:restartNumberingAfterBreak="0">
     <w:nsid w:val="4E880B14"/>
     <w:multiLevelType w:val="hybridMultilevel"/>
     <w:tmpl w:val="588695E2"/>
@@ -14294,7 +15684,7 @@
       </w:pPr>
     </w:lvl>
   </w:abstractNum>
-  <w:abstractNum w:abstractNumId="48" w15:restartNumberingAfterBreak="0">
+  <w:abstractNum w:abstractNumId="54" w15:restartNumberingAfterBreak="0">
     <w:nsid w:val="4EFB319D"/>
     <w:multiLevelType w:val="hybridMultilevel"/>
     <w:tmpl w:val="D70A16EC"/>
@@ -14407,7 +15797,7 @@
       </w:rPr>
     </w:lvl>
   </w:abstractNum>
-  <w:abstractNum w:abstractNumId="49" w15:restartNumberingAfterBreak="0">
+  <w:abstractNum w:abstractNumId="55" w15:restartNumberingAfterBreak="0">
     <w:nsid w:val="4FF40332"/>
     <w:multiLevelType w:val="hybridMultilevel"/>
     <w:tmpl w:val="AE8471CE"/>
@@ -14520,7 +15910,7 @@
       </w:rPr>
     </w:lvl>
   </w:abstractNum>
-  <w:abstractNum w:abstractNumId="50" w15:restartNumberingAfterBreak="0">
+  <w:abstractNum w:abstractNumId="56" w15:restartNumberingAfterBreak="0">
     <w:nsid w:val="50D72083"/>
     <w:multiLevelType w:val="multilevel"/>
     <w:tmpl w:val="F73AFD5C"/>
@@ -14665,7 +16055,7 @@
       </w:rPr>
     </w:lvl>
   </w:abstractNum>
-  <w:abstractNum w:abstractNumId="51" w15:restartNumberingAfterBreak="0">
+  <w:abstractNum w:abstractNumId="57" w15:restartNumberingAfterBreak="0">
     <w:nsid w:val="51876E89"/>
     <w:multiLevelType w:val="multilevel"/>
     <w:tmpl w:val="AE00E0CE"/>
@@ -14814,7 +16204,7 @@
       </w:rPr>
     </w:lvl>
   </w:abstractNum>
-  <w:abstractNum w:abstractNumId="52" w15:restartNumberingAfterBreak="0">
+  <w:abstractNum w:abstractNumId="58" w15:restartNumberingAfterBreak="0">
     <w:nsid w:val="52AB4161"/>
     <w:multiLevelType w:val="multilevel"/>
     <w:tmpl w:val="BFCC9260"/>
@@ -14931,7 +16321,7 @@
       </w:pPr>
     </w:lvl>
   </w:abstractNum>
-  <w:abstractNum w:abstractNumId="53" w15:restartNumberingAfterBreak="0">
+  <w:abstractNum w:abstractNumId="59" w15:restartNumberingAfterBreak="0">
     <w:nsid w:val="572B450E"/>
     <w:multiLevelType w:val="hybridMultilevel"/>
     <w:tmpl w:val="1818C56A"/>
@@ -15044,7 +16434,93 @@
       </w:rPr>
     </w:lvl>
   </w:abstractNum>
-  <w:abstractNum w:abstractNumId="54" w15:restartNumberingAfterBreak="0">
+  <w:abstractNum w:abstractNumId="60" w15:restartNumberingAfterBreak="0">
+    <w:nsid w:val="57C55BAB"/>
+    <w:multiLevelType w:val="hybridMultilevel"/>
+    <w:tmpl w:val="E0CC7CB4"/>
+    <w:lvl w:ilvl="0" w:tplc="100C000F">
+      <w:start w:val="1"/>
+      <w:numFmt w:val="decimal"/>
+      <w:lvlText w:val="%1."/>
+      <w:lvlJc w:val="left"/>
+      <w:pPr>
+        <w:ind w:left="720" w:hanging="360"/>
+      </w:pPr>
+    </w:lvl>
+    <w:lvl w:ilvl="1" w:tplc="100C0019" w:tentative="1">
+      <w:start w:val="1"/>
+      <w:numFmt w:val="lowerLetter"/>
+      <w:lvlText w:val="%2."/>
+      <w:lvlJc w:val="left"/>
+      <w:pPr>
+        <w:ind w:left="1440" w:hanging="360"/>
+      </w:pPr>
+    </w:lvl>
+    <w:lvl w:ilvl="2" w:tplc="100C001B" w:tentative="1">
+      <w:start w:val="1"/>
+      <w:numFmt w:val="lowerRoman"/>
+      <w:lvlText w:val="%3."/>
+      <w:lvlJc w:val="right"/>
+      <w:pPr>
+        <w:ind w:left="2160" w:hanging="180"/>
+      </w:pPr>
+    </w:lvl>
+    <w:lvl w:ilvl="3" w:tplc="100C000F" w:tentative="1">
+      <w:start w:val="1"/>
+      <w:numFmt w:val="decimal"/>
+      <w:lvlText w:val="%4."/>
+      <w:lvlJc w:val="left"/>
+      <w:pPr>
+        <w:ind w:left="2880" w:hanging="360"/>
+      </w:pPr>
+    </w:lvl>
+    <w:lvl w:ilvl="4" w:tplc="100C0019" w:tentative="1">
+      <w:start w:val="1"/>
+      <w:numFmt w:val="lowerLetter"/>
+      <w:lvlText w:val="%5."/>
+      <w:lvlJc w:val="left"/>
+      <w:pPr>
+        <w:ind w:left="3600" w:hanging="360"/>
+      </w:pPr>
+    </w:lvl>
+    <w:lvl w:ilvl="5" w:tplc="100C001B" w:tentative="1">
+      <w:start w:val="1"/>
+      <w:numFmt w:val="lowerRoman"/>
+      <w:lvlText w:val="%6."/>
+      <w:lvlJc w:val="right"/>
+      <w:pPr>
+        <w:ind w:left="4320" w:hanging="180"/>
+      </w:pPr>
+    </w:lvl>
+    <w:lvl w:ilvl="6" w:tplc="100C000F" w:tentative="1">
+      <w:start w:val="1"/>
+      <w:numFmt w:val="decimal"/>
+      <w:lvlText w:val="%7."/>
+      <w:lvlJc w:val="left"/>
+      <w:pPr>
+        <w:ind w:left="5040" w:hanging="360"/>
+      </w:pPr>
+    </w:lvl>
+    <w:lvl w:ilvl="7" w:tplc="100C0019" w:tentative="1">
+      <w:start w:val="1"/>
+      <w:numFmt w:val="lowerLetter"/>
+      <w:lvlText w:val="%8."/>
+      <w:lvlJc w:val="left"/>
+      <w:pPr>
+        <w:ind w:left="5760" w:hanging="360"/>
+      </w:pPr>
+    </w:lvl>
+    <w:lvl w:ilvl="8" w:tplc="100C001B" w:tentative="1">
+      <w:start w:val="1"/>
+      <w:numFmt w:val="lowerRoman"/>
+      <w:lvlText w:val="%9."/>
+      <w:lvlJc w:val="right"/>
+      <w:pPr>
+        <w:ind w:left="6480" w:hanging="180"/>
+      </w:pPr>
+    </w:lvl>
+  </w:abstractNum>
+  <w:abstractNum w:abstractNumId="61" w15:restartNumberingAfterBreak="0">
     <w:nsid w:val="58BB3E46"/>
     <w:multiLevelType w:val="multilevel"/>
     <w:tmpl w:val="9A7AE602"/>
@@ -15193,7 +16669,7 @@
       </w:rPr>
     </w:lvl>
   </w:abstractNum>
-  <w:abstractNum w:abstractNumId="55" w15:restartNumberingAfterBreak="0">
+  <w:abstractNum w:abstractNumId="62" w15:restartNumberingAfterBreak="0">
     <w:nsid w:val="590C58DA"/>
     <w:multiLevelType w:val="multilevel"/>
     <w:tmpl w:val="13AAA4C8"/>
@@ -15338,7 +16814,7 @@
       </w:rPr>
     </w:lvl>
   </w:abstractNum>
-  <w:abstractNum w:abstractNumId="56" w15:restartNumberingAfterBreak="0">
+  <w:abstractNum w:abstractNumId="63" w15:restartNumberingAfterBreak="0">
     <w:nsid w:val="595A1A91"/>
     <w:multiLevelType w:val="multilevel"/>
     <w:tmpl w:val="B494260A"/>
@@ -15487,7 +16963,7 @@
       </w:rPr>
     </w:lvl>
   </w:abstractNum>
-  <w:abstractNum w:abstractNumId="57" w15:restartNumberingAfterBreak="0">
+  <w:abstractNum w:abstractNumId="64" w15:restartNumberingAfterBreak="0">
     <w:nsid w:val="5A1353C9"/>
     <w:multiLevelType w:val="hybridMultilevel"/>
     <w:tmpl w:val="40B84EF0"/>
@@ -15573,7 +17049,7 @@
       </w:pPr>
     </w:lvl>
   </w:abstractNum>
-  <w:abstractNum w:abstractNumId="58" w15:restartNumberingAfterBreak="0">
+  <w:abstractNum w:abstractNumId="65" w15:restartNumberingAfterBreak="0">
     <w:nsid w:val="5B6337DC"/>
     <w:multiLevelType w:val="multilevel"/>
     <w:tmpl w:val="68341AF2"/>
@@ -15722,7 +17198,7 @@
       </w:rPr>
     </w:lvl>
   </w:abstractNum>
-  <w:abstractNum w:abstractNumId="59" w15:restartNumberingAfterBreak="0">
+  <w:abstractNum w:abstractNumId="66" w15:restartNumberingAfterBreak="0">
     <w:nsid w:val="5C0C1455"/>
     <w:multiLevelType w:val="multilevel"/>
     <w:tmpl w:val="5E3A69CE"/>
@@ -15871,7 +17347,7 @@
       </w:rPr>
     </w:lvl>
   </w:abstractNum>
-  <w:abstractNum w:abstractNumId="60" w15:restartNumberingAfterBreak="0">
+  <w:abstractNum w:abstractNumId="67" w15:restartNumberingAfterBreak="0">
     <w:nsid w:val="5C877673"/>
     <w:multiLevelType w:val="multilevel"/>
     <w:tmpl w:val="100C0021"/>
@@ -15984,7 +17460,7 @@
       </w:rPr>
     </w:lvl>
   </w:abstractNum>
-  <w:abstractNum w:abstractNumId="61" w15:restartNumberingAfterBreak="0">
+  <w:abstractNum w:abstractNumId="68" w15:restartNumberingAfterBreak="0">
     <w:nsid w:val="5EB75F87"/>
     <w:multiLevelType w:val="multilevel"/>
     <w:tmpl w:val="1612F80A"/>
@@ -16105,7 +17581,7 @@
       </w:pPr>
     </w:lvl>
   </w:abstractNum>
-  <w:abstractNum w:abstractNumId="62" w15:restartNumberingAfterBreak="0">
+  <w:abstractNum w:abstractNumId="69" w15:restartNumberingAfterBreak="0">
     <w:nsid w:val="606E216E"/>
     <w:multiLevelType w:val="multilevel"/>
     <w:tmpl w:val="F73AFD5C"/>
@@ -16250,7 +17726,7 @@
       </w:rPr>
     </w:lvl>
   </w:abstractNum>
-  <w:abstractNum w:abstractNumId="63" w15:restartNumberingAfterBreak="0">
+  <w:abstractNum w:abstractNumId="70" w15:restartNumberingAfterBreak="0">
     <w:nsid w:val="623E39A1"/>
     <w:multiLevelType w:val="hybridMultilevel"/>
     <w:tmpl w:val="48A0B1AE"/>
@@ -16336,7 +17812,7 @@
       </w:pPr>
     </w:lvl>
   </w:abstractNum>
-  <w:abstractNum w:abstractNumId="64" w15:restartNumberingAfterBreak="0">
+  <w:abstractNum w:abstractNumId="71" w15:restartNumberingAfterBreak="0">
     <w:nsid w:val="64CD52AC"/>
     <w:multiLevelType w:val="multilevel"/>
     <w:tmpl w:val="9466875A"/>
@@ -16485,7 +17961,7 @@
       </w:rPr>
     </w:lvl>
   </w:abstractNum>
-  <w:abstractNum w:abstractNumId="65" w15:restartNumberingAfterBreak="0">
+  <w:abstractNum w:abstractNumId="72" w15:restartNumberingAfterBreak="0">
     <w:nsid w:val="656770F6"/>
     <w:multiLevelType w:val="hybridMultilevel"/>
     <w:tmpl w:val="B75AA2EC"/>
@@ -16571,7 +18047,7 @@
       </w:pPr>
     </w:lvl>
   </w:abstractNum>
-  <w:abstractNum w:abstractNumId="66" w15:restartNumberingAfterBreak="0">
+  <w:abstractNum w:abstractNumId="73" w15:restartNumberingAfterBreak="0">
     <w:nsid w:val="675461B1"/>
     <w:multiLevelType w:val="multilevel"/>
     <w:tmpl w:val="2D4C1872"/>
@@ -16720,7 +18196,156 @@
       </w:rPr>
     </w:lvl>
   </w:abstractNum>
-  <w:abstractNum w:abstractNumId="67" w15:restartNumberingAfterBreak="0">
+  <w:abstractNum w:abstractNumId="74" w15:restartNumberingAfterBreak="0">
+    <w:nsid w:val="67D65433"/>
+    <w:multiLevelType w:val="multilevel"/>
+    <w:tmpl w:val="E0D038E8"/>
+    <w:lvl w:ilvl="0">
+      <w:start w:val="1"/>
+      <w:numFmt w:val="bullet"/>
+      <w:lvlText w:val=""/>
+      <w:lvlJc w:val="left"/>
+      <w:pPr>
+        <w:tabs>
+          <w:tab w:val="num" w:pos="720"/>
+        </w:tabs>
+        <w:ind w:left="720" w:hanging="360"/>
+      </w:pPr>
+      <w:rPr>
+        <w:rFonts w:ascii="Symbol" w:hAnsi="Symbol" w:hint="default"/>
+        <w:sz w:val="20"/>
+      </w:rPr>
+    </w:lvl>
+    <w:lvl w:ilvl="1">
+      <w:start w:val="1"/>
+      <w:numFmt w:val="bullet"/>
+      <w:lvlText w:val="o"/>
+      <w:lvlJc w:val="left"/>
+      <w:pPr>
+        <w:tabs>
+          <w:tab w:val="num" w:pos="1440"/>
+        </w:tabs>
+        <w:ind w:left="1440" w:hanging="360"/>
+      </w:pPr>
+      <w:rPr>
+        <w:rFonts w:ascii="Courier New" w:hAnsi="Courier New" w:hint="default"/>
+        <w:sz w:val="20"/>
+      </w:rPr>
+    </w:lvl>
+    <w:lvl w:ilvl="2" w:tentative="1">
+      <w:start w:val="1"/>
+      <w:numFmt w:val="bullet"/>
+      <w:lvlText w:val=""/>
+      <w:lvlJc w:val="left"/>
+      <w:pPr>
+        <w:tabs>
+          <w:tab w:val="num" w:pos="2160"/>
+        </w:tabs>
+        <w:ind w:left="2160" w:hanging="360"/>
+      </w:pPr>
+      <w:rPr>
+        <w:rFonts w:ascii="Wingdings" w:hAnsi="Wingdings" w:hint="default"/>
+        <w:sz w:val="20"/>
+      </w:rPr>
+    </w:lvl>
+    <w:lvl w:ilvl="3" w:tentative="1">
+      <w:start w:val="1"/>
+      <w:numFmt w:val="bullet"/>
+      <w:lvlText w:val=""/>
+      <w:lvlJc w:val="left"/>
+      <w:pPr>
+        <w:tabs>
+          <w:tab w:val="num" w:pos="2880"/>
+        </w:tabs>
+        <w:ind w:left="2880" w:hanging="360"/>
+      </w:pPr>
+      <w:rPr>
+        <w:rFonts w:ascii="Wingdings" w:hAnsi="Wingdings" w:hint="default"/>
+        <w:sz w:val="20"/>
+      </w:rPr>
+    </w:lvl>
+    <w:lvl w:ilvl="4" w:tentative="1">
+      <w:start w:val="1"/>
+      <w:numFmt w:val="bullet"/>
+      <w:lvlText w:val=""/>
+      <w:lvlJc w:val="left"/>
+      <w:pPr>
+        <w:tabs>
+          <w:tab w:val="num" w:pos="3600"/>
+        </w:tabs>
+        <w:ind w:left="3600" w:hanging="360"/>
+      </w:pPr>
+      <w:rPr>
+        <w:rFonts w:ascii="Wingdings" w:hAnsi="Wingdings" w:hint="default"/>
+        <w:sz w:val="20"/>
+      </w:rPr>
+    </w:lvl>
+    <w:lvl w:ilvl="5" w:tentative="1">
+      <w:start w:val="1"/>
+      <w:numFmt w:val="bullet"/>
+      <w:lvlText w:val=""/>
+      <w:lvlJc w:val="left"/>
+      <w:pPr>
+        <w:tabs>
+          <w:tab w:val="num" w:pos="4320"/>
+        </w:tabs>
+        <w:ind w:left="4320" w:hanging="360"/>
+      </w:pPr>
+      <w:rPr>
+        <w:rFonts w:ascii="Wingdings" w:hAnsi="Wingdings" w:hint="default"/>
+        <w:sz w:val="20"/>
+      </w:rPr>
+    </w:lvl>
+    <w:lvl w:ilvl="6" w:tentative="1">
+      <w:start w:val="1"/>
+      <w:numFmt w:val="bullet"/>
+      <w:lvlText w:val=""/>
+      <w:lvlJc w:val="left"/>
+      <w:pPr>
+        <w:tabs>
+          <w:tab w:val="num" w:pos="5040"/>
+        </w:tabs>
+        <w:ind w:left="5040" w:hanging="360"/>
+      </w:pPr>
+      <w:rPr>
+        <w:rFonts w:ascii="Wingdings" w:hAnsi="Wingdings" w:hint="default"/>
+        <w:sz w:val="20"/>
+      </w:rPr>
+    </w:lvl>
+    <w:lvl w:ilvl="7" w:tentative="1">
+      <w:start w:val="1"/>
+      <w:numFmt w:val="bullet"/>
+      <w:lvlText w:val=""/>
+      <w:lvlJc w:val="left"/>
+      <w:pPr>
+        <w:tabs>
+          <w:tab w:val="num" w:pos="5760"/>
+        </w:tabs>
+        <w:ind w:left="5760" w:hanging="360"/>
+      </w:pPr>
+      <w:rPr>
+        <w:rFonts w:ascii="Wingdings" w:hAnsi="Wingdings" w:hint="default"/>
+        <w:sz w:val="20"/>
+      </w:rPr>
+    </w:lvl>
+    <w:lvl w:ilvl="8" w:tentative="1">
+      <w:start w:val="1"/>
+      <w:numFmt w:val="bullet"/>
+      <w:lvlText w:val=""/>
+      <w:lvlJc w:val="left"/>
+      <w:pPr>
+        <w:tabs>
+          <w:tab w:val="num" w:pos="6480"/>
+        </w:tabs>
+        <w:ind w:left="6480" w:hanging="360"/>
+      </w:pPr>
+      <w:rPr>
+        <w:rFonts w:ascii="Wingdings" w:hAnsi="Wingdings" w:hint="default"/>
+        <w:sz w:val="20"/>
+      </w:rPr>
+    </w:lvl>
+  </w:abstractNum>
+  <w:abstractNum w:abstractNumId="75" w15:restartNumberingAfterBreak="0">
     <w:nsid w:val="67E92066"/>
     <w:multiLevelType w:val="multilevel"/>
     <w:tmpl w:val="13AAA4C8"/>
@@ -16865,7 +18490,7 @@
       </w:rPr>
     </w:lvl>
   </w:abstractNum>
-  <w:abstractNum w:abstractNumId="68" w15:restartNumberingAfterBreak="0">
+  <w:abstractNum w:abstractNumId="76" w15:restartNumberingAfterBreak="0">
     <w:nsid w:val="67FA2FB8"/>
     <w:multiLevelType w:val="multilevel"/>
     <w:tmpl w:val="E21E3B8A"/>
@@ -17014,7 +18639,7 @@
       </w:rPr>
     </w:lvl>
   </w:abstractNum>
-  <w:abstractNum w:abstractNumId="69" w15:restartNumberingAfterBreak="0">
+  <w:abstractNum w:abstractNumId="77" w15:restartNumberingAfterBreak="0">
     <w:nsid w:val="689854E7"/>
     <w:multiLevelType w:val="hybridMultilevel"/>
     <w:tmpl w:val="C4B28D26"/>
@@ -17127,7 +18752,7 @@
       </w:rPr>
     </w:lvl>
   </w:abstractNum>
-  <w:abstractNum w:abstractNumId="70" w15:restartNumberingAfterBreak="0">
+  <w:abstractNum w:abstractNumId="78" w15:restartNumberingAfterBreak="0">
     <w:nsid w:val="6B305FF5"/>
     <w:multiLevelType w:val="multilevel"/>
     <w:tmpl w:val="0694BF10"/>
@@ -17276,7 +18901,7 @@
       </w:rPr>
     </w:lvl>
   </w:abstractNum>
-  <w:abstractNum w:abstractNumId="71" w15:restartNumberingAfterBreak="0">
+  <w:abstractNum w:abstractNumId="79" w15:restartNumberingAfterBreak="0">
     <w:nsid w:val="6E482070"/>
     <w:multiLevelType w:val="multilevel"/>
     <w:tmpl w:val="600E8028"/>
@@ -17425,7 +19050,7 @@
       </w:rPr>
     </w:lvl>
   </w:abstractNum>
-  <w:abstractNum w:abstractNumId="72" w15:restartNumberingAfterBreak="0">
+  <w:abstractNum w:abstractNumId="80" w15:restartNumberingAfterBreak="0">
     <w:nsid w:val="6EC667E1"/>
     <w:multiLevelType w:val="hybridMultilevel"/>
     <w:tmpl w:val="0F1C05AA"/>
@@ -17538,7 +19163,7 @@
       </w:rPr>
     </w:lvl>
   </w:abstractNum>
-  <w:abstractNum w:abstractNumId="73" w15:restartNumberingAfterBreak="0">
+  <w:abstractNum w:abstractNumId="81" w15:restartNumberingAfterBreak="0">
     <w:nsid w:val="6F8E7937"/>
     <w:multiLevelType w:val="multilevel"/>
     <w:tmpl w:val="2618C62C"/>
@@ -17687,7 +19312,7 @@
       </w:rPr>
     </w:lvl>
   </w:abstractNum>
-  <w:abstractNum w:abstractNumId="74" w15:restartNumberingAfterBreak="0">
+  <w:abstractNum w:abstractNumId="82" w15:restartNumberingAfterBreak="0">
     <w:nsid w:val="705A7A56"/>
     <w:multiLevelType w:val="multilevel"/>
     <w:tmpl w:val="FFDAE2A6"/>
@@ -17836,7 +19461,7 @@
       </w:rPr>
     </w:lvl>
   </w:abstractNum>
-  <w:abstractNum w:abstractNumId="75" w15:restartNumberingAfterBreak="0">
+  <w:abstractNum w:abstractNumId="83" w15:restartNumberingAfterBreak="0">
     <w:nsid w:val="72185589"/>
     <w:multiLevelType w:val="multilevel"/>
     <w:tmpl w:val="5C7A424E"/>
@@ -17985,7 +19610,7 @@
       </w:rPr>
     </w:lvl>
   </w:abstractNum>
-  <w:abstractNum w:abstractNumId="76" w15:restartNumberingAfterBreak="0">
+  <w:abstractNum w:abstractNumId="84" w15:restartNumberingAfterBreak="0">
     <w:nsid w:val="732773D2"/>
     <w:multiLevelType w:val="multilevel"/>
     <w:tmpl w:val="B10A766E"/>
@@ -18130,7 +19755,7 @@
       </w:rPr>
     </w:lvl>
   </w:abstractNum>
-  <w:abstractNum w:abstractNumId="77" w15:restartNumberingAfterBreak="0">
+  <w:abstractNum w:abstractNumId="85" w15:restartNumberingAfterBreak="0">
     <w:nsid w:val="73E13F6B"/>
     <w:multiLevelType w:val="hybridMultilevel"/>
     <w:tmpl w:val="A5D21806"/>
@@ -18243,7 +19868,7 @@
       </w:rPr>
     </w:lvl>
   </w:abstractNum>
-  <w:abstractNum w:abstractNumId="78" w15:restartNumberingAfterBreak="0">
+  <w:abstractNum w:abstractNumId="86" w15:restartNumberingAfterBreak="0">
     <w:nsid w:val="743C6B91"/>
     <w:multiLevelType w:val="multilevel"/>
     <w:tmpl w:val="C8D87FC4"/>
@@ -18392,7 +20017,7 @@
       </w:rPr>
     </w:lvl>
   </w:abstractNum>
-  <w:abstractNum w:abstractNumId="79" w15:restartNumberingAfterBreak="0">
+  <w:abstractNum w:abstractNumId="87" w15:restartNumberingAfterBreak="0">
     <w:nsid w:val="77AD7629"/>
     <w:multiLevelType w:val="multilevel"/>
     <w:tmpl w:val="9BAA795A"/>
@@ -18541,7 +20166,7 @@
       </w:rPr>
     </w:lvl>
   </w:abstractNum>
-  <w:abstractNum w:abstractNumId="80" w15:restartNumberingAfterBreak="0">
+  <w:abstractNum w:abstractNumId="88" w15:restartNumberingAfterBreak="0">
     <w:nsid w:val="7802400F"/>
     <w:multiLevelType w:val="multilevel"/>
     <w:tmpl w:val="A2029AC2"/>
@@ -18690,7 +20315,7 @@
       </w:rPr>
     </w:lvl>
   </w:abstractNum>
-  <w:abstractNum w:abstractNumId="81" w15:restartNumberingAfterBreak="0">
+  <w:abstractNum w:abstractNumId="89" w15:restartNumberingAfterBreak="0">
     <w:nsid w:val="78A81255"/>
     <w:multiLevelType w:val="multilevel"/>
     <w:tmpl w:val="14B25418"/>
@@ -18839,7 +20464,7 @@
       </w:rPr>
     </w:lvl>
   </w:abstractNum>
-  <w:abstractNum w:abstractNumId="82" w15:restartNumberingAfterBreak="0">
+  <w:abstractNum w:abstractNumId="90" w15:restartNumberingAfterBreak="0">
     <w:nsid w:val="79306A20"/>
     <w:multiLevelType w:val="multilevel"/>
     <w:tmpl w:val="3B3CEBEC"/>
@@ -18988,7 +20613,156 @@
       </w:rPr>
     </w:lvl>
   </w:abstractNum>
-  <w:abstractNum w:abstractNumId="83" w15:restartNumberingAfterBreak="0">
+  <w:abstractNum w:abstractNumId="91" w15:restartNumberingAfterBreak="0">
+    <w:nsid w:val="79DE1723"/>
+    <w:multiLevelType w:val="multilevel"/>
+    <w:tmpl w:val="A4FC045A"/>
+    <w:lvl w:ilvl="0">
+      <w:start w:val="1"/>
+      <w:numFmt w:val="bullet"/>
+      <w:lvlText w:val=""/>
+      <w:lvlJc w:val="left"/>
+      <w:pPr>
+        <w:tabs>
+          <w:tab w:val="num" w:pos="720"/>
+        </w:tabs>
+        <w:ind w:left="720" w:hanging="360"/>
+      </w:pPr>
+      <w:rPr>
+        <w:rFonts w:ascii="Symbol" w:hAnsi="Symbol" w:hint="default"/>
+        <w:sz w:val="20"/>
+      </w:rPr>
+    </w:lvl>
+    <w:lvl w:ilvl="1">
+      <w:start w:val="1"/>
+      <w:numFmt w:val="bullet"/>
+      <w:lvlText w:val="o"/>
+      <w:lvlJc w:val="left"/>
+      <w:pPr>
+        <w:tabs>
+          <w:tab w:val="num" w:pos="1440"/>
+        </w:tabs>
+        <w:ind w:left="1440" w:hanging="360"/>
+      </w:pPr>
+      <w:rPr>
+        <w:rFonts w:ascii="Courier New" w:hAnsi="Courier New" w:hint="default"/>
+        <w:sz w:val="20"/>
+      </w:rPr>
+    </w:lvl>
+    <w:lvl w:ilvl="2" w:tentative="1">
+      <w:start w:val="1"/>
+      <w:numFmt w:val="bullet"/>
+      <w:lvlText w:val=""/>
+      <w:lvlJc w:val="left"/>
+      <w:pPr>
+        <w:tabs>
+          <w:tab w:val="num" w:pos="2160"/>
+        </w:tabs>
+        <w:ind w:left="2160" w:hanging="360"/>
+      </w:pPr>
+      <w:rPr>
+        <w:rFonts w:ascii="Wingdings" w:hAnsi="Wingdings" w:hint="default"/>
+        <w:sz w:val="20"/>
+      </w:rPr>
+    </w:lvl>
+    <w:lvl w:ilvl="3" w:tentative="1">
+      <w:start w:val="1"/>
+      <w:numFmt w:val="bullet"/>
+      <w:lvlText w:val=""/>
+      <w:lvlJc w:val="left"/>
+      <w:pPr>
+        <w:tabs>
+          <w:tab w:val="num" w:pos="2880"/>
+        </w:tabs>
+        <w:ind w:left="2880" w:hanging="360"/>
+      </w:pPr>
+      <w:rPr>
+        <w:rFonts w:ascii="Wingdings" w:hAnsi="Wingdings" w:hint="default"/>
+        <w:sz w:val="20"/>
+      </w:rPr>
+    </w:lvl>
+    <w:lvl w:ilvl="4" w:tentative="1">
+      <w:start w:val="1"/>
+      <w:numFmt w:val="bullet"/>
+      <w:lvlText w:val=""/>
+      <w:lvlJc w:val="left"/>
+      <w:pPr>
+        <w:tabs>
+          <w:tab w:val="num" w:pos="3600"/>
+        </w:tabs>
+        <w:ind w:left="3600" w:hanging="360"/>
+      </w:pPr>
+      <w:rPr>
+        <w:rFonts w:ascii="Wingdings" w:hAnsi="Wingdings" w:hint="default"/>
+        <w:sz w:val="20"/>
+      </w:rPr>
+    </w:lvl>
+    <w:lvl w:ilvl="5" w:tentative="1">
+      <w:start w:val="1"/>
+      <w:numFmt w:val="bullet"/>
+      <w:lvlText w:val=""/>
+      <w:lvlJc w:val="left"/>
+      <w:pPr>
+        <w:tabs>
+          <w:tab w:val="num" w:pos="4320"/>
+        </w:tabs>
+        <w:ind w:left="4320" w:hanging="360"/>
+      </w:pPr>
+      <w:rPr>
+        <w:rFonts w:ascii="Wingdings" w:hAnsi="Wingdings" w:hint="default"/>
+        <w:sz w:val="20"/>
+      </w:rPr>
+    </w:lvl>
+    <w:lvl w:ilvl="6" w:tentative="1">
+      <w:start w:val="1"/>
+      <w:numFmt w:val="bullet"/>
+      <w:lvlText w:val=""/>
+      <w:lvlJc w:val="left"/>
+      <w:pPr>
+        <w:tabs>
+          <w:tab w:val="num" w:pos="5040"/>
+        </w:tabs>
+        <w:ind w:left="5040" w:hanging="360"/>
+      </w:pPr>
+      <w:rPr>
+        <w:rFonts w:ascii="Wingdings" w:hAnsi="Wingdings" w:hint="default"/>
+        <w:sz w:val="20"/>
+      </w:rPr>
+    </w:lvl>
+    <w:lvl w:ilvl="7" w:tentative="1">
+      <w:start w:val="1"/>
+      <w:numFmt w:val="bullet"/>
+      <w:lvlText w:val=""/>
+      <w:lvlJc w:val="left"/>
+      <w:pPr>
+        <w:tabs>
+          <w:tab w:val="num" w:pos="5760"/>
+        </w:tabs>
+        <w:ind w:left="5760" w:hanging="360"/>
+      </w:pPr>
+      <w:rPr>
+        <w:rFonts w:ascii="Wingdings" w:hAnsi="Wingdings" w:hint="default"/>
+        <w:sz w:val="20"/>
+      </w:rPr>
+    </w:lvl>
+    <w:lvl w:ilvl="8" w:tentative="1">
+      <w:start w:val="1"/>
+      <w:numFmt w:val="bullet"/>
+      <w:lvlText w:val=""/>
+      <w:lvlJc w:val="left"/>
+      <w:pPr>
+        <w:tabs>
+          <w:tab w:val="num" w:pos="6480"/>
+        </w:tabs>
+        <w:ind w:left="6480" w:hanging="360"/>
+      </w:pPr>
+      <w:rPr>
+        <w:rFonts w:ascii="Wingdings" w:hAnsi="Wingdings" w:hint="default"/>
+        <w:sz w:val="20"/>
+      </w:rPr>
+    </w:lvl>
+  </w:abstractNum>
+  <w:abstractNum w:abstractNumId="92" w15:restartNumberingAfterBreak="0">
     <w:nsid w:val="7A683687"/>
     <w:multiLevelType w:val="multilevel"/>
     <w:tmpl w:val="F73AFD5C"/>
@@ -19133,7 +20907,7 @@
       </w:rPr>
     </w:lvl>
   </w:abstractNum>
-  <w:abstractNum w:abstractNumId="84" w15:restartNumberingAfterBreak="0">
+  <w:abstractNum w:abstractNumId="93" w15:restartNumberingAfterBreak="0">
     <w:nsid w:val="7C2B5F1F"/>
     <w:multiLevelType w:val="multilevel"/>
     <w:tmpl w:val="D9227486"/>
@@ -19282,7 +21056,7 @@
       </w:rPr>
     </w:lvl>
   </w:abstractNum>
-  <w:abstractNum w:abstractNumId="85" w15:restartNumberingAfterBreak="0">
+  <w:abstractNum w:abstractNumId="94" w15:restartNumberingAfterBreak="0">
     <w:nsid w:val="7E1137AC"/>
     <w:multiLevelType w:val="hybridMultilevel"/>
     <w:tmpl w:val="DF4AA514"/>
@@ -19368,7 +21142,7 @@
       </w:pPr>
     </w:lvl>
   </w:abstractNum>
-  <w:abstractNum w:abstractNumId="86" w15:restartNumberingAfterBreak="0">
+  <w:abstractNum w:abstractNumId="95" w15:restartNumberingAfterBreak="0">
     <w:nsid w:val="7E4B5B66"/>
     <w:multiLevelType w:val="multilevel"/>
     <w:tmpl w:val="2DD2493A"/>
@@ -19517,7 +21291,7 @@
       </w:rPr>
     </w:lvl>
   </w:abstractNum>
-  <w:abstractNum w:abstractNumId="87" w15:restartNumberingAfterBreak="0">
+  <w:abstractNum w:abstractNumId="96" w15:restartNumberingAfterBreak="0">
     <w:nsid w:val="7F053DF4"/>
     <w:multiLevelType w:val="hybridMultilevel"/>
     <w:tmpl w:val="CEFACCCA"/>
@@ -19631,196 +21405,196 @@
     </w:lvl>
   </w:abstractNum>
   <w:num w:numId="1" w16cid:durableId="401492678">
-    <w:abstractNumId w:val="26"/>
+    <w:abstractNumId w:val="30"/>
   </w:num>
   <w:num w:numId="2" w16cid:durableId="1425683647">
-    <w:abstractNumId w:val="60"/>
+    <w:abstractNumId w:val="67"/>
   </w:num>
   <w:num w:numId="3" w16cid:durableId="969819765">
-    <w:abstractNumId w:val="45"/>
+    <w:abstractNumId w:val="50"/>
   </w:num>
   <w:num w:numId="4" w16cid:durableId="1165972880">
-    <w:abstractNumId w:val="33"/>
+    <w:abstractNumId w:val="38"/>
   </w:num>
   <w:num w:numId="5" w16cid:durableId="1192498471">
-    <w:abstractNumId w:val="32"/>
+    <w:abstractNumId w:val="37"/>
   </w:num>
   <w:num w:numId="6" w16cid:durableId="1027293449">
     <w:abstractNumId w:val="6"/>
   </w:num>
   <w:num w:numId="7" w16cid:durableId="981427660">
-    <w:abstractNumId w:val="13"/>
+    <w:abstractNumId w:val="14"/>
   </w:num>
   <w:num w:numId="8" w16cid:durableId="2116553527">
-    <w:abstractNumId w:val="43"/>
+    <w:abstractNumId w:val="48"/>
   </w:num>
   <w:num w:numId="9" w16cid:durableId="2054190808">
-    <w:abstractNumId w:val="49"/>
+    <w:abstractNumId w:val="55"/>
   </w:num>
   <w:num w:numId="10" w16cid:durableId="361367619">
-    <w:abstractNumId w:val="69"/>
+    <w:abstractNumId w:val="77"/>
   </w:num>
   <w:num w:numId="11" w16cid:durableId="631521416">
-    <w:abstractNumId w:val="24"/>
+    <w:abstractNumId w:val="28"/>
   </w:num>
   <w:num w:numId="12" w16cid:durableId="1837070714">
-    <w:abstractNumId w:val="35"/>
+    <w:abstractNumId w:val="40"/>
   </w:num>
   <w:num w:numId="13" w16cid:durableId="355236561">
-    <w:abstractNumId w:val="29"/>
+    <w:abstractNumId w:val="34"/>
   </w:num>
   <w:num w:numId="14" w16cid:durableId="1861703874">
-    <w:abstractNumId w:val="59"/>
+    <w:abstractNumId w:val="66"/>
   </w:num>
   <w:num w:numId="15" w16cid:durableId="1483962153">
     <w:abstractNumId w:val="8"/>
   </w:num>
   <w:num w:numId="16" w16cid:durableId="1024138830">
-    <w:abstractNumId w:val="54"/>
+    <w:abstractNumId w:val="61"/>
   </w:num>
   <w:num w:numId="17" w16cid:durableId="1115096640">
     <w:abstractNumId w:val="7"/>
   </w:num>
   <w:num w:numId="18" w16cid:durableId="1730182888">
-    <w:abstractNumId w:val="73"/>
+    <w:abstractNumId w:val="81"/>
   </w:num>
   <w:num w:numId="19" w16cid:durableId="1841895485">
-    <w:abstractNumId w:val="27"/>
+    <w:abstractNumId w:val="31"/>
   </w:num>
   <w:num w:numId="20" w16cid:durableId="569927713">
-    <w:abstractNumId w:val="51"/>
+    <w:abstractNumId w:val="57"/>
   </w:num>
   <w:num w:numId="21" w16cid:durableId="25182164">
-    <w:abstractNumId w:val="46"/>
+    <w:abstractNumId w:val="51"/>
   </w:num>
   <w:num w:numId="22" w16cid:durableId="1734503633">
     <w:abstractNumId w:val="3"/>
   </w:num>
   <w:num w:numId="23" w16cid:durableId="1393579624">
-    <w:abstractNumId w:val="41"/>
+    <w:abstractNumId w:val="46"/>
   </w:num>
   <w:num w:numId="24" w16cid:durableId="529802780">
-    <w:abstractNumId w:val="18"/>
+    <w:abstractNumId w:val="21"/>
   </w:num>
   <w:num w:numId="25" w16cid:durableId="1009716527">
-    <w:abstractNumId w:val="65"/>
+    <w:abstractNumId w:val="72"/>
   </w:num>
   <w:num w:numId="26" w16cid:durableId="1803109818">
     <w:abstractNumId w:val="11"/>
   </w:num>
   <w:num w:numId="27" w16cid:durableId="1153568286">
-    <w:abstractNumId w:val="47"/>
+    <w:abstractNumId w:val="53"/>
   </w:num>
   <w:num w:numId="28" w16cid:durableId="1269850232">
-    <w:abstractNumId w:val="25"/>
+    <w:abstractNumId w:val="29"/>
   </w:num>
   <w:num w:numId="29" w16cid:durableId="865482755">
-    <w:abstractNumId w:val="85"/>
+    <w:abstractNumId w:val="94"/>
   </w:num>
   <w:num w:numId="30" w16cid:durableId="128667884">
     <w:abstractNumId w:val="4"/>
   </w:num>
   <w:num w:numId="31" w16cid:durableId="1055591606">
-    <w:abstractNumId w:val="57"/>
+    <w:abstractNumId w:val="64"/>
   </w:num>
   <w:num w:numId="32" w16cid:durableId="1455560741">
-    <w:abstractNumId w:val="56"/>
+    <w:abstractNumId w:val="63"/>
   </w:num>
   <w:num w:numId="33" w16cid:durableId="1977880186">
-    <w:abstractNumId w:val="81"/>
+    <w:abstractNumId w:val="89"/>
   </w:num>
   <w:num w:numId="34" w16cid:durableId="165289367">
-    <w:abstractNumId w:val="87"/>
+    <w:abstractNumId w:val="96"/>
   </w:num>
   <w:num w:numId="35" w16cid:durableId="1357655090">
-    <w:abstractNumId w:val="53"/>
+    <w:abstractNumId w:val="59"/>
   </w:num>
   <w:num w:numId="36" w16cid:durableId="1068966224">
     <w:abstractNumId w:val="10"/>
   </w:num>
   <w:num w:numId="37" w16cid:durableId="559630263">
-    <w:abstractNumId w:val="37"/>
+    <w:abstractNumId w:val="42"/>
   </w:num>
   <w:num w:numId="38" w16cid:durableId="219441423">
-    <w:abstractNumId w:val="77"/>
+    <w:abstractNumId w:val="85"/>
   </w:num>
   <w:num w:numId="39" w16cid:durableId="581574493">
-    <w:abstractNumId w:val="72"/>
+    <w:abstractNumId w:val="80"/>
   </w:num>
   <w:num w:numId="40" w16cid:durableId="1478643207">
-    <w:abstractNumId w:val="48"/>
+    <w:abstractNumId w:val="54"/>
   </w:num>
   <w:num w:numId="41" w16cid:durableId="816413178">
-    <w:abstractNumId w:val="83"/>
+    <w:abstractNumId w:val="92"/>
   </w:num>
   <w:num w:numId="42" w16cid:durableId="879365290">
-    <w:abstractNumId w:val="62"/>
+    <w:abstractNumId w:val="69"/>
   </w:num>
   <w:num w:numId="43" w16cid:durableId="256332733">
-    <w:abstractNumId w:val="14"/>
+    <w:abstractNumId w:val="15"/>
   </w:num>
   <w:num w:numId="44" w16cid:durableId="958417952">
-    <w:abstractNumId w:val="76"/>
+    <w:abstractNumId w:val="84"/>
   </w:num>
   <w:num w:numId="45" w16cid:durableId="739714405">
-    <w:abstractNumId w:val="50"/>
+    <w:abstractNumId w:val="56"/>
   </w:num>
   <w:num w:numId="46" w16cid:durableId="1090663949">
     <w:abstractNumId w:val="2"/>
   </w:num>
   <w:num w:numId="47" w16cid:durableId="1066996378">
-    <w:abstractNumId w:val="31"/>
+    <w:abstractNumId w:val="36"/>
   </w:num>
   <w:num w:numId="48" w16cid:durableId="1637293962">
-    <w:abstractNumId w:val="40"/>
+    <w:abstractNumId w:val="45"/>
   </w:num>
   <w:num w:numId="49" w16cid:durableId="658966665">
-    <w:abstractNumId w:val="74"/>
+    <w:abstractNumId w:val="82"/>
   </w:num>
   <w:num w:numId="50" w16cid:durableId="730739043">
-    <w:abstractNumId w:val="82"/>
+    <w:abstractNumId w:val="90"/>
   </w:num>
   <w:num w:numId="51" w16cid:durableId="1361395958">
-    <w:abstractNumId w:val="42"/>
+    <w:abstractNumId w:val="47"/>
   </w:num>
   <w:num w:numId="52" w16cid:durableId="1585603859">
-    <w:abstractNumId w:val="70"/>
+    <w:abstractNumId w:val="78"/>
   </w:num>
   <w:num w:numId="53" w16cid:durableId="1245456023">
-    <w:abstractNumId w:val="68"/>
+    <w:abstractNumId w:val="76"/>
   </w:num>
   <w:num w:numId="54" w16cid:durableId="726415147">
+    <w:abstractNumId w:val="95"/>
+  </w:num>
+  <w:num w:numId="55" w16cid:durableId="471217994">
+    <w:abstractNumId w:val="23"/>
+  </w:num>
+  <w:num w:numId="56" w16cid:durableId="1111359962">
     <w:abstractNumId w:val="86"/>
   </w:num>
-  <w:num w:numId="55" w16cid:durableId="471217994">
-    <w:abstractNumId w:val="20"/>
-  </w:num>
-  <w:num w:numId="56" w16cid:durableId="1111359962">
-    <w:abstractNumId w:val="78"/>
-  </w:num>
   <w:num w:numId="57" w16cid:durableId="682174154">
-    <w:abstractNumId w:val="38"/>
+    <w:abstractNumId w:val="43"/>
   </w:num>
   <w:num w:numId="58" w16cid:durableId="993460229">
-    <w:abstractNumId w:val="80"/>
+    <w:abstractNumId w:val="88"/>
   </w:num>
   <w:num w:numId="59" w16cid:durableId="1612778526">
     <w:abstractNumId w:val="9"/>
   </w:num>
   <w:num w:numId="60" w16cid:durableId="184637057">
-    <w:abstractNumId w:val="52"/>
+    <w:abstractNumId w:val="58"/>
   </w:num>
   <w:num w:numId="61" w16cid:durableId="1657807602">
-    <w:abstractNumId w:val="44"/>
+    <w:abstractNumId w:val="49"/>
   </w:num>
   <w:num w:numId="62" w16cid:durableId="1486580873">
-    <w:abstractNumId w:val="61"/>
+    <w:abstractNumId w:val="68"/>
   </w:num>
   <w:num w:numId="63" w16cid:durableId="101800978">
-    <w:abstractNumId w:val="58"/>
+    <w:abstractNumId w:val="65"/>
   </w:num>
   <w:num w:numId="64" w16cid:durableId="1838496560">
-    <w:abstractNumId w:val="64"/>
+    <w:abstractNumId w:val="71"/>
   </w:num>
   <w:num w:numId="65" w16cid:durableId="1606309814">
     <w:abstractNumId w:val="1"/>
@@ -19829,70 +21603,97 @@
     <w:abstractNumId w:val="0"/>
   </w:num>
   <w:num w:numId="67" w16cid:durableId="1602106308">
-    <w:abstractNumId w:val="30"/>
+    <w:abstractNumId w:val="35"/>
   </w:num>
   <w:num w:numId="68" w16cid:durableId="509418428">
-    <w:abstractNumId w:val="84"/>
+    <w:abstractNumId w:val="93"/>
   </w:num>
   <w:num w:numId="69" w16cid:durableId="1060712400">
-    <w:abstractNumId w:val="79"/>
+    <w:abstractNumId w:val="87"/>
   </w:num>
   <w:num w:numId="70" w16cid:durableId="186604655">
-    <w:abstractNumId w:val="17"/>
+    <w:abstractNumId w:val="19"/>
   </w:num>
   <w:num w:numId="71" w16cid:durableId="1362126248">
-    <w:abstractNumId w:val="75"/>
+    <w:abstractNumId w:val="83"/>
   </w:num>
   <w:num w:numId="72" w16cid:durableId="547685254">
     <w:abstractNumId w:val="5"/>
   </w:num>
   <w:num w:numId="73" w16cid:durableId="1558930994">
-    <w:abstractNumId w:val="23"/>
+    <w:abstractNumId w:val="27"/>
   </w:num>
   <w:num w:numId="74" w16cid:durableId="1571691474">
-    <w:abstractNumId w:val="28"/>
+    <w:abstractNumId w:val="32"/>
   </w:num>
   <w:num w:numId="75" w16cid:durableId="1917157331">
-    <w:abstractNumId w:val="21"/>
+    <w:abstractNumId w:val="25"/>
   </w:num>
   <w:num w:numId="76" w16cid:durableId="146213322">
+    <w:abstractNumId w:val="18"/>
+  </w:num>
+  <w:num w:numId="77" w16cid:durableId="1912040523">
+    <w:abstractNumId w:val="13"/>
+  </w:num>
+  <w:num w:numId="78" w16cid:durableId="489752627">
+    <w:abstractNumId w:val="41"/>
+  </w:num>
+  <w:num w:numId="79" w16cid:durableId="53744689">
+    <w:abstractNumId w:val="22"/>
+  </w:num>
+  <w:num w:numId="80" w16cid:durableId="1594507617">
+    <w:abstractNumId w:val="75"/>
+  </w:num>
+  <w:num w:numId="81" w16cid:durableId="434712669">
+    <w:abstractNumId w:val="44"/>
+  </w:num>
+  <w:num w:numId="82" w16cid:durableId="804741220">
     <w:abstractNumId w:val="16"/>
   </w:num>
-  <w:num w:numId="77" w16cid:durableId="1912040523">
+  <w:num w:numId="83" w16cid:durableId="909001377">
+    <w:abstractNumId w:val="39"/>
+  </w:num>
+  <w:num w:numId="84" w16cid:durableId="753475756">
+    <w:abstractNumId w:val="26"/>
+  </w:num>
+  <w:num w:numId="85" w16cid:durableId="837692950">
+    <w:abstractNumId w:val="79"/>
+  </w:num>
+  <w:num w:numId="86" w16cid:durableId="1724787246">
+    <w:abstractNumId w:val="70"/>
+  </w:num>
+  <w:num w:numId="87" w16cid:durableId="1781297175">
+    <w:abstractNumId w:val="62"/>
+  </w:num>
+  <w:num w:numId="88" w16cid:durableId="588972358">
+    <w:abstractNumId w:val="73"/>
+  </w:num>
+  <w:num w:numId="89" w16cid:durableId="791292524">
+    <w:abstractNumId w:val="24"/>
+  </w:num>
+  <w:num w:numId="90" w16cid:durableId="2099717864">
+    <w:abstractNumId w:val="91"/>
+  </w:num>
+  <w:num w:numId="91" w16cid:durableId="448282674">
     <w:abstractNumId w:val="12"/>
   </w:num>
-  <w:num w:numId="78" w16cid:durableId="489752627">
-    <w:abstractNumId w:val="36"/>
+  <w:num w:numId="92" w16cid:durableId="1039861843">
+    <w:abstractNumId w:val="52"/>
   </w:num>
-  <w:num w:numId="79" w16cid:durableId="53744689">
-    <w:abstractNumId w:val="19"/>
+  <w:num w:numId="93" w16cid:durableId="206455256">
+    <w:abstractNumId w:val="17"/>
   </w:num>
-  <w:num w:numId="80" w16cid:durableId="1594507617">
-    <w:abstractNumId w:val="67"/>
+  <w:num w:numId="94" w16cid:durableId="34744868">
+    <w:abstractNumId w:val="60"/>
   </w:num>
-  <w:num w:numId="81" w16cid:durableId="434712669">
-    <w:abstractNumId w:val="39"/>
+  <w:num w:numId="95" w16cid:durableId="1871412960">
+    <w:abstractNumId w:val="33"/>
   </w:num>
-  <w:num w:numId="82" w16cid:durableId="804741220">
-    <w:abstractNumId w:val="15"/>
+  <w:num w:numId="96" w16cid:durableId="1118135921">
+    <w:abstractNumId w:val="74"/>
   </w:num>
-  <w:num w:numId="83" w16cid:durableId="909001377">
-    <w:abstractNumId w:val="34"/>
-  </w:num>
-  <w:num w:numId="84" w16cid:durableId="753475756">
-    <w:abstractNumId w:val="22"/>
-  </w:num>
-  <w:num w:numId="85" w16cid:durableId="837692950">
-    <w:abstractNumId w:val="71"/>
-  </w:num>
-  <w:num w:numId="86" w16cid:durableId="1724787246">
-    <w:abstractNumId w:val="63"/>
-  </w:num>
-  <w:num w:numId="87" w16cid:durableId="1781297175">
-    <w:abstractNumId w:val="55"/>
-  </w:num>
-  <w:num w:numId="88" w16cid:durableId="588972358">
-    <w:abstractNumId w:val="66"/>
+  <w:num w:numId="97" w16cid:durableId="1291283478">
+    <w:abstractNumId w:val="20"/>
   </w:num>
 </w:numbering>
 </file>

</xml_diff>

<commit_message>
2.3	Analyse de la structure du code qui sera effectuée
</commit_message>
<xml_diff>
--- a/documentation/rapport.docx
+++ b/documentation/rapport.docx
@@ -6559,6 +6559,996 @@
     </w:p>
     <w:p>
       <w:pPr>
+        <w:pStyle w:val="Retraitcorpsdetexte"/>
+        <w:rPr>
+          <w:rFonts w:cstheme="minorHAnsi"/>
+        </w:rPr>
+      </w:pPr>
+    </w:p>
+    <w:p>
+      <w:pPr>
+        <w:rPr>
+          <w:rFonts w:cstheme="minorHAnsi"/>
+          <w:szCs w:val="24"/>
+        </w:rPr>
+      </w:pPr>
+      <w:r>
+        <w:rPr>
+          <w:rFonts w:cstheme="minorHAnsi"/>
+          <w:szCs w:val="24"/>
+        </w:rPr>
+        <w:t>L'application frontend est construite selon une architecture moderne et modulaire, utilisant Vue.js comme framework principal. L'analyse détaillée de la structure révèle une organisation méthodique et professionnelle du code.</w:t>
+      </w:r>
+    </w:p>
+    <w:p>
+      <w:pPr>
+        <w:rPr>
+          <w:rFonts w:cstheme="minorHAnsi"/>
+          <w:szCs w:val="24"/>
+        </w:rPr>
+      </w:pPr>
+      <w:r>
+        <w:rPr>
+          <w:rFonts w:cstheme="minorHAnsi"/>
+          <w:b/>
+          <w:bCs/>
+          <w:szCs w:val="24"/>
+        </w:rPr>
+        <w:t>1. Architecture Globale</w:t>
+      </w:r>
+    </w:p>
+    <w:p>
+      <w:pPr>
+        <w:numPr>
+          <w:ilvl w:val="0"/>
+          <w:numId w:val="107"/>
+        </w:numPr>
+        <w:spacing w:before="30" w:after="30"/>
+        <w:ind w:left="960"/>
+        <w:rPr>
+          <w:rFonts w:cstheme="minorHAnsi"/>
+          <w:szCs w:val="24"/>
+        </w:rPr>
+      </w:pPr>
+      <w:r>
+        <w:rPr>
+          <w:rFonts w:cstheme="minorHAnsi"/>
+          <w:b/>
+          <w:bCs/>
+          <w:szCs w:val="24"/>
+        </w:rPr>
+        <w:t>Pattern Architectural</w:t>
+      </w:r>
+      <w:r>
+        <w:rPr>
+          <w:rFonts w:cstheme="minorHAnsi"/>
+          <w:szCs w:val="24"/>
+        </w:rPr>
+        <w:t> : Application Single Page (SPA) avec Vue.js</w:t>
+      </w:r>
+    </w:p>
+    <w:p>
+      <w:pPr>
+        <w:numPr>
+          <w:ilvl w:val="0"/>
+          <w:numId w:val="108"/>
+        </w:numPr>
+        <w:spacing w:before="30" w:after="30"/>
+        <w:ind w:left="960"/>
+        <w:rPr>
+          <w:rFonts w:cstheme="minorHAnsi"/>
+          <w:szCs w:val="24"/>
+        </w:rPr>
+      </w:pPr>
+      <w:r>
+        <w:rPr>
+          <w:rFonts w:cstheme="minorHAnsi"/>
+          <w:b/>
+          <w:bCs/>
+          <w:szCs w:val="24"/>
+        </w:rPr>
+        <w:t>Gestionnaire de Build</w:t>
+      </w:r>
+      <w:r>
+        <w:rPr>
+          <w:rFonts w:cstheme="minorHAnsi"/>
+          <w:szCs w:val="24"/>
+        </w:rPr>
+        <w:t> : Vite pour des performances optimales</w:t>
+      </w:r>
+    </w:p>
+    <w:p>
+      <w:pPr>
+        <w:numPr>
+          <w:ilvl w:val="0"/>
+          <w:numId w:val="109"/>
+        </w:numPr>
+        <w:spacing w:before="30" w:after="30"/>
+        <w:ind w:left="960"/>
+        <w:rPr>
+          <w:rFonts w:cstheme="minorHAnsi"/>
+          <w:szCs w:val="24"/>
+        </w:rPr>
+      </w:pPr>
+      <w:r>
+        <w:rPr>
+          <w:rFonts w:cstheme="minorHAnsi"/>
+          <w:b/>
+          <w:bCs/>
+          <w:szCs w:val="24"/>
+        </w:rPr>
+        <w:t>Structure Modulaire</w:t>
+      </w:r>
+      <w:r>
+        <w:rPr>
+          <w:rFonts w:cstheme="minorHAnsi"/>
+          <w:szCs w:val="24"/>
+        </w:rPr>
+        <w:t> : Organisation claire des composants et des fonctionnalités</w:t>
+      </w:r>
+    </w:p>
+    <w:p>
+      <w:pPr>
+        <w:pStyle w:val="Retraitcorpsdetexte"/>
+        <w:tabs>
+          <w:tab w:val="clear" w:pos="4395"/>
+          <w:tab w:val="left" w:pos="2771"/>
+        </w:tabs>
+        <w:rPr>
+          <w:rFonts w:cstheme="minorHAnsi"/>
+        </w:rPr>
+      </w:pPr>
+      <w:r>
+        <w:rPr>
+          <w:rFonts w:cstheme="minorHAnsi"/>
+        </w:rPr>
+        <w:tab/>
+      </w:r>
+    </w:p>
+    <w:p>
+      <w:pPr>
+        <w:rPr>
+          <w:rFonts w:cstheme="minorHAnsi"/>
+          <w:b/>
+          <w:bCs/>
+        </w:rPr>
+      </w:pPr>
+      <w:r>
+        <w:rPr>
+          <w:rFonts w:cstheme="minorHAnsi"/>
+          <w:b/>
+          <w:bCs/>
+        </w:rPr>
+        <w:t>2. Organisation des Dossiers</w:t>
+      </w:r>
+    </w:p>
+    <w:p>
+      <w:pPr>
+        <w:pStyle w:val="NormalWeb"/>
+        <w:jc w:val="center"/>
+        <w:rPr>
+          <w:rFonts w:asciiTheme="minorHAnsi" w:hAnsiTheme="minorHAnsi" w:cstheme="minorHAnsi"/>
+        </w:rPr>
+      </w:pPr>
+      <w:r>
+        <w:rPr>
+          <w:rFonts w:asciiTheme="minorHAnsi" w:hAnsiTheme="minorHAnsi" w:cstheme="minorHAnsi"/>
+          <w:noProof/>
+        </w:rPr>
+        <w:drawing>
+          <wp:inline distT="0" distB="0" distL="0" distR="0" wp14:anchorId="2F0EF402" wp14:editId="56D70E45">
+            <wp:extent cx="4063042" cy="1623962"/>
+            <wp:effectExtent l="0" t="0" r="0" b="0"/>
+            <wp:docPr id="6" name="Image 6"/>
+            <wp:cNvGraphicFramePr>
+              <a:graphicFrameLocks xmlns:a="http://schemas.openxmlformats.org/drawingml/2006/main" noChangeAspect="1"/>
+            </wp:cNvGraphicFramePr>
+            <a:graphic xmlns:a="http://schemas.openxmlformats.org/drawingml/2006/main">
+              <a:graphicData uri="http://schemas.openxmlformats.org/drawingml/2006/picture">
+                <pic:pic xmlns:pic="http://schemas.openxmlformats.org/drawingml/2006/picture">
+                  <pic:nvPicPr>
+                    <pic:cNvPr id="0" name="Picture 1"/>
+                    <pic:cNvPicPr>
+                      <a:picLocks noChangeAspect="1" noChangeArrowheads="1"/>
+                    </pic:cNvPicPr>
+                  </pic:nvPicPr>
+                  <pic:blipFill>
+                    <a:blip r:embed="rId11">
+                      <a:extLst>
+                        <a:ext uri="{28A0092B-C50C-407E-A947-70E740481C1C}">
+                          <a14:useLocalDpi xmlns:a14="http://schemas.microsoft.com/office/drawing/2010/main" val="0"/>
+                        </a:ext>
+                      </a:extLst>
+                    </a:blip>
+                    <a:srcRect/>
+                    <a:stretch>
+                      <a:fillRect/>
+                    </a:stretch>
+                  </pic:blipFill>
+                  <pic:spPr bwMode="auto">
+                    <a:xfrm>
+                      <a:off x="0" y="0"/>
+                      <a:ext cx="4084102" cy="1632379"/>
+                    </a:xfrm>
+                    <a:prstGeom prst="rect">
+                      <a:avLst/>
+                    </a:prstGeom>
+                    <a:noFill/>
+                    <a:ln>
+                      <a:noFill/>
+                    </a:ln>
+                  </pic:spPr>
+                </pic:pic>
+              </a:graphicData>
+            </a:graphic>
+          </wp:inline>
+        </w:drawing>
+      </w:r>
+    </w:p>
+    <w:p>
+      <w:pPr>
+        <w:pStyle w:val="NormalWeb"/>
+        <w:numPr>
+          <w:ilvl w:val="0"/>
+          <w:numId w:val="112"/>
+        </w:numPr>
+        <w:rPr>
+          <w:rFonts w:asciiTheme="minorHAnsi" w:hAnsiTheme="minorHAnsi" w:cstheme="minorHAnsi"/>
+          <w:b/>
+          <w:bCs/>
+        </w:rPr>
+      </w:pPr>
+      <w:r>
+        <w:rPr>
+          <w:rFonts w:asciiTheme="minorHAnsi" w:hAnsiTheme="minorHAnsi" w:cstheme="minorHAnsi"/>
+          <w:b/>
+          <w:bCs/>
+        </w:rPr>
+        <w:t xml:space="preserve">Composants Principaux </w:t>
+      </w:r>
+    </w:p>
+    <w:p>
+      <w:pPr>
+        <w:pStyle w:val="NormalWeb"/>
+        <w:numPr>
+          <w:ilvl w:val="0"/>
+          <w:numId w:val="110"/>
+        </w:numPr>
+        <w:rPr>
+          <w:rFonts w:asciiTheme="minorHAnsi" w:hAnsiTheme="minorHAnsi" w:cstheme="minorHAnsi"/>
+        </w:rPr>
+      </w:pPr>
+      <w:r>
+        <w:rPr>
+          <w:rFonts w:asciiTheme="minorHAnsi" w:hAnsiTheme="minorHAnsi" w:cstheme="minorHAnsi"/>
+          <w:b/>
+          <w:bCs/>
+        </w:rPr>
+        <w:t>App.vue :</w:t>
+      </w:r>
+      <w:r>
+        <w:rPr>
+          <w:rFonts w:asciiTheme="minorHAnsi" w:hAnsiTheme="minorHAnsi" w:cstheme="minorHAnsi"/>
+        </w:rPr>
+        <w:t xml:space="preserve"> Composant racine définissant la structure principale</w:t>
+      </w:r>
+    </w:p>
+    <w:p>
+      <w:pPr>
+        <w:pStyle w:val="NormalWeb"/>
+        <w:numPr>
+          <w:ilvl w:val="1"/>
+          <w:numId w:val="110"/>
+        </w:numPr>
+        <w:rPr>
+          <w:rFonts w:asciiTheme="minorHAnsi" w:hAnsiTheme="minorHAnsi" w:cstheme="minorHAnsi"/>
+        </w:rPr>
+      </w:pPr>
+      <w:r>
+        <w:rPr>
+          <w:rFonts w:asciiTheme="minorHAnsi" w:hAnsiTheme="minorHAnsi" w:cstheme="minorHAnsi"/>
+        </w:rPr>
+        <w:t xml:space="preserve"> Header : Navigation et interface utilisateur globale</w:t>
+      </w:r>
+    </w:p>
+    <w:p>
+      <w:pPr>
+        <w:pStyle w:val="NormalWeb"/>
+        <w:numPr>
+          <w:ilvl w:val="1"/>
+          <w:numId w:val="110"/>
+        </w:numPr>
+        <w:rPr>
+          <w:rFonts w:asciiTheme="minorHAnsi" w:hAnsiTheme="minorHAnsi" w:cstheme="minorHAnsi"/>
+        </w:rPr>
+      </w:pPr>
+      <w:r>
+        <w:rPr>
+          <w:rFonts w:asciiTheme="minorHAnsi" w:hAnsiTheme="minorHAnsi" w:cstheme="minorHAnsi"/>
+        </w:rPr>
+        <w:t xml:space="preserve"> RouterView : Zone de contenu dynamique </w:t>
+      </w:r>
+    </w:p>
+    <w:p>
+      <w:pPr>
+        <w:pStyle w:val="NormalWeb"/>
+        <w:numPr>
+          <w:ilvl w:val="1"/>
+          <w:numId w:val="110"/>
+        </w:numPr>
+        <w:rPr>
+          <w:rFonts w:asciiTheme="minorHAnsi" w:hAnsiTheme="minorHAnsi" w:cstheme="minorHAnsi"/>
+        </w:rPr>
+      </w:pPr>
+      <w:r>
+        <w:rPr>
+          <w:rFonts w:asciiTheme="minorHAnsi" w:hAnsiTheme="minorHAnsi" w:cstheme="minorHAnsi"/>
+        </w:rPr>
+        <w:t xml:space="preserve">Footer : Pied de page constant </w:t>
+      </w:r>
+    </w:p>
+    <w:p>
+      <w:pPr>
+        <w:pStyle w:val="NormalWeb"/>
+        <w:numPr>
+          <w:ilvl w:val="0"/>
+          <w:numId w:val="110"/>
+        </w:numPr>
+        <w:rPr>
+          <w:rFonts w:asciiTheme="minorHAnsi" w:hAnsiTheme="minorHAnsi" w:cstheme="minorHAnsi"/>
+          <w:b/>
+          <w:bCs/>
+        </w:rPr>
+      </w:pPr>
+      <w:r>
+        <w:rPr>
+          <w:rFonts w:asciiTheme="minorHAnsi" w:hAnsiTheme="minorHAnsi" w:cstheme="minorHAnsi"/>
+          <w:b/>
+          <w:bCs/>
+        </w:rPr>
+        <w:t>Utilise une mise en page à trois sections:</w:t>
+      </w:r>
+    </w:p>
+    <w:p>
+      <w:pPr>
+        <w:pStyle w:val="NormalWeb"/>
+        <w:ind w:left="360"/>
+        <w:rPr>
+          <w:rFonts w:asciiTheme="minorHAnsi" w:hAnsiTheme="minorHAnsi" w:cstheme="minorHAnsi"/>
+          <w:b/>
+          <w:bCs/>
+        </w:rPr>
+      </w:pPr>
+      <w:r>
+        <w:rPr>
+          <w:rFonts w:asciiTheme="minorHAnsi" w:hAnsiTheme="minorHAnsi" w:cstheme="minorHAnsi"/>
+          <w:b/>
+          <w:bCs/>
+        </w:rPr>
+        <w:drawing>
+          <wp:inline distT="0" distB="0" distL="0" distR="0" wp14:anchorId="0F4EDBBE" wp14:editId="5F50BB46">
+            <wp:extent cx="2572109" cy="1733792"/>
+            <wp:effectExtent l="0" t="0" r="0" b="0"/>
+            <wp:docPr id="8" name="Image 8"/>
+            <wp:cNvGraphicFramePr>
+              <a:graphicFrameLocks xmlns:a="http://schemas.openxmlformats.org/drawingml/2006/main" noChangeAspect="1"/>
+            </wp:cNvGraphicFramePr>
+            <a:graphic xmlns:a="http://schemas.openxmlformats.org/drawingml/2006/main">
+              <a:graphicData uri="http://schemas.openxmlformats.org/drawingml/2006/picture">
+                <pic:pic xmlns:pic="http://schemas.openxmlformats.org/drawingml/2006/picture">
+                  <pic:nvPicPr>
+                    <pic:cNvPr id="1" name=""/>
+                    <pic:cNvPicPr/>
+                  </pic:nvPicPr>
+                  <pic:blipFill>
+                    <a:blip r:embed="rId12"/>
+                    <a:stretch>
+                      <a:fillRect/>
+                    </a:stretch>
+                  </pic:blipFill>
+                  <pic:spPr>
+                    <a:xfrm>
+                      <a:off x="0" y="0"/>
+                      <a:ext cx="2572109" cy="1733792"/>
+                    </a:xfrm>
+                    <a:prstGeom prst="rect">
+                      <a:avLst/>
+                    </a:prstGeom>
+                  </pic:spPr>
+                </pic:pic>
+              </a:graphicData>
+            </a:graphic>
+          </wp:inline>
+        </w:drawing>
+      </w:r>
+    </w:p>
+    <w:p>
+      <w:pPr>
+        <w:pStyle w:val="NormalWeb"/>
+        <w:numPr>
+          <w:ilvl w:val="0"/>
+          <w:numId w:val="112"/>
+        </w:numPr>
+        <w:rPr>
+          <w:rFonts w:asciiTheme="minorHAnsi" w:hAnsiTheme="minorHAnsi" w:cstheme="minorHAnsi"/>
+          <w:b/>
+          <w:bCs/>
+        </w:rPr>
+      </w:pPr>
+      <w:r>
+        <w:rPr>
+          <w:rFonts w:asciiTheme="minorHAnsi" w:hAnsiTheme="minorHAnsi" w:cstheme="minorHAnsi"/>
+          <w:b/>
+          <w:bCs/>
+        </w:rPr>
+        <w:t xml:space="preserve">Système de Routage </w:t>
+      </w:r>
+    </w:p>
+    <w:p>
+      <w:pPr>
+        <w:pStyle w:val="NormalWeb"/>
+        <w:numPr>
+          <w:ilvl w:val="0"/>
+          <w:numId w:val="110"/>
+        </w:numPr>
+        <w:spacing w:before="0" w:beforeAutospacing="0" w:after="0" w:afterAutospacing="0"/>
+        <w:rPr>
+          <w:rFonts w:asciiTheme="minorHAnsi" w:hAnsiTheme="minorHAnsi" w:cstheme="minorHAnsi"/>
+        </w:rPr>
+      </w:pPr>
+      <w:r>
+        <w:rPr>
+          <w:rFonts w:asciiTheme="minorHAnsi" w:hAnsiTheme="minorHAnsi" w:cstheme="minorHAnsi"/>
+        </w:rPr>
+        <w:t xml:space="preserve">Architecture de routes bien définie avec lazy-loading </w:t>
+      </w:r>
+    </w:p>
+    <w:p>
+      <w:pPr>
+        <w:pStyle w:val="NormalWeb"/>
+        <w:numPr>
+          <w:ilvl w:val="0"/>
+          <w:numId w:val="110"/>
+        </w:numPr>
+        <w:rPr>
+          <w:rFonts w:asciiTheme="minorHAnsi" w:hAnsiTheme="minorHAnsi" w:cstheme="minorHAnsi"/>
+        </w:rPr>
+      </w:pPr>
+      <w:r>
+        <w:rPr>
+          <w:rFonts w:asciiTheme="minorHAnsi" w:hAnsiTheme="minorHAnsi" w:cstheme="minorHAnsi"/>
+        </w:rPr>
+        <w:t>Protection des routes sensibles (authentification requise)</w:t>
+      </w:r>
+    </w:p>
+    <w:p>
+      <w:pPr>
+        <w:pStyle w:val="NormalWeb"/>
+        <w:numPr>
+          <w:ilvl w:val="0"/>
+          <w:numId w:val="110"/>
+        </w:numPr>
+        <w:rPr>
+          <w:rFonts w:asciiTheme="minorHAnsi" w:hAnsiTheme="minorHAnsi" w:cstheme="minorHAnsi"/>
+        </w:rPr>
+      </w:pPr>
+      <w:r>
+        <w:rPr>
+          <w:rFonts w:asciiTheme="minorHAnsi" w:hAnsiTheme="minorHAnsi" w:cstheme="minorHAnsi"/>
+        </w:rPr>
+        <w:t xml:space="preserve">Gestion des paramètres dynamiques pour les détails des livres et profils </w:t>
+      </w:r>
+    </w:p>
+    <w:p>
+      <w:pPr>
+        <w:pStyle w:val="NormalWeb"/>
+        <w:numPr>
+          <w:ilvl w:val="0"/>
+          <w:numId w:val="110"/>
+        </w:numPr>
+        <w:rPr>
+          <w:rFonts w:asciiTheme="minorHAnsi" w:hAnsiTheme="minorHAnsi" w:cstheme="minorHAnsi"/>
+        </w:rPr>
+      </w:pPr>
+      <w:r>
+        <w:rPr>
+          <w:rFonts w:asciiTheme="minorHAnsi" w:hAnsiTheme="minorHAnsi" w:cstheme="minorHAnsi"/>
+        </w:rPr>
+        <w:t>Gestion des routes protégées :</w:t>
+      </w:r>
+    </w:p>
+    <w:p>
+      <w:pPr>
+        <w:pStyle w:val="NormalWeb"/>
+        <w:ind w:left="360"/>
+        <w:rPr>
+          <w:rFonts w:asciiTheme="minorHAnsi" w:hAnsiTheme="minorHAnsi" w:cstheme="minorHAnsi"/>
+        </w:rPr>
+      </w:pPr>
+      <w:r>
+        <w:rPr>
+          <w:rFonts w:asciiTheme="minorHAnsi" w:hAnsiTheme="minorHAnsi" w:cstheme="minorHAnsi"/>
+        </w:rPr>
+        <w:lastRenderedPageBreak/>
+        <w:drawing>
+          <wp:inline distT="0" distB="0" distL="0" distR="0" wp14:anchorId="0690F549" wp14:editId="021EA60C">
+            <wp:extent cx="4448796" cy="1552792"/>
+            <wp:effectExtent l="0" t="0" r="0" b="9525"/>
+            <wp:docPr id="7" name="Image 7"/>
+            <wp:cNvGraphicFramePr>
+              <a:graphicFrameLocks xmlns:a="http://schemas.openxmlformats.org/drawingml/2006/main" noChangeAspect="1"/>
+            </wp:cNvGraphicFramePr>
+            <a:graphic xmlns:a="http://schemas.openxmlformats.org/drawingml/2006/main">
+              <a:graphicData uri="http://schemas.openxmlformats.org/drawingml/2006/picture">
+                <pic:pic xmlns:pic="http://schemas.openxmlformats.org/drawingml/2006/picture">
+                  <pic:nvPicPr>
+                    <pic:cNvPr id="1" name=""/>
+                    <pic:cNvPicPr/>
+                  </pic:nvPicPr>
+                  <pic:blipFill>
+                    <a:blip r:embed="rId13"/>
+                    <a:stretch>
+                      <a:fillRect/>
+                    </a:stretch>
+                  </pic:blipFill>
+                  <pic:spPr>
+                    <a:xfrm>
+                      <a:off x="0" y="0"/>
+                      <a:ext cx="4448796" cy="1552792"/>
+                    </a:xfrm>
+                    <a:prstGeom prst="rect">
+                      <a:avLst/>
+                    </a:prstGeom>
+                  </pic:spPr>
+                </pic:pic>
+              </a:graphicData>
+            </a:graphic>
+          </wp:inline>
+        </w:drawing>
+      </w:r>
+    </w:p>
+    <w:p>
+      <w:pPr>
+        <w:pStyle w:val="NormalWeb"/>
+        <w:numPr>
+          <w:ilvl w:val="0"/>
+          <w:numId w:val="112"/>
+        </w:numPr>
+        <w:rPr>
+          <w:rFonts w:asciiTheme="minorHAnsi" w:hAnsiTheme="minorHAnsi" w:cstheme="minorHAnsi"/>
+          <w:b/>
+          <w:bCs/>
+        </w:rPr>
+      </w:pPr>
+      <w:r>
+        <w:rPr>
+          <w:rFonts w:asciiTheme="minorHAnsi" w:hAnsiTheme="minorHAnsi" w:cstheme="minorHAnsi"/>
+          <w:b/>
+          <w:bCs/>
+        </w:rPr>
+        <w:t xml:space="preserve">Gestion des États et Services </w:t>
+      </w:r>
+    </w:p>
+    <w:p>
+      <w:pPr>
+        <w:pStyle w:val="NormalWeb"/>
+        <w:numPr>
+          <w:ilvl w:val="1"/>
+          <w:numId w:val="112"/>
+        </w:numPr>
+        <w:rPr>
+          <w:rFonts w:asciiTheme="minorHAnsi" w:hAnsiTheme="minorHAnsi" w:cstheme="minorHAnsi"/>
+        </w:rPr>
+      </w:pPr>
+      <w:r>
+        <w:rPr>
+          <w:rFonts w:asciiTheme="minorHAnsi" w:hAnsiTheme="minorHAnsi" w:cstheme="minorHAnsi"/>
+        </w:rPr>
+        <w:t xml:space="preserve">Services modulaires pour la logique métier </w:t>
+      </w:r>
+    </w:p>
+    <w:p>
+      <w:pPr>
+        <w:pStyle w:val="NormalWeb"/>
+        <w:numPr>
+          <w:ilvl w:val="1"/>
+          <w:numId w:val="112"/>
+        </w:numPr>
+        <w:rPr>
+          <w:rFonts w:asciiTheme="minorHAnsi" w:hAnsiTheme="minorHAnsi" w:cstheme="minorHAnsi"/>
+        </w:rPr>
+      </w:pPr>
+      <w:r>
+        <w:rPr>
+          <w:rFonts w:asciiTheme="minorHAnsi" w:hAnsiTheme="minorHAnsi" w:cstheme="minorHAnsi"/>
+        </w:rPr>
+        <w:t xml:space="preserve">Séparation claire entre la logique de présentation et métier </w:t>
+      </w:r>
+    </w:p>
+    <w:p>
+      <w:pPr>
+        <w:pStyle w:val="NormalWeb"/>
+        <w:numPr>
+          <w:ilvl w:val="1"/>
+          <w:numId w:val="112"/>
+        </w:numPr>
+        <w:rPr>
+          <w:rFonts w:asciiTheme="minorHAnsi" w:hAnsiTheme="minorHAnsi" w:cstheme="minorHAnsi"/>
+        </w:rPr>
+      </w:pPr>
+      <w:r>
+        <w:rPr>
+          <w:rFonts w:asciiTheme="minorHAnsi" w:hAnsiTheme="minorHAnsi" w:cstheme="minorHAnsi"/>
+        </w:rPr>
+        <w:t xml:space="preserve">Gestion d'état pour l'authentification et les données utilisateur </w:t>
+      </w:r>
+    </w:p>
+    <w:p>
+      <w:pPr>
+        <w:pStyle w:val="NormalWeb"/>
+        <w:numPr>
+          <w:ilvl w:val="0"/>
+          <w:numId w:val="112"/>
+        </w:numPr>
+        <w:rPr>
+          <w:rFonts w:asciiTheme="minorHAnsi" w:hAnsiTheme="minorHAnsi" w:cstheme="minorHAnsi"/>
+          <w:b/>
+          <w:bCs/>
+        </w:rPr>
+      </w:pPr>
+      <w:r>
+        <w:rPr>
+          <w:rFonts w:asciiTheme="minorHAnsi" w:hAnsiTheme="minorHAnsi" w:cstheme="minorHAnsi"/>
+          <w:b/>
+          <w:bCs/>
+        </w:rPr>
+        <w:t>Bonnes Pratiques Implémentées</w:t>
+      </w:r>
+    </w:p>
+    <w:p>
+      <w:pPr>
+        <w:pStyle w:val="NormalWeb"/>
+        <w:numPr>
+          <w:ilvl w:val="0"/>
+          <w:numId w:val="113"/>
+        </w:numPr>
+        <w:rPr>
+          <w:rFonts w:asciiTheme="minorHAnsi" w:hAnsiTheme="minorHAnsi" w:cstheme="minorHAnsi"/>
+        </w:rPr>
+      </w:pPr>
+      <w:r>
+        <w:rPr>
+          <w:rFonts w:asciiTheme="minorHAnsi" w:hAnsiTheme="minorHAnsi" w:cstheme="minorHAnsi"/>
+        </w:rPr>
+        <w:t xml:space="preserve">Modularité : Composants réutilisables et maintenables </w:t>
+      </w:r>
+    </w:p>
+    <w:p>
+      <w:pPr>
+        <w:pStyle w:val="NormalWeb"/>
+        <w:numPr>
+          <w:ilvl w:val="0"/>
+          <w:numId w:val="113"/>
+        </w:numPr>
+        <w:rPr>
+          <w:rFonts w:asciiTheme="minorHAnsi" w:hAnsiTheme="minorHAnsi" w:cstheme="minorHAnsi"/>
+        </w:rPr>
+      </w:pPr>
+      <w:r>
+        <w:rPr>
+          <w:rFonts w:asciiTheme="minorHAnsi" w:hAnsiTheme="minorHAnsi" w:cstheme="minorHAnsi"/>
+        </w:rPr>
+        <w:t>Sécurité : Protection des routes sensibles</w:t>
+      </w:r>
+    </w:p>
+    <w:p>
+      <w:pPr>
+        <w:pStyle w:val="NormalWeb"/>
+        <w:numPr>
+          <w:ilvl w:val="0"/>
+          <w:numId w:val="113"/>
+        </w:numPr>
+        <w:rPr>
+          <w:rFonts w:asciiTheme="minorHAnsi" w:hAnsiTheme="minorHAnsi" w:cstheme="minorHAnsi"/>
+        </w:rPr>
+      </w:pPr>
+      <w:r>
+        <w:rPr>
+          <w:rFonts w:asciiTheme="minorHAnsi" w:hAnsiTheme="minorHAnsi" w:cstheme="minorHAnsi"/>
+        </w:rPr>
+        <w:t xml:space="preserve"> Performance : Chargement différé des composants </w:t>
+      </w:r>
+    </w:p>
+    <w:p>
+      <w:pPr>
+        <w:pStyle w:val="NormalWeb"/>
+        <w:numPr>
+          <w:ilvl w:val="0"/>
+          <w:numId w:val="113"/>
+        </w:numPr>
+        <w:rPr>
+          <w:rFonts w:asciiTheme="minorHAnsi" w:hAnsiTheme="minorHAnsi" w:cstheme="minorHAnsi"/>
+        </w:rPr>
+      </w:pPr>
+      <w:r>
+        <w:rPr>
+          <w:rFonts w:asciiTheme="minorHAnsi" w:hAnsiTheme="minorHAnsi" w:cstheme="minorHAnsi"/>
+        </w:rPr>
+        <w:t>Maintenance : Structure claire et cohérente</w:t>
+      </w:r>
+    </w:p>
+    <w:p>
+      <w:pPr>
+        <w:pStyle w:val="NormalWeb"/>
+        <w:numPr>
+          <w:ilvl w:val="0"/>
+          <w:numId w:val="113"/>
+        </w:numPr>
+        <w:rPr>
+          <w:rFonts w:asciiTheme="minorHAnsi" w:hAnsiTheme="minorHAnsi" w:cstheme="minorHAnsi"/>
+        </w:rPr>
+      </w:pPr>
+      <w:r>
+        <w:rPr>
+          <w:rFonts w:asciiTheme="minorHAnsi" w:hAnsiTheme="minorHAnsi" w:cstheme="minorHAnsi"/>
+        </w:rPr>
+        <w:t xml:space="preserve">Style : Utilisation de CSS modulaire et responsive </w:t>
+      </w:r>
+    </w:p>
+    <w:p>
+      <w:pPr>
+        <w:pStyle w:val="NormalWeb"/>
+        <w:numPr>
+          <w:ilvl w:val="0"/>
+          <w:numId w:val="113"/>
+        </w:numPr>
+        <w:rPr>
+          <w:rFonts w:asciiTheme="minorHAnsi" w:hAnsiTheme="minorHAnsi" w:cstheme="minorHAnsi"/>
+        </w:rPr>
+      </w:pPr>
+      <w:r>
+        <w:rPr>
+          <w:rFonts w:asciiTheme="minorHAnsi" w:hAnsiTheme="minorHAnsi" w:cstheme="minorHAnsi"/>
+        </w:rPr>
+        <w:t>Design responsive avec media queries:</w:t>
+      </w:r>
+    </w:p>
+    <w:p>
+      <w:pPr>
+        <w:pStyle w:val="NormalWeb"/>
+        <w:ind w:left="360"/>
+        <w:rPr>
+          <w:rFonts w:asciiTheme="minorHAnsi" w:hAnsiTheme="minorHAnsi" w:cstheme="minorHAnsi"/>
+        </w:rPr>
+      </w:pPr>
+      <w:r>
+        <w:rPr>
+          <w:rFonts w:asciiTheme="minorHAnsi" w:hAnsiTheme="minorHAnsi" w:cstheme="minorHAnsi"/>
+        </w:rPr>
+        <w:drawing>
+          <wp:inline distT="0" distB="0" distL="0" distR="0" wp14:anchorId="04618396" wp14:editId="2C01B7DB">
+            <wp:extent cx="2600688" cy="981212"/>
+            <wp:effectExtent l="0" t="0" r="9525" b="9525"/>
+            <wp:docPr id="9" name="Image 9"/>
+            <wp:cNvGraphicFramePr>
+              <a:graphicFrameLocks xmlns:a="http://schemas.openxmlformats.org/drawingml/2006/main" noChangeAspect="1"/>
+            </wp:cNvGraphicFramePr>
+            <a:graphic xmlns:a="http://schemas.openxmlformats.org/drawingml/2006/main">
+              <a:graphicData uri="http://schemas.openxmlformats.org/drawingml/2006/picture">
+                <pic:pic xmlns:pic="http://schemas.openxmlformats.org/drawingml/2006/picture">
+                  <pic:nvPicPr>
+                    <pic:cNvPr id="1" name=""/>
+                    <pic:cNvPicPr/>
+                  </pic:nvPicPr>
+                  <pic:blipFill>
+                    <a:blip r:embed="rId14"/>
+                    <a:stretch>
+                      <a:fillRect/>
+                    </a:stretch>
+                  </pic:blipFill>
+                  <pic:spPr>
+                    <a:xfrm>
+                      <a:off x="0" y="0"/>
+                      <a:ext cx="2600688" cy="981212"/>
+                    </a:xfrm>
+                    <a:prstGeom prst="rect">
+                      <a:avLst/>
+                    </a:prstGeom>
+                  </pic:spPr>
+                </pic:pic>
+              </a:graphicData>
+            </a:graphic>
+          </wp:inline>
+        </w:drawing>
+      </w:r>
+    </w:p>
+    <w:p>
+      <w:pPr>
+        <w:pStyle w:val="NormalWeb"/>
+        <w:numPr>
+          <w:ilvl w:val="0"/>
+          <w:numId w:val="112"/>
+        </w:numPr>
+        <w:rPr>
+          <w:rFonts w:asciiTheme="minorHAnsi" w:hAnsiTheme="minorHAnsi" w:cstheme="minorHAnsi"/>
+          <w:b/>
+          <w:bCs/>
+        </w:rPr>
+      </w:pPr>
+      <w:r>
+        <w:rPr>
+          <w:rFonts w:asciiTheme="minorHAnsi" w:hAnsiTheme="minorHAnsi" w:cstheme="minorHAnsi"/>
+          <w:b/>
+          <w:bCs/>
+        </w:rPr>
+        <w:t xml:space="preserve">Outils de Développement </w:t>
+      </w:r>
+    </w:p>
+    <w:p>
+      <w:pPr>
+        <w:pStyle w:val="NormalWeb"/>
+        <w:numPr>
+          <w:ilvl w:val="0"/>
+          <w:numId w:val="114"/>
+        </w:numPr>
+        <w:rPr>
+          <w:rFonts w:asciiTheme="minorHAnsi" w:hAnsiTheme="minorHAnsi" w:cstheme="minorHAnsi"/>
+        </w:rPr>
+      </w:pPr>
+      <w:r>
+        <w:rPr>
+          <w:rFonts w:asciiTheme="minorHAnsi" w:hAnsiTheme="minorHAnsi" w:cstheme="minorHAnsi"/>
+        </w:rPr>
+        <w:t xml:space="preserve">ESLint : Qualité et cohérence du code </w:t>
+      </w:r>
+    </w:p>
+    <w:p>
+      <w:pPr>
+        <w:pStyle w:val="NormalWeb"/>
+        <w:numPr>
+          <w:ilvl w:val="0"/>
+          <w:numId w:val="114"/>
+        </w:numPr>
+        <w:rPr>
+          <w:rFonts w:asciiTheme="minorHAnsi" w:hAnsiTheme="minorHAnsi" w:cstheme="minorHAnsi"/>
+        </w:rPr>
+      </w:pPr>
+      <w:r>
+        <w:rPr>
+          <w:rFonts w:asciiTheme="minorHAnsi" w:hAnsiTheme="minorHAnsi" w:cstheme="minorHAnsi"/>
+        </w:rPr>
+        <w:t xml:space="preserve">Prettier : Formatage automatique </w:t>
+      </w:r>
+    </w:p>
+    <w:p>
+      <w:pPr>
+        <w:pStyle w:val="NormalWeb"/>
+        <w:numPr>
+          <w:ilvl w:val="0"/>
+          <w:numId w:val="114"/>
+        </w:numPr>
+        <w:rPr>
+          <w:rFonts w:asciiTheme="minorHAnsi" w:hAnsiTheme="minorHAnsi" w:cstheme="minorHAnsi"/>
+        </w:rPr>
+      </w:pPr>
+      <w:r>
+        <w:rPr>
+          <w:rFonts w:asciiTheme="minorHAnsi" w:hAnsiTheme="minorHAnsi" w:cstheme="minorHAnsi"/>
+        </w:rPr>
+        <w:t xml:space="preserve">EditorConfig : Standardisation entre éditeurs </w:t>
+      </w:r>
+    </w:p>
+    <w:p>
+      <w:pPr>
+        <w:pStyle w:val="NormalWeb"/>
+        <w:ind w:left="360"/>
+        <w:rPr>
+          <w:rFonts w:asciiTheme="minorHAnsi" w:hAnsiTheme="minorHAnsi" w:cstheme="minorHAnsi"/>
+          <w:b/>
+          <w:bCs/>
+        </w:rPr>
+      </w:pPr>
+      <w:r>
+        <w:rPr>
+          <w:rFonts w:asciiTheme="minorHAnsi" w:hAnsiTheme="minorHAnsi" w:cstheme="minorHAnsi"/>
+          <w:b/>
+          <w:bCs/>
+        </w:rPr>
+        <w:t xml:space="preserve">Cette organisation permet : </w:t>
+      </w:r>
+    </w:p>
+    <w:p>
+      <w:pPr>
+        <w:pStyle w:val="NormalWeb"/>
+        <w:numPr>
+          <w:ilvl w:val="0"/>
+          <w:numId w:val="114"/>
+        </w:numPr>
+        <w:rPr>
+          <w:rFonts w:asciiTheme="minorHAnsi" w:hAnsiTheme="minorHAnsi" w:cstheme="minorHAnsi"/>
+        </w:rPr>
+      </w:pPr>
+      <w:r>
+        <w:rPr>
+          <w:rFonts w:asciiTheme="minorHAnsi" w:hAnsiTheme="minorHAnsi" w:cstheme="minorHAnsi"/>
+        </w:rPr>
+        <w:t xml:space="preserve">Une maintenance facilitée </w:t>
+      </w:r>
+    </w:p>
+    <w:p>
+      <w:pPr>
+        <w:pStyle w:val="NormalWeb"/>
+        <w:numPr>
+          <w:ilvl w:val="0"/>
+          <w:numId w:val="114"/>
+        </w:numPr>
+        <w:rPr>
+          <w:rFonts w:asciiTheme="minorHAnsi" w:hAnsiTheme="minorHAnsi" w:cstheme="minorHAnsi"/>
+        </w:rPr>
+      </w:pPr>
+      <w:r>
+        <w:rPr>
+          <w:rFonts w:asciiTheme="minorHAnsi" w:hAnsiTheme="minorHAnsi" w:cstheme="minorHAnsi"/>
+        </w:rPr>
+        <w:t xml:space="preserve">Une évolution progressive de l'application </w:t>
+      </w:r>
+    </w:p>
+    <w:p>
+      <w:pPr>
+        <w:pStyle w:val="NormalWeb"/>
+        <w:numPr>
+          <w:ilvl w:val="0"/>
+          <w:numId w:val="114"/>
+        </w:numPr>
+        <w:rPr>
+          <w:rFonts w:asciiTheme="minorHAnsi" w:hAnsiTheme="minorHAnsi" w:cstheme="minorHAnsi"/>
+        </w:rPr>
+      </w:pPr>
+      <w:r>
+        <w:rPr>
+          <w:rFonts w:asciiTheme="minorHAnsi" w:hAnsiTheme="minorHAnsi" w:cstheme="minorHAnsi"/>
+        </w:rPr>
+        <w:t xml:space="preserve">Une collaboration efficace entre développeurs </w:t>
+      </w:r>
+    </w:p>
+    <w:p>
+      <w:pPr>
+        <w:pStyle w:val="NormalWeb"/>
+        <w:numPr>
+          <w:ilvl w:val="0"/>
+          <w:numId w:val="114"/>
+        </w:numPr>
+        <w:rPr>
+          <w:rFonts w:asciiTheme="minorHAnsi" w:hAnsiTheme="minorHAnsi" w:cstheme="minorHAnsi"/>
+        </w:rPr>
+      </w:pPr>
+      <w:r>
+        <w:rPr>
+          <w:rFonts w:asciiTheme="minorHAnsi" w:hAnsiTheme="minorHAnsi" w:cstheme="minorHAnsi"/>
+        </w:rPr>
+        <w:t xml:space="preserve">Une séparation claire des responsabilités </w:t>
+      </w:r>
+    </w:p>
+    <w:p>
+      <w:pPr>
+        <w:pStyle w:val="NormalWeb"/>
+        <w:numPr>
+          <w:ilvl w:val="0"/>
+          <w:numId w:val="114"/>
+        </w:numPr>
+        <w:rPr>
+          <w:rFonts w:asciiTheme="minorHAnsi" w:hAnsiTheme="minorHAnsi" w:cstheme="minorHAnsi"/>
+        </w:rPr>
+      </w:pPr>
+      <w:r>
+        <w:rPr>
+          <w:rFonts w:asciiTheme="minorHAnsi" w:hAnsiTheme="minorHAnsi" w:cstheme="minorHAnsi"/>
+        </w:rPr>
+        <w:t>Une gestion optimale des performances</w:t>
+      </w:r>
+    </w:p>
+    <w:p>
+      <w:pPr>
         <w:pStyle w:val="Titre2"/>
         <w:rPr>
           <w:rFonts w:cstheme="minorHAnsi"/>
@@ -6570,8 +7560,9 @@
           <w:rFonts w:cstheme="minorHAnsi"/>
           <w:noProof/>
         </w:rPr>
+        <w:lastRenderedPageBreak/>
         <w:drawing>
-          <wp:anchor distT="0" distB="0" distL="114300" distR="114300" simplePos="0" relativeHeight="251658240" behindDoc="0" locked="0" layoutInCell="1" allowOverlap="1" wp14:anchorId="04C44C51" wp14:editId="205EAC6C">
+          <wp:anchor distT="0" distB="0" distL="114300" distR="114300" simplePos="0" relativeHeight="251658240" behindDoc="0" locked="0" layoutInCell="1" allowOverlap="1" wp14:anchorId="04C44C51" wp14:editId="28E8FD69">
             <wp:simplePos x="0" y="0"/>
             <wp:positionH relativeFrom="column">
               <wp:posOffset>1013991</wp:posOffset>
@@ -6596,7 +7587,7 @@
                     </pic:cNvPicPr>
                   </pic:nvPicPr>
                   <pic:blipFill>
-                    <a:blip r:embed="rId11" cstate="print">
+                    <a:blip r:embed="rId15" cstate="print">
                       <a:extLst>
                         <a:ext uri="{28A0092B-C50C-407E-A947-70E740481C1C}">
                           <a14:useLocalDpi xmlns:a14="http://schemas.microsoft.com/office/drawing/2010/main" val="0"/>
@@ -10244,7 +11235,7 @@
         </w:rPr>
         <w:t xml:space="preserve"> vuejs : </w:t>
       </w:r>
-      <w:hyperlink r:id="rId12" w:history="1">
+      <w:hyperlink r:id="rId16" w:history="1">
         <w:r>
           <w:rPr>
             <w:rStyle w:val="Lienhypertexte"/>
@@ -10289,7 +11280,7 @@
         </w:rPr>
         <w:t xml:space="preserve"> routers vuejs : </w:t>
       </w:r>
-      <w:hyperlink r:id="rId13" w:history="1">
+      <w:hyperlink r:id="rId17" w:history="1">
         <w:r>
           <w:rPr>
             <w:rStyle w:val="Lienhypertexte"/>
@@ -10326,7 +11317,7 @@
         </w:rPr>
         <w:t xml:space="preserve">Conseils utiles: </w:t>
       </w:r>
-      <w:hyperlink r:id="rId14" w:history="1">
+      <w:hyperlink r:id="rId18" w:history="1">
         <w:r>
           <w:rPr>
             <w:rStyle w:val="Lienhypertexte"/>
@@ -10371,7 +11362,7 @@
         </w:rPr>
         <w:t xml:space="preserve"> vitejs : </w:t>
       </w:r>
-      <w:hyperlink r:id="rId15" w:history="1">
+      <w:hyperlink r:id="rId19" w:history="1">
         <w:r>
           <w:rPr>
             <w:rStyle w:val="Lienhypertexte"/>
@@ -10404,7 +11395,7 @@
         </w:rPr>
         <w:t xml:space="preserve">Documentation Sequelize : </w:t>
       </w:r>
-      <w:hyperlink r:id="rId16" w:history="1">
+      <w:hyperlink r:id="rId20" w:history="1">
         <w:r>
           <w:rPr>
             <w:rStyle w:val="Lienhypertexte"/>
@@ -10437,7 +11428,7 @@
         </w:rPr>
         <w:t xml:space="preserve">Documentation Express.js : </w:t>
       </w:r>
-      <w:hyperlink r:id="rId17" w:history="1">
+      <w:hyperlink r:id="rId21" w:history="1">
         <w:r>
           <w:rPr>
             <w:rStyle w:val="Lienhypertexte"/>
@@ -10472,7 +11463,7 @@
         </w:rPr>
         <w:t xml:space="preserve">Swagger API Docs : </w:t>
       </w:r>
-      <w:hyperlink r:id="rId18" w:history="1">
+      <w:hyperlink r:id="rId22" w:history="1">
         <w:r>
           <w:rPr>
             <w:rStyle w:val="Lienhypertexte"/>
@@ -10506,7 +11497,7 @@
         </w:rPr>
         <w:t xml:space="preserve">Tutoriels JWT et sécurité des API : </w:t>
       </w:r>
-      <w:hyperlink r:id="rId19" w:history="1">
+      <w:hyperlink r:id="rId23" w:history="1">
         <w:r>
           <w:rPr>
             <w:rStyle w:val="Lienhypertexte"/>
@@ -10567,7 +11558,7 @@
         </w:rPr>
         <w:t xml:space="preserve">Repo GitHub: </w:t>
       </w:r>
-      <w:hyperlink r:id="rId20" w:history="1">
+      <w:hyperlink r:id="rId24" w:history="1">
         <w:r>
           <w:rPr>
             <w:rStyle w:val="Lienhypertexte"/>
@@ -10608,7 +11599,7 @@
         </w:rPr>
         <w:t xml:space="preserve">Figma : </w:t>
       </w:r>
-      <w:hyperlink r:id="rId21" w:history="1">
+      <w:hyperlink r:id="rId25" w:history="1">
         <w:r>
           <w:rPr>
             <w:rStyle w:val="Lienhypertexte"/>
@@ -10641,7 +11632,7 @@
         </w:rPr>
         <w:t xml:space="preserve">GitHub Project : </w:t>
       </w:r>
-      <w:hyperlink r:id="rId22" w:history="1">
+      <w:hyperlink r:id="rId26" w:history="1">
         <w:r>
           <w:rPr>
             <w:rStyle w:val="Lienhypertexte"/>
@@ -10870,6 +11861,119 @@
     </w:lvl>
   </w:abstractNum>
   <w:abstractNum w:abstractNumId="1" w15:restartNumberingAfterBreak="0">
+    <w:nsid w:val="00880551"/>
+    <w:multiLevelType w:val="hybridMultilevel"/>
+    <w:tmpl w:val="3C0866F8"/>
+    <w:lvl w:ilvl="0" w:tplc="100C0001">
+      <w:start w:val="1"/>
+      <w:numFmt w:val="bullet"/>
+      <w:lvlText w:val=""/>
+      <w:lvlJc w:val="left"/>
+      <w:pPr>
+        <w:ind w:left="360" w:hanging="360"/>
+      </w:pPr>
+      <w:rPr>
+        <w:rFonts w:ascii="Symbol" w:hAnsi="Symbol" w:hint="default"/>
+      </w:rPr>
+    </w:lvl>
+    <w:lvl w:ilvl="1" w:tplc="100C0003" w:tentative="1">
+      <w:start w:val="1"/>
+      <w:numFmt w:val="bullet"/>
+      <w:lvlText w:val="o"/>
+      <w:lvlJc w:val="left"/>
+      <w:pPr>
+        <w:ind w:left="1080" w:hanging="360"/>
+      </w:pPr>
+      <w:rPr>
+        <w:rFonts w:ascii="Courier New" w:hAnsi="Courier New" w:cs="Courier New" w:hint="default"/>
+      </w:rPr>
+    </w:lvl>
+    <w:lvl w:ilvl="2" w:tplc="100C0005" w:tentative="1">
+      <w:start w:val="1"/>
+      <w:numFmt w:val="bullet"/>
+      <w:lvlText w:val=""/>
+      <w:lvlJc w:val="left"/>
+      <w:pPr>
+        <w:ind w:left="1800" w:hanging="360"/>
+      </w:pPr>
+      <w:rPr>
+        <w:rFonts w:ascii="Wingdings" w:hAnsi="Wingdings" w:hint="default"/>
+      </w:rPr>
+    </w:lvl>
+    <w:lvl w:ilvl="3" w:tplc="100C0001" w:tentative="1">
+      <w:start w:val="1"/>
+      <w:numFmt w:val="bullet"/>
+      <w:lvlText w:val=""/>
+      <w:lvlJc w:val="left"/>
+      <w:pPr>
+        <w:ind w:left="2520" w:hanging="360"/>
+      </w:pPr>
+      <w:rPr>
+        <w:rFonts w:ascii="Symbol" w:hAnsi="Symbol" w:hint="default"/>
+      </w:rPr>
+    </w:lvl>
+    <w:lvl w:ilvl="4" w:tplc="100C0003" w:tentative="1">
+      <w:start w:val="1"/>
+      <w:numFmt w:val="bullet"/>
+      <w:lvlText w:val="o"/>
+      <w:lvlJc w:val="left"/>
+      <w:pPr>
+        <w:ind w:left="3240" w:hanging="360"/>
+      </w:pPr>
+      <w:rPr>
+        <w:rFonts w:ascii="Courier New" w:hAnsi="Courier New" w:cs="Courier New" w:hint="default"/>
+      </w:rPr>
+    </w:lvl>
+    <w:lvl w:ilvl="5" w:tplc="100C0005" w:tentative="1">
+      <w:start w:val="1"/>
+      <w:numFmt w:val="bullet"/>
+      <w:lvlText w:val=""/>
+      <w:lvlJc w:val="left"/>
+      <w:pPr>
+        <w:ind w:left="3960" w:hanging="360"/>
+      </w:pPr>
+      <w:rPr>
+        <w:rFonts w:ascii="Wingdings" w:hAnsi="Wingdings" w:hint="default"/>
+      </w:rPr>
+    </w:lvl>
+    <w:lvl w:ilvl="6" w:tplc="100C0001" w:tentative="1">
+      <w:start w:val="1"/>
+      <w:numFmt w:val="bullet"/>
+      <w:lvlText w:val=""/>
+      <w:lvlJc w:val="left"/>
+      <w:pPr>
+        <w:ind w:left="4680" w:hanging="360"/>
+      </w:pPr>
+      <w:rPr>
+        <w:rFonts w:ascii="Symbol" w:hAnsi="Symbol" w:hint="default"/>
+      </w:rPr>
+    </w:lvl>
+    <w:lvl w:ilvl="7" w:tplc="100C0003" w:tentative="1">
+      <w:start w:val="1"/>
+      <w:numFmt w:val="bullet"/>
+      <w:lvlText w:val="o"/>
+      <w:lvlJc w:val="left"/>
+      <w:pPr>
+        <w:ind w:left="5400" w:hanging="360"/>
+      </w:pPr>
+      <w:rPr>
+        <w:rFonts w:ascii="Courier New" w:hAnsi="Courier New" w:cs="Courier New" w:hint="default"/>
+      </w:rPr>
+    </w:lvl>
+    <w:lvl w:ilvl="8" w:tplc="100C0005" w:tentative="1">
+      <w:start w:val="1"/>
+      <w:numFmt w:val="bullet"/>
+      <w:lvlText w:val=""/>
+      <w:lvlJc w:val="left"/>
+      <w:pPr>
+        <w:ind w:left="6120" w:hanging="360"/>
+      </w:pPr>
+      <w:rPr>
+        <w:rFonts w:ascii="Wingdings" w:hAnsi="Wingdings" w:hint="default"/>
+      </w:rPr>
+    </w:lvl>
+  </w:abstractNum>
+  <w:abstractNum w:abstractNumId="2" w15:restartNumberingAfterBreak="0">
     <w:nsid w:val="01653245"/>
     <w:multiLevelType w:val="multilevel"/>
     <w:tmpl w:val="87C4DC0E"/>
@@ -11018,7 +12122,120 @@
       </w:rPr>
     </w:lvl>
   </w:abstractNum>
-  <w:abstractNum w:abstractNumId="2" w15:restartNumberingAfterBreak="0">
+  <w:abstractNum w:abstractNumId="3" w15:restartNumberingAfterBreak="0">
+    <w:nsid w:val="021E5EEA"/>
+    <w:multiLevelType w:val="hybridMultilevel"/>
+    <w:tmpl w:val="B0E61A72"/>
+    <w:lvl w:ilvl="0" w:tplc="100C0001">
+      <w:start w:val="1"/>
+      <w:numFmt w:val="bullet"/>
+      <w:lvlText w:val=""/>
+      <w:lvlJc w:val="left"/>
+      <w:pPr>
+        <w:ind w:left="360" w:hanging="360"/>
+      </w:pPr>
+      <w:rPr>
+        <w:rFonts w:ascii="Symbol" w:hAnsi="Symbol" w:hint="default"/>
+      </w:rPr>
+    </w:lvl>
+    <w:lvl w:ilvl="1" w:tplc="100C0003" w:tentative="1">
+      <w:start w:val="1"/>
+      <w:numFmt w:val="bullet"/>
+      <w:lvlText w:val="o"/>
+      <w:lvlJc w:val="left"/>
+      <w:pPr>
+        <w:ind w:left="1080" w:hanging="360"/>
+      </w:pPr>
+      <w:rPr>
+        <w:rFonts w:ascii="Courier New" w:hAnsi="Courier New" w:cs="Courier New" w:hint="default"/>
+      </w:rPr>
+    </w:lvl>
+    <w:lvl w:ilvl="2" w:tplc="100C0005" w:tentative="1">
+      <w:start w:val="1"/>
+      <w:numFmt w:val="bullet"/>
+      <w:lvlText w:val=""/>
+      <w:lvlJc w:val="left"/>
+      <w:pPr>
+        <w:ind w:left="1800" w:hanging="360"/>
+      </w:pPr>
+      <w:rPr>
+        <w:rFonts w:ascii="Wingdings" w:hAnsi="Wingdings" w:hint="default"/>
+      </w:rPr>
+    </w:lvl>
+    <w:lvl w:ilvl="3" w:tplc="100C0001" w:tentative="1">
+      <w:start w:val="1"/>
+      <w:numFmt w:val="bullet"/>
+      <w:lvlText w:val=""/>
+      <w:lvlJc w:val="left"/>
+      <w:pPr>
+        <w:ind w:left="2520" w:hanging="360"/>
+      </w:pPr>
+      <w:rPr>
+        <w:rFonts w:ascii="Symbol" w:hAnsi="Symbol" w:hint="default"/>
+      </w:rPr>
+    </w:lvl>
+    <w:lvl w:ilvl="4" w:tplc="100C0003" w:tentative="1">
+      <w:start w:val="1"/>
+      <w:numFmt w:val="bullet"/>
+      <w:lvlText w:val="o"/>
+      <w:lvlJc w:val="left"/>
+      <w:pPr>
+        <w:ind w:left="3240" w:hanging="360"/>
+      </w:pPr>
+      <w:rPr>
+        <w:rFonts w:ascii="Courier New" w:hAnsi="Courier New" w:cs="Courier New" w:hint="default"/>
+      </w:rPr>
+    </w:lvl>
+    <w:lvl w:ilvl="5" w:tplc="100C0005" w:tentative="1">
+      <w:start w:val="1"/>
+      <w:numFmt w:val="bullet"/>
+      <w:lvlText w:val=""/>
+      <w:lvlJc w:val="left"/>
+      <w:pPr>
+        <w:ind w:left="3960" w:hanging="360"/>
+      </w:pPr>
+      <w:rPr>
+        <w:rFonts w:ascii="Wingdings" w:hAnsi="Wingdings" w:hint="default"/>
+      </w:rPr>
+    </w:lvl>
+    <w:lvl w:ilvl="6" w:tplc="100C0001" w:tentative="1">
+      <w:start w:val="1"/>
+      <w:numFmt w:val="bullet"/>
+      <w:lvlText w:val=""/>
+      <w:lvlJc w:val="left"/>
+      <w:pPr>
+        <w:ind w:left="4680" w:hanging="360"/>
+      </w:pPr>
+      <w:rPr>
+        <w:rFonts w:ascii="Symbol" w:hAnsi="Symbol" w:hint="default"/>
+      </w:rPr>
+    </w:lvl>
+    <w:lvl w:ilvl="7" w:tplc="100C0003" w:tentative="1">
+      <w:start w:val="1"/>
+      <w:numFmt w:val="bullet"/>
+      <w:lvlText w:val="o"/>
+      <w:lvlJc w:val="left"/>
+      <w:pPr>
+        <w:ind w:left="5400" w:hanging="360"/>
+      </w:pPr>
+      <w:rPr>
+        <w:rFonts w:ascii="Courier New" w:hAnsi="Courier New" w:cs="Courier New" w:hint="default"/>
+      </w:rPr>
+    </w:lvl>
+    <w:lvl w:ilvl="8" w:tplc="100C0005" w:tentative="1">
+      <w:start w:val="1"/>
+      <w:numFmt w:val="bullet"/>
+      <w:lvlText w:val=""/>
+      <w:lvlJc w:val="left"/>
+      <w:pPr>
+        <w:ind w:left="6120" w:hanging="360"/>
+      </w:pPr>
+      <w:rPr>
+        <w:rFonts w:ascii="Wingdings" w:hAnsi="Wingdings" w:hint="default"/>
+      </w:rPr>
+    </w:lvl>
+  </w:abstractNum>
+  <w:abstractNum w:abstractNumId="4" w15:restartNumberingAfterBreak="0">
     <w:nsid w:val="02AE7CC5"/>
     <w:multiLevelType w:val="multilevel"/>
     <w:tmpl w:val="F73AFD5C"/>
@@ -11163,7 +12380,7 @@
       </w:rPr>
     </w:lvl>
   </w:abstractNum>
-  <w:abstractNum w:abstractNumId="3" w15:restartNumberingAfterBreak="0">
+  <w:abstractNum w:abstractNumId="5" w15:restartNumberingAfterBreak="0">
     <w:nsid w:val="04057132"/>
     <w:multiLevelType w:val="hybridMultilevel"/>
     <w:tmpl w:val="4ECA0A4C"/>
@@ -11276,7 +12493,7 @@
       </w:rPr>
     </w:lvl>
   </w:abstractNum>
-  <w:abstractNum w:abstractNumId="4" w15:restartNumberingAfterBreak="0">
+  <w:abstractNum w:abstractNumId="6" w15:restartNumberingAfterBreak="0">
     <w:nsid w:val="041E2334"/>
     <w:multiLevelType w:val="hybridMultilevel"/>
     <w:tmpl w:val="78C80E48"/>
@@ -11362,7 +12579,7 @@
       </w:pPr>
     </w:lvl>
   </w:abstractNum>
-  <w:abstractNum w:abstractNumId="5" w15:restartNumberingAfterBreak="0">
+  <w:abstractNum w:abstractNumId="7" w15:restartNumberingAfterBreak="0">
     <w:nsid w:val="056A5C5B"/>
     <w:multiLevelType w:val="multilevel"/>
     <w:tmpl w:val="D0BC7672"/>
@@ -11511,7 +12728,7 @@
       </w:rPr>
     </w:lvl>
   </w:abstractNum>
-  <w:abstractNum w:abstractNumId="6" w15:restartNumberingAfterBreak="0">
+  <w:abstractNum w:abstractNumId="8" w15:restartNumberingAfterBreak="0">
     <w:nsid w:val="06482CAE"/>
     <w:multiLevelType w:val="multilevel"/>
     <w:tmpl w:val="100C0021"/>
@@ -11624,7 +12841,7 @@
       </w:rPr>
     </w:lvl>
   </w:abstractNum>
-  <w:abstractNum w:abstractNumId="7" w15:restartNumberingAfterBreak="0">
+  <w:abstractNum w:abstractNumId="9" w15:restartNumberingAfterBreak="0">
     <w:nsid w:val="07A90EF7"/>
     <w:multiLevelType w:val="multilevel"/>
     <w:tmpl w:val="BD589302"/>
@@ -11773,7 +12990,7 @@
       </w:rPr>
     </w:lvl>
   </w:abstractNum>
-  <w:abstractNum w:abstractNumId="8" w15:restartNumberingAfterBreak="0">
+  <w:abstractNum w:abstractNumId="10" w15:restartNumberingAfterBreak="0">
     <w:nsid w:val="0837517A"/>
     <w:multiLevelType w:val="multilevel"/>
     <w:tmpl w:val="DCDA45C4"/>
@@ -11922,7 +13139,7 @@
       </w:rPr>
     </w:lvl>
   </w:abstractNum>
-  <w:abstractNum w:abstractNumId="9" w15:restartNumberingAfterBreak="0">
+  <w:abstractNum w:abstractNumId="11" w15:restartNumberingAfterBreak="0">
     <w:nsid w:val="0AC549A7"/>
     <w:multiLevelType w:val="multilevel"/>
     <w:tmpl w:val="8B8295E4"/>
@@ -12039,7 +13256,7 @@
       </w:pPr>
     </w:lvl>
   </w:abstractNum>
-  <w:abstractNum w:abstractNumId="10" w15:restartNumberingAfterBreak="0">
+  <w:abstractNum w:abstractNumId="12" w15:restartNumberingAfterBreak="0">
     <w:nsid w:val="0E463CAA"/>
     <w:multiLevelType w:val="hybridMultilevel"/>
     <w:tmpl w:val="E6CE1A7A"/>
@@ -12152,7 +13369,7 @@
       </w:rPr>
     </w:lvl>
   </w:abstractNum>
-  <w:abstractNum w:abstractNumId="11" w15:restartNumberingAfterBreak="0">
+  <w:abstractNum w:abstractNumId="13" w15:restartNumberingAfterBreak="0">
     <w:nsid w:val="0F9457A1"/>
     <w:multiLevelType w:val="hybridMultilevel"/>
     <w:tmpl w:val="05281C40"/>
@@ -12238,7 +13455,7 @@
       </w:pPr>
     </w:lvl>
   </w:abstractNum>
-  <w:abstractNum w:abstractNumId="12" w15:restartNumberingAfterBreak="0">
+  <w:abstractNum w:abstractNumId="14" w15:restartNumberingAfterBreak="0">
     <w:nsid w:val="12143962"/>
     <w:multiLevelType w:val="hybridMultilevel"/>
     <w:tmpl w:val="3704F608"/>
@@ -12351,7 +13568,7 @@
       </w:rPr>
     </w:lvl>
   </w:abstractNum>
-  <w:abstractNum w:abstractNumId="13" w15:restartNumberingAfterBreak="0">
+  <w:abstractNum w:abstractNumId="15" w15:restartNumberingAfterBreak="0">
     <w:nsid w:val="12656F5C"/>
     <w:multiLevelType w:val="multilevel"/>
     <w:tmpl w:val="B60ED442"/>
@@ -12500,7 +13717,7 @@
       </w:rPr>
     </w:lvl>
   </w:abstractNum>
-  <w:abstractNum w:abstractNumId="14" w15:restartNumberingAfterBreak="0">
+  <w:abstractNum w:abstractNumId="16" w15:restartNumberingAfterBreak="0">
     <w:nsid w:val="13386E8A"/>
     <w:multiLevelType w:val="multilevel"/>
     <w:tmpl w:val="100C0021"/>
@@ -12613,7 +13830,7 @@
       </w:rPr>
     </w:lvl>
   </w:abstractNum>
-  <w:abstractNum w:abstractNumId="15" w15:restartNumberingAfterBreak="0">
+  <w:abstractNum w:abstractNumId="17" w15:restartNumberingAfterBreak="0">
     <w:nsid w:val="134D3147"/>
     <w:multiLevelType w:val="multilevel"/>
     <w:tmpl w:val="F73AFD5C"/>
@@ -12758,7 +13975,7 @@
       </w:rPr>
     </w:lvl>
   </w:abstractNum>
-  <w:abstractNum w:abstractNumId="16" w15:restartNumberingAfterBreak="0">
+  <w:abstractNum w:abstractNumId="18" w15:restartNumberingAfterBreak="0">
     <w:nsid w:val="1431616B"/>
     <w:multiLevelType w:val="multilevel"/>
     <w:tmpl w:val="20E43E96"/>
@@ -12907,7 +14124,7 @@
       </w:rPr>
     </w:lvl>
   </w:abstractNum>
-  <w:abstractNum w:abstractNumId="17" w15:restartNumberingAfterBreak="0">
+  <w:abstractNum w:abstractNumId="19" w15:restartNumberingAfterBreak="0">
     <w:nsid w:val="14E7137A"/>
     <w:multiLevelType w:val="multilevel"/>
     <w:tmpl w:val="A9722A44"/>
@@ -13056,7 +14273,7 @@
       </w:rPr>
     </w:lvl>
   </w:abstractNum>
-  <w:abstractNum w:abstractNumId="18" w15:restartNumberingAfterBreak="0">
+  <w:abstractNum w:abstractNumId="20" w15:restartNumberingAfterBreak="0">
     <w:nsid w:val="14FC4DFC"/>
     <w:multiLevelType w:val="multilevel"/>
     <w:tmpl w:val="1374A3DE"/>
@@ -13205,7 +14422,7 @@
       </w:rPr>
     </w:lvl>
   </w:abstractNum>
-  <w:abstractNum w:abstractNumId="19" w15:restartNumberingAfterBreak="0">
+  <w:abstractNum w:abstractNumId="21" w15:restartNumberingAfterBreak="0">
     <w:nsid w:val="1582525B"/>
     <w:multiLevelType w:val="multilevel"/>
     <w:tmpl w:val="77BE150C"/>
@@ -13354,7 +14571,7 @@
       </w:rPr>
     </w:lvl>
   </w:abstractNum>
-  <w:abstractNum w:abstractNumId="20" w15:restartNumberingAfterBreak="0">
+  <w:abstractNum w:abstractNumId="22" w15:restartNumberingAfterBreak="0">
     <w:nsid w:val="15AC1C01"/>
     <w:multiLevelType w:val="multilevel"/>
     <w:tmpl w:val="37448B88"/>
@@ -13503,7 +14720,7 @@
       </w:rPr>
     </w:lvl>
   </w:abstractNum>
-  <w:abstractNum w:abstractNumId="21" w15:restartNumberingAfterBreak="0">
+  <w:abstractNum w:abstractNumId="23" w15:restartNumberingAfterBreak="0">
     <w:nsid w:val="18814CF8"/>
     <w:multiLevelType w:val="multilevel"/>
     <w:tmpl w:val="077ECA56"/>
@@ -13652,7 +14869,7 @@
       </w:rPr>
     </w:lvl>
   </w:abstractNum>
-  <w:abstractNum w:abstractNumId="22" w15:restartNumberingAfterBreak="0">
+  <w:abstractNum w:abstractNumId="24" w15:restartNumberingAfterBreak="0">
     <w:nsid w:val="19BD1802"/>
     <w:multiLevelType w:val="hybridMultilevel"/>
     <w:tmpl w:val="4FCCBE06"/>
@@ -13738,7 +14955,7 @@
       </w:pPr>
     </w:lvl>
   </w:abstractNum>
-  <w:abstractNum w:abstractNumId="23" w15:restartNumberingAfterBreak="0">
+  <w:abstractNum w:abstractNumId="25" w15:restartNumberingAfterBreak="0">
     <w:nsid w:val="1A557357"/>
     <w:multiLevelType w:val="multilevel"/>
     <w:tmpl w:val="49F6B5CE"/>
@@ -13887,7 +15104,7 @@
       </w:rPr>
     </w:lvl>
   </w:abstractNum>
-  <w:abstractNum w:abstractNumId="24" w15:restartNumberingAfterBreak="0">
+  <w:abstractNum w:abstractNumId="26" w15:restartNumberingAfterBreak="0">
     <w:nsid w:val="1B4009C4"/>
     <w:multiLevelType w:val="multilevel"/>
     <w:tmpl w:val="9B8E0480"/>
@@ -14036,7 +15253,7 @@
       </w:rPr>
     </w:lvl>
   </w:abstractNum>
-  <w:abstractNum w:abstractNumId="25" w15:restartNumberingAfterBreak="0">
+  <w:abstractNum w:abstractNumId="27" w15:restartNumberingAfterBreak="0">
     <w:nsid w:val="1CDC6C28"/>
     <w:multiLevelType w:val="hybridMultilevel"/>
     <w:tmpl w:val="FC3C1C0E"/>
@@ -14149,7 +15366,7 @@
       </w:rPr>
     </w:lvl>
   </w:abstractNum>
-  <w:abstractNum w:abstractNumId="26" w15:restartNumberingAfterBreak="0">
+  <w:abstractNum w:abstractNumId="28" w15:restartNumberingAfterBreak="0">
     <w:nsid w:val="1CF81CA9"/>
     <w:multiLevelType w:val="multilevel"/>
     <w:tmpl w:val="7862D484"/>
@@ -14298,7 +15515,7 @@
       </w:rPr>
     </w:lvl>
   </w:abstractNum>
-  <w:abstractNum w:abstractNumId="27" w15:restartNumberingAfterBreak="0">
+  <w:abstractNum w:abstractNumId="29" w15:restartNumberingAfterBreak="0">
     <w:nsid w:val="2401657E"/>
     <w:multiLevelType w:val="hybridMultilevel"/>
     <w:tmpl w:val="9B7445A8"/>
@@ -14384,7 +15601,156 @@
       </w:pPr>
     </w:lvl>
   </w:abstractNum>
-  <w:abstractNum w:abstractNumId="28" w15:restartNumberingAfterBreak="0">
+  <w:abstractNum w:abstractNumId="30" w15:restartNumberingAfterBreak="0">
+    <w:nsid w:val="25AE2E56"/>
+    <w:multiLevelType w:val="multilevel"/>
+    <w:tmpl w:val="BB2C1478"/>
+    <w:lvl w:ilvl="0">
+      <w:start w:val="1"/>
+      <w:numFmt w:val="bullet"/>
+      <w:lvlText w:val=""/>
+      <w:lvlJc w:val="left"/>
+      <w:pPr>
+        <w:tabs>
+          <w:tab w:val="num" w:pos="720"/>
+        </w:tabs>
+        <w:ind w:left="720" w:hanging="360"/>
+      </w:pPr>
+      <w:rPr>
+        <w:rFonts w:ascii="Symbol" w:hAnsi="Symbol" w:hint="default"/>
+        <w:sz w:val="20"/>
+      </w:rPr>
+    </w:lvl>
+    <w:lvl w:ilvl="1" w:tentative="1">
+      <w:start w:val="1"/>
+      <w:numFmt w:val="bullet"/>
+      <w:lvlText w:val="o"/>
+      <w:lvlJc w:val="left"/>
+      <w:pPr>
+        <w:tabs>
+          <w:tab w:val="num" w:pos="1440"/>
+        </w:tabs>
+        <w:ind w:left="1440" w:hanging="360"/>
+      </w:pPr>
+      <w:rPr>
+        <w:rFonts w:ascii="Courier New" w:hAnsi="Courier New" w:hint="default"/>
+        <w:sz w:val="20"/>
+      </w:rPr>
+    </w:lvl>
+    <w:lvl w:ilvl="2" w:tentative="1">
+      <w:start w:val="1"/>
+      <w:numFmt w:val="bullet"/>
+      <w:lvlText w:val=""/>
+      <w:lvlJc w:val="left"/>
+      <w:pPr>
+        <w:tabs>
+          <w:tab w:val="num" w:pos="2160"/>
+        </w:tabs>
+        <w:ind w:left="2160" w:hanging="360"/>
+      </w:pPr>
+      <w:rPr>
+        <w:rFonts w:ascii="Wingdings" w:hAnsi="Wingdings" w:hint="default"/>
+        <w:sz w:val="20"/>
+      </w:rPr>
+    </w:lvl>
+    <w:lvl w:ilvl="3" w:tentative="1">
+      <w:start w:val="1"/>
+      <w:numFmt w:val="bullet"/>
+      <w:lvlText w:val=""/>
+      <w:lvlJc w:val="left"/>
+      <w:pPr>
+        <w:tabs>
+          <w:tab w:val="num" w:pos="2880"/>
+        </w:tabs>
+        <w:ind w:left="2880" w:hanging="360"/>
+      </w:pPr>
+      <w:rPr>
+        <w:rFonts w:ascii="Wingdings" w:hAnsi="Wingdings" w:hint="default"/>
+        <w:sz w:val="20"/>
+      </w:rPr>
+    </w:lvl>
+    <w:lvl w:ilvl="4" w:tentative="1">
+      <w:start w:val="1"/>
+      <w:numFmt w:val="bullet"/>
+      <w:lvlText w:val=""/>
+      <w:lvlJc w:val="left"/>
+      <w:pPr>
+        <w:tabs>
+          <w:tab w:val="num" w:pos="3600"/>
+        </w:tabs>
+        <w:ind w:left="3600" w:hanging="360"/>
+      </w:pPr>
+      <w:rPr>
+        <w:rFonts w:ascii="Wingdings" w:hAnsi="Wingdings" w:hint="default"/>
+        <w:sz w:val="20"/>
+      </w:rPr>
+    </w:lvl>
+    <w:lvl w:ilvl="5" w:tentative="1">
+      <w:start w:val="1"/>
+      <w:numFmt w:val="bullet"/>
+      <w:lvlText w:val=""/>
+      <w:lvlJc w:val="left"/>
+      <w:pPr>
+        <w:tabs>
+          <w:tab w:val="num" w:pos="4320"/>
+        </w:tabs>
+        <w:ind w:left="4320" w:hanging="360"/>
+      </w:pPr>
+      <w:rPr>
+        <w:rFonts w:ascii="Wingdings" w:hAnsi="Wingdings" w:hint="default"/>
+        <w:sz w:val="20"/>
+      </w:rPr>
+    </w:lvl>
+    <w:lvl w:ilvl="6" w:tentative="1">
+      <w:start w:val="1"/>
+      <w:numFmt w:val="bullet"/>
+      <w:lvlText w:val=""/>
+      <w:lvlJc w:val="left"/>
+      <w:pPr>
+        <w:tabs>
+          <w:tab w:val="num" w:pos="5040"/>
+        </w:tabs>
+        <w:ind w:left="5040" w:hanging="360"/>
+      </w:pPr>
+      <w:rPr>
+        <w:rFonts w:ascii="Wingdings" w:hAnsi="Wingdings" w:hint="default"/>
+        <w:sz w:val="20"/>
+      </w:rPr>
+    </w:lvl>
+    <w:lvl w:ilvl="7" w:tentative="1">
+      <w:start w:val="1"/>
+      <w:numFmt w:val="bullet"/>
+      <w:lvlText w:val=""/>
+      <w:lvlJc w:val="left"/>
+      <w:pPr>
+        <w:tabs>
+          <w:tab w:val="num" w:pos="5760"/>
+        </w:tabs>
+        <w:ind w:left="5760" w:hanging="360"/>
+      </w:pPr>
+      <w:rPr>
+        <w:rFonts w:ascii="Wingdings" w:hAnsi="Wingdings" w:hint="default"/>
+        <w:sz w:val="20"/>
+      </w:rPr>
+    </w:lvl>
+    <w:lvl w:ilvl="8" w:tentative="1">
+      <w:start w:val="1"/>
+      <w:numFmt w:val="bullet"/>
+      <w:lvlText w:val=""/>
+      <w:lvlJc w:val="left"/>
+      <w:pPr>
+        <w:tabs>
+          <w:tab w:val="num" w:pos="6480"/>
+        </w:tabs>
+        <w:ind w:left="6480" w:hanging="360"/>
+      </w:pPr>
+      <w:rPr>
+        <w:rFonts w:ascii="Wingdings" w:hAnsi="Wingdings" w:hint="default"/>
+        <w:sz w:val="20"/>
+      </w:rPr>
+    </w:lvl>
+  </w:abstractNum>
+  <w:abstractNum w:abstractNumId="31" w15:restartNumberingAfterBreak="0">
     <w:nsid w:val="26A66FA2"/>
     <w:multiLevelType w:val="multilevel"/>
     <w:tmpl w:val="F0A48D78"/>
@@ -14533,7 +15899,7 @@
       </w:rPr>
     </w:lvl>
   </w:abstractNum>
-  <w:abstractNum w:abstractNumId="29" w15:restartNumberingAfterBreak="0">
+  <w:abstractNum w:abstractNumId="32" w15:restartNumberingAfterBreak="0">
     <w:nsid w:val="286972F3"/>
     <w:multiLevelType w:val="hybridMultilevel"/>
     <w:tmpl w:val="625A9CBA"/>
@@ -14619,7 +15985,7 @@
       </w:pPr>
     </w:lvl>
   </w:abstractNum>
-  <w:abstractNum w:abstractNumId="30" w15:restartNumberingAfterBreak="0">
+  <w:abstractNum w:abstractNumId="33" w15:restartNumberingAfterBreak="0">
     <w:nsid w:val="2A4975AE"/>
     <w:multiLevelType w:val="hybridMultilevel"/>
     <w:tmpl w:val="AD144DB8"/>
@@ -14705,7 +16071,7 @@
       </w:pPr>
     </w:lvl>
   </w:abstractNum>
-  <w:abstractNum w:abstractNumId="31" w15:restartNumberingAfterBreak="0">
+  <w:abstractNum w:abstractNumId="34" w15:restartNumberingAfterBreak="0">
     <w:nsid w:val="2A8F67FD"/>
     <w:multiLevelType w:val="multilevel"/>
     <w:tmpl w:val="AB265ADE"/>
@@ -14821,7 +16187,7 @@
       </w:pPr>
     </w:lvl>
   </w:abstractNum>
-  <w:abstractNum w:abstractNumId="32" w15:restartNumberingAfterBreak="0">
+  <w:abstractNum w:abstractNumId="35" w15:restartNumberingAfterBreak="0">
     <w:nsid w:val="2F9178C1"/>
     <w:multiLevelType w:val="multilevel"/>
     <w:tmpl w:val="C996001C"/>
@@ -14970,7 +16336,7 @@
       </w:rPr>
     </w:lvl>
   </w:abstractNum>
-  <w:abstractNum w:abstractNumId="33" w15:restartNumberingAfterBreak="0">
+  <w:abstractNum w:abstractNumId="36" w15:restartNumberingAfterBreak="0">
     <w:nsid w:val="30061AC0"/>
     <w:multiLevelType w:val="multilevel"/>
     <w:tmpl w:val="CA36010A"/>
@@ -15119,7 +16485,7 @@
       </w:rPr>
     </w:lvl>
   </w:abstractNum>
-  <w:abstractNum w:abstractNumId="34" w15:restartNumberingAfterBreak="0">
+  <w:abstractNum w:abstractNumId="37" w15:restartNumberingAfterBreak="0">
     <w:nsid w:val="33224AE7"/>
     <w:multiLevelType w:val="hybridMultilevel"/>
     <w:tmpl w:val="BB5EB058"/>
@@ -15205,7 +16571,7 @@
       </w:pPr>
     </w:lvl>
   </w:abstractNum>
-  <w:abstractNum w:abstractNumId="35" w15:restartNumberingAfterBreak="0">
+  <w:abstractNum w:abstractNumId="38" w15:restartNumberingAfterBreak="0">
     <w:nsid w:val="352802CD"/>
     <w:multiLevelType w:val="multilevel"/>
     <w:tmpl w:val="295C0684"/>
@@ -15354,7 +16720,7 @@
       </w:rPr>
     </w:lvl>
   </w:abstractNum>
-  <w:abstractNum w:abstractNumId="36" w15:restartNumberingAfterBreak="0">
+  <w:abstractNum w:abstractNumId="39" w15:restartNumberingAfterBreak="0">
     <w:nsid w:val="3754479B"/>
     <w:multiLevelType w:val="multilevel"/>
     <w:tmpl w:val="874CD94C"/>
@@ -15503,7 +16869,156 @@
       </w:rPr>
     </w:lvl>
   </w:abstractNum>
-  <w:abstractNum w:abstractNumId="37" w15:restartNumberingAfterBreak="0">
+  <w:abstractNum w:abstractNumId="40" w15:restartNumberingAfterBreak="0">
+    <w:nsid w:val="399F5414"/>
+    <w:multiLevelType w:val="multilevel"/>
+    <w:tmpl w:val="AC860F7C"/>
+    <w:lvl w:ilvl="0">
+      <w:start w:val="1"/>
+      <w:numFmt w:val="bullet"/>
+      <w:lvlText w:val=""/>
+      <w:lvlJc w:val="left"/>
+      <w:pPr>
+        <w:tabs>
+          <w:tab w:val="num" w:pos="720"/>
+        </w:tabs>
+        <w:ind w:left="720" w:hanging="360"/>
+      </w:pPr>
+      <w:rPr>
+        <w:rFonts w:ascii="Symbol" w:hAnsi="Symbol" w:hint="default"/>
+        <w:sz w:val="20"/>
+      </w:rPr>
+    </w:lvl>
+    <w:lvl w:ilvl="1" w:tentative="1">
+      <w:start w:val="1"/>
+      <w:numFmt w:val="bullet"/>
+      <w:lvlText w:val="o"/>
+      <w:lvlJc w:val="left"/>
+      <w:pPr>
+        <w:tabs>
+          <w:tab w:val="num" w:pos="1440"/>
+        </w:tabs>
+        <w:ind w:left="1440" w:hanging="360"/>
+      </w:pPr>
+      <w:rPr>
+        <w:rFonts w:ascii="Courier New" w:hAnsi="Courier New" w:hint="default"/>
+        <w:sz w:val="20"/>
+      </w:rPr>
+    </w:lvl>
+    <w:lvl w:ilvl="2" w:tentative="1">
+      <w:start w:val="1"/>
+      <w:numFmt w:val="bullet"/>
+      <w:lvlText w:val=""/>
+      <w:lvlJc w:val="left"/>
+      <w:pPr>
+        <w:tabs>
+          <w:tab w:val="num" w:pos="2160"/>
+        </w:tabs>
+        <w:ind w:left="2160" w:hanging="360"/>
+      </w:pPr>
+      <w:rPr>
+        <w:rFonts w:ascii="Wingdings" w:hAnsi="Wingdings" w:hint="default"/>
+        <w:sz w:val="20"/>
+      </w:rPr>
+    </w:lvl>
+    <w:lvl w:ilvl="3" w:tentative="1">
+      <w:start w:val="1"/>
+      <w:numFmt w:val="bullet"/>
+      <w:lvlText w:val=""/>
+      <w:lvlJc w:val="left"/>
+      <w:pPr>
+        <w:tabs>
+          <w:tab w:val="num" w:pos="2880"/>
+        </w:tabs>
+        <w:ind w:left="2880" w:hanging="360"/>
+      </w:pPr>
+      <w:rPr>
+        <w:rFonts w:ascii="Wingdings" w:hAnsi="Wingdings" w:hint="default"/>
+        <w:sz w:val="20"/>
+      </w:rPr>
+    </w:lvl>
+    <w:lvl w:ilvl="4" w:tentative="1">
+      <w:start w:val="1"/>
+      <w:numFmt w:val="bullet"/>
+      <w:lvlText w:val=""/>
+      <w:lvlJc w:val="left"/>
+      <w:pPr>
+        <w:tabs>
+          <w:tab w:val="num" w:pos="3600"/>
+        </w:tabs>
+        <w:ind w:left="3600" w:hanging="360"/>
+      </w:pPr>
+      <w:rPr>
+        <w:rFonts w:ascii="Wingdings" w:hAnsi="Wingdings" w:hint="default"/>
+        <w:sz w:val="20"/>
+      </w:rPr>
+    </w:lvl>
+    <w:lvl w:ilvl="5" w:tentative="1">
+      <w:start w:val="1"/>
+      <w:numFmt w:val="bullet"/>
+      <w:lvlText w:val=""/>
+      <w:lvlJc w:val="left"/>
+      <w:pPr>
+        <w:tabs>
+          <w:tab w:val="num" w:pos="4320"/>
+        </w:tabs>
+        <w:ind w:left="4320" w:hanging="360"/>
+      </w:pPr>
+      <w:rPr>
+        <w:rFonts w:ascii="Wingdings" w:hAnsi="Wingdings" w:hint="default"/>
+        <w:sz w:val="20"/>
+      </w:rPr>
+    </w:lvl>
+    <w:lvl w:ilvl="6" w:tentative="1">
+      <w:start w:val="1"/>
+      <w:numFmt w:val="bullet"/>
+      <w:lvlText w:val=""/>
+      <w:lvlJc w:val="left"/>
+      <w:pPr>
+        <w:tabs>
+          <w:tab w:val="num" w:pos="5040"/>
+        </w:tabs>
+        <w:ind w:left="5040" w:hanging="360"/>
+      </w:pPr>
+      <w:rPr>
+        <w:rFonts w:ascii="Wingdings" w:hAnsi="Wingdings" w:hint="default"/>
+        <w:sz w:val="20"/>
+      </w:rPr>
+    </w:lvl>
+    <w:lvl w:ilvl="7" w:tentative="1">
+      <w:start w:val="1"/>
+      <w:numFmt w:val="bullet"/>
+      <w:lvlText w:val=""/>
+      <w:lvlJc w:val="left"/>
+      <w:pPr>
+        <w:tabs>
+          <w:tab w:val="num" w:pos="5760"/>
+        </w:tabs>
+        <w:ind w:left="5760" w:hanging="360"/>
+      </w:pPr>
+      <w:rPr>
+        <w:rFonts w:ascii="Wingdings" w:hAnsi="Wingdings" w:hint="default"/>
+        <w:sz w:val="20"/>
+      </w:rPr>
+    </w:lvl>
+    <w:lvl w:ilvl="8" w:tentative="1">
+      <w:start w:val="1"/>
+      <w:numFmt w:val="bullet"/>
+      <w:lvlText w:val=""/>
+      <w:lvlJc w:val="left"/>
+      <w:pPr>
+        <w:tabs>
+          <w:tab w:val="num" w:pos="6480"/>
+        </w:tabs>
+        <w:ind w:left="6480" w:hanging="360"/>
+      </w:pPr>
+      <w:rPr>
+        <w:rFonts w:ascii="Wingdings" w:hAnsi="Wingdings" w:hint="default"/>
+        <w:sz w:val="20"/>
+      </w:rPr>
+    </w:lvl>
+  </w:abstractNum>
+  <w:abstractNum w:abstractNumId="41" w15:restartNumberingAfterBreak="0">
     <w:nsid w:val="3AE80592"/>
     <w:multiLevelType w:val="multilevel"/>
     <w:tmpl w:val="E454055A"/>
@@ -15652,7 +17167,7 @@
       </w:rPr>
     </w:lvl>
   </w:abstractNum>
-  <w:abstractNum w:abstractNumId="38" w15:restartNumberingAfterBreak="0">
+  <w:abstractNum w:abstractNumId="42" w15:restartNumberingAfterBreak="0">
     <w:nsid w:val="3BD16F36"/>
     <w:multiLevelType w:val="multilevel"/>
     <w:tmpl w:val="100C0021"/>
@@ -15765,7 +17280,7 @@
       </w:rPr>
     </w:lvl>
   </w:abstractNum>
-  <w:abstractNum w:abstractNumId="39" w15:restartNumberingAfterBreak="0">
+  <w:abstractNum w:abstractNumId="43" w15:restartNumberingAfterBreak="0">
     <w:nsid w:val="3EF922F0"/>
     <w:multiLevelType w:val="multilevel"/>
     <w:tmpl w:val="100C0021"/>
@@ -15878,7 +17393,7 @@
       </w:rPr>
     </w:lvl>
   </w:abstractNum>
-  <w:abstractNum w:abstractNumId="40" w15:restartNumberingAfterBreak="0">
+  <w:abstractNum w:abstractNumId="44" w15:restartNumberingAfterBreak="0">
     <w:nsid w:val="404022A0"/>
     <w:multiLevelType w:val="multilevel"/>
     <w:tmpl w:val="102CDDAE"/>
@@ -16027,7 +17542,7 @@
       </w:rPr>
     </w:lvl>
   </w:abstractNum>
-  <w:abstractNum w:abstractNumId="41" w15:restartNumberingAfterBreak="0">
+  <w:abstractNum w:abstractNumId="45" w15:restartNumberingAfterBreak="0">
     <w:nsid w:val="40413F2D"/>
     <w:multiLevelType w:val="multilevel"/>
     <w:tmpl w:val="BF582436"/>
@@ -16176,7 +17691,7 @@
       </w:rPr>
     </w:lvl>
   </w:abstractNum>
-  <w:abstractNum w:abstractNumId="42" w15:restartNumberingAfterBreak="0">
+  <w:abstractNum w:abstractNumId="46" w15:restartNumberingAfterBreak="0">
     <w:nsid w:val="42601ED3"/>
     <w:multiLevelType w:val="multilevel"/>
     <w:tmpl w:val="B10A766E"/>
@@ -16321,7 +17836,7 @@
       </w:rPr>
     </w:lvl>
   </w:abstractNum>
-  <w:abstractNum w:abstractNumId="43" w15:restartNumberingAfterBreak="0">
+  <w:abstractNum w:abstractNumId="47" w15:restartNumberingAfterBreak="0">
     <w:nsid w:val="42F60F8E"/>
     <w:multiLevelType w:val="hybridMultilevel"/>
     <w:tmpl w:val="F4202DE4"/>
@@ -16434,7 +17949,7 @@
       </w:rPr>
     </w:lvl>
   </w:abstractNum>
-  <w:abstractNum w:abstractNumId="44" w15:restartNumberingAfterBreak="0">
+  <w:abstractNum w:abstractNumId="48" w15:restartNumberingAfterBreak="0">
     <w:nsid w:val="43375E5A"/>
     <w:multiLevelType w:val="hybridMultilevel"/>
     <w:tmpl w:val="09520796"/>
@@ -16547,7 +18062,7 @@
       </w:rPr>
     </w:lvl>
   </w:abstractNum>
-  <w:abstractNum w:abstractNumId="45" w15:restartNumberingAfterBreak="0">
+  <w:abstractNum w:abstractNumId="49" w15:restartNumberingAfterBreak="0">
     <w:nsid w:val="443160C6"/>
     <w:multiLevelType w:val="multilevel"/>
     <w:tmpl w:val="BB94C320"/>
@@ -16696,7 +18211,7 @@
       </w:rPr>
     </w:lvl>
   </w:abstractNum>
-  <w:abstractNum w:abstractNumId="46" w15:restartNumberingAfterBreak="0">
+  <w:abstractNum w:abstractNumId="50" w15:restartNumberingAfterBreak="0">
     <w:nsid w:val="44716BF9"/>
     <w:multiLevelType w:val="multilevel"/>
     <w:tmpl w:val="01404C1C"/>
@@ -16813,7 +18328,7 @@
       </w:pPr>
     </w:lvl>
   </w:abstractNum>
-  <w:abstractNum w:abstractNumId="47" w15:restartNumberingAfterBreak="0">
+  <w:abstractNum w:abstractNumId="51" w15:restartNumberingAfterBreak="0">
     <w:nsid w:val="44EF3A5B"/>
     <w:multiLevelType w:val="multilevel"/>
     <w:tmpl w:val="0EA89E0C"/>
@@ -16962,7 +18477,7 @@
       </w:rPr>
     </w:lvl>
   </w:abstractNum>
-  <w:abstractNum w:abstractNumId="48" w15:restartNumberingAfterBreak="0">
+  <w:abstractNum w:abstractNumId="52" w15:restartNumberingAfterBreak="0">
     <w:nsid w:val="4558764F"/>
     <w:multiLevelType w:val="multilevel"/>
     <w:tmpl w:val="2564D57A"/>
@@ -17111,7 +18626,120 @@
       </w:rPr>
     </w:lvl>
   </w:abstractNum>
-  <w:abstractNum w:abstractNumId="49" w15:restartNumberingAfterBreak="0">
+  <w:abstractNum w:abstractNumId="53" w15:restartNumberingAfterBreak="0">
+    <w:nsid w:val="4590575C"/>
+    <w:multiLevelType w:val="hybridMultilevel"/>
+    <w:tmpl w:val="254E8470"/>
+    <w:lvl w:ilvl="0" w:tplc="100C0001">
+      <w:start w:val="1"/>
+      <w:numFmt w:val="bullet"/>
+      <w:lvlText w:val=""/>
+      <w:lvlJc w:val="left"/>
+      <w:pPr>
+        <w:ind w:left="360" w:hanging="360"/>
+      </w:pPr>
+      <w:rPr>
+        <w:rFonts w:ascii="Symbol" w:hAnsi="Symbol" w:hint="default"/>
+      </w:rPr>
+    </w:lvl>
+    <w:lvl w:ilvl="1" w:tplc="100C0003">
+      <w:start w:val="1"/>
+      <w:numFmt w:val="bullet"/>
+      <w:lvlText w:val="o"/>
+      <w:lvlJc w:val="left"/>
+      <w:pPr>
+        <w:ind w:left="1080" w:hanging="360"/>
+      </w:pPr>
+      <w:rPr>
+        <w:rFonts w:ascii="Courier New" w:hAnsi="Courier New" w:cs="Courier New" w:hint="default"/>
+      </w:rPr>
+    </w:lvl>
+    <w:lvl w:ilvl="2" w:tplc="100C0005" w:tentative="1">
+      <w:start w:val="1"/>
+      <w:numFmt w:val="bullet"/>
+      <w:lvlText w:val=""/>
+      <w:lvlJc w:val="left"/>
+      <w:pPr>
+        <w:ind w:left="1800" w:hanging="360"/>
+      </w:pPr>
+      <w:rPr>
+        <w:rFonts w:ascii="Wingdings" w:hAnsi="Wingdings" w:hint="default"/>
+      </w:rPr>
+    </w:lvl>
+    <w:lvl w:ilvl="3" w:tplc="100C0001" w:tentative="1">
+      <w:start w:val="1"/>
+      <w:numFmt w:val="bullet"/>
+      <w:lvlText w:val=""/>
+      <w:lvlJc w:val="left"/>
+      <w:pPr>
+        <w:ind w:left="2520" w:hanging="360"/>
+      </w:pPr>
+      <w:rPr>
+        <w:rFonts w:ascii="Symbol" w:hAnsi="Symbol" w:hint="default"/>
+      </w:rPr>
+    </w:lvl>
+    <w:lvl w:ilvl="4" w:tplc="100C0003" w:tentative="1">
+      <w:start w:val="1"/>
+      <w:numFmt w:val="bullet"/>
+      <w:lvlText w:val="o"/>
+      <w:lvlJc w:val="left"/>
+      <w:pPr>
+        <w:ind w:left="3240" w:hanging="360"/>
+      </w:pPr>
+      <w:rPr>
+        <w:rFonts w:ascii="Courier New" w:hAnsi="Courier New" w:cs="Courier New" w:hint="default"/>
+      </w:rPr>
+    </w:lvl>
+    <w:lvl w:ilvl="5" w:tplc="100C0005" w:tentative="1">
+      <w:start w:val="1"/>
+      <w:numFmt w:val="bullet"/>
+      <w:lvlText w:val=""/>
+      <w:lvlJc w:val="left"/>
+      <w:pPr>
+        <w:ind w:left="3960" w:hanging="360"/>
+      </w:pPr>
+      <w:rPr>
+        <w:rFonts w:ascii="Wingdings" w:hAnsi="Wingdings" w:hint="default"/>
+      </w:rPr>
+    </w:lvl>
+    <w:lvl w:ilvl="6" w:tplc="100C0001" w:tentative="1">
+      <w:start w:val="1"/>
+      <w:numFmt w:val="bullet"/>
+      <w:lvlText w:val=""/>
+      <w:lvlJc w:val="left"/>
+      <w:pPr>
+        <w:ind w:left="4680" w:hanging="360"/>
+      </w:pPr>
+      <w:rPr>
+        <w:rFonts w:ascii="Symbol" w:hAnsi="Symbol" w:hint="default"/>
+      </w:rPr>
+    </w:lvl>
+    <w:lvl w:ilvl="7" w:tplc="100C0003" w:tentative="1">
+      <w:start w:val="1"/>
+      <w:numFmt w:val="bullet"/>
+      <w:lvlText w:val="o"/>
+      <w:lvlJc w:val="left"/>
+      <w:pPr>
+        <w:ind w:left="5400" w:hanging="360"/>
+      </w:pPr>
+      <w:rPr>
+        <w:rFonts w:ascii="Courier New" w:hAnsi="Courier New" w:cs="Courier New" w:hint="default"/>
+      </w:rPr>
+    </w:lvl>
+    <w:lvl w:ilvl="8" w:tplc="100C0005" w:tentative="1">
+      <w:start w:val="1"/>
+      <w:numFmt w:val="bullet"/>
+      <w:lvlText w:val=""/>
+      <w:lvlJc w:val="left"/>
+      <w:pPr>
+        <w:ind w:left="6120" w:hanging="360"/>
+      </w:pPr>
+      <w:rPr>
+        <w:rFonts w:ascii="Wingdings" w:hAnsi="Wingdings" w:hint="default"/>
+      </w:rPr>
+    </w:lvl>
+  </w:abstractNum>
+  <w:abstractNum w:abstractNumId="54" w15:restartNumberingAfterBreak="0">
     <w:nsid w:val="45D7053A"/>
     <w:multiLevelType w:val="hybridMultilevel"/>
     <w:tmpl w:val="C94C0CC2"/>
@@ -17224,7 +18852,7 @@
       </w:rPr>
     </w:lvl>
   </w:abstractNum>
-  <w:abstractNum w:abstractNumId="50" w15:restartNumberingAfterBreak="0">
+  <w:abstractNum w:abstractNumId="55" w15:restartNumberingAfterBreak="0">
     <w:nsid w:val="466E1CC2"/>
     <w:multiLevelType w:val="multilevel"/>
     <w:tmpl w:val="03F887D8"/>
@@ -17373,7 +19001,7 @@
       </w:rPr>
     </w:lvl>
   </w:abstractNum>
-  <w:abstractNum w:abstractNumId="51" w15:restartNumberingAfterBreak="0">
+  <w:abstractNum w:abstractNumId="56" w15:restartNumberingAfterBreak="0">
     <w:nsid w:val="47013D00"/>
     <w:multiLevelType w:val="hybridMultilevel"/>
     <w:tmpl w:val="EDB283C0"/>
@@ -17459,7 +19087,7 @@
       </w:pPr>
     </w:lvl>
   </w:abstractNum>
-  <w:abstractNum w:abstractNumId="52" w15:restartNumberingAfterBreak="0">
+  <w:abstractNum w:abstractNumId="57" w15:restartNumberingAfterBreak="0">
     <w:nsid w:val="470304FF"/>
     <w:multiLevelType w:val="multilevel"/>
     <w:tmpl w:val="DB142014"/>
@@ -17576,7 +19204,7 @@
       </w:pPr>
     </w:lvl>
   </w:abstractNum>
-  <w:abstractNum w:abstractNumId="53" w15:restartNumberingAfterBreak="0">
+  <w:abstractNum w:abstractNumId="58" w15:restartNumberingAfterBreak="0">
     <w:nsid w:val="486164F4"/>
     <w:multiLevelType w:val="multilevel"/>
     <w:tmpl w:val="100C0021"/>
@@ -17689,7 +19317,7 @@
       </w:rPr>
     </w:lvl>
   </w:abstractNum>
-  <w:abstractNum w:abstractNumId="54" w15:restartNumberingAfterBreak="0">
+  <w:abstractNum w:abstractNumId="59" w15:restartNumberingAfterBreak="0">
     <w:nsid w:val="49A04187"/>
     <w:multiLevelType w:val="multilevel"/>
     <w:tmpl w:val="21BC8390"/>
@@ -17806,7 +19434,7 @@
       </w:pPr>
     </w:lvl>
   </w:abstractNum>
-  <w:abstractNum w:abstractNumId="55" w15:restartNumberingAfterBreak="0">
+  <w:abstractNum w:abstractNumId="60" w15:restartNumberingAfterBreak="0">
     <w:nsid w:val="4BA54C3F"/>
     <w:multiLevelType w:val="multilevel"/>
     <w:tmpl w:val="83A834C6"/>
@@ -17955,7 +19583,7 @@
       </w:rPr>
     </w:lvl>
   </w:abstractNum>
-  <w:abstractNum w:abstractNumId="56" w15:restartNumberingAfterBreak="0">
+  <w:abstractNum w:abstractNumId="61" w15:restartNumberingAfterBreak="0">
     <w:nsid w:val="4D613D88"/>
     <w:multiLevelType w:val="hybridMultilevel"/>
     <w:tmpl w:val="3762FDEE"/>
@@ -18068,7 +19696,7 @@
       </w:rPr>
     </w:lvl>
   </w:abstractNum>
-  <w:abstractNum w:abstractNumId="57" w15:restartNumberingAfterBreak="0">
+  <w:abstractNum w:abstractNumId="62" w15:restartNumberingAfterBreak="0">
     <w:nsid w:val="4E880B14"/>
     <w:multiLevelType w:val="hybridMultilevel"/>
     <w:tmpl w:val="588695E2"/>
@@ -18154,7 +19782,7 @@
       </w:pPr>
     </w:lvl>
   </w:abstractNum>
-  <w:abstractNum w:abstractNumId="58" w15:restartNumberingAfterBreak="0">
+  <w:abstractNum w:abstractNumId="63" w15:restartNumberingAfterBreak="0">
     <w:nsid w:val="4EFB319D"/>
     <w:multiLevelType w:val="hybridMultilevel"/>
     <w:tmpl w:val="D70A16EC"/>
@@ -18267,7 +19895,7 @@
       </w:rPr>
     </w:lvl>
   </w:abstractNum>
-  <w:abstractNum w:abstractNumId="59" w15:restartNumberingAfterBreak="0">
+  <w:abstractNum w:abstractNumId="64" w15:restartNumberingAfterBreak="0">
     <w:nsid w:val="4FF40332"/>
     <w:multiLevelType w:val="hybridMultilevel"/>
     <w:tmpl w:val="AE8471CE"/>
@@ -18380,7 +20008,7 @@
       </w:rPr>
     </w:lvl>
   </w:abstractNum>
-  <w:abstractNum w:abstractNumId="60" w15:restartNumberingAfterBreak="0">
+  <w:abstractNum w:abstractNumId="65" w15:restartNumberingAfterBreak="0">
     <w:nsid w:val="50D72083"/>
     <w:multiLevelType w:val="multilevel"/>
     <w:tmpl w:val="F73AFD5C"/>
@@ -18525,7 +20153,7 @@
       </w:rPr>
     </w:lvl>
   </w:abstractNum>
-  <w:abstractNum w:abstractNumId="61" w15:restartNumberingAfterBreak="0">
+  <w:abstractNum w:abstractNumId="66" w15:restartNumberingAfterBreak="0">
     <w:nsid w:val="51876E89"/>
     <w:multiLevelType w:val="multilevel"/>
     <w:tmpl w:val="AE00E0CE"/>
@@ -18674,7 +20302,7 @@
       </w:rPr>
     </w:lvl>
   </w:abstractNum>
-  <w:abstractNum w:abstractNumId="62" w15:restartNumberingAfterBreak="0">
+  <w:abstractNum w:abstractNumId="67" w15:restartNumberingAfterBreak="0">
     <w:nsid w:val="52AB4161"/>
     <w:multiLevelType w:val="multilevel"/>
     <w:tmpl w:val="BFCC9260"/>
@@ -18791,7 +20419,7 @@
       </w:pPr>
     </w:lvl>
   </w:abstractNum>
-  <w:abstractNum w:abstractNumId="63" w15:restartNumberingAfterBreak="0">
+  <w:abstractNum w:abstractNumId="68" w15:restartNumberingAfterBreak="0">
     <w:nsid w:val="572B450E"/>
     <w:multiLevelType w:val="hybridMultilevel"/>
     <w:tmpl w:val="1818C56A"/>
@@ -18904,7 +20532,7 @@
       </w:rPr>
     </w:lvl>
   </w:abstractNum>
-  <w:abstractNum w:abstractNumId="64" w15:restartNumberingAfterBreak="0">
+  <w:abstractNum w:abstractNumId="69" w15:restartNumberingAfterBreak="0">
     <w:nsid w:val="57C55BAB"/>
     <w:multiLevelType w:val="hybridMultilevel"/>
     <w:tmpl w:val="E0CC7CB4"/>
@@ -18990,7 +20618,7 @@
       </w:pPr>
     </w:lvl>
   </w:abstractNum>
-  <w:abstractNum w:abstractNumId="65" w15:restartNumberingAfterBreak="0">
+  <w:abstractNum w:abstractNumId="70" w15:restartNumberingAfterBreak="0">
     <w:nsid w:val="58BB3E46"/>
     <w:multiLevelType w:val="multilevel"/>
     <w:tmpl w:val="9A7AE602"/>
@@ -19139,7 +20767,7 @@
       </w:rPr>
     </w:lvl>
   </w:abstractNum>
-  <w:abstractNum w:abstractNumId="66" w15:restartNumberingAfterBreak="0">
+  <w:abstractNum w:abstractNumId="71" w15:restartNumberingAfterBreak="0">
     <w:nsid w:val="590C58DA"/>
     <w:multiLevelType w:val="multilevel"/>
     <w:tmpl w:val="13AAA4C8"/>
@@ -19284,7 +20912,7 @@
       </w:rPr>
     </w:lvl>
   </w:abstractNum>
-  <w:abstractNum w:abstractNumId="67" w15:restartNumberingAfterBreak="0">
+  <w:abstractNum w:abstractNumId="72" w15:restartNumberingAfterBreak="0">
     <w:nsid w:val="595A1A91"/>
     <w:multiLevelType w:val="multilevel"/>
     <w:tmpl w:val="B494260A"/>
@@ -19433,7 +21061,7 @@
       </w:rPr>
     </w:lvl>
   </w:abstractNum>
-  <w:abstractNum w:abstractNumId="68" w15:restartNumberingAfterBreak="0">
+  <w:abstractNum w:abstractNumId="73" w15:restartNumberingAfterBreak="0">
     <w:nsid w:val="5A1353C9"/>
     <w:multiLevelType w:val="hybridMultilevel"/>
     <w:tmpl w:val="40B84EF0"/>
@@ -19519,7 +21147,7 @@
       </w:pPr>
     </w:lvl>
   </w:abstractNum>
-  <w:abstractNum w:abstractNumId="69" w15:restartNumberingAfterBreak="0">
+  <w:abstractNum w:abstractNumId="74" w15:restartNumberingAfterBreak="0">
     <w:nsid w:val="5B6337DC"/>
     <w:multiLevelType w:val="multilevel"/>
     <w:tmpl w:val="68341AF2"/>
@@ -19668,7 +21296,7 @@
       </w:rPr>
     </w:lvl>
   </w:abstractNum>
-  <w:abstractNum w:abstractNumId="70" w15:restartNumberingAfterBreak="0">
+  <w:abstractNum w:abstractNumId="75" w15:restartNumberingAfterBreak="0">
     <w:nsid w:val="5C0C1455"/>
     <w:multiLevelType w:val="multilevel"/>
     <w:tmpl w:val="5E3A69CE"/>
@@ -19817,7 +21445,7 @@
       </w:rPr>
     </w:lvl>
   </w:abstractNum>
-  <w:abstractNum w:abstractNumId="71" w15:restartNumberingAfterBreak="0">
+  <w:abstractNum w:abstractNumId="76" w15:restartNumberingAfterBreak="0">
     <w:nsid w:val="5C877673"/>
     <w:multiLevelType w:val="multilevel"/>
     <w:tmpl w:val="100C0021"/>
@@ -19930,7 +21558,7 @@
       </w:rPr>
     </w:lvl>
   </w:abstractNum>
-  <w:abstractNum w:abstractNumId="72" w15:restartNumberingAfterBreak="0">
+  <w:abstractNum w:abstractNumId="77" w15:restartNumberingAfterBreak="0">
     <w:nsid w:val="5E4C45C4"/>
     <w:multiLevelType w:val="multilevel"/>
     <w:tmpl w:val="584CB40A"/>
@@ -20079,7 +21707,7 @@
       </w:rPr>
     </w:lvl>
   </w:abstractNum>
-  <w:abstractNum w:abstractNumId="73" w15:restartNumberingAfterBreak="0">
+  <w:abstractNum w:abstractNumId="78" w15:restartNumberingAfterBreak="0">
     <w:nsid w:val="5EB75F87"/>
     <w:multiLevelType w:val="multilevel"/>
     <w:tmpl w:val="1612F80A"/>
@@ -20200,7 +21828,7 @@
       </w:pPr>
     </w:lvl>
   </w:abstractNum>
-  <w:abstractNum w:abstractNumId="74" w15:restartNumberingAfterBreak="0">
+  <w:abstractNum w:abstractNumId="79" w15:restartNumberingAfterBreak="0">
     <w:nsid w:val="606E216E"/>
     <w:multiLevelType w:val="multilevel"/>
     <w:tmpl w:val="F73AFD5C"/>
@@ -20345,7 +21973,156 @@
       </w:rPr>
     </w:lvl>
   </w:abstractNum>
-  <w:abstractNum w:abstractNumId="75" w15:restartNumberingAfterBreak="0">
+  <w:abstractNum w:abstractNumId="80" w15:restartNumberingAfterBreak="0">
+    <w:nsid w:val="61F374D5"/>
+    <w:multiLevelType w:val="multilevel"/>
+    <w:tmpl w:val="AC909C72"/>
+    <w:lvl w:ilvl="0">
+      <w:start w:val="1"/>
+      <w:numFmt w:val="bullet"/>
+      <w:lvlText w:val=""/>
+      <w:lvlJc w:val="left"/>
+      <w:pPr>
+        <w:tabs>
+          <w:tab w:val="num" w:pos="720"/>
+        </w:tabs>
+        <w:ind w:left="720" w:hanging="360"/>
+      </w:pPr>
+      <w:rPr>
+        <w:rFonts w:ascii="Symbol" w:hAnsi="Symbol" w:hint="default"/>
+        <w:sz w:val="20"/>
+      </w:rPr>
+    </w:lvl>
+    <w:lvl w:ilvl="1" w:tentative="1">
+      <w:start w:val="1"/>
+      <w:numFmt w:val="bullet"/>
+      <w:lvlText w:val="o"/>
+      <w:lvlJc w:val="left"/>
+      <w:pPr>
+        <w:tabs>
+          <w:tab w:val="num" w:pos="1440"/>
+        </w:tabs>
+        <w:ind w:left="1440" w:hanging="360"/>
+      </w:pPr>
+      <w:rPr>
+        <w:rFonts w:ascii="Courier New" w:hAnsi="Courier New" w:hint="default"/>
+        <w:sz w:val="20"/>
+      </w:rPr>
+    </w:lvl>
+    <w:lvl w:ilvl="2" w:tentative="1">
+      <w:start w:val="1"/>
+      <w:numFmt w:val="bullet"/>
+      <w:lvlText w:val=""/>
+      <w:lvlJc w:val="left"/>
+      <w:pPr>
+        <w:tabs>
+          <w:tab w:val="num" w:pos="2160"/>
+        </w:tabs>
+        <w:ind w:left="2160" w:hanging="360"/>
+      </w:pPr>
+      <w:rPr>
+        <w:rFonts w:ascii="Wingdings" w:hAnsi="Wingdings" w:hint="default"/>
+        <w:sz w:val="20"/>
+      </w:rPr>
+    </w:lvl>
+    <w:lvl w:ilvl="3" w:tentative="1">
+      <w:start w:val="1"/>
+      <w:numFmt w:val="bullet"/>
+      <w:lvlText w:val=""/>
+      <w:lvlJc w:val="left"/>
+      <w:pPr>
+        <w:tabs>
+          <w:tab w:val="num" w:pos="2880"/>
+        </w:tabs>
+        <w:ind w:left="2880" w:hanging="360"/>
+      </w:pPr>
+      <w:rPr>
+        <w:rFonts w:ascii="Wingdings" w:hAnsi="Wingdings" w:hint="default"/>
+        <w:sz w:val="20"/>
+      </w:rPr>
+    </w:lvl>
+    <w:lvl w:ilvl="4" w:tentative="1">
+      <w:start w:val="1"/>
+      <w:numFmt w:val="bullet"/>
+      <w:lvlText w:val=""/>
+      <w:lvlJc w:val="left"/>
+      <w:pPr>
+        <w:tabs>
+          <w:tab w:val="num" w:pos="3600"/>
+        </w:tabs>
+        <w:ind w:left="3600" w:hanging="360"/>
+      </w:pPr>
+      <w:rPr>
+        <w:rFonts w:ascii="Wingdings" w:hAnsi="Wingdings" w:hint="default"/>
+        <w:sz w:val="20"/>
+      </w:rPr>
+    </w:lvl>
+    <w:lvl w:ilvl="5" w:tentative="1">
+      <w:start w:val="1"/>
+      <w:numFmt w:val="bullet"/>
+      <w:lvlText w:val=""/>
+      <w:lvlJc w:val="left"/>
+      <w:pPr>
+        <w:tabs>
+          <w:tab w:val="num" w:pos="4320"/>
+        </w:tabs>
+        <w:ind w:left="4320" w:hanging="360"/>
+      </w:pPr>
+      <w:rPr>
+        <w:rFonts w:ascii="Wingdings" w:hAnsi="Wingdings" w:hint="default"/>
+        <w:sz w:val="20"/>
+      </w:rPr>
+    </w:lvl>
+    <w:lvl w:ilvl="6" w:tentative="1">
+      <w:start w:val="1"/>
+      <w:numFmt w:val="bullet"/>
+      <w:lvlText w:val=""/>
+      <w:lvlJc w:val="left"/>
+      <w:pPr>
+        <w:tabs>
+          <w:tab w:val="num" w:pos="5040"/>
+        </w:tabs>
+        <w:ind w:left="5040" w:hanging="360"/>
+      </w:pPr>
+      <w:rPr>
+        <w:rFonts w:ascii="Wingdings" w:hAnsi="Wingdings" w:hint="default"/>
+        <w:sz w:val="20"/>
+      </w:rPr>
+    </w:lvl>
+    <w:lvl w:ilvl="7" w:tentative="1">
+      <w:start w:val="1"/>
+      <w:numFmt w:val="bullet"/>
+      <w:lvlText w:val=""/>
+      <w:lvlJc w:val="left"/>
+      <w:pPr>
+        <w:tabs>
+          <w:tab w:val="num" w:pos="5760"/>
+        </w:tabs>
+        <w:ind w:left="5760" w:hanging="360"/>
+      </w:pPr>
+      <w:rPr>
+        <w:rFonts w:ascii="Wingdings" w:hAnsi="Wingdings" w:hint="default"/>
+        <w:sz w:val="20"/>
+      </w:rPr>
+    </w:lvl>
+    <w:lvl w:ilvl="8" w:tentative="1">
+      <w:start w:val="1"/>
+      <w:numFmt w:val="bullet"/>
+      <w:lvlText w:val=""/>
+      <w:lvlJc w:val="left"/>
+      <w:pPr>
+        <w:tabs>
+          <w:tab w:val="num" w:pos="6480"/>
+        </w:tabs>
+        <w:ind w:left="6480" w:hanging="360"/>
+      </w:pPr>
+      <w:rPr>
+        <w:rFonts w:ascii="Wingdings" w:hAnsi="Wingdings" w:hint="default"/>
+        <w:sz w:val="20"/>
+      </w:rPr>
+    </w:lvl>
+  </w:abstractNum>
+  <w:abstractNum w:abstractNumId="81" w15:restartNumberingAfterBreak="0">
     <w:nsid w:val="623E39A1"/>
     <w:multiLevelType w:val="hybridMultilevel"/>
     <w:tmpl w:val="48A0B1AE"/>
@@ -20431,7 +22208,7 @@
       </w:pPr>
     </w:lvl>
   </w:abstractNum>
-  <w:abstractNum w:abstractNumId="76" w15:restartNumberingAfterBreak="0">
+  <w:abstractNum w:abstractNumId="82" w15:restartNumberingAfterBreak="0">
     <w:nsid w:val="64CD52AC"/>
     <w:multiLevelType w:val="multilevel"/>
     <w:tmpl w:val="9466875A"/>
@@ -20580,7 +22357,7 @@
       </w:rPr>
     </w:lvl>
   </w:abstractNum>
-  <w:abstractNum w:abstractNumId="77" w15:restartNumberingAfterBreak="0">
+  <w:abstractNum w:abstractNumId="83" w15:restartNumberingAfterBreak="0">
     <w:nsid w:val="656770F6"/>
     <w:multiLevelType w:val="hybridMultilevel"/>
     <w:tmpl w:val="B75AA2EC"/>
@@ -20666,7 +22443,7 @@
       </w:pPr>
     </w:lvl>
   </w:abstractNum>
-  <w:abstractNum w:abstractNumId="78" w15:restartNumberingAfterBreak="0">
+  <w:abstractNum w:abstractNumId="84" w15:restartNumberingAfterBreak="0">
     <w:nsid w:val="675461B1"/>
     <w:multiLevelType w:val="multilevel"/>
     <w:tmpl w:val="2D4C1872"/>
@@ -20815,7 +22592,7 @@
       </w:rPr>
     </w:lvl>
   </w:abstractNum>
-  <w:abstractNum w:abstractNumId="79" w15:restartNumberingAfterBreak="0">
+  <w:abstractNum w:abstractNumId="85" w15:restartNumberingAfterBreak="0">
     <w:nsid w:val="67D65433"/>
     <w:multiLevelType w:val="multilevel"/>
     <w:tmpl w:val="E0D038E8"/>
@@ -20964,14 +22741,14 @@
       </w:rPr>
     </w:lvl>
   </w:abstractNum>
-  <w:abstractNum w:abstractNumId="80" w15:restartNumberingAfterBreak="0">
+  <w:abstractNum w:abstractNumId="86" w15:restartNumberingAfterBreak="0">
     <w:nsid w:val="67E92066"/>
     <w:multiLevelType w:val="multilevel"/>
-    <w:tmpl w:val="13AAA4C8"/>
+    <w:tmpl w:val="3066435C"/>
     <w:lvl w:ilvl="0">
       <w:start w:val="1"/>
-      <w:numFmt w:val="bullet"/>
-      <w:lvlText w:val=""/>
+      <w:numFmt w:val="decimal"/>
+      <w:lvlText w:val="%1."/>
       <w:lvlJc w:val="left"/>
       <w:pPr>
         <w:tabs>
@@ -20980,7 +22757,7 @@
         <w:ind w:left="720" w:hanging="360"/>
       </w:pPr>
       <w:rPr>
-        <w:rFonts w:ascii="Symbol" w:hAnsi="Symbol" w:hint="default"/>
+        <w:rFonts w:hint="default"/>
         <w:sz w:val="20"/>
       </w:rPr>
     </w:lvl>
@@ -21109,7 +22886,7 @@
       </w:rPr>
     </w:lvl>
   </w:abstractNum>
-  <w:abstractNum w:abstractNumId="81" w15:restartNumberingAfterBreak="0">
+  <w:abstractNum w:abstractNumId="87" w15:restartNumberingAfterBreak="0">
     <w:nsid w:val="67FA2FB8"/>
     <w:multiLevelType w:val="multilevel"/>
     <w:tmpl w:val="E21E3B8A"/>
@@ -21258,7 +23035,7 @@
       </w:rPr>
     </w:lvl>
   </w:abstractNum>
-  <w:abstractNum w:abstractNumId="82" w15:restartNumberingAfterBreak="0">
+  <w:abstractNum w:abstractNumId="88" w15:restartNumberingAfterBreak="0">
     <w:nsid w:val="689854E7"/>
     <w:multiLevelType w:val="hybridMultilevel"/>
     <w:tmpl w:val="C4B28D26"/>
@@ -21371,7 +23148,7 @@
       </w:rPr>
     </w:lvl>
   </w:abstractNum>
-  <w:abstractNum w:abstractNumId="83" w15:restartNumberingAfterBreak="0">
+  <w:abstractNum w:abstractNumId="89" w15:restartNumberingAfterBreak="0">
     <w:nsid w:val="6B305FF5"/>
     <w:multiLevelType w:val="multilevel"/>
     <w:tmpl w:val="0694BF10"/>
@@ -21520,7 +23297,7 @@
       </w:rPr>
     </w:lvl>
   </w:abstractNum>
-  <w:abstractNum w:abstractNumId="84" w15:restartNumberingAfterBreak="0">
+  <w:abstractNum w:abstractNumId="90" w15:restartNumberingAfterBreak="0">
     <w:nsid w:val="6E482070"/>
     <w:multiLevelType w:val="multilevel"/>
     <w:tmpl w:val="600E8028"/>
@@ -21669,7 +23446,7 @@
       </w:rPr>
     </w:lvl>
   </w:abstractNum>
-  <w:abstractNum w:abstractNumId="85" w15:restartNumberingAfterBreak="0">
+  <w:abstractNum w:abstractNumId="91" w15:restartNumberingAfterBreak="0">
     <w:nsid w:val="6EC667E1"/>
     <w:multiLevelType w:val="hybridMultilevel"/>
     <w:tmpl w:val="0F1C05AA"/>
@@ -21782,7 +23559,7 @@
       </w:rPr>
     </w:lvl>
   </w:abstractNum>
-  <w:abstractNum w:abstractNumId="86" w15:restartNumberingAfterBreak="0">
+  <w:abstractNum w:abstractNumId="92" w15:restartNumberingAfterBreak="0">
     <w:nsid w:val="6F8E7937"/>
     <w:multiLevelType w:val="multilevel"/>
     <w:tmpl w:val="2618C62C"/>
@@ -21931,7 +23708,7 @@
       </w:rPr>
     </w:lvl>
   </w:abstractNum>
-  <w:abstractNum w:abstractNumId="87" w15:restartNumberingAfterBreak="0">
+  <w:abstractNum w:abstractNumId="93" w15:restartNumberingAfterBreak="0">
     <w:nsid w:val="6FB42ED4"/>
     <w:multiLevelType w:val="multilevel"/>
     <w:tmpl w:val="69320D0E"/>
@@ -22080,7 +23857,7 @@
       </w:rPr>
     </w:lvl>
   </w:abstractNum>
-  <w:abstractNum w:abstractNumId="88" w15:restartNumberingAfterBreak="0">
+  <w:abstractNum w:abstractNumId="94" w15:restartNumberingAfterBreak="0">
     <w:nsid w:val="705A7A56"/>
     <w:multiLevelType w:val="multilevel"/>
     <w:tmpl w:val="FFDAE2A6"/>
@@ -22229,7 +24006,7 @@
       </w:rPr>
     </w:lvl>
   </w:abstractNum>
-  <w:abstractNum w:abstractNumId="89" w15:restartNumberingAfterBreak="0">
+  <w:abstractNum w:abstractNumId="95" w15:restartNumberingAfterBreak="0">
     <w:nsid w:val="72185589"/>
     <w:multiLevelType w:val="multilevel"/>
     <w:tmpl w:val="5C7A424E"/>
@@ -22378,7 +24155,7 @@
       </w:rPr>
     </w:lvl>
   </w:abstractNum>
-  <w:abstractNum w:abstractNumId="90" w15:restartNumberingAfterBreak="0">
+  <w:abstractNum w:abstractNumId="96" w15:restartNumberingAfterBreak="0">
     <w:nsid w:val="732773D2"/>
     <w:multiLevelType w:val="multilevel"/>
     <w:tmpl w:val="B10A766E"/>
@@ -22523,7 +24300,7 @@
       </w:rPr>
     </w:lvl>
   </w:abstractNum>
-  <w:abstractNum w:abstractNumId="91" w15:restartNumberingAfterBreak="0">
+  <w:abstractNum w:abstractNumId="97" w15:restartNumberingAfterBreak="0">
     <w:nsid w:val="73E13F6B"/>
     <w:multiLevelType w:val="hybridMultilevel"/>
     <w:tmpl w:val="A5D21806"/>
@@ -22636,7 +24413,7 @@
       </w:rPr>
     </w:lvl>
   </w:abstractNum>
-  <w:abstractNum w:abstractNumId="92" w15:restartNumberingAfterBreak="0">
+  <w:abstractNum w:abstractNumId="98" w15:restartNumberingAfterBreak="0">
     <w:nsid w:val="743C6B91"/>
     <w:multiLevelType w:val="multilevel"/>
     <w:tmpl w:val="C8D87FC4"/>
@@ -22785,7 +24562,101 @@
       </w:rPr>
     </w:lvl>
   </w:abstractNum>
-  <w:abstractNum w:abstractNumId="93" w15:restartNumberingAfterBreak="0">
+  <w:abstractNum w:abstractNumId="99" w15:restartNumberingAfterBreak="0">
+    <w:nsid w:val="761430D4"/>
+    <w:multiLevelType w:val="hybridMultilevel"/>
+    <w:tmpl w:val="4CE2E246"/>
+    <w:lvl w:ilvl="0" w:tplc="3992E180">
+      <w:start w:val="3"/>
+      <w:numFmt w:val="decimal"/>
+      <w:lvlText w:val="%1."/>
+      <w:lvlJc w:val="left"/>
+      <w:pPr>
+        <w:ind w:left="360" w:hanging="360"/>
+      </w:pPr>
+      <w:rPr>
+        <w:rFonts w:hint="default"/>
+        <w:b/>
+        <w:bCs/>
+      </w:rPr>
+    </w:lvl>
+    <w:lvl w:ilvl="1" w:tplc="100C0001">
+      <w:start w:val="1"/>
+      <w:numFmt w:val="bullet"/>
+      <w:lvlText w:val=""/>
+      <w:lvlJc w:val="left"/>
+      <w:pPr>
+        <w:ind w:left="360" w:hanging="360"/>
+      </w:pPr>
+      <w:rPr>
+        <w:rFonts w:ascii="Symbol" w:hAnsi="Symbol" w:hint="default"/>
+      </w:rPr>
+    </w:lvl>
+    <w:lvl w:ilvl="2" w:tplc="100C001B" w:tentative="1">
+      <w:start w:val="1"/>
+      <w:numFmt w:val="lowerRoman"/>
+      <w:lvlText w:val="%3."/>
+      <w:lvlJc w:val="right"/>
+      <w:pPr>
+        <w:ind w:left="2160" w:hanging="180"/>
+      </w:pPr>
+    </w:lvl>
+    <w:lvl w:ilvl="3" w:tplc="100C000F" w:tentative="1">
+      <w:start w:val="1"/>
+      <w:numFmt w:val="decimal"/>
+      <w:lvlText w:val="%4."/>
+      <w:lvlJc w:val="left"/>
+      <w:pPr>
+        <w:ind w:left="2880" w:hanging="360"/>
+      </w:pPr>
+    </w:lvl>
+    <w:lvl w:ilvl="4" w:tplc="100C0019" w:tentative="1">
+      <w:start w:val="1"/>
+      <w:numFmt w:val="lowerLetter"/>
+      <w:lvlText w:val="%5."/>
+      <w:lvlJc w:val="left"/>
+      <w:pPr>
+        <w:ind w:left="3600" w:hanging="360"/>
+      </w:pPr>
+    </w:lvl>
+    <w:lvl w:ilvl="5" w:tplc="100C001B" w:tentative="1">
+      <w:start w:val="1"/>
+      <w:numFmt w:val="lowerRoman"/>
+      <w:lvlText w:val="%6."/>
+      <w:lvlJc w:val="right"/>
+      <w:pPr>
+        <w:ind w:left="4320" w:hanging="180"/>
+      </w:pPr>
+    </w:lvl>
+    <w:lvl w:ilvl="6" w:tplc="100C000F" w:tentative="1">
+      <w:start w:val="1"/>
+      <w:numFmt w:val="decimal"/>
+      <w:lvlText w:val="%7."/>
+      <w:lvlJc w:val="left"/>
+      <w:pPr>
+        <w:ind w:left="5040" w:hanging="360"/>
+      </w:pPr>
+    </w:lvl>
+    <w:lvl w:ilvl="7" w:tplc="100C0019" w:tentative="1">
+      <w:start w:val="1"/>
+      <w:numFmt w:val="lowerLetter"/>
+      <w:lvlText w:val="%8."/>
+      <w:lvlJc w:val="left"/>
+      <w:pPr>
+        <w:ind w:left="5760" w:hanging="360"/>
+      </w:pPr>
+    </w:lvl>
+    <w:lvl w:ilvl="8" w:tplc="100C001B" w:tentative="1">
+      <w:start w:val="1"/>
+      <w:numFmt w:val="lowerRoman"/>
+      <w:lvlText w:val="%9."/>
+      <w:lvlJc w:val="right"/>
+      <w:pPr>
+        <w:ind w:left="6480" w:hanging="180"/>
+      </w:pPr>
+    </w:lvl>
+  </w:abstractNum>
+  <w:abstractNum w:abstractNumId="100" w15:restartNumberingAfterBreak="0">
     <w:nsid w:val="778506C8"/>
     <w:multiLevelType w:val="multilevel"/>
     <w:tmpl w:val="A4EC904A"/>
@@ -22934,7 +24805,7 @@
       </w:rPr>
     </w:lvl>
   </w:abstractNum>
-  <w:abstractNum w:abstractNumId="94" w15:restartNumberingAfterBreak="0">
+  <w:abstractNum w:abstractNumId="101" w15:restartNumberingAfterBreak="0">
     <w:nsid w:val="77AD7629"/>
     <w:multiLevelType w:val="multilevel"/>
     <w:tmpl w:val="9BAA795A"/>
@@ -23083,7 +24954,7 @@
       </w:rPr>
     </w:lvl>
   </w:abstractNum>
-  <w:abstractNum w:abstractNumId="95" w15:restartNumberingAfterBreak="0">
+  <w:abstractNum w:abstractNumId="102" w15:restartNumberingAfterBreak="0">
     <w:nsid w:val="7802400F"/>
     <w:multiLevelType w:val="multilevel"/>
     <w:tmpl w:val="A2029AC2"/>
@@ -23232,7 +25103,7 @@
       </w:rPr>
     </w:lvl>
   </w:abstractNum>
-  <w:abstractNum w:abstractNumId="96" w15:restartNumberingAfterBreak="0">
+  <w:abstractNum w:abstractNumId="103" w15:restartNumberingAfterBreak="0">
     <w:nsid w:val="78A81255"/>
     <w:multiLevelType w:val="multilevel"/>
     <w:tmpl w:val="14B25418"/>
@@ -23381,7 +25252,7 @@
       </w:rPr>
     </w:lvl>
   </w:abstractNum>
-  <w:abstractNum w:abstractNumId="97" w15:restartNumberingAfterBreak="0">
+  <w:abstractNum w:abstractNumId="104" w15:restartNumberingAfterBreak="0">
     <w:nsid w:val="79306A20"/>
     <w:multiLevelType w:val="multilevel"/>
     <w:tmpl w:val="3B3CEBEC"/>
@@ -23530,7 +25401,7 @@
       </w:rPr>
     </w:lvl>
   </w:abstractNum>
-  <w:abstractNum w:abstractNumId="98" w15:restartNumberingAfterBreak="0">
+  <w:abstractNum w:abstractNumId="105" w15:restartNumberingAfterBreak="0">
     <w:nsid w:val="79DE1723"/>
     <w:multiLevelType w:val="multilevel"/>
     <w:tmpl w:val="A4FC045A"/>
@@ -23679,7 +25550,7 @@
       </w:rPr>
     </w:lvl>
   </w:abstractNum>
-  <w:abstractNum w:abstractNumId="99" w15:restartNumberingAfterBreak="0">
+  <w:abstractNum w:abstractNumId="106" w15:restartNumberingAfterBreak="0">
     <w:nsid w:val="7A683687"/>
     <w:multiLevelType w:val="multilevel"/>
     <w:tmpl w:val="F73AFD5C"/>
@@ -23824,7 +25695,93 @@
       </w:rPr>
     </w:lvl>
   </w:abstractNum>
-  <w:abstractNum w:abstractNumId="100" w15:restartNumberingAfterBreak="0">
+  <w:abstractNum w:abstractNumId="107" w15:restartNumberingAfterBreak="0">
+    <w:nsid w:val="7BD30FA3"/>
+    <w:multiLevelType w:val="hybridMultilevel"/>
+    <w:tmpl w:val="1FF677E6"/>
+    <w:lvl w:ilvl="0" w:tplc="100C000F">
+      <w:start w:val="1"/>
+      <w:numFmt w:val="decimal"/>
+      <w:lvlText w:val="%1."/>
+      <w:lvlJc w:val="left"/>
+      <w:pPr>
+        <w:ind w:left="360" w:hanging="360"/>
+      </w:pPr>
+    </w:lvl>
+    <w:lvl w:ilvl="1" w:tplc="100C0019" w:tentative="1">
+      <w:start w:val="1"/>
+      <w:numFmt w:val="lowerLetter"/>
+      <w:lvlText w:val="%2."/>
+      <w:lvlJc w:val="left"/>
+      <w:pPr>
+        <w:ind w:left="1080" w:hanging="360"/>
+      </w:pPr>
+    </w:lvl>
+    <w:lvl w:ilvl="2" w:tplc="100C001B" w:tentative="1">
+      <w:start w:val="1"/>
+      <w:numFmt w:val="lowerRoman"/>
+      <w:lvlText w:val="%3."/>
+      <w:lvlJc w:val="right"/>
+      <w:pPr>
+        <w:ind w:left="1800" w:hanging="180"/>
+      </w:pPr>
+    </w:lvl>
+    <w:lvl w:ilvl="3" w:tplc="100C000F" w:tentative="1">
+      <w:start w:val="1"/>
+      <w:numFmt w:val="decimal"/>
+      <w:lvlText w:val="%4."/>
+      <w:lvlJc w:val="left"/>
+      <w:pPr>
+        <w:ind w:left="2520" w:hanging="360"/>
+      </w:pPr>
+    </w:lvl>
+    <w:lvl w:ilvl="4" w:tplc="100C0019" w:tentative="1">
+      <w:start w:val="1"/>
+      <w:numFmt w:val="lowerLetter"/>
+      <w:lvlText w:val="%5."/>
+      <w:lvlJc w:val="left"/>
+      <w:pPr>
+        <w:ind w:left="3240" w:hanging="360"/>
+      </w:pPr>
+    </w:lvl>
+    <w:lvl w:ilvl="5" w:tplc="100C001B" w:tentative="1">
+      <w:start w:val="1"/>
+      <w:numFmt w:val="lowerRoman"/>
+      <w:lvlText w:val="%6."/>
+      <w:lvlJc w:val="right"/>
+      <w:pPr>
+        <w:ind w:left="3960" w:hanging="180"/>
+      </w:pPr>
+    </w:lvl>
+    <w:lvl w:ilvl="6" w:tplc="100C000F" w:tentative="1">
+      <w:start w:val="1"/>
+      <w:numFmt w:val="decimal"/>
+      <w:lvlText w:val="%7."/>
+      <w:lvlJc w:val="left"/>
+      <w:pPr>
+        <w:ind w:left="4680" w:hanging="360"/>
+      </w:pPr>
+    </w:lvl>
+    <w:lvl w:ilvl="7" w:tplc="100C0019" w:tentative="1">
+      <w:start w:val="1"/>
+      <w:numFmt w:val="lowerLetter"/>
+      <w:lvlText w:val="%8."/>
+      <w:lvlJc w:val="left"/>
+      <w:pPr>
+        <w:ind w:left="5400" w:hanging="360"/>
+      </w:pPr>
+    </w:lvl>
+    <w:lvl w:ilvl="8" w:tplc="100C001B" w:tentative="1">
+      <w:start w:val="1"/>
+      <w:numFmt w:val="lowerRoman"/>
+      <w:lvlText w:val="%9."/>
+      <w:lvlJc w:val="right"/>
+      <w:pPr>
+        <w:ind w:left="6120" w:hanging="180"/>
+      </w:pPr>
+    </w:lvl>
+  </w:abstractNum>
+  <w:abstractNum w:abstractNumId="108" w15:restartNumberingAfterBreak="0">
     <w:nsid w:val="7C2B5F1F"/>
     <w:multiLevelType w:val="multilevel"/>
     <w:tmpl w:val="D9227486"/>
@@ -23973,7 +25930,7 @@
       </w:rPr>
     </w:lvl>
   </w:abstractNum>
-  <w:abstractNum w:abstractNumId="101" w15:restartNumberingAfterBreak="0">
+  <w:abstractNum w:abstractNumId="109" w15:restartNumberingAfterBreak="0">
     <w:nsid w:val="7C620C59"/>
     <w:multiLevelType w:val="multilevel"/>
     <w:tmpl w:val="CBA650B2"/>
@@ -24122,7 +26079,7 @@
       </w:rPr>
     </w:lvl>
   </w:abstractNum>
-  <w:abstractNum w:abstractNumId="102" w15:restartNumberingAfterBreak="0">
+  <w:abstractNum w:abstractNumId="110" w15:restartNumberingAfterBreak="0">
     <w:nsid w:val="7E1137AC"/>
     <w:multiLevelType w:val="hybridMultilevel"/>
     <w:tmpl w:val="DF4AA514"/>
@@ -24208,7 +26165,7 @@
       </w:pPr>
     </w:lvl>
   </w:abstractNum>
-  <w:abstractNum w:abstractNumId="103" w15:restartNumberingAfterBreak="0">
+  <w:abstractNum w:abstractNumId="111" w15:restartNumberingAfterBreak="0">
     <w:nsid w:val="7E4B5B66"/>
     <w:multiLevelType w:val="multilevel"/>
     <w:tmpl w:val="2DD2493A"/>
@@ -24357,7 +26314,7 @@
       </w:rPr>
     </w:lvl>
   </w:abstractNum>
-  <w:abstractNum w:abstractNumId="104" w15:restartNumberingAfterBreak="0">
+  <w:abstractNum w:abstractNumId="112" w15:restartNumberingAfterBreak="0">
     <w:nsid w:val="7F053DF4"/>
     <w:multiLevelType w:val="hybridMultilevel"/>
     <w:tmpl w:val="CEFACCCA"/>
@@ -24470,7 +26427,7 @@
       </w:rPr>
     </w:lvl>
   </w:abstractNum>
-  <w:abstractNum w:abstractNumId="105" w15:restartNumberingAfterBreak="0">
+  <w:abstractNum w:abstractNumId="113" w15:restartNumberingAfterBreak="0">
     <w:nsid w:val="7F2A45F0"/>
     <w:multiLevelType w:val="multilevel"/>
     <w:tmpl w:val="9FD2A58E"/>
@@ -24620,322 +26577,346 @@
     </w:lvl>
   </w:abstractNum>
   <w:num w:numId="1" w16cid:durableId="401492678">
-    <w:abstractNumId w:val="31"/>
+    <w:abstractNumId w:val="34"/>
   </w:num>
   <w:num w:numId="2" w16cid:durableId="1425683647">
-    <w:abstractNumId w:val="71"/>
+    <w:abstractNumId w:val="76"/>
   </w:num>
   <w:num w:numId="3" w16cid:durableId="969819765">
-    <w:abstractNumId w:val="53"/>
+    <w:abstractNumId w:val="58"/>
   </w:num>
   <w:num w:numId="4" w16cid:durableId="1165972880">
-    <w:abstractNumId w:val="39"/>
+    <w:abstractNumId w:val="43"/>
   </w:num>
   <w:num w:numId="5" w16cid:durableId="1192498471">
+    <w:abstractNumId w:val="42"/>
+  </w:num>
+  <w:num w:numId="6" w16cid:durableId="1027293449">
+    <w:abstractNumId w:val="8"/>
+  </w:num>
+  <w:num w:numId="7" w16cid:durableId="981427660">
+    <w:abstractNumId w:val="16"/>
+  </w:num>
+  <w:num w:numId="8" w16cid:durableId="2116553527">
+    <w:abstractNumId w:val="56"/>
+  </w:num>
+  <w:num w:numId="9" w16cid:durableId="2054190808">
+    <w:abstractNumId w:val="64"/>
+  </w:num>
+  <w:num w:numId="10" w16cid:durableId="361367619">
+    <w:abstractNumId w:val="88"/>
+  </w:num>
+  <w:num w:numId="11" w16cid:durableId="631521416">
+    <w:abstractNumId w:val="32"/>
+  </w:num>
+  <w:num w:numId="12" w16cid:durableId="1837070714">
+    <w:abstractNumId w:val="46"/>
+  </w:num>
+  <w:num w:numId="13" w16cid:durableId="355236561">
     <w:abstractNumId w:val="38"/>
   </w:num>
-  <w:num w:numId="6" w16cid:durableId="1027293449">
+  <w:num w:numId="14" w16cid:durableId="1861703874">
+    <w:abstractNumId w:val="75"/>
+  </w:num>
+  <w:num w:numId="15" w16cid:durableId="1483962153">
+    <w:abstractNumId w:val="10"/>
+  </w:num>
+  <w:num w:numId="16" w16cid:durableId="1024138830">
+    <w:abstractNumId w:val="70"/>
+  </w:num>
+  <w:num w:numId="17" w16cid:durableId="1115096640">
+    <w:abstractNumId w:val="9"/>
+  </w:num>
+  <w:num w:numId="18" w16cid:durableId="1730182888">
+    <w:abstractNumId w:val="92"/>
+  </w:num>
+  <w:num w:numId="19" w16cid:durableId="1841895485">
+    <w:abstractNumId w:val="35"/>
+  </w:num>
+  <w:num w:numId="20" w16cid:durableId="569927713">
+    <w:abstractNumId w:val="66"/>
+  </w:num>
+  <w:num w:numId="21" w16cid:durableId="25182164">
+    <w:abstractNumId w:val="59"/>
+  </w:num>
+  <w:num w:numId="22" w16cid:durableId="1734503633">
+    <w:abstractNumId w:val="5"/>
+  </w:num>
+  <w:num w:numId="23" w16cid:durableId="1393579624">
+    <w:abstractNumId w:val="54"/>
+  </w:num>
+  <w:num w:numId="24" w16cid:durableId="529802780">
+    <w:abstractNumId w:val="24"/>
+  </w:num>
+  <w:num w:numId="25" w16cid:durableId="1009716527">
+    <w:abstractNumId w:val="83"/>
+  </w:num>
+  <w:num w:numId="26" w16cid:durableId="1803109818">
+    <w:abstractNumId w:val="13"/>
+  </w:num>
+  <w:num w:numId="27" w16cid:durableId="1153568286">
+    <w:abstractNumId w:val="62"/>
+  </w:num>
+  <w:num w:numId="28" w16cid:durableId="1269850232">
+    <w:abstractNumId w:val="33"/>
+  </w:num>
+  <w:num w:numId="29" w16cid:durableId="865482755">
+    <w:abstractNumId w:val="110"/>
+  </w:num>
+  <w:num w:numId="30" w16cid:durableId="128667884">
     <w:abstractNumId w:val="6"/>
   </w:num>
-  <w:num w:numId="7" w16cid:durableId="981427660">
-    <w:abstractNumId w:val="14"/>
+  <w:num w:numId="31" w16cid:durableId="1055591606">
+    <w:abstractNumId w:val="73"/>
   </w:num>
-  <w:num w:numId="8" w16cid:durableId="2116553527">
+  <w:num w:numId="32" w16cid:durableId="1455560741">
+    <w:abstractNumId w:val="72"/>
+  </w:num>
+  <w:num w:numId="33" w16cid:durableId="1977880186">
+    <w:abstractNumId w:val="103"/>
+  </w:num>
+  <w:num w:numId="34" w16cid:durableId="165289367">
+    <w:abstractNumId w:val="112"/>
+  </w:num>
+  <w:num w:numId="35" w16cid:durableId="1357655090">
+    <w:abstractNumId w:val="68"/>
+  </w:num>
+  <w:num w:numId="36" w16cid:durableId="1068966224">
+    <w:abstractNumId w:val="12"/>
+  </w:num>
+  <w:num w:numId="37" w16cid:durableId="559630263">
+    <w:abstractNumId w:val="48"/>
+  </w:num>
+  <w:num w:numId="38" w16cid:durableId="219441423">
+    <w:abstractNumId w:val="97"/>
+  </w:num>
+  <w:num w:numId="39" w16cid:durableId="581574493">
+    <w:abstractNumId w:val="91"/>
+  </w:num>
+  <w:num w:numId="40" w16cid:durableId="1478643207">
+    <w:abstractNumId w:val="63"/>
+  </w:num>
+  <w:num w:numId="41" w16cid:durableId="816413178">
+    <w:abstractNumId w:val="106"/>
+  </w:num>
+  <w:num w:numId="42" w16cid:durableId="879365290">
+    <w:abstractNumId w:val="79"/>
+  </w:num>
+  <w:num w:numId="43" w16cid:durableId="256332733">
+    <w:abstractNumId w:val="17"/>
+  </w:num>
+  <w:num w:numId="44" w16cid:durableId="958417952">
+    <w:abstractNumId w:val="96"/>
+  </w:num>
+  <w:num w:numId="45" w16cid:durableId="739714405">
+    <w:abstractNumId w:val="65"/>
+  </w:num>
+  <w:num w:numId="46" w16cid:durableId="1090663949">
+    <w:abstractNumId w:val="4"/>
+  </w:num>
+  <w:num w:numId="47" w16cid:durableId="1066996378">
+    <w:abstractNumId w:val="41"/>
+  </w:num>
+  <w:num w:numId="48" w16cid:durableId="1637293962">
     <w:abstractNumId w:val="51"/>
   </w:num>
-  <w:num w:numId="9" w16cid:durableId="2054190808">
-    <w:abstractNumId w:val="59"/>
+  <w:num w:numId="49" w16cid:durableId="658966665">
+    <w:abstractNumId w:val="94"/>
   </w:num>
-  <w:num w:numId="10" w16cid:durableId="361367619">
+  <w:num w:numId="50" w16cid:durableId="730739043">
+    <w:abstractNumId w:val="104"/>
+  </w:num>
+  <w:num w:numId="51" w16cid:durableId="1361395958">
+    <w:abstractNumId w:val="55"/>
+  </w:num>
+  <w:num w:numId="52" w16cid:durableId="1585603859">
+    <w:abstractNumId w:val="89"/>
+  </w:num>
+  <w:num w:numId="53" w16cid:durableId="1245456023">
+    <w:abstractNumId w:val="87"/>
+  </w:num>
+  <w:num w:numId="54" w16cid:durableId="726415147">
+    <w:abstractNumId w:val="111"/>
+  </w:num>
+  <w:num w:numId="55" w16cid:durableId="471217994">
+    <w:abstractNumId w:val="26"/>
+  </w:num>
+  <w:num w:numId="56" w16cid:durableId="1111359962">
+    <w:abstractNumId w:val="98"/>
+  </w:num>
+  <w:num w:numId="57" w16cid:durableId="682174154">
+    <w:abstractNumId w:val="49"/>
+  </w:num>
+  <w:num w:numId="58" w16cid:durableId="993460229">
+    <w:abstractNumId w:val="102"/>
+  </w:num>
+  <w:num w:numId="59" w16cid:durableId="1612778526">
+    <w:abstractNumId w:val="11"/>
+  </w:num>
+  <w:num w:numId="60" w16cid:durableId="184637057">
+    <w:abstractNumId w:val="67"/>
+  </w:num>
+  <w:num w:numId="61" w16cid:durableId="1657807602">
+    <w:abstractNumId w:val="57"/>
+  </w:num>
+  <w:num w:numId="62" w16cid:durableId="1486580873">
+    <w:abstractNumId w:val="78"/>
+  </w:num>
+  <w:num w:numId="63" w16cid:durableId="101800978">
+    <w:abstractNumId w:val="74"/>
+  </w:num>
+  <w:num w:numId="64" w16cid:durableId="1838496560">
     <w:abstractNumId w:val="82"/>
   </w:num>
-  <w:num w:numId="11" w16cid:durableId="631521416">
-    <w:abstractNumId w:val="29"/>
-  </w:num>
-  <w:num w:numId="12" w16cid:durableId="1837070714">
-    <w:abstractNumId w:val="42"/>
-  </w:num>
-  <w:num w:numId="13" w16cid:durableId="355236561">
-    <w:abstractNumId w:val="35"/>
-  </w:num>
-  <w:num w:numId="14" w16cid:durableId="1861703874">
-    <w:abstractNumId w:val="70"/>
-  </w:num>
-  <w:num w:numId="15" w16cid:durableId="1483962153">
-    <w:abstractNumId w:val="8"/>
-  </w:num>
-  <w:num w:numId="16" w16cid:durableId="1024138830">
-    <w:abstractNumId w:val="65"/>
-  </w:num>
-  <w:num w:numId="17" w16cid:durableId="1115096640">
-    <w:abstractNumId w:val="7"/>
-  </w:num>
-  <w:num w:numId="18" w16cid:durableId="1730182888">
-    <w:abstractNumId w:val="86"/>
-  </w:num>
-  <w:num w:numId="19" w16cid:durableId="1841895485">
-    <w:abstractNumId w:val="32"/>
-  </w:num>
-  <w:num w:numId="20" w16cid:durableId="569927713">
-    <w:abstractNumId w:val="61"/>
-  </w:num>
-  <w:num w:numId="21" w16cid:durableId="25182164">
-    <w:abstractNumId w:val="54"/>
-  </w:num>
-  <w:num w:numId="22" w16cid:durableId="1734503633">
-    <w:abstractNumId w:val="3"/>
-  </w:num>
-  <w:num w:numId="23" w16cid:durableId="1393579624">
-    <w:abstractNumId w:val="49"/>
-  </w:num>
-  <w:num w:numId="24" w16cid:durableId="529802780">
-    <w:abstractNumId w:val="22"/>
-  </w:num>
-  <w:num w:numId="25" w16cid:durableId="1009716527">
-    <w:abstractNumId w:val="77"/>
-  </w:num>
-  <w:num w:numId="26" w16cid:durableId="1803109818">
-    <w:abstractNumId w:val="11"/>
-  </w:num>
-  <w:num w:numId="27" w16cid:durableId="1153568286">
-    <w:abstractNumId w:val="57"/>
-  </w:num>
-  <w:num w:numId="28" w16cid:durableId="1269850232">
-    <w:abstractNumId w:val="30"/>
-  </w:num>
-  <w:num w:numId="29" w16cid:durableId="865482755">
-    <w:abstractNumId w:val="102"/>
-  </w:num>
-  <w:num w:numId="30" w16cid:durableId="128667884">
-    <w:abstractNumId w:val="4"/>
-  </w:num>
-  <w:num w:numId="31" w16cid:durableId="1055591606">
-    <w:abstractNumId w:val="68"/>
-  </w:num>
-  <w:num w:numId="32" w16cid:durableId="1455560741">
-    <w:abstractNumId w:val="67"/>
-  </w:num>
-  <w:num w:numId="33" w16cid:durableId="1977880186">
-    <w:abstractNumId w:val="96"/>
-  </w:num>
-  <w:num w:numId="34" w16cid:durableId="165289367">
-    <w:abstractNumId w:val="104"/>
-  </w:num>
-  <w:num w:numId="35" w16cid:durableId="1357655090">
-    <w:abstractNumId w:val="63"/>
-  </w:num>
-  <w:num w:numId="36" w16cid:durableId="1068966224">
-    <w:abstractNumId w:val="10"/>
-  </w:num>
-  <w:num w:numId="37" w16cid:durableId="559630263">
-    <w:abstractNumId w:val="44"/>
-  </w:num>
-  <w:num w:numId="38" w16cid:durableId="219441423">
-    <w:abstractNumId w:val="91"/>
-  </w:num>
-  <w:num w:numId="39" w16cid:durableId="581574493">
-    <w:abstractNumId w:val="85"/>
-  </w:num>
-  <w:num w:numId="40" w16cid:durableId="1478643207">
-    <w:abstractNumId w:val="58"/>
-  </w:num>
-  <w:num w:numId="41" w16cid:durableId="816413178">
-    <w:abstractNumId w:val="99"/>
-  </w:num>
-  <w:num w:numId="42" w16cid:durableId="879365290">
-    <w:abstractNumId w:val="74"/>
-  </w:num>
-  <w:num w:numId="43" w16cid:durableId="256332733">
-    <w:abstractNumId w:val="15"/>
-  </w:num>
-  <w:num w:numId="44" w16cid:durableId="958417952">
-    <w:abstractNumId w:val="90"/>
-  </w:num>
-  <w:num w:numId="45" w16cid:durableId="739714405">
-    <w:abstractNumId w:val="60"/>
-  </w:num>
-  <w:num w:numId="46" w16cid:durableId="1090663949">
+  <w:num w:numId="65" w16cid:durableId="1606309814">
     <w:abstractNumId w:val="2"/>
-  </w:num>
-  <w:num w:numId="47" w16cid:durableId="1066996378">
-    <w:abstractNumId w:val="37"/>
-  </w:num>
-  <w:num w:numId="48" w16cid:durableId="1637293962">
-    <w:abstractNumId w:val="47"/>
-  </w:num>
-  <w:num w:numId="49" w16cid:durableId="658966665">
-    <w:abstractNumId w:val="88"/>
-  </w:num>
-  <w:num w:numId="50" w16cid:durableId="730739043">
-    <w:abstractNumId w:val="97"/>
-  </w:num>
-  <w:num w:numId="51" w16cid:durableId="1361395958">
-    <w:abstractNumId w:val="50"/>
-  </w:num>
-  <w:num w:numId="52" w16cid:durableId="1585603859">
-    <w:abstractNumId w:val="83"/>
-  </w:num>
-  <w:num w:numId="53" w16cid:durableId="1245456023">
-    <w:abstractNumId w:val="81"/>
-  </w:num>
-  <w:num w:numId="54" w16cid:durableId="726415147">
-    <w:abstractNumId w:val="103"/>
-  </w:num>
-  <w:num w:numId="55" w16cid:durableId="471217994">
-    <w:abstractNumId w:val="24"/>
-  </w:num>
-  <w:num w:numId="56" w16cid:durableId="1111359962">
-    <w:abstractNumId w:val="92"/>
-  </w:num>
-  <w:num w:numId="57" w16cid:durableId="682174154">
-    <w:abstractNumId w:val="45"/>
-  </w:num>
-  <w:num w:numId="58" w16cid:durableId="993460229">
-    <w:abstractNumId w:val="95"/>
-  </w:num>
-  <w:num w:numId="59" w16cid:durableId="1612778526">
-    <w:abstractNumId w:val="9"/>
-  </w:num>
-  <w:num w:numId="60" w16cid:durableId="184637057">
-    <w:abstractNumId w:val="62"/>
-  </w:num>
-  <w:num w:numId="61" w16cid:durableId="1657807602">
-    <w:abstractNumId w:val="52"/>
-  </w:num>
-  <w:num w:numId="62" w16cid:durableId="1486580873">
-    <w:abstractNumId w:val="73"/>
-  </w:num>
-  <w:num w:numId="63" w16cid:durableId="101800978">
-    <w:abstractNumId w:val="69"/>
-  </w:num>
-  <w:num w:numId="64" w16cid:durableId="1838496560">
-    <w:abstractNumId w:val="76"/>
-  </w:num>
-  <w:num w:numId="65" w16cid:durableId="1606309814">
-    <w:abstractNumId w:val="1"/>
   </w:num>
   <w:num w:numId="66" w16cid:durableId="574243369">
     <w:abstractNumId w:val="0"/>
   </w:num>
   <w:num w:numId="67" w16cid:durableId="1602106308">
+    <w:abstractNumId w:val="39"/>
+  </w:num>
+  <w:num w:numId="68" w16cid:durableId="509418428">
+    <w:abstractNumId w:val="108"/>
+  </w:num>
+  <w:num w:numId="69" w16cid:durableId="1060712400">
+    <w:abstractNumId w:val="101"/>
+  </w:num>
+  <w:num w:numId="70" w16cid:durableId="186604655">
+    <w:abstractNumId w:val="22"/>
+  </w:num>
+  <w:num w:numId="71" w16cid:durableId="1362126248">
+    <w:abstractNumId w:val="95"/>
+  </w:num>
+  <w:num w:numId="72" w16cid:durableId="547685254">
+    <w:abstractNumId w:val="7"/>
+  </w:num>
+  <w:num w:numId="73" w16cid:durableId="1558930994">
+    <w:abstractNumId w:val="31"/>
+  </w:num>
+  <w:num w:numId="74" w16cid:durableId="1571691474">
     <w:abstractNumId w:val="36"/>
   </w:num>
-  <w:num w:numId="68" w16cid:durableId="509418428">
+  <w:num w:numId="75" w16cid:durableId="1917157331">
+    <w:abstractNumId w:val="28"/>
+  </w:num>
+  <w:num w:numId="76" w16cid:durableId="146213322">
+    <w:abstractNumId w:val="21"/>
+  </w:num>
+  <w:num w:numId="77" w16cid:durableId="1912040523">
+    <w:abstractNumId w:val="15"/>
+  </w:num>
+  <w:num w:numId="78" w16cid:durableId="489752627">
+    <w:abstractNumId w:val="47"/>
+  </w:num>
+  <w:num w:numId="79" w16cid:durableId="53744689">
+    <w:abstractNumId w:val="25"/>
+  </w:num>
+  <w:num w:numId="80" w16cid:durableId="1594507617">
+    <w:abstractNumId w:val="86"/>
+  </w:num>
+  <w:num w:numId="81" w16cid:durableId="434712669">
+    <w:abstractNumId w:val="50"/>
+  </w:num>
+  <w:num w:numId="82" w16cid:durableId="804741220">
+    <w:abstractNumId w:val="18"/>
+  </w:num>
+  <w:num w:numId="83" w16cid:durableId="909001377">
+    <w:abstractNumId w:val="45"/>
+  </w:num>
+  <w:num w:numId="84" w16cid:durableId="753475756">
+    <w:abstractNumId w:val="29"/>
+  </w:num>
+  <w:num w:numId="85" w16cid:durableId="837692950">
+    <w:abstractNumId w:val="90"/>
+  </w:num>
+  <w:num w:numId="86" w16cid:durableId="1724787246">
+    <w:abstractNumId w:val="81"/>
+  </w:num>
+  <w:num w:numId="87" w16cid:durableId="1781297175">
+    <w:abstractNumId w:val="71"/>
+  </w:num>
+  <w:num w:numId="88" w16cid:durableId="588972358">
+    <w:abstractNumId w:val="84"/>
+  </w:num>
+  <w:num w:numId="89" w16cid:durableId="791292524">
+    <w:abstractNumId w:val="27"/>
+  </w:num>
+  <w:num w:numId="90" w16cid:durableId="2099717864">
+    <w:abstractNumId w:val="105"/>
+  </w:num>
+  <w:num w:numId="91" w16cid:durableId="448282674">
+    <w:abstractNumId w:val="14"/>
+  </w:num>
+  <w:num w:numId="92" w16cid:durableId="1039861843">
+    <w:abstractNumId w:val="61"/>
+  </w:num>
+  <w:num w:numId="93" w16cid:durableId="206455256">
+    <w:abstractNumId w:val="20"/>
+  </w:num>
+  <w:num w:numId="94" w16cid:durableId="34744868">
+    <w:abstractNumId w:val="69"/>
+  </w:num>
+  <w:num w:numId="95" w16cid:durableId="1871412960">
+    <w:abstractNumId w:val="37"/>
+  </w:num>
+  <w:num w:numId="96" w16cid:durableId="1118135921">
+    <w:abstractNumId w:val="85"/>
+  </w:num>
+  <w:num w:numId="97" w16cid:durableId="1291283478">
+    <w:abstractNumId w:val="23"/>
+  </w:num>
+  <w:num w:numId="98" w16cid:durableId="83889627">
+    <w:abstractNumId w:val="113"/>
+  </w:num>
+  <w:num w:numId="99" w16cid:durableId="789593114">
     <w:abstractNumId w:val="100"/>
   </w:num>
-  <w:num w:numId="69" w16cid:durableId="1060712400">
-    <w:abstractNumId w:val="94"/>
+  <w:num w:numId="100" w16cid:durableId="1697657640">
+    <w:abstractNumId w:val="77"/>
   </w:num>
-  <w:num w:numId="70" w16cid:durableId="186604655">
-    <w:abstractNumId w:val="20"/>
+  <w:num w:numId="101" w16cid:durableId="153379504">
+    <w:abstractNumId w:val="60"/>
   </w:num>
-  <w:num w:numId="71" w16cid:durableId="1362126248">
-    <w:abstractNumId w:val="89"/>
+  <w:num w:numId="102" w16cid:durableId="854686685">
+    <w:abstractNumId w:val="44"/>
   </w:num>
-  <w:num w:numId="72" w16cid:durableId="547685254">
-    <w:abstractNumId w:val="5"/>
+  <w:num w:numId="103" w16cid:durableId="355423209">
+    <w:abstractNumId w:val="52"/>
   </w:num>
-  <w:num w:numId="73" w16cid:durableId="1558930994">
-    <w:abstractNumId w:val="28"/>
+  <w:num w:numId="104" w16cid:durableId="1560936614">
+    <w:abstractNumId w:val="93"/>
   </w:num>
-  <w:num w:numId="74" w16cid:durableId="1571691474">
-    <w:abstractNumId w:val="33"/>
-  </w:num>
-  <w:num w:numId="75" w16cid:durableId="1917157331">
-    <w:abstractNumId w:val="26"/>
-  </w:num>
-  <w:num w:numId="76" w16cid:durableId="146213322">
+  <w:num w:numId="105" w16cid:durableId="254558591">
     <w:abstractNumId w:val="19"/>
   </w:num>
-  <w:num w:numId="77" w16cid:durableId="1912040523">
-    <w:abstractNumId w:val="13"/>
+  <w:num w:numId="106" w16cid:durableId="1899322038">
+    <w:abstractNumId w:val="109"/>
   </w:num>
-  <w:num w:numId="78" w16cid:durableId="489752627">
-    <w:abstractNumId w:val="43"/>
-  </w:num>
-  <w:num w:numId="79" w16cid:durableId="53744689">
-    <w:abstractNumId w:val="23"/>
-  </w:num>
-  <w:num w:numId="80" w16cid:durableId="1594507617">
+  <w:num w:numId="107" w16cid:durableId="848177343">
     <w:abstractNumId w:val="80"/>
   </w:num>
-  <w:num w:numId="81" w16cid:durableId="434712669">
-    <w:abstractNumId w:val="46"/>
+  <w:num w:numId="108" w16cid:durableId="1326785751">
+    <w:abstractNumId w:val="30"/>
   </w:num>
-  <w:num w:numId="82" w16cid:durableId="804741220">
-    <w:abstractNumId w:val="16"/>
-  </w:num>
-  <w:num w:numId="83" w16cid:durableId="909001377">
-    <w:abstractNumId w:val="41"/>
-  </w:num>
-  <w:num w:numId="84" w16cid:durableId="753475756">
-    <w:abstractNumId w:val="27"/>
-  </w:num>
-  <w:num w:numId="85" w16cid:durableId="837692950">
-    <w:abstractNumId w:val="84"/>
-  </w:num>
-  <w:num w:numId="86" w16cid:durableId="1724787246">
-    <w:abstractNumId w:val="75"/>
-  </w:num>
-  <w:num w:numId="87" w16cid:durableId="1781297175">
-    <w:abstractNumId w:val="66"/>
-  </w:num>
-  <w:num w:numId="88" w16cid:durableId="588972358">
-    <w:abstractNumId w:val="78"/>
-  </w:num>
-  <w:num w:numId="89" w16cid:durableId="791292524">
-    <w:abstractNumId w:val="25"/>
-  </w:num>
-  <w:num w:numId="90" w16cid:durableId="2099717864">
-    <w:abstractNumId w:val="98"/>
-  </w:num>
-  <w:num w:numId="91" w16cid:durableId="448282674">
-    <w:abstractNumId w:val="12"/>
-  </w:num>
-  <w:num w:numId="92" w16cid:durableId="1039861843">
-    <w:abstractNumId w:val="56"/>
-  </w:num>
-  <w:num w:numId="93" w16cid:durableId="206455256">
-    <w:abstractNumId w:val="18"/>
-  </w:num>
-  <w:num w:numId="94" w16cid:durableId="34744868">
-    <w:abstractNumId w:val="64"/>
-  </w:num>
-  <w:num w:numId="95" w16cid:durableId="1871412960">
-    <w:abstractNumId w:val="34"/>
-  </w:num>
-  <w:num w:numId="96" w16cid:durableId="1118135921">
-    <w:abstractNumId w:val="79"/>
-  </w:num>
-  <w:num w:numId="97" w16cid:durableId="1291283478">
-    <w:abstractNumId w:val="21"/>
-  </w:num>
-  <w:num w:numId="98" w16cid:durableId="83889627">
-    <w:abstractNumId w:val="105"/>
-  </w:num>
-  <w:num w:numId="99" w16cid:durableId="789593114">
-    <w:abstractNumId w:val="93"/>
-  </w:num>
-  <w:num w:numId="100" w16cid:durableId="1697657640">
-    <w:abstractNumId w:val="72"/>
-  </w:num>
-  <w:num w:numId="101" w16cid:durableId="153379504">
-    <w:abstractNumId w:val="55"/>
-  </w:num>
-  <w:num w:numId="102" w16cid:durableId="854686685">
+  <w:num w:numId="109" w16cid:durableId="2039041264">
     <w:abstractNumId w:val="40"/>
   </w:num>
-  <w:num w:numId="103" w16cid:durableId="355423209">
-    <w:abstractNumId w:val="48"/>
+  <w:num w:numId="110" w16cid:durableId="1611817695">
+    <w:abstractNumId w:val="53"/>
   </w:num>
-  <w:num w:numId="104" w16cid:durableId="1560936614">
-    <w:abstractNumId w:val="87"/>
+  <w:num w:numId="111" w16cid:durableId="170066873">
+    <w:abstractNumId w:val="107"/>
   </w:num>
-  <w:num w:numId="105" w16cid:durableId="254558591">
-    <w:abstractNumId w:val="17"/>
+  <w:num w:numId="112" w16cid:durableId="340623121">
+    <w:abstractNumId w:val="99"/>
   </w:num>
-  <w:num w:numId="106" w16cid:durableId="1899322038">
-    <w:abstractNumId w:val="101"/>
+  <w:num w:numId="113" w16cid:durableId="78867846">
+    <w:abstractNumId w:val="1"/>
+  </w:num>
+  <w:num w:numId="114" w16cid:durableId="939290961">
+    <w:abstractNumId w:val="3"/>
   </w:num>
 </w:numbering>
 </file>
@@ -25956,6 +27937,11 @@
       <w14:ligatures w14:val="none"/>
     </w:rPr>
   </w:style>
+  <w:style w:type="character" w:customStyle="1" w:styleId="markdown-bold-text">
+    <w:name w:val="markdown-bold-text"/>
+    <w:basedOn w:val="Policepardfaut"/>
+    <w:rsid w:val="00917882"/>
+  </w:style>
 </w:styles>
 </file>
 

</xml_diff>

<commit_message>
udpate(rapport):add conclision perso + typo
</commit_message>
<xml_diff>
--- a/documentation/rapport.docx
+++ b/documentation/rapport.docx
@@ -3118,19 +3118,11 @@
           <w:rFonts w:cstheme="minorHAnsi"/>
         </w:rPr>
       </w:pPr>
-      <w:proofErr w:type="gramStart"/>
-      <w:r>
-        <w:rPr>
-          <w:rFonts w:cstheme="minorHAnsi"/>
-        </w:rPr>
-        <w:t>de</w:t>
-      </w:r>
-      <w:proofErr w:type="gramEnd"/>
-      <w:r>
-        <w:rPr>
-          <w:rFonts w:cstheme="minorHAnsi"/>
-        </w:rPr>
-        <w:t xml:space="preserve"> répartir équitablement les responsabilités,</w:t>
+      <w:r>
+        <w:rPr>
+          <w:rFonts w:cstheme="minorHAnsi"/>
+        </w:rPr>
+        <w:t>de répartir équitablement les responsabilités,</w:t>
       </w:r>
     </w:p>
     <w:p>
@@ -3144,19 +3136,11 @@
           <w:rFonts w:cstheme="minorHAnsi"/>
         </w:rPr>
       </w:pPr>
-      <w:proofErr w:type="gramStart"/>
-      <w:r>
-        <w:rPr>
-          <w:rFonts w:cstheme="minorHAnsi"/>
-        </w:rPr>
-        <w:t>d’avoir</w:t>
-      </w:r>
-      <w:proofErr w:type="gramEnd"/>
-      <w:r>
-        <w:rPr>
-          <w:rFonts w:cstheme="minorHAnsi"/>
-        </w:rPr>
-        <w:t xml:space="preserve"> une vue claire de l’avancement,</w:t>
+      <w:r>
+        <w:rPr>
+          <w:rFonts w:cstheme="minorHAnsi"/>
+        </w:rPr>
+        <w:t>d’avoir une vue claire de l’avancement,</w:t>
       </w:r>
     </w:p>
     <w:p>
@@ -3170,19 +3154,11 @@
           <w:rFonts w:cstheme="minorHAnsi"/>
         </w:rPr>
       </w:pPr>
-      <w:proofErr w:type="gramStart"/>
-      <w:r>
-        <w:rPr>
-          <w:rFonts w:cstheme="minorHAnsi"/>
-        </w:rPr>
-        <w:t>de</w:t>
-      </w:r>
-      <w:proofErr w:type="gramEnd"/>
-      <w:r>
-        <w:rPr>
-          <w:rFonts w:cstheme="minorHAnsi"/>
-        </w:rPr>
-        <w:t xml:space="preserve"> détecter rapidement les blocages ou retards.</w:t>
+      <w:r>
+        <w:rPr>
+          <w:rFonts w:cstheme="minorHAnsi"/>
+        </w:rPr>
+        <w:t>de détecter rapidement les blocages ou retards.</w:t>
       </w:r>
     </w:p>
     <w:p>
@@ -3196,27 +3172,13 @@
         <w:rPr>
           <w:rFonts w:cstheme="minorHAnsi"/>
         </w:rPr>
-        <w:t>Des réunions régulières (rapides</w:t>
-      </w:r>
-      <w:proofErr w:type="gramStart"/>
-      <w:r>
-        <w:rPr>
-          <w:rFonts w:cstheme="minorHAnsi"/>
-        </w:rPr>
-        <w:t xml:space="preserve"> </w:t>
-      </w:r>
-      <w:r>
-        <w:rPr>
-          <w:rFonts w:cstheme="minorHAnsi"/>
-        </w:rPr>
-        <w:t>«Daily</w:t>
-      </w:r>
-      <w:proofErr w:type="gramEnd"/>
-      <w:r>
-        <w:rPr>
-          <w:rFonts w:cstheme="minorHAnsi"/>
-        </w:rPr>
-        <w:t xml:space="preserve"> Scrum» </w:t>
+        <w:t xml:space="preserve">Des réunions régulières (rapides </w:t>
+      </w:r>
+      <w:r>
+        <w:rPr>
+          <w:rFonts w:cstheme="minorHAnsi"/>
+        </w:rPr>
+        <w:t xml:space="preserve">«Daily Scrum» </w:t>
       </w:r>
       <w:r>
         <w:rPr>
@@ -3242,20 +3204,12 @@
         </w:rPr>
       </w:pPr>
       <w:bookmarkStart w:id="10" w:name="_Toc199321502"/>
-      <w:proofErr w:type="gramStart"/>
       <w:r>
         <w:rPr>
           <w:rFonts w:cstheme="minorHAnsi"/>
         </w:rPr>
         <w:lastRenderedPageBreak/>
-        <w:t>l’analyse</w:t>
-      </w:r>
-      <w:proofErr w:type="gramEnd"/>
-      <w:r>
-        <w:rPr>
-          <w:rFonts w:cstheme="minorHAnsi"/>
-        </w:rPr>
-        <w:t xml:space="preserve"> de de la base de données à réaliser (MCD, MLD, MPD</w:t>
+        <w:t>l’analyse de de la base de données à réaliser (MCD, MLD, MPD</w:t>
       </w:r>
       <w:r>
         <w:rPr>
@@ -3580,14 +3534,7 @@
         <w:rPr>
           <w:rFonts w:asciiTheme="minorHAnsi" w:hAnsiTheme="minorHAnsi" w:cstheme="minorHAnsi"/>
         </w:rPr>
-        <w:t xml:space="preserve"> (relation </w:t>
-      </w:r>
-      <w:proofErr w:type="gramStart"/>
-      <w:r>
-        <w:rPr>
-          <w:rFonts w:asciiTheme="minorHAnsi" w:hAnsiTheme="minorHAnsi" w:cstheme="minorHAnsi"/>
-        </w:rPr>
-        <w:t>1,</w:t>
+        <w:t xml:space="preserve"> (relation 1,</w:t>
       </w:r>
       <w:r>
         <w:rPr>
@@ -3595,7 +3542,6 @@
         </w:rPr>
         <w:t>N</w:t>
       </w:r>
-      <w:proofErr w:type="gramEnd"/>
       <w:r>
         <w:rPr>
           <w:rFonts w:asciiTheme="minorHAnsi" w:hAnsiTheme="minorHAnsi" w:cstheme="minorHAnsi"/>
@@ -3644,14 +3590,7 @@
         <w:rPr>
           <w:rFonts w:asciiTheme="minorHAnsi" w:hAnsiTheme="minorHAnsi" w:cstheme="minorHAnsi"/>
         </w:rPr>
-        <w:t xml:space="preserve"> (</w:t>
-      </w:r>
-      <w:proofErr w:type="gramStart"/>
-      <w:r>
-        <w:rPr>
-          <w:rFonts w:asciiTheme="minorHAnsi" w:hAnsiTheme="minorHAnsi" w:cstheme="minorHAnsi"/>
-        </w:rPr>
-        <w:t>1,</w:t>
+        <w:t xml:space="preserve"> (1,</w:t>
       </w:r>
       <w:r>
         <w:rPr>
@@ -3659,7 +3598,6 @@
         </w:rPr>
         <w:t>N</w:t>
       </w:r>
-      <w:proofErr w:type="gramEnd"/>
       <w:r>
         <w:rPr>
           <w:rFonts w:asciiTheme="minorHAnsi" w:hAnsiTheme="minorHAnsi" w:cstheme="minorHAnsi"/>
@@ -3710,7 +3648,6 @@
         </w:rPr>
         <w:t xml:space="preserve"> (</w:t>
       </w:r>
-      <w:proofErr w:type="gramStart"/>
       <w:r>
         <w:rPr>
           <w:rFonts w:asciiTheme="minorHAnsi" w:hAnsiTheme="minorHAnsi" w:cstheme="minorHAnsi"/>
@@ -3721,14 +3658,7 @@
         <w:rPr>
           <w:rFonts w:asciiTheme="minorHAnsi" w:hAnsiTheme="minorHAnsi" w:cstheme="minorHAnsi"/>
         </w:rPr>
-        <w:t>,N</w:t>
-      </w:r>
-      <w:proofErr w:type="gramEnd"/>
-      <w:r>
-        <w:rPr>
-          <w:rFonts w:asciiTheme="minorHAnsi" w:hAnsiTheme="minorHAnsi" w:cstheme="minorHAnsi"/>
-        </w:rPr>
-        <w:t>).</w:t>
+        <w:t>,N).</w:t>
       </w:r>
     </w:p>
     <w:p>
@@ -3772,21 +3702,7 @@
         <w:rPr>
           <w:rFonts w:asciiTheme="minorHAnsi" w:hAnsiTheme="minorHAnsi" w:cstheme="minorHAnsi"/>
         </w:rPr>
-        <w:t xml:space="preserve"> plusieurs livres (relation </w:t>
-      </w:r>
-      <w:proofErr w:type="gramStart"/>
-      <w:r>
-        <w:rPr>
-          <w:rFonts w:asciiTheme="minorHAnsi" w:hAnsiTheme="minorHAnsi" w:cstheme="minorHAnsi"/>
-        </w:rPr>
-        <w:t>N,N</w:t>
-      </w:r>
-      <w:proofErr w:type="gramEnd"/>
-      <w:r>
-        <w:rPr>
-          <w:rFonts w:asciiTheme="minorHAnsi" w:hAnsiTheme="minorHAnsi" w:cstheme="minorHAnsi"/>
-        </w:rPr>
-        <w:t xml:space="preserve"> avec attributs).</w:t>
+        <w:t xml:space="preserve"> plusieurs livres (relation N,N avec attributs).</w:t>
       </w:r>
     </w:p>
     <w:p>
@@ -3931,21 +3847,12 @@
         </w:rPr>
       </w:pPr>
       <w:proofErr w:type="spellStart"/>
-      <w:proofErr w:type="gramStart"/>
       <w:r>
         <w:rPr>
           <w:rStyle w:val="CodeHTML"/>
           <w:rFonts w:asciiTheme="minorHAnsi" w:hAnsiTheme="minorHAnsi" w:cstheme="minorHAnsi"/>
         </w:rPr>
-        <w:t>t</w:t>
-      </w:r>
-      <w:proofErr w:type="gramEnd"/>
-      <w:r>
-        <w:rPr>
-          <w:rStyle w:val="CodeHTML"/>
-          <w:rFonts w:asciiTheme="minorHAnsi" w:hAnsiTheme="minorHAnsi" w:cstheme="minorHAnsi"/>
-        </w:rPr>
-        <w:t>_utilisateur</w:t>
+        <w:t>t_utilisateur</w:t>
       </w:r>
       <w:proofErr w:type="spellEnd"/>
       <w:r>
@@ -4048,21 +3955,12 @@
         </w:rPr>
       </w:pPr>
       <w:proofErr w:type="spellStart"/>
-      <w:proofErr w:type="gramStart"/>
       <w:r>
         <w:rPr>
           <w:rStyle w:val="CodeHTML"/>
           <w:rFonts w:asciiTheme="minorHAnsi" w:hAnsiTheme="minorHAnsi" w:cstheme="minorHAnsi"/>
         </w:rPr>
-        <w:t>t</w:t>
-      </w:r>
-      <w:proofErr w:type="gramEnd"/>
-      <w:r>
-        <w:rPr>
-          <w:rStyle w:val="CodeHTML"/>
-          <w:rFonts w:asciiTheme="minorHAnsi" w:hAnsiTheme="minorHAnsi" w:cstheme="minorHAnsi"/>
-        </w:rPr>
-        <w:t>_ecrivain</w:t>
+        <w:t>t_ecrivain</w:t>
       </w:r>
       <w:proofErr w:type="spellEnd"/>
       <w:r>
@@ -4133,21 +4031,12 @@
         </w:rPr>
       </w:pPr>
       <w:proofErr w:type="spellStart"/>
-      <w:proofErr w:type="gramStart"/>
       <w:r>
         <w:rPr>
           <w:rStyle w:val="CodeHTML"/>
           <w:rFonts w:asciiTheme="minorHAnsi" w:hAnsiTheme="minorHAnsi" w:cstheme="minorHAnsi"/>
         </w:rPr>
-        <w:t>t</w:t>
-      </w:r>
-      <w:proofErr w:type="gramEnd"/>
-      <w:r>
-        <w:rPr>
-          <w:rStyle w:val="CodeHTML"/>
-          <w:rFonts w:asciiTheme="minorHAnsi" w:hAnsiTheme="minorHAnsi" w:cstheme="minorHAnsi"/>
-        </w:rPr>
-        <w:t>_categorie</w:t>
+        <w:t>t_categorie</w:t>
       </w:r>
       <w:proofErr w:type="spellEnd"/>
       <w:r>
@@ -4186,21 +4075,12 @@
         </w:rPr>
       </w:pPr>
       <w:proofErr w:type="spellStart"/>
-      <w:proofErr w:type="gramStart"/>
       <w:r>
         <w:rPr>
           <w:rStyle w:val="CodeHTML"/>
           <w:rFonts w:asciiTheme="minorHAnsi" w:hAnsiTheme="minorHAnsi" w:cstheme="minorHAnsi"/>
         </w:rPr>
-        <w:t>t</w:t>
-      </w:r>
-      <w:proofErr w:type="gramEnd"/>
-      <w:r>
-        <w:rPr>
-          <w:rStyle w:val="CodeHTML"/>
-          <w:rFonts w:asciiTheme="minorHAnsi" w:hAnsiTheme="minorHAnsi" w:cstheme="minorHAnsi"/>
-        </w:rPr>
-        <w:t>_livre</w:t>
+        <w:t>t_livre</w:t>
       </w:r>
       <w:proofErr w:type="spellEnd"/>
       <w:r>
@@ -4383,21 +4263,12 @@
         </w:rPr>
       </w:pPr>
       <w:proofErr w:type="spellStart"/>
-      <w:proofErr w:type="gramStart"/>
       <w:r>
         <w:rPr>
           <w:rStyle w:val="CodeHTML"/>
           <w:rFonts w:asciiTheme="minorHAnsi" w:hAnsiTheme="minorHAnsi" w:cstheme="minorHAnsi"/>
         </w:rPr>
-        <w:t>t</w:t>
-      </w:r>
-      <w:proofErr w:type="gramEnd"/>
-      <w:r>
-        <w:rPr>
-          <w:rStyle w:val="CodeHTML"/>
-          <w:rFonts w:asciiTheme="minorHAnsi" w:hAnsiTheme="minorHAnsi" w:cstheme="minorHAnsi"/>
-        </w:rPr>
-        <w:t>_evaluer</w:t>
+        <w:t>t_evaluer</w:t>
       </w:r>
       <w:proofErr w:type="spellEnd"/>
       <w:r>
@@ -4629,18 +4500,9 @@
           <w:rFonts w:cstheme="minorHAnsi"/>
           <w:highlight w:val="lightGray"/>
         </w:rPr>
-        <w:t>\</w:t>
-      </w:r>
-      <w:proofErr w:type="gramStart"/>
-      <w:r>
-        <w:rPr>
-          <w:rFonts w:cstheme="minorHAnsi"/>
-          <w:highlight w:val="lightGray"/>
-        </w:rPr>
-        <w:t>DB(</w:t>
+        <w:t>\DB(</w:t>
       </w:r>
       <w:proofErr w:type="spellStart"/>
-      <w:proofErr w:type="gramEnd"/>
       <w:r>
         <w:rPr>
           <w:rFonts w:cstheme="minorHAnsi"/>
@@ -4742,17 +4604,7 @@
           <w:sz w:val="21"/>
           <w:szCs w:val="21"/>
         </w:rPr>
-        <w:t>t_</w:t>
-      </w:r>
-      <w:proofErr w:type="gramStart"/>
-      <w:r>
-        <w:rPr>
-          <w:rFonts w:cstheme="minorHAnsi"/>
-          <w:color w:val="DCDCAA"/>
-          <w:sz w:val="21"/>
-          <w:szCs w:val="21"/>
-        </w:rPr>
-        <w:t>utilisateur</w:t>
+        <w:t>t_utilisateur</w:t>
       </w:r>
       <w:proofErr w:type="spellEnd"/>
       <w:r>
@@ -4764,7 +4616,6 @@
         </w:rPr>
         <w:t>(</w:t>
       </w:r>
-      <w:proofErr w:type="gramEnd"/>
     </w:p>
     <w:p>
       <w:pPr>
@@ -4787,7 +4638,6 @@
         <w:t>   </w:t>
       </w:r>
       <w:proofErr w:type="spellStart"/>
-      <w:proofErr w:type="gramStart"/>
       <w:r>
         <w:rPr>
           <w:rFonts w:cstheme="minorHAnsi"/>
@@ -4795,17 +4645,7 @@
           <w:sz w:val="21"/>
           <w:szCs w:val="21"/>
         </w:rPr>
-        <w:t>utilisateur</w:t>
-      </w:r>
-      <w:proofErr w:type="gramEnd"/>
-      <w:r>
-        <w:rPr>
-          <w:rFonts w:cstheme="minorHAnsi"/>
-          <w:color w:val="D4D4D4"/>
-          <w:sz w:val="21"/>
-          <w:szCs w:val="21"/>
-        </w:rPr>
-        <w:t>_id</w:t>
+        <w:t>utilisateur_id</w:t>
       </w:r>
       <w:proofErr w:type="spellEnd"/>
       <w:r>
@@ -4879,7 +4719,6 @@
         </w:rPr>
         <w:t xml:space="preserve"> </w:t>
       </w:r>
-      <w:proofErr w:type="gramStart"/>
       <w:r>
         <w:rPr>
           <w:rFonts w:cstheme="minorHAnsi"/>
@@ -4900,7 +4739,6 @@
         </w:rPr>
         <w:t>(</w:t>
       </w:r>
-      <w:proofErr w:type="gramEnd"/>
       <w:r>
         <w:rPr>
           <w:rFonts w:cstheme="minorHAnsi"/>
@@ -4964,7 +4802,6 @@
         </w:rPr>
         <w:t xml:space="preserve">   username </w:t>
       </w:r>
-      <w:proofErr w:type="gramStart"/>
       <w:r>
         <w:rPr>
           <w:rFonts w:cstheme="minorHAnsi"/>
@@ -4985,7 +4822,6 @@
         </w:rPr>
         <w:t>(</w:t>
       </w:r>
-      <w:proofErr w:type="gramEnd"/>
       <w:r>
         <w:rPr>
           <w:rFonts w:cstheme="minorHAnsi"/>
@@ -5227,31 +5063,19 @@
           <w:szCs w:val="21"/>
           <w:lang w:val="en-US"/>
         </w:rPr>
-        <w:t xml:space="preserve">PRIMARY </w:t>
-      </w:r>
-      <w:proofErr w:type="gramStart"/>
-      <w:r>
-        <w:rPr>
-          <w:rFonts w:cstheme="minorHAnsi"/>
-          <w:color w:val="569CD6"/>
+        <w:t>PRIMARY KEY</w:t>
+      </w:r>
+      <w:r>
+        <w:rPr>
+          <w:rFonts w:cstheme="minorHAnsi"/>
+          <w:color w:val="D4D4D4"/>
           <w:sz w:val="21"/>
           <w:szCs w:val="21"/>
           <w:lang w:val="en-US"/>
         </w:rPr>
-        <w:t>KEY</w:t>
-      </w:r>
-      <w:r>
-        <w:rPr>
-          <w:rFonts w:cstheme="minorHAnsi"/>
-          <w:color w:val="D4D4D4"/>
-          <w:sz w:val="21"/>
-          <w:szCs w:val="21"/>
-          <w:lang w:val="en-US"/>
-        </w:rPr>
         <w:t>(</w:t>
       </w:r>
       <w:proofErr w:type="spellStart"/>
-      <w:proofErr w:type="gramEnd"/>
       <w:r>
         <w:rPr>
           <w:rFonts w:cstheme="minorHAnsi"/>
@@ -5297,7 +5121,6 @@
         <w:lastRenderedPageBreak/>
         <w:t>   </w:t>
       </w:r>
-      <w:proofErr w:type="gramStart"/>
       <w:r>
         <w:rPr>
           <w:rFonts w:cstheme="minorHAnsi"/>
@@ -5319,7 +5142,6 @@
         <w:t>(</w:t>
       </w:r>
       <w:proofErr w:type="spellStart"/>
-      <w:proofErr w:type="gramEnd"/>
       <w:r>
         <w:rPr>
           <w:rFonts w:cstheme="minorHAnsi"/>
@@ -5363,7 +5185,6 @@
         </w:rPr>
         <w:t>   </w:t>
       </w:r>
-      <w:proofErr w:type="gramStart"/>
       <w:r>
         <w:rPr>
           <w:rFonts w:cstheme="minorHAnsi"/>
@@ -5383,7 +5204,6 @@
         <w:t>(</w:t>
       </w:r>
       <w:proofErr w:type="spellStart"/>
-      <w:proofErr w:type="gramEnd"/>
       <w:r>
         <w:rPr>
           <w:rFonts w:cstheme="minorHAnsi"/>
@@ -5492,17 +5312,7 @@
           <w:sz w:val="21"/>
           <w:szCs w:val="21"/>
         </w:rPr>
-        <w:t>t_</w:t>
-      </w:r>
-      <w:proofErr w:type="gramStart"/>
-      <w:r>
-        <w:rPr>
-          <w:rFonts w:cstheme="minorHAnsi"/>
-          <w:color w:val="DCDCAA"/>
-          <w:sz w:val="21"/>
-          <w:szCs w:val="21"/>
-        </w:rPr>
-        <w:t>ecrivain</w:t>
+        <w:t>t_ecrivain</w:t>
       </w:r>
       <w:proofErr w:type="spellEnd"/>
       <w:r>
@@ -5514,7 +5324,6 @@
         </w:rPr>
         <w:t>(</w:t>
       </w:r>
-      <w:proofErr w:type="gramEnd"/>
     </w:p>
     <w:p>
       <w:pPr>
@@ -5537,7 +5346,6 @@
         <w:t>   </w:t>
       </w:r>
       <w:proofErr w:type="spellStart"/>
-      <w:proofErr w:type="gramStart"/>
       <w:r>
         <w:rPr>
           <w:rFonts w:cstheme="minorHAnsi"/>
@@ -5545,17 +5353,7 @@
           <w:sz w:val="21"/>
           <w:szCs w:val="21"/>
         </w:rPr>
-        <w:t>ecrivain</w:t>
-      </w:r>
-      <w:proofErr w:type="gramEnd"/>
-      <w:r>
-        <w:rPr>
-          <w:rFonts w:cstheme="minorHAnsi"/>
-          <w:color w:val="D4D4D4"/>
-          <w:sz w:val="21"/>
-          <w:szCs w:val="21"/>
-        </w:rPr>
-        <w:t>_id</w:t>
+        <w:t>ecrivain_id</w:t>
       </w:r>
       <w:proofErr w:type="spellEnd"/>
       <w:r>
@@ -5607,7 +5405,6 @@
         <w:t>   </w:t>
       </w:r>
       <w:proofErr w:type="spellStart"/>
-      <w:proofErr w:type="gramStart"/>
       <w:r>
         <w:rPr>
           <w:rFonts w:cstheme="minorHAnsi"/>
@@ -5618,7 +5415,6 @@
         <w:t>prenom</w:t>
       </w:r>
       <w:proofErr w:type="spellEnd"/>
-      <w:proofErr w:type="gramEnd"/>
       <w:r>
         <w:rPr>
           <w:rFonts w:cstheme="minorHAnsi"/>
@@ -5686,7 +5482,6 @@
         <w:t>   </w:t>
       </w:r>
       <w:proofErr w:type="spellStart"/>
-      <w:proofErr w:type="gramStart"/>
       <w:r>
         <w:rPr>
           <w:rFonts w:cstheme="minorHAnsi"/>
@@ -5694,17 +5489,7 @@
           <w:sz w:val="21"/>
           <w:szCs w:val="21"/>
         </w:rPr>
-        <w:t>nom</w:t>
-      </w:r>
-      <w:proofErr w:type="gramEnd"/>
-      <w:r>
-        <w:rPr>
-          <w:rFonts w:cstheme="minorHAnsi"/>
-          <w:color w:val="D4D4D4"/>
-          <w:sz w:val="21"/>
-          <w:szCs w:val="21"/>
-        </w:rPr>
-        <w:t>_de_famille</w:t>
+        <w:t>nom_de_famille</w:t>
       </w:r>
       <w:proofErr w:type="spellEnd"/>
       <w:r>
@@ -5780,17 +5565,7 @@
           <w:sz w:val="21"/>
           <w:szCs w:val="21"/>
         </w:rPr>
-        <w:t xml:space="preserve">PRIMARY </w:t>
-      </w:r>
-      <w:proofErr w:type="gramStart"/>
-      <w:r>
-        <w:rPr>
-          <w:rFonts w:cstheme="minorHAnsi"/>
-          <w:color w:val="569CD6"/>
-          <w:sz w:val="21"/>
-          <w:szCs w:val="21"/>
-        </w:rPr>
-        <w:t>KEY</w:t>
+        <w:t>PRIMARY KEY</w:t>
       </w:r>
       <w:r>
         <w:rPr>
@@ -5802,7 +5577,6 @@
         <w:t>(</w:t>
       </w:r>
       <w:proofErr w:type="spellStart"/>
-      <w:proofErr w:type="gramEnd"/>
       <w:r>
         <w:rPr>
           <w:rFonts w:cstheme="minorHAnsi"/>
@@ -5920,31 +5694,19 @@
           <w:szCs w:val="21"/>
           <w:lang w:val="en-US"/>
         </w:rPr>
-        <w:t>t_</w:t>
-      </w:r>
-      <w:proofErr w:type="gramStart"/>
-      <w:r>
-        <w:rPr>
-          <w:rFonts w:cstheme="minorHAnsi"/>
-          <w:color w:val="DCDCAA"/>
+        <w:t>t_categorie</w:t>
+      </w:r>
+      <w:proofErr w:type="spellEnd"/>
+      <w:r>
+        <w:rPr>
+          <w:rFonts w:cstheme="minorHAnsi"/>
+          <w:color w:val="D4D4D4"/>
           <w:sz w:val="21"/>
           <w:szCs w:val="21"/>
           <w:lang w:val="en-US"/>
         </w:rPr>
-        <w:t>categorie</w:t>
-      </w:r>
-      <w:proofErr w:type="spellEnd"/>
-      <w:r>
-        <w:rPr>
-          <w:rFonts w:cstheme="minorHAnsi"/>
-          <w:color w:val="D4D4D4"/>
-          <w:sz w:val="21"/>
-          <w:szCs w:val="21"/>
-          <w:lang w:val="en-US"/>
-        </w:rPr>
         <w:t>(</w:t>
       </w:r>
-      <w:proofErr w:type="gramEnd"/>
     </w:p>
     <w:p>
       <w:pPr>
@@ -6033,7 +5795,6 @@
         </w:rPr>
         <w:t xml:space="preserve">   nom </w:t>
       </w:r>
-      <w:proofErr w:type="gramStart"/>
       <w:r>
         <w:rPr>
           <w:rFonts w:cstheme="minorHAnsi"/>
@@ -6054,7 +5815,6 @@
         </w:rPr>
         <w:t>(</w:t>
       </w:r>
-      <w:proofErr w:type="gramEnd"/>
       <w:r>
         <w:rPr>
           <w:rFonts w:cstheme="minorHAnsi"/>
@@ -6126,31 +5886,19 @@
           <w:szCs w:val="21"/>
           <w:lang w:val="en-US"/>
         </w:rPr>
-        <w:t xml:space="preserve">PRIMARY </w:t>
-      </w:r>
-      <w:proofErr w:type="gramStart"/>
-      <w:r>
-        <w:rPr>
-          <w:rFonts w:cstheme="minorHAnsi"/>
-          <w:color w:val="569CD6"/>
+        <w:t>PRIMARY KEY</w:t>
+      </w:r>
+      <w:r>
+        <w:rPr>
+          <w:rFonts w:cstheme="minorHAnsi"/>
+          <w:color w:val="D4D4D4"/>
           <w:sz w:val="21"/>
           <w:szCs w:val="21"/>
           <w:lang w:val="en-US"/>
         </w:rPr>
-        <w:t>KEY</w:t>
-      </w:r>
-      <w:r>
-        <w:rPr>
-          <w:rFonts w:cstheme="minorHAnsi"/>
-          <w:color w:val="D4D4D4"/>
-          <w:sz w:val="21"/>
-          <w:szCs w:val="21"/>
-          <w:lang w:val="en-US"/>
-        </w:rPr>
         <w:t>(</w:t>
       </w:r>
       <w:proofErr w:type="spellStart"/>
-      <w:proofErr w:type="gramEnd"/>
       <w:r>
         <w:rPr>
           <w:rFonts w:cstheme="minorHAnsi"/>
@@ -6194,7 +5942,6 @@
         </w:rPr>
         <w:t>   </w:t>
       </w:r>
-      <w:proofErr w:type="gramStart"/>
       <w:r>
         <w:rPr>
           <w:rFonts w:cstheme="minorHAnsi"/>
@@ -6211,17 +5958,7 @@
           <w:sz w:val="21"/>
           <w:szCs w:val="21"/>
         </w:rPr>
-        <w:t>(</w:t>
-      </w:r>
-      <w:proofErr w:type="gramEnd"/>
-      <w:r>
-        <w:rPr>
-          <w:rFonts w:cstheme="minorHAnsi"/>
-          <w:color w:val="D4D4D4"/>
-          <w:sz w:val="21"/>
-          <w:szCs w:val="21"/>
-        </w:rPr>
-        <w:t>nom)</w:t>
+        <w:t>(nom)</w:t>
       </w:r>
     </w:p>
     <w:p>
@@ -6312,17 +6049,7 @@
           <w:sz w:val="21"/>
           <w:szCs w:val="21"/>
         </w:rPr>
-        <w:t>t_</w:t>
-      </w:r>
-      <w:proofErr w:type="gramStart"/>
-      <w:r>
-        <w:rPr>
-          <w:rFonts w:cstheme="minorHAnsi"/>
-          <w:color w:val="DCDCAA"/>
-          <w:sz w:val="21"/>
-          <w:szCs w:val="21"/>
-        </w:rPr>
-        <w:t>livre</w:t>
+        <w:t>t_livre</w:t>
       </w:r>
       <w:proofErr w:type="spellEnd"/>
       <w:r>
@@ -6334,7 +6061,6 @@
         </w:rPr>
         <w:t>(</w:t>
       </w:r>
-      <w:proofErr w:type="gramEnd"/>
     </w:p>
     <w:p>
       <w:pPr>
@@ -6357,7 +6083,6 @@
         <w:t>   </w:t>
       </w:r>
       <w:proofErr w:type="spellStart"/>
-      <w:proofErr w:type="gramStart"/>
       <w:r>
         <w:rPr>
           <w:rFonts w:cstheme="minorHAnsi"/>
@@ -6365,17 +6090,7 @@
           <w:sz w:val="21"/>
           <w:szCs w:val="21"/>
         </w:rPr>
-        <w:t>livre</w:t>
-      </w:r>
-      <w:proofErr w:type="gramEnd"/>
-      <w:r>
-        <w:rPr>
-          <w:rFonts w:cstheme="minorHAnsi"/>
-          <w:color w:val="D4D4D4"/>
-          <w:sz w:val="21"/>
-          <w:szCs w:val="21"/>
-        </w:rPr>
-        <w:t>_id</w:t>
+        <w:t>livre_id</w:t>
       </w:r>
       <w:proofErr w:type="spellEnd"/>
       <w:r>
@@ -6449,7 +6164,6 @@
         </w:rPr>
         <w:t xml:space="preserve"> </w:t>
       </w:r>
-      <w:proofErr w:type="gramStart"/>
       <w:r>
         <w:rPr>
           <w:rFonts w:cstheme="minorHAnsi"/>
@@ -6470,7 +6184,6 @@
         </w:rPr>
         <w:t>(</w:t>
       </w:r>
-      <w:proofErr w:type="gramEnd"/>
       <w:r>
         <w:rPr>
           <w:rFonts w:cstheme="minorHAnsi"/>
@@ -6599,7 +6312,6 @@
         <w:t>   </w:t>
       </w:r>
       <w:proofErr w:type="spellStart"/>
-      <w:proofErr w:type="gramStart"/>
       <w:r>
         <w:rPr>
           <w:rFonts w:cstheme="minorHAnsi"/>
@@ -6607,17 +6319,7 @@
           <w:sz w:val="21"/>
           <w:szCs w:val="21"/>
         </w:rPr>
-        <w:t>lien</w:t>
-      </w:r>
-      <w:proofErr w:type="gramEnd"/>
-      <w:r>
-        <w:rPr>
-          <w:rFonts w:cstheme="minorHAnsi"/>
-          <w:color w:val="D4D4D4"/>
-          <w:sz w:val="21"/>
-          <w:szCs w:val="21"/>
-        </w:rPr>
-        <w:t>_image</w:t>
+        <w:t>lien_image</w:t>
       </w:r>
       <w:proofErr w:type="spellEnd"/>
       <w:r>
@@ -6687,7 +6389,6 @@
         <w:t>   </w:t>
       </w:r>
       <w:proofErr w:type="spellStart"/>
-      <w:proofErr w:type="gramStart"/>
       <w:r>
         <w:rPr>
           <w:rFonts w:cstheme="minorHAnsi"/>
@@ -6695,17 +6396,7 @@
           <w:sz w:val="21"/>
           <w:szCs w:val="21"/>
         </w:rPr>
-        <w:t>lien</w:t>
-      </w:r>
-      <w:proofErr w:type="gramEnd"/>
-      <w:r>
-        <w:rPr>
-          <w:rFonts w:cstheme="minorHAnsi"/>
-          <w:color w:val="D4D4D4"/>
-          <w:sz w:val="21"/>
-          <w:szCs w:val="21"/>
-        </w:rPr>
-        <w:t>_pdf</w:t>
+        <w:t>lien_pdf</w:t>
       </w:r>
       <w:proofErr w:type="spellEnd"/>
       <w:r>
@@ -6775,7 +6466,6 @@
         <w:t>   </w:t>
       </w:r>
       <w:proofErr w:type="spellStart"/>
-      <w:proofErr w:type="gramStart"/>
       <w:r>
         <w:rPr>
           <w:rFonts w:cstheme="minorHAnsi"/>
@@ -6786,7 +6476,6 @@
         <w:t>resume</w:t>
       </w:r>
       <w:proofErr w:type="spellEnd"/>
-      <w:proofErr w:type="gramEnd"/>
       <w:r>
         <w:rPr>
           <w:rFonts w:cstheme="minorHAnsi"/>
@@ -6836,7 +6525,6 @@
         <w:t>   </w:t>
       </w:r>
       <w:proofErr w:type="spellStart"/>
-      <w:proofErr w:type="gramStart"/>
       <w:r>
         <w:rPr>
           <w:rFonts w:cstheme="minorHAnsi"/>
@@ -6847,7 +6535,6 @@
         <w:t>editeur</w:t>
       </w:r>
       <w:proofErr w:type="spellEnd"/>
-      <w:proofErr w:type="gramEnd"/>
       <w:r>
         <w:rPr>
           <w:rFonts w:cstheme="minorHAnsi"/>
@@ -6915,7 +6602,6 @@
         <w:t>   </w:t>
       </w:r>
       <w:proofErr w:type="spellStart"/>
-      <w:proofErr w:type="gramStart"/>
       <w:r>
         <w:rPr>
           <w:rFonts w:cstheme="minorHAnsi"/>
@@ -6923,17 +6609,7 @@
           <w:sz w:val="21"/>
           <w:szCs w:val="21"/>
         </w:rPr>
-        <w:t>nombre</w:t>
-      </w:r>
-      <w:proofErr w:type="gramEnd"/>
-      <w:r>
-        <w:rPr>
-          <w:rFonts w:cstheme="minorHAnsi"/>
-          <w:color w:val="D4D4D4"/>
-          <w:sz w:val="21"/>
-          <w:szCs w:val="21"/>
-        </w:rPr>
-        <w:t>_de_page</w:t>
+        <w:t>nombre_de_page</w:t>
       </w:r>
       <w:proofErr w:type="spellEnd"/>
       <w:r>
@@ -7003,7 +6679,6 @@
         <w:t>   </w:t>
       </w:r>
       <w:proofErr w:type="spellStart"/>
-      <w:proofErr w:type="gramStart"/>
       <w:r>
         <w:rPr>
           <w:rFonts w:cstheme="minorHAnsi"/>
@@ -7011,17 +6686,7 @@
           <w:sz w:val="21"/>
           <w:szCs w:val="21"/>
         </w:rPr>
-        <w:t>utilisateur</w:t>
-      </w:r>
-      <w:proofErr w:type="gramEnd"/>
-      <w:r>
-        <w:rPr>
-          <w:rFonts w:cstheme="minorHAnsi"/>
-          <w:color w:val="D4D4D4"/>
-          <w:sz w:val="21"/>
-          <w:szCs w:val="21"/>
-        </w:rPr>
-        <w:t>_fk</w:t>
+        <w:t>utilisateur_fk</w:t>
       </w:r>
       <w:proofErr w:type="spellEnd"/>
       <w:r>
@@ -7267,17 +6932,7 @@
           <w:sz w:val="21"/>
           <w:szCs w:val="21"/>
         </w:rPr>
-        <w:t xml:space="preserve">PRIMARY </w:t>
-      </w:r>
-      <w:proofErr w:type="gramStart"/>
-      <w:r>
-        <w:rPr>
-          <w:rFonts w:cstheme="minorHAnsi"/>
-          <w:color w:val="569CD6"/>
-          <w:sz w:val="21"/>
-          <w:szCs w:val="21"/>
-        </w:rPr>
-        <w:t>KEY</w:t>
+        <w:t>PRIMARY KEY</w:t>
       </w:r>
       <w:r>
         <w:rPr>
@@ -7289,7 +6944,6 @@
         <w:t>(</w:t>
       </w:r>
       <w:proofErr w:type="spellStart"/>
-      <w:proofErr w:type="gramEnd"/>
       <w:r>
         <w:rPr>
           <w:rFonts w:cstheme="minorHAnsi"/>
@@ -7330,7 +6984,6 @@
         </w:rPr>
         <w:t>   </w:t>
       </w:r>
-      <w:proofErr w:type="gramStart"/>
       <w:r>
         <w:rPr>
           <w:rFonts w:cstheme="minorHAnsi"/>
@@ -7347,17 +7000,7 @@
           <w:sz w:val="21"/>
           <w:szCs w:val="21"/>
         </w:rPr>
-        <w:t>(</w:t>
-      </w:r>
-      <w:proofErr w:type="gramEnd"/>
-      <w:r>
-        <w:rPr>
-          <w:rFonts w:cstheme="minorHAnsi"/>
-          <w:color w:val="D4D4D4"/>
-          <w:sz w:val="21"/>
-          <w:szCs w:val="21"/>
-        </w:rPr>
-        <w:t>titre),</w:t>
+        <w:t>(titre),</w:t>
       </w:r>
     </w:p>
     <w:p>
@@ -7380,7 +7023,6 @@
         </w:rPr>
         <w:t>   </w:t>
       </w:r>
-      <w:proofErr w:type="gramStart"/>
       <w:r>
         <w:rPr>
           <w:rFonts w:cstheme="minorHAnsi"/>
@@ -7400,7 +7042,6 @@
         <w:t>(</w:t>
       </w:r>
       <w:proofErr w:type="spellStart"/>
-      <w:proofErr w:type="gramEnd"/>
       <w:r>
         <w:rPr>
           <w:rFonts w:cstheme="minorHAnsi"/>
@@ -7448,17 +7089,7 @@
           <w:sz w:val="21"/>
           <w:szCs w:val="21"/>
         </w:rPr>
-        <w:t xml:space="preserve">FOREIGN </w:t>
-      </w:r>
-      <w:proofErr w:type="gramStart"/>
-      <w:r>
-        <w:rPr>
-          <w:rFonts w:cstheme="minorHAnsi"/>
-          <w:color w:val="569CD6"/>
-          <w:sz w:val="21"/>
-          <w:szCs w:val="21"/>
-        </w:rPr>
-        <w:t>KEY</w:t>
+        <w:t>FOREIGN KEY</w:t>
       </w:r>
       <w:r>
         <w:rPr>
@@ -7470,7 +7101,6 @@
         <w:t>(</w:t>
       </w:r>
       <w:proofErr w:type="spellStart"/>
-      <w:proofErr w:type="gramEnd"/>
       <w:r>
         <w:rPr>
           <w:rFonts w:cstheme="minorHAnsi"/>
@@ -7578,31 +7208,19 @@
           <w:szCs w:val="21"/>
           <w:lang w:val="en-US"/>
         </w:rPr>
-        <w:t xml:space="preserve">FOREIGN </w:t>
-      </w:r>
-      <w:proofErr w:type="gramStart"/>
-      <w:r>
-        <w:rPr>
-          <w:rFonts w:cstheme="minorHAnsi"/>
-          <w:color w:val="569CD6"/>
+        <w:t>FOREIGN KEY</w:t>
+      </w:r>
+      <w:r>
+        <w:rPr>
+          <w:rFonts w:cstheme="minorHAnsi"/>
+          <w:color w:val="D4D4D4"/>
           <w:sz w:val="21"/>
           <w:szCs w:val="21"/>
           <w:lang w:val="en-US"/>
         </w:rPr>
-        <w:t>KEY</w:t>
-      </w:r>
-      <w:r>
-        <w:rPr>
-          <w:rFonts w:cstheme="minorHAnsi"/>
-          <w:color w:val="D4D4D4"/>
-          <w:sz w:val="21"/>
-          <w:szCs w:val="21"/>
-          <w:lang w:val="en-US"/>
-        </w:rPr>
         <w:t>(</w:t>
       </w:r>
       <w:proofErr w:type="spellStart"/>
-      <w:proofErr w:type="gramEnd"/>
       <w:r>
         <w:rPr>
           <w:rFonts w:cstheme="minorHAnsi"/>
@@ -7719,31 +7337,19 @@
           <w:szCs w:val="21"/>
           <w:lang w:val="en-US"/>
         </w:rPr>
-        <w:t xml:space="preserve">FOREIGN </w:t>
-      </w:r>
-      <w:proofErr w:type="gramStart"/>
-      <w:r>
-        <w:rPr>
-          <w:rFonts w:cstheme="minorHAnsi"/>
-          <w:color w:val="569CD6"/>
+        <w:t>FOREIGN KEY</w:t>
+      </w:r>
+      <w:r>
+        <w:rPr>
+          <w:rFonts w:cstheme="minorHAnsi"/>
+          <w:color w:val="D4D4D4"/>
           <w:sz w:val="21"/>
           <w:szCs w:val="21"/>
           <w:lang w:val="en-US"/>
         </w:rPr>
-        <w:t>KEY</w:t>
-      </w:r>
-      <w:r>
-        <w:rPr>
-          <w:rFonts w:cstheme="minorHAnsi"/>
-          <w:color w:val="D4D4D4"/>
-          <w:sz w:val="21"/>
-          <w:szCs w:val="21"/>
-          <w:lang w:val="en-US"/>
-        </w:rPr>
         <w:t>(</w:t>
       </w:r>
       <w:proofErr w:type="spellStart"/>
-      <w:proofErr w:type="gramEnd"/>
       <w:r>
         <w:rPr>
           <w:rFonts w:cstheme="minorHAnsi"/>
@@ -7918,17 +7524,7 @@
           <w:sz w:val="21"/>
           <w:szCs w:val="21"/>
         </w:rPr>
-        <w:t>t_</w:t>
-      </w:r>
-      <w:proofErr w:type="gramStart"/>
-      <w:r>
-        <w:rPr>
-          <w:rFonts w:cstheme="minorHAnsi"/>
-          <w:color w:val="DCDCAA"/>
-          <w:sz w:val="21"/>
-          <w:szCs w:val="21"/>
-        </w:rPr>
-        <w:t>evaluer</w:t>
+        <w:t>t_evaluer</w:t>
       </w:r>
       <w:proofErr w:type="spellEnd"/>
       <w:r>
@@ -7940,7 +7536,6 @@
         </w:rPr>
         <w:t>(</w:t>
       </w:r>
-      <w:proofErr w:type="gramEnd"/>
     </w:p>
     <w:p>
       <w:pPr>
@@ -7963,7 +7558,6 @@
         <w:t>   </w:t>
       </w:r>
       <w:proofErr w:type="spellStart"/>
-      <w:proofErr w:type="gramStart"/>
       <w:r>
         <w:rPr>
           <w:rFonts w:cstheme="minorHAnsi"/>
@@ -7971,17 +7565,7 @@
           <w:sz w:val="21"/>
           <w:szCs w:val="21"/>
         </w:rPr>
-        <w:t>utilisateur</w:t>
-      </w:r>
-      <w:proofErr w:type="gramEnd"/>
-      <w:r>
-        <w:rPr>
-          <w:rFonts w:cstheme="minorHAnsi"/>
-          <w:color w:val="D4D4D4"/>
-          <w:sz w:val="21"/>
-          <w:szCs w:val="21"/>
-        </w:rPr>
-        <w:t>_fk</w:t>
+        <w:t>utilisateur_fk</w:t>
       </w:r>
       <w:proofErr w:type="spellEnd"/>
       <w:r>
@@ -8033,7 +7617,6 @@
         <w:t>   </w:t>
       </w:r>
       <w:proofErr w:type="spellStart"/>
-      <w:proofErr w:type="gramStart"/>
       <w:r>
         <w:rPr>
           <w:rFonts w:cstheme="minorHAnsi"/>
@@ -8041,17 +7624,7 @@
           <w:sz w:val="21"/>
           <w:szCs w:val="21"/>
         </w:rPr>
-        <w:t>livre</w:t>
-      </w:r>
-      <w:proofErr w:type="gramEnd"/>
-      <w:r>
-        <w:rPr>
-          <w:rFonts w:cstheme="minorHAnsi"/>
-          <w:color w:val="D4D4D4"/>
-          <w:sz w:val="21"/>
-          <w:szCs w:val="21"/>
-        </w:rPr>
-        <w:t>_fk</w:t>
+        <w:t>livre_fk</w:t>
       </w:r>
       <w:proofErr w:type="spellEnd"/>
       <w:r>
@@ -8100,27 +7673,7 @@
           <w:sz w:val="21"/>
           <w:szCs w:val="21"/>
         </w:rPr>
-        <w:t>   </w:t>
-      </w:r>
-      <w:proofErr w:type="gramStart"/>
-      <w:r>
-        <w:rPr>
-          <w:rFonts w:cstheme="minorHAnsi"/>
-          <w:color w:val="D4D4D4"/>
-          <w:sz w:val="21"/>
-          <w:szCs w:val="21"/>
-        </w:rPr>
-        <w:t>commentaire</w:t>
-      </w:r>
-      <w:proofErr w:type="gramEnd"/>
-      <w:r>
-        <w:rPr>
-          <w:rFonts w:cstheme="minorHAnsi"/>
-          <w:color w:val="D4D4D4"/>
-          <w:sz w:val="21"/>
-          <w:szCs w:val="21"/>
-        </w:rPr>
-        <w:t xml:space="preserve"> </w:t>
+        <w:t xml:space="preserve">   commentaire </w:t>
       </w:r>
       <w:r>
         <w:rPr>
@@ -8339,17 +7892,7 @@
           <w:sz w:val="21"/>
           <w:szCs w:val="21"/>
         </w:rPr>
-        <w:t xml:space="preserve">PRIMARY </w:t>
-      </w:r>
-      <w:proofErr w:type="gramStart"/>
-      <w:r>
-        <w:rPr>
-          <w:rFonts w:cstheme="minorHAnsi"/>
-          <w:color w:val="569CD6"/>
-          <w:sz w:val="21"/>
-          <w:szCs w:val="21"/>
-        </w:rPr>
-        <w:t>KEY</w:t>
+        <w:t>PRIMARY KEY</w:t>
       </w:r>
       <w:r>
         <w:rPr>
@@ -8361,7 +7904,6 @@
         <w:t>(</w:t>
       </w:r>
       <w:proofErr w:type="spellStart"/>
-      <w:proofErr w:type="gramEnd"/>
       <w:r>
         <w:rPr>
           <w:rFonts w:cstheme="minorHAnsi"/>
@@ -8429,17 +7971,7 @@
           <w:sz w:val="21"/>
           <w:szCs w:val="21"/>
         </w:rPr>
-        <w:t xml:space="preserve">FOREIGN </w:t>
-      </w:r>
-      <w:proofErr w:type="gramStart"/>
-      <w:r>
-        <w:rPr>
-          <w:rFonts w:cstheme="minorHAnsi"/>
-          <w:color w:val="569CD6"/>
-          <w:sz w:val="21"/>
-          <w:szCs w:val="21"/>
-        </w:rPr>
-        <w:t>KEY</w:t>
+        <w:t>FOREIGN KEY</w:t>
       </w:r>
       <w:r>
         <w:rPr>
@@ -8451,7 +7983,6 @@
         <w:t>(</w:t>
       </w:r>
       <w:proofErr w:type="spellStart"/>
-      <w:proofErr w:type="gramEnd"/>
       <w:r>
         <w:rPr>
           <w:rFonts w:cstheme="minorHAnsi"/>
@@ -8557,17 +8088,7 @@
           <w:sz w:val="21"/>
           <w:szCs w:val="21"/>
         </w:rPr>
-        <w:t xml:space="preserve">FOREIGN </w:t>
-      </w:r>
-      <w:proofErr w:type="gramStart"/>
-      <w:r>
-        <w:rPr>
-          <w:rFonts w:cstheme="minorHAnsi"/>
-          <w:color w:val="569CD6"/>
-          <w:sz w:val="21"/>
-          <w:szCs w:val="21"/>
-        </w:rPr>
-        <w:t>KEY</w:t>
+        <w:t>FOREIGN KEY</w:t>
       </w:r>
       <w:r>
         <w:rPr>
@@ -8579,7 +8100,6 @@
         <w:t>(</w:t>
       </w:r>
       <w:proofErr w:type="spellStart"/>
-      <w:proofErr w:type="gramEnd"/>
       <w:r>
         <w:rPr>
           <w:rFonts w:cstheme="minorHAnsi"/>
@@ -9393,19 +8913,11 @@
         </w:rPr>
       </w:pPr>
       <w:bookmarkStart w:id="14" w:name="_Toc199321506"/>
-      <w:proofErr w:type="gramStart"/>
-      <w:r>
-        <w:rPr>
-          <w:rFonts w:cstheme="minorHAnsi"/>
-        </w:rPr>
-        <w:t>explication</w:t>
-      </w:r>
-      <w:proofErr w:type="gramEnd"/>
-      <w:r>
-        <w:rPr>
-          <w:rFonts w:cstheme="minorHAnsi"/>
-        </w:rPr>
-        <w:t xml:space="preserve"> des mesures prises pour les aspects de sécurité</w:t>
+      <w:r>
+        <w:rPr>
+          <w:rFonts w:cstheme="minorHAnsi"/>
+        </w:rPr>
+        <w:t>explication des mesures prises pour les aspects de sécurité</w:t>
       </w:r>
       <w:bookmarkEnd w:id="14"/>
     </w:p>
@@ -9917,19 +9429,11 @@
         </w:rPr>
       </w:pPr>
       <w:bookmarkStart w:id="15" w:name="_Toc199321507"/>
-      <w:proofErr w:type="gramStart"/>
-      <w:r>
-        <w:rPr>
-          <w:rFonts w:cstheme="minorHAnsi"/>
-        </w:rPr>
-        <w:t>explication</w:t>
-      </w:r>
-      <w:proofErr w:type="gramEnd"/>
-      <w:r>
-        <w:rPr>
-          <w:rFonts w:cstheme="minorHAnsi"/>
-        </w:rPr>
-        <w:t xml:space="preserve"> sur chaque fonctionnalité technique demandée</w:t>
+      <w:r>
+        <w:rPr>
+          <w:rFonts w:cstheme="minorHAnsi"/>
+        </w:rPr>
+        <w:t>explication sur chaque fonctionnalité technique demandée</w:t>
       </w:r>
       <w:bookmarkEnd w:id="15"/>
     </w:p>
@@ -10032,7 +9536,6 @@
         <w:t>&lt;</w:t>
       </w:r>
       <w:proofErr w:type="spellStart"/>
-      <w:proofErr w:type="gramStart"/>
       <w:r>
         <w:rPr>
           <w:rStyle w:val="CodeHTML"/>
@@ -10048,16 +9551,7 @@
           <w:rFonts w:asciiTheme="minorHAnsi" w:hAnsiTheme="minorHAnsi" w:cstheme="minorHAnsi"/>
           <w:lang w:val="en-US"/>
         </w:rPr>
-        <w:t xml:space="preserve"> :books</w:t>
-      </w:r>
-      <w:proofErr w:type="gramEnd"/>
-      <w:r>
-        <w:rPr>
-          <w:rStyle w:val="CodeHTML"/>
-          <w:rFonts w:asciiTheme="minorHAnsi" w:hAnsiTheme="minorHAnsi" w:cstheme="minorHAnsi"/>
-          <w:lang w:val="en-US"/>
-        </w:rPr>
-        <w:t>="books" :show-all="false" /&gt;</w:t>
+        <w:t xml:space="preserve"> :books="books" :show-all="false" /&gt;</w:t>
       </w:r>
     </w:p>
     <w:p>
@@ -10555,7 +10049,6 @@
         </w:rPr>
       </w:pPr>
       <w:proofErr w:type="spellStart"/>
-      <w:proofErr w:type="gramStart"/>
       <w:r>
         <w:rPr>
           <w:rStyle w:val="CodeHTML"/>
@@ -10564,7 +10057,6 @@
         <w:t>const</w:t>
       </w:r>
       <w:proofErr w:type="spellEnd"/>
-      <w:proofErr w:type="gramEnd"/>
       <w:r>
         <w:rPr>
           <w:rStyle w:val="CodeHTML"/>
@@ -10810,23 +10302,7 @@
           <w:rStyle w:val="CodeHTML"/>
           <w:rFonts w:asciiTheme="minorHAnsi" w:hAnsiTheme="minorHAnsi" w:cstheme="minorHAnsi"/>
         </w:rPr>
-        <w:t>&lt;</w:t>
-      </w:r>
-      <w:proofErr w:type="gramStart"/>
-      <w:r>
-        <w:rPr>
-          <w:rStyle w:val="CodeHTML"/>
-          <w:rFonts w:asciiTheme="minorHAnsi" w:hAnsiTheme="minorHAnsi" w:cstheme="minorHAnsi"/>
-        </w:rPr>
-        <w:t>star</w:t>
-      </w:r>
-      <w:proofErr w:type="gramEnd"/>
-      <w:r>
-        <w:rPr>
-          <w:rStyle w:val="CodeHTML"/>
-          <w:rFonts w:asciiTheme="minorHAnsi" w:hAnsiTheme="minorHAnsi" w:cstheme="minorHAnsi"/>
-        </w:rPr>
-        <w:t>-rating ... /&gt;</w:t>
+        <w:t>&lt;star-rating ... /&gt;</w:t>
       </w:r>
     </w:p>
     <w:p>
@@ -10905,16 +10381,8 @@
         <w:rPr>
           <w:rFonts w:cstheme="minorHAnsi"/>
         </w:rPr>
-        <w:t xml:space="preserve"> : Contrôle automatique </w:t>
-      </w:r>
-      <w:proofErr w:type="gramStart"/>
-      <w:r>
-        <w:rPr>
-          <w:rFonts w:cstheme="minorHAnsi"/>
-        </w:rPr>
-        <w:t>des droits administrateur</w:t>
-      </w:r>
-      <w:proofErr w:type="gramEnd"/>
+        <w:t xml:space="preserve"> : Contrôle automatique des droits administrateur</w:t>
+      </w:r>
     </w:p>
     <w:p>
       <w:pPr>
@@ -11010,28 +10478,18 @@
           <w:rFonts w:asciiTheme="minorHAnsi" w:hAnsiTheme="minorHAnsi" w:cstheme="minorHAnsi"/>
           <w:lang w:val="en-US"/>
         </w:rPr>
-        <w:t>&lt;router-link to="/login" v-if=</w:t>
-      </w:r>
-      <w:proofErr w:type="gramStart"/>
+        <w:t>&lt;router-link to="/login" v-if="!</w:t>
+      </w:r>
+      <w:proofErr w:type="spellStart"/>
       <w:r>
         <w:rPr>
           <w:rStyle w:val="CodeHTML"/>
           <w:rFonts w:asciiTheme="minorHAnsi" w:hAnsiTheme="minorHAnsi" w:cstheme="minorHAnsi"/>
           <w:lang w:val="en-US"/>
         </w:rPr>
-        <w:t>"!</w:t>
-      </w:r>
-      <w:proofErr w:type="spellStart"/>
-      <w:r>
-        <w:rPr>
-          <w:rStyle w:val="CodeHTML"/>
-          <w:rFonts w:asciiTheme="minorHAnsi" w:hAnsiTheme="minorHAnsi" w:cstheme="minorHAnsi"/>
-          <w:lang w:val="en-US"/>
-        </w:rPr>
         <w:t>isLoggedIn</w:t>
       </w:r>
       <w:proofErr w:type="spellEnd"/>
-      <w:proofErr w:type="gramEnd"/>
       <w:r>
         <w:rPr>
           <w:rStyle w:val="CodeHTML"/>
@@ -11144,20 +10602,12 @@
         </w:rPr>
       </w:pPr>
       <w:bookmarkStart w:id="16" w:name="_Toc199321508"/>
-      <w:proofErr w:type="gramStart"/>
       <w:r>
         <w:rPr>
           <w:rFonts w:cstheme="minorHAnsi"/>
         </w:rPr>
         <w:lastRenderedPageBreak/>
-        <w:t>explication</w:t>
-      </w:r>
-      <w:proofErr w:type="gramEnd"/>
-      <w:r>
-        <w:rPr>
-          <w:rFonts w:cstheme="minorHAnsi"/>
-        </w:rPr>
-        <w:t xml:space="preserve"> de l’organisation du groupe quant à la gestion du code avec git/</w:t>
+        <w:t>explication de l’organisation du groupe quant à la gestion du code avec git/</w:t>
       </w:r>
       <w:proofErr w:type="spellStart"/>
       <w:r>
@@ -11396,19 +10846,11 @@
           <w:rFonts w:asciiTheme="minorHAnsi" w:hAnsiTheme="minorHAnsi" w:cstheme="minorHAnsi"/>
         </w:rPr>
       </w:pPr>
-      <w:proofErr w:type="gramStart"/>
-      <w:r>
-        <w:rPr>
-          <w:rFonts w:asciiTheme="minorHAnsi" w:hAnsiTheme="minorHAnsi" w:cstheme="minorHAnsi"/>
-        </w:rPr>
-        <w:t>une</w:t>
-      </w:r>
-      <w:proofErr w:type="gramEnd"/>
-      <w:r>
-        <w:rPr>
-          <w:rFonts w:asciiTheme="minorHAnsi" w:hAnsiTheme="minorHAnsi" w:cstheme="minorHAnsi"/>
-        </w:rPr>
-        <w:t xml:space="preserve"> </w:t>
+      <w:r>
+        <w:rPr>
+          <w:rFonts w:asciiTheme="minorHAnsi" w:hAnsiTheme="minorHAnsi" w:cstheme="minorHAnsi"/>
+        </w:rPr>
+        <w:t xml:space="preserve">une </w:t>
       </w:r>
       <w:r>
         <w:rPr>
@@ -11435,19 +10877,11 @@
           <w:rFonts w:asciiTheme="minorHAnsi" w:hAnsiTheme="minorHAnsi" w:cstheme="minorHAnsi"/>
         </w:rPr>
       </w:pPr>
-      <w:proofErr w:type="gramStart"/>
-      <w:r>
-        <w:rPr>
-          <w:rFonts w:asciiTheme="minorHAnsi" w:hAnsiTheme="minorHAnsi" w:cstheme="minorHAnsi"/>
-        </w:rPr>
-        <w:t>un</w:t>
-      </w:r>
-      <w:proofErr w:type="gramEnd"/>
-      <w:r>
-        <w:rPr>
-          <w:rFonts w:asciiTheme="minorHAnsi" w:hAnsiTheme="minorHAnsi" w:cstheme="minorHAnsi"/>
-        </w:rPr>
-        <w:t xml:space="preserve"> </w:t>
+      <w:r>
+        <w:rPr>
+          <w:rFonts w:asciiTheme="minorHAnsi" w:hAnsiTheme="minorHAnsi" w:cstheme="minorHAnsi"/>
+        </w:rPr>
+        <w:t xml:space="preserve">un </w:t>
       </w:r>
       <w:r>
         <w:rPr>
@@ -11474,19 +10908,11 @@
           <w:rFonts w:asciiTheme="minorHAnsi" w:hAnsiTheme="minorHAnsi" w:cstheme="minorHAnsi"/>
         </w:rPr>
       </w:pPr>
-      <w:proofErr w:type="gramStart"/>
-      <w:r>
-        <w:rPr>
-          <w:rFonts w:asciiTheme="minorHAnsi" w:hAnsiTheme="minorHAnsi" w:cstheme="minorHAnsi"/>
-        </w:rPr>
-        <w:t>et</w:t>
-      </w:r>
-      <w:proofErr w:type="gramEnd"/>
-      <w:r>
-        <w:rPr>
-          <w:rFonts w:asciiTheme="minorHAnsi" w:hAnsiTheme="minorHAnsi" w:cstheme="minorHAnsi"/>
-        </w:rPr>
-        <w:t xml:space="preserve"> une </w:t>
+      <w:r>
+        <w:rPr>
+          <w:rFonts w:asciiTheme="minorHAnsi" w:hAnsiTheme="minorHAnsi" w:cstheme="minorHAnsi"/>
+        </w:rPr>
+        <w:t xml:space="preserve">et une </w:t>
       </w:r>
       <w:r>
         <w:rPr>
@@ -11660,19 +11086,11 @@
           <w:rFonts w:asciiTheme="minorHAnsi" w:hAnsiTheme="minorHAnsi" w:cstheme="minorHAnsi"/>
         </w:rPr>
       </w:pPr>
-      <w:proofErr w:type="gramStart"/>
-      <w:r>
-        <w:rPr>
-          <w:rFonts w:asciiTheme="minorHAnsi" w:hAnsiTheme="minorHAnsi" w:cstheme="minorHAnsi"/>
-        </w:rPr>
-        <w:t>de</w:t>
-      </w:r>
-      <w:proofErr w:type="gramEnd"/>
-      <w:r>
-        <w:rPr>
-          <w:rFonts w:asciiTheme="minorHAnsi" w:hAnsiTheme="minorHAnsi" w:cstheme="minorHAnsi"/>
-        </w:rPr>
-        <w:t xml:space="preserve"> garantir la qualité du code,</w:t>
+      <w:r>
+        <w:rPr>
+          <w:rFonts w:asciiTheme="minorHAnsi" w:hAnsiTheme="minorHAnsi" w:cstheme="minorHAnsi"/>
+        </w:rPr>
+        <w:t>de garantir la qualité du code,</w:t>
       </w:r>
     </w:p>
     <w:p>
@@ -11686,19 +11104,11 @@
           <w:rFonts w:asciiTheme="minorHAnsi" w:hAnsiTheme="minorHAnsi" w:cstheme="minorHAnsi"/>
         </w:rPr>
       </w:pPr>
-      <w:proofErr w:type="gramStart"/>
-      <w:r>
-        <w:rPr>
-          <w:rFonts w:asciiTheme="minorHAnsi" w:hAnsiTheme="minorHAnsi" w:cstheme="minorHAnsi"/>
-        </w:rPr>
-        <w:t>de</w:t>
-      </w:r>
-      <w:proofErr w:type="gramEnd"/>
-      <w:r>
-        <w:rPr>
-          <w:rFonts w:asciiTheme="minorHAnsi" w:hAnsiTheme="minorHAnsi" w:cstheme="minorHAnsi"/>
-        </w:rPr>
-        <w:t xml:space="preserve"> détecter les erreurs potentielles,</w:t>
+      <w:r>
+        <w:rPr>
+          <w:rFonts w:asciiTheme="minorHAnsi" w:hAnsiTheme="minorHAnsi" w:cstheme="minorHAnsi"/>
+        </w:rPr>
+        <w:t>de détecter les erreurs potentielles,</w:t>
       </w:r>
     </w:p>
     <w:p>
@@ -11712,19 +11122,11 @@
           <w:rFonts w:asciiTheme="minorHAnsi" w:hAnsiTheme="minorHAnsi" w:cstheme="minorHAnsi"/>
         </w:rPr>
       </w:pPr>
-      <w:proofErr w:type="gramStart"/>
-      <w:r>
-        <w:rPr>
-          <w:rFonts w:asciiTheme="minorHAnsi" w:hAnsiTheme="minorHAnsi" w:cstheme="minorHAnsi"/>
-        </w:rPr>
-        <w:t>et</w:t>
-      </w:r>
-      <w:proofErr w:type="gramEnd"/>
-      <w:r>
-        <w:rPr>
-          <w:rFonts w:asciiTheme="minorHAnsi" w:hAnsiTheme="minorHAnsi" w:cstheme="minorHAnsi"/>
-        </w:rPr>
-        <w:t xml:space="preserve"> d’assurer le respect des conventions de codage (</w:t>
+      <w:r>
+        <w:rPr>
+          <w:rFonts w:asciiTheme="minorHAnsi" w:hAnsiTheme="minorHAnsi" w:cstheme="minorHAnsi"/>
+        </w:rPr>
+        <w:t>et d’assurer le respect des conventions de codage (</w:t>
       </w:r>
       <w:proofErr w:type="spellStart"/>
       <w:r>
@@ -11913,14 +11315,7 @@
         <w:rPr>
           <w:rFonts w:asciiTheme="minorHAnsi" w:hAnsiTheme="minorHAnsi" w:cstheme="minorHAnsi"/>
         </w:rPr>
-        <w:t xml:space="preserve">Utilisation d’un </w:t>
-      </w:r>
-      <w:proofErr w:type="gramStart"/>
-      <w:r>
-        <w:rPr>
-          <w:rFonts w:asciiTheme="minorHAnsi" w:hAnsiTheme="minorHAnsi" w:cstheme="minorHAnsi"/>
-        </w:rPr>
-        <w:t xml:space="preserve">fichier </w:t>
+        <w:t xml:space="preserve">Utilisation d’un fichier </w:t>
       </w:r>
       <w:r>
         <w:rPr>
@@ -11942,7 +11337,6 @@
         <w:t>gitignore</w:t>
       </w:r>
       <w:proofErr w:type="spellEnd"/>
-      <w:proofErr w:type="gramEnd"/>
       <w:r>
         <w:rPr>
           <w:rFonts w:asciiTheme="minorHAnsi" w:hAnsiTheme="minorHAnsi" w:cstheme="minorHAnsi"/>
@@ -11953,6 +11347,7 @@
     <w:p>
       <w:pPr>
         <w:pStyle w:val="Retraitcorpsdetexte"/>
+        <w:ind w:left="0"/>
         <w:rPr>
           <w:rFonts w:cstheme="minorHAnsi"/>
         </w:rPr>
@@ -11961,6 +11356,43 @@
     <w:p>
       <w:pPr>
         <w:pStyle w:val="Retraitcorpsdetexte"/>
+        <w:ind w:left="0"/>
+        <w:rPr>
+          <w:rFonts w:cstheme="minorHAnsi"/>
+        </w:rPr>
+      </w:pPr>
+    </w:p>
+    <w:p>
+      <w:pPr>
+        <w:pStyle w:val="Retraitcorpsdetexte"/>
+        <w:ind w:left="0"/>
+        <w:rPr>
+          <w:rFonts w:cstheme="minorHAnsi"/>
+        </w:rPr>
+      </w:pPr>
+    </w:p>
+    <w:p>
+      <w:pPr>
+        <w:pStyle w:val="Retraitcorpsdetexte"/>
+        <w:ind w:left="0"/>
+        <w:rPr>
+          <w:rFonts w:cstheme="minorHAnsi"/>
+        </w:rPr>
+      </w:pPr>
+    </w:p>
+    <w:p>
+      <w:pPr>
+        <w:pStyle w:val="Retraitcorpsdetexte"/>
+        <w:ind w:left="0"/>
+        <w:rPr>
+          <w:rFonts w:cstheme="minorHAnsi"/>
+        </w:rPr>
+      </w:pPr>
+    </w:p>
+    <w:p>
+      <w:pPr>
+        <w:pStyle w:val="Retraitcorpsdetexte"/>
+        <w:ind w:left="0"/>
         <w:rPr>
           <w:rFonts w:cstheme="minorHAnsi"/>
         </w:rPr>
@@ -11978,6 +11410,7 @@
         <w:rPr>
           <w:rFonts w:cstheme="minorHAnsi"/>
         </w:rPr>
+        <w:lastRenderedPageBreak/>
         <w:t>Ecoconception Web</w:t>
       </w:r>
       <w:bookmarkEnd w:id="17"/>
@@ -12018,14 +11451,7 @@
         <w:rPr>
           <w:rFonts w:asciiTheme="minorHAnsi" w:hAnsiTheme="minorHAnsi" w:cstheme="minorHAnsi"/>
         </w:rPr>
-        <w:t xml:space="preserve"> : les images ne sont pas enregistrées directement dans la base de données sous forme de BLOB (ce qui alourdirait considérablement les </w:t>
-      </w:r>
-      <w:r>
-        <w:rPr>
-          <w:rFonts w:asciiTheme="minorHAnsi" w:hAnsiTheme="minorHAnsi" w:cstheme="minorHAnsi"/>
-        </w:rPr>
-        <w:lastRenderedPageBreak/>
-        <w:t xml:space="preserve">échanges entre le frontend et le backend), mais uniquement sous forme de </w:t>
+        <w:t xml:space="preserve"> : les images ne sont pas enregistrées directement dans la base de données sous forme de BLOB (ce qui alourdirait considérablement les échanges entre le frontend et le backend), mais uniquement sous forme de </w:t>
       </w:r>
       <w:r>
         <w:rPr>
@@ -12375,9 +11801,9 @@
     </w:p>
     <w:p>
       <w:pPr>
-        <w:pStyle w:val="Paragraphedeliste"/>
-        <w:rPr>
-          <w:rFonts w:cstheme="minorHAnsi"/>
+        <w:pStyle w:val="NormalWeb"/>
+        <w:rPr>
+          <w:rFonts w:asciiTheme="minorHAnsi" w:hAnsiTheme="minorHAnsi" w:cstheme="minorHAnsi"/>
         </w:rPr>
       </w:pPr>
     </w:p>
@@ -12468,7 +11894,14 @@
         <w:rPr>
           <w:rFonts w:asciiTheme="minorHAnsi" w:hAnsiTheme="minorHAnsi" w:cstheme="minorHAnsi"/>
         </w:rPr>
-        <w:t xml:space="preserve"> permet une gestion efficace des requêtes SQL, évitant les </w:t>
+        <w:t xml:space="preserve"> permet une gestion </w:t>
+      </w:r>
+      <w:r>
+        <w:rPr>
+          <w:rFonts w:asciiTheme="minorHAnsi" w:hAnsiTheme="minorHAnsi" w:cstheme="minorHAnsi"/>
+        </w:rPr>
+        <w:lastRenderedPageBreak/>
+        <w:t xml:space="preserve">efficace des requêtes SQL, évitant les </w:t>
       </w:r>
       <w:proofErr w:type="spellStart"/>
       <w:r>
@@ -12488,15 +11921,6 @@
     <w:p>
       <w:pPr>
         <w:pStyle w:val="NormalWeb"/>
-        <w:ind w:left="720"/>
-        <w:rPr>
-          <w:rFonts w:asciiTheme="minorHAnsi" w:hAnsiTheme="minorHAnsi" w:cstheme="minorHAnsi"/>
-        </w:rPr>
-      </w:pPr>
-    </w:p>
-    <w:p>
-      <w:pPr>
-        <w:pStyle w:val="NormalWeb"/>
         <w:rPr>
           <w:rFonts w:asciiTheme="minorHAnsi" w:hAnsiTheme="minorHAnsi" w:cstheme="minorHAnsi"/>
         </w:rPr>
@@ -12536,14 +11960,6 @@
     </w:p>
     <w:p>
       <w:pPr>
-        <w:pStyle w:val="Retraitcorpsdetexte"/>
-        <w:rPr>
-          <w:rFonts w:cstheme="minorHAnsi"/>
-        </w:rPr>
-      </w:pPr>
-    </w:p>
-    <w:p>
-      <w:pPr>
         <w:pStyle w:val="Titre1"/>
         <w:rPr>
           <w:rFonts w:cstheme="minorHAnsi"/>
@@ -12566,19 +11982,11 @@
         </w:rPr>
       </w:pPr>
       <w:bookmarkStart w:id="19" w:name="_Toc199321511"/>
-      <w:proofErr w:type="gramStart"/>
-      <w:r>
-        <w:rPr>
-          <w:rFonts w:cstheme="minorHAnsi"/>
-        </w:rPr>
-        <w:t>explication</w:t>
-      </w:r>
-      <w:proofErr w:type="gramEnd"/>
-      <w:r>
-        <w:rPr>
-          <w:rFonts w:cstheme="minorHAnsi"/>
-        </w:rPr>
-        <w:t xml:space="preserve"> de la stratégie de tests</w:t>
+      <w:r>
+        <w:rPr>
+          <w:rFonts w:cstheme="minorHAnsi"/>
+        </w:rPr>
+        <w:t>explication de la stratégie de tests</w:t>
       </w:r>
       <w:bookmarkEnd w:id="19"/>
     </w:p>
@@ -12972,27 +12380,33 @@
         <w:rPr>
           <w:rFonts w:cstheme="minorHAnsi"/>
         </w:rPr>
-        <w:t xml:space="preserve"> pour organiser efficacement les tâches et maintenir une bonne coordination au sein du groupe. L’architecture technique mise en place assure une interaction fluide entre les différentes couches de l’application, tandis que les mesures de sécurité et les pratiques responsables en matière de performance et de sobriété numérique montrent une attention particulière portée à la qualité et à la durabilité du produit final.</w:t>
-      </w:r>
-    </w:p>
-    <w:p>
-      <w:pPr>
-        <w:rPr>
-          <w:rFonts w:cstheme="minorHAnsi"/>
-        </w:rPr>
-      </w:pPr>
-    </w:p>
-    <w:p>
-      <w:pPr>
-        <w:rPr>
-          <w:rFonts w:cstheme="minorHAnsi"/>
-        </w:rPr>
-      </w:pPr>
+        <w:t xml:space="preserve"> pour organiser efficacement les tâches et maintenir une bonne coordination au sein du groupe. L’architecture technique </w:t>
+      </w:r>
       <w:r>
         <w:rPr>
           <w:rFonts w:cstheme="minorHAnsi"/>
         </w:rPr>
         <w:lastRenderedPageBreak/>
+        <w:t>mise en place assure une interaction fluide entre les différentes couches de l’application, tandis que les mesures de sécurité et les pratiques responsables en matière de performance et de sobriété numérique montrent une attention particulière portée à la qualité et à la durabilité du produit final.</w:t>
+      </w:r>
+    </w:p>
+    <w:p>
+      <w:pPr>
+        <w:rPr>
+          <w:rFonts w:cstheme="minorHAnsi"/>
+        </w:rPr>
+      </w:pPr>
+    </w:p>
+    <w:p>
+      <w:pPr>
+        <w:rPr>
+          <w:rFonts w:cstheme="minorHAnsi"/>
+        </w:rPr>
+      </w:pPr>
+      <w:r>
+        <w:rPr>
+          <w:rFonts w:cstheme="minorHAnsi"/>
+        </w:rPr>
         <w:t xml:space="preserve">En somme, </w:t>
       </w:r>
       <w:r>
@@ -13330,19 +12744,20 @@
           <w:iCs/>
           <w:szCs w:val="24"/>
         </w:rPr>
-        <w:t xml:space="preserve">Travailler en groupe m’a aussi appris à mieux communiquer, à partager mes idées, à écouter celles </w:t>
-      </w:r>
-      <w:proofErr w:type="gramStart"/>
-      <w:r>
+        <w:t>Travailler en groupe m’a aussi appris à mieux communiquer, à partager mes idées, à écouter celles des autres, et à adapter ma façon de faire quand c’était nécessaire. J’ai également pris conscience de l’importance de tester régulièrement ce qu’on développe, et de bien planifier le travail pour ne pas se retrouver dépassé à la fin.</w:t>
+      </w:r>
+    </w:p>
+    <w:p>
+      <w:pPr>
+        <w:pStyle w:val="Retraitcorpsdetexte"/>
+        <w:ind w:left="0"/>
         <w:rPr>
           <w:rFonts w:cstheme="minorHAnsi"/>
           <w:i/>
           <w:iCs/>
           <w:szCs w:val="24"/>
         </w:rPr>
-        <w:t>des autres</w:t>
-      </w:r>
-      <w:proofErr w:type="gramEnd"/>
+      </w:pPr>
       <w:r>
         <w:rPr>
           <w:rFonts w:cstheme="minorHAnsi"/>
@@ -13350,7 +12765,7 @@
           <w:iCs/>
           <w:szCs w:val="24"/>
         </w:rPr>
-        <w:t>, et à adapter ma façon de faire quand c’était nécessaire. J’ai également pris conscience de l’importance de tester régulièrement ce qu’on développe, et de bien planifier le travail pour ne pas se retrouver dépassé à la fin.</w:t>
+        <w:t>Je ressors de ce projet avec plus de rigueur, plus d’aisance en développement web, et avec l’envie de continuer à progresser dans ce domaine.</w:t>
       </w:r>
     </w:p>
     <w:p>
@@ -13364,15 +12779,161 @@
           <w:szCs w:val="24"/>
         </w:rPr>
       </w:pPr>
-      <w:r>
+    </w:p>
+    <w:p>
+      <w:pPr>
+        <w:pStyle w:val="Retraitcorpsdetexte"/>
+        <w:ind w:left="0"/>
         <w:rPr>
           <w:rFonts w:cstheme="minorHAnsi"/>
           <w:i/>
           <w:iCs/>
           <w:szCs w:val="24"/>
         </w:rPr>
-        <w:t>Je ressors de ce projet avec plus de rigueur, plus d’aisance en développement web, et avec l’envie de continuer à progresser dans ce domaine.</w:t>
-      </w:r>
+      </w:pPr>
+      <w:r>
+        <w:rPr>
+          <w:rFonts w:cstheme="minorHAnsi"/>
+          <w:b/>
+          <w:bCs/>
+          <w:i/>
+          <w:iCs/>
+          <w:szCs w:val="24"/>
+        </w:rPr>
+        <w:t>Antoine Piguet </w:t>
+      </w:r>
+      <w:r>
+        <w:rPr>
+          <w:rFonts w:cstheme="minorHAnsi"/>
+          <w:i/>
+          <w:iCs/>
+          <w:szCs w:val="24"/>
+        </w:rPr>
+        <w:t xml:space="preserve">: </w:t>
+      </w:r>
+      <w:r>
+        <w:rPr>
+          <w:rFonts w:cstheme="minorHAnsi"/>
+          <w:i/>
+          <w:iCs/>
+          <w:szCs w:val="24"/>
+        </w:rPr>
+        <w:t>Ce projet m'a vraiment apporté beaucoup, autant techniquement qu'humainement. J'ai pu solidifier mes bases en Vue.js et mieux comprendre comment tout s'articule entre le frontend, le backend et la base de données.</w:t>
+      </w:r>
+    </w:p>
+    <w:p>
+      <w:pPr>
+        <w:pStyle w:val="Retraitcorpsdetexte"/>
+        <w:ind w:left="0"/>
+        <w:rPr>
+          <w:rFonts w:cstheme="minorHAnsi"/>
+          <w:i/>
+          <w:iCs/>
+          <w:szCs w:val="24"/>
+        </w:rPr>
+      </w:pPr>
+      <w:r>
+        <w:rPr>
+          <w:rFonts w:cstheme="minorHAnsi"/>
+          <w:i/>
+          <w:iCs/>
+          <w:szCs w:val="24"/>
+        </w:rPr>
+        <w:t xml:space="preserve">Ce qui m'a le plus marqué, c'est de voir nos idées prendre forme concrètement et de réaliser l'importance d'écrire du code propre qu'on peut facilement reprendre plus tard. Travailler en équipe m'a aussi appris à mieux communiquer et </w:t>
+      </w:r>
+      <w:r>
+        <w:rPr>
+          <w:rFonts w:cstheme="minorHAnsi"/>
+          <w:i/>
+          <w:iCs/>
+          <w:szCs w:val="24"/>
+        </w:rPr>
+        <w:t>à m’organiser</w:t>
+      </w:r>
+      <w:r>
+        <w:rPr>
+          <w:rFonts w:cstheme="minorHAnsi"/>
+          <w:i/>
+          <w:iCs/>
+          <w:szCs w:val="24"/>
+        </w:rPr>
+        <w:t>.</w:t>
+      </w:r>
+    </w:p>
+    <w:p>
+      <w:pPr>
+        <w:pStyle w:val="Retraitcorpsdetexte"/>
+        <w:ind w:left="0"/>
+        <w:rPr>
+          <w:rFonts w:cstheme="minorHAnsi"/>
+          <w:i/>
+          <w:iCs/>
+          <w:szCs w:val="24"/>
+        </w:rPr>
+      </w:pPr>
+      <w:r>
+        <w:rPr>
+          <w:rFonts w:cstheme="minorHAnsi"/>
+          <w:i/>
+          <w:iCs/>
+          <w:szCs w:val="24"/>
+        </w:rPr>
+        <w:t xml:space="preserve">Je ressors de </w:t>
+      </w:r>
+      <w:r>
+        <w:rPr>
+          <w:rFonts w:cstheme="minorHAnsi"/>
+          <w:i/>
+          <w:iCs/>
+          <w:szCs w:val="24"/>
+        </w:rPr>
+        <w:t>ce projet</w:t>
+      </w:r>
+      <w:r>
+        <w:rPr>
+          <w:rFonts w:cstheme="minorHAnsi"/>
+          <w:i/>
+          <w:iCs/>
+          <w:szCs w:val="24"/>
+        </w:rPr>
+        <w:t xml:space="preserve"> plus confiant dans mes capacités de développement et avec l'envie de continuer à apprendre. Ce projet m'a confirmé que j'étais sur la bonne voie dans ce domaine qui me plaît vraiment.</w:t>
+      </w:r>
+    </w:p>
+    <w:p>
+      <w:pPr>
+        <w:pStyle w:val="Retraitcorpsdetexte"/>
+        <w:ind w:left="0"/>
+        <w:rPr>
+          <w:rFonts w:cstheme="minorHAnsi"/>
+          <w:i/>
+          <w:iCs/>
+          <w:szCs w:val="24"/>
+        </w:rPr>
+      </w:pPr>
+    </w:p>
+    <w:p>
+      <w:pPr>
+        <w:pStyle w:val="Retraitcorpsdetexte"/>
+        <w:ind w:left="0"/>
+        <w:rPr>
+          <w:rFonts w:cstheme="minorHAnsi"/>
+          <w:i/>
+          <w:iCs/>
+          <w:szCs w:val="24"/>
+        </w:rPr>
+      </w:pPr>
+    </w:p>
+    <w:p>
+      <w:pPr>
+        <w:pStyle w:val="Retraitcorpsdetexte"/>
+        <w:ind w:left="0"/>
+        <w:rPr>
+          <w:rFonts w:cstheme="minorHAnsi"/>
+          <w:i/>
+          <w:iCs/>
+          <w:szCs w:val="24"/>
+        </w:rPr>
+      </w:pPr>
     </w:p>
     <w:p>
       <w:pPr>
@@ -13552,7 +13113,6 @@
         <w:rPr>
           <w:rFonts w:cstheme="minorHAnsi"/>
         </w:rPr>
-        <w:lastRenderedPageBreak/>
         <w:t>Une planification plus fine, avec des marges de sécurité et une meilleure anticipation des risques, aurait permis de gérer le temps plus efficacement, de mieux équilibrer les phases de développement et de test, et d’atteindre un résultat encore plus stable.</w:t>
       </w:r>
     </w:p>
@@ -13745,23 +13305,7 @@
           <w:rFonts w:cstheme="minorHAnsi"/>
           <w:szCs w:val="24"/>
         </w:rPr>
-        <w:t xml:space="preserve">Conseils </w:t>
-      </w:r>
-      <w:proofErr w:type="gramStart"/>
-      <w:r>
-        <w:rPr>
-          <w:rFonts w:cstheme="minorHAnsi"/>
-          <w:szCs w:val="24"/>
-        </w:rPr>
-        <w:t>utiles:</w:t>
-      </w:r>
-      <w:proofErr w:type="gramEnd"/>
-      <w:r>
-        <w:rPr>
-          <w:rFonts w:cstheme="minorHAnsi"/>
-          <w:szCs w:val="24"/>
-        </w:rPr>
-        <w:t xml:space="preserve"> </w:t>
+        <w:t xml:space="preserve">Conseils utiles: </w:t>
       </w:r>
       <w:hyperlink r:id="rId14" w:history="1">
         <w:r>
@@ -13941,27 +13485,7 @@
           <w:szCs w:val="22"/>
           <w:lang w:val="en-US"/>
         </w:rPr>
-        <w:t xml:space="preserve">Swagger API </w:t>
-      </w:r>
-      <w:proofErr w:type="gramStart"/>
-      <w:r>
-        <w:rPr>
-          <w:rFonts w:cstheme="minorHAnsi"/>
-          <w:sz w:val="22"/>
-          <w:szCs w:val="22"/>
-          <w:lang w:val="en-US"/>
-        </w:rPr>
-        <w:t>Docs :</w:t>
-      </w:r>
-      <w:proofErr w:type="gramEnd"/>
-      <w:r>
-        <w:rPr>
-          <w:rFonts w:cstheme="minorHAnsi"/>
-          <w:sz w:val="22"/>
-          <w:szCs w:val="22"/>
-          <w:lang w:val="en-US"/>
-        </w:rPr>
-        <w:t xml:space="preserve"> </w:t>
+        <w:t xml:space="preserve">Swagger API Docs : </w:t>
       </w:r>
       <w:hyperlink r:id="rId18" w:history="1">
         <w:r>
@@ -14149,27 +13673,7 @@
           <w:szCs w:val="22"/>
           <w:lang w:val="en-US"/>
         </w:rPr>
-        <w:t xml:space="preserve">GitHub </w:t>
-      </w:r>
-      <w:proofErr w:type="gramStart"/>
-      <w:r>
-        <w:rPr>
-          <w:rFonts w:cstheme="minorHAnsi"/>
-          <w:sz w:val="22"/>
-          <w:szCs w:val="22"/>
-          <w:lang w:val="en-US"/>
-        </w:rPr>
-        <w:t>Project :</w:t>
-      </w:r>
-      <w:proofErr w:type="gramEnd"/>
-      <w:r>
-        <w:rPr>
-          <w:rFonts w:cstheme="minorHAnsi"/>
-          <w:sz w:val="22"/>
-          <w:szCs w:val="22"/>
-          <w:lang w:val="en-US"/>
-        </w:rPr>
-        <w:t xml:space="preserve"> </w:t>
+        <w:t xml:space="preserve">GitHub Project : </w:t>
       </w:r>
       <w:hyperlink r:id="rId22" w:history="1">
         <w:r>

</xml_diff>